<commit_message>
Level Design - Monday
</commit_message>
<xml_diff>
--- a/level design.docx
+++ b/level design.docx
@@ -121,7 +121,31 @@
               <w:rPr>
                 <w:lang w:val="en-US"/>
               </w:rPr>
-              <w:t xml:space="preserve">Normal Play with phishing emails, malware emails, </w:t>
+              <w:t xml:space="preserve">Introduction of fake email addresses with wrong spelling tactics. </w:t>
+            </w:r>
+            <w:r>
+              <w:rPr>
+                <w:lang w:val="en-US"/>
+              </w:rPr>
+              <w:t xml:space="preserve">Normal Play with phishing emails, </w:t>
+            </w:r>
+            <w:r>
+              <w:rPr>
+                <w:lang w:val="en-US"/>
+              </w:rPr>
+              <w:t>adware</w:t>
+            </w:r>
+            <w:r>
+              <w:rPr>
+                <w:lang w:val="en-US"/>
+              </w:rPr>
+              <w:t xml:space="preserve"> emails</w:t>
+            </w:r>
+            <w:r>
+              <w:rPr>
+                <w:lang w:val="en-US"/>
+              </w:rPr>
+              <w:t>.</w:t>
             </w:r>
           </w:p>
         </w:tc>
@@ -168,7 +192,13 @@
               <w:rPr>
                 <w:lang w:val="en-US"/>
               </w:rPr>
-              <w:t>Increasing difficulty, appearance of antagonist.</w:t>
+              <w:t>Increasing difficulty, appearance of antagonist</w:t>
+            </w:r>
+            <w:r>
+              <w:rPr>
+                <w:lang w:val="en-US"/>
+              </w:rPr>
+              <w:t xml:space="preserve"> company. Impersonation of authority pretending to investigate the company.</w:t>
             </w:r>
           </w:p>
         </w:tc>
@@ -211,6 +241,12 @@
                 <w:lang w:val="en-US"/>
               </w:rPr>
             </w:pPr>
+            <w:r>
+              <w:rPr>
+                <w:lang w:val="en-US"/>
+              </w:rPr>
+              <w:t>More malware, adware, more realistic impersonation, antivirus corruption</w:t>
+            </w:r>
           </w:p>
         </w:tc>
       </w:tr>
@@ -252,6 +288,12 @@
                 <w:lang w:val="en-US"/>
               </w:rPr>
             </w:pPr>
+            <w:r>
+              <w:rPr>
+                <w:lang w:val="en-US"/>
+              </w:rPr>
+              <w:t xml:space="preserve">Chaos, blatant attacks from hacking team. </w:t>
+            </w:r>
           </w:p>
         </w:tc>
       </w:tr>
@@ -299,7 +341,37 @@
         <w:rPr>
           <w:lang w:val="en-US"/>
         </w:rPr>
-        <w:t>Impersonation of authority: We are investigating your company, please send one of the documents for checking.</w:t>
+        <w:t xml:space="preserve">Impersonation of authority: </w:t>
+      </w:r>
+      <w:r>
+        <w:rPr>
+          <w:lang w:val="en-US"/>
+        </w:rPr>
+        <w:t>“</w:t>
+      </w:r>
+      <w:r>
+        <w:rPr>
+          <w:lang w:val="en-US"/>
+        </w:rPr>
+        <w:t>We are investigating your company, please send one of the documents for checking</w:t>
+      </w:r>
+      <w:r>
+        <w:rPr>
+          <w:lang w:val="en-US"/>
+        </w:rPr>
+        <w:t>”</w:t>
+      </w:r>
+      <w:r>
+        <w:rPr>
+          <w:lang w:val="en-US"/>
+        </w:rPr>
+        <w:t>.</w:t>
+      </w:r>
+      <w:r>
+        <w:rPr>
+          <w:lang w:val="en-US"/>
+        </w:rPr>
+        <w:t xml:space="preserve"> Guide teaches not to immediately follow the request, open other emails first for more information.</w:t>
       </w:r>
     </w:p>
     <w:p>
@@ -524,15 +596,6 @@
               </w:rPr>
               <w:t xml:space="preserve">: </w:t>
             </w:r>
-            <w:hyperlink r:id="rId5" w:history="1">
-              <w:r>
-                <w:rPr>
-                  <w:rStyle w:val="Hyperlink"/>
-                  <w:lang w:val="en-US"/>
-                </w:rPr>
-                <w:t>dallas@abc.com.my</w:t>
-              </w:r>
-            </w:hyperlink>
           </w:p>
           <w:p>
             <w:pPr>
@@ -585,7 +648,235 @@
               <w:rPr>
                 <w:lang w:val="en-US"/>
               </w:rPr>
-              <w:t>Hello! I am your assigned buddy to guide you through the basic tasks you will be doing!</w:t>
+              <w:t xml:space="preserve">Welcome </w:t>
+            </w:r>
+            <w:r>
+              <w:rPr>
+                <w:lang w:val="en-US"/>
+              </w:rPr>
+              <w:t>aboard</w:t>
+            </w:r>
+            <w:r>
+              <w:rPr>
+                <w:lang w:val="en-US"/>
+              </w:rPr>
+              <w:t xml:space="preserve"> ABC Stationery, {</w:t>
+            </w:r>
+            <w:proofErr w:type="spellStart"/>
+            <w:r>
+              <w:rPr>
+                <w:lang w:val="en-US"/>
+              </w:rPr>
+              <w:t>player_name</w:t>
+            </w:r>
+            <w:proofErr w:type="spellEnd"/>
+            <w:r>
+              <w:rPr>
+                <w:lang w:val="en-US"/>
+              </w:rPr>
+              <w:t>}</w:t>
+            </w:r>
+            <w:r>
+              <w:rPr>
+                <w:lang w:val="en-US"/>
+              </w:rPr>
+              <w:t>!</w:t>
+            </w:r>
+          </w:p>
+          <w:p>
+            <w:pPr>
+              <w:rPr>
+                <w:lang w:val="en-US"/>
+              </w:rPr>
+            </w:pPr>
+            <w:r>
+              <w:rPr>
+                <w:lang w:val="en-US"/>
+              </w:rPr>
+              <w:t xml:space="preserve">[p] </w:t>
+            </w:r>
+          </w:p>
+          <w:p>
+            <w:pPr>
+              <w:rPr>
+                <w:lang w:val="en-US"/>
+              </w:rPr>
+            </w:pPr>
+            <w:r>
+              <w:rPr>
+                <w:lang w:val="en-US"/>
+              </w:rPr>
+              <w:t>[p]</w:t>
+            </w:r>
+            <w:r>
+              <w:rPr>
+                <w:lang w:val="en-US"/>
+              </w:rPr>
+              <w:t>I am your assigned buddy to guide you through the basic tasks you will be doing!</w:t>
+            </w:r>
+          </w:p>
+          <w:p>
+            <w:pPr>
+              <w:rPr>
+                <w:lang w:val="en-US"/>
+              </w:rPr>
+            </w:pPr>
+            <w:r>
+              <w:rPr>
+                <w:lang w:val="en-US"/>
+              </w:rPr>
+              <w:t xml:space="preserve">[p] </w:t>
+            </w:r>
+          </w:p>
+          <w:p>
+            <w:pPr>
+              <w:rPr>
+                <w:lang w:val="en-US"/>
+              </w:rPr>
+            </w:pPr>
+            <w:r>
+              <w:rPr>
+                <w:lang w:val="en-US"/>
+              </w:rPr>
+              <w:t>[p]We have sales representatives visiting stores like retailers, bookstores, office supply stores and more.</w:t>
+            </w:r>
+          </w:p>
+          <w:p>
+            <w:pPr>
+              <w:rPr>
+                <w:lang w:val="en-US"/>
+              </w:rPr>
+            </w:pPr>
+            <w:r>
+              <w:rPr>
+                <w:lang w:val="en-US"/>
+              </w:rPr>
+              <w:t xml:space="preserve">[p] </w:t>
+            </w:r>
+          </w:p>
+          <w:p>
+            <w:pPr>
+              <w:rPr>
+                <w:lang w:val="en-US"/>
+              </w:rPr>
+            </w:pPr>
+            <w:r>
+              <w:rPr>
+                <w:lang w:val="en-US"/>
+              </w:rPr>
+              <w:t>[p]Your job is to receive documents sent from our clients, make sure it is safe before sending it to Finance, someone from there will provide further explanation to you soon.</w:t>
+            </w:r>
+          </w:p>
+          <w:p>
+            <w:pPr>
+              <w:rPr>
+                <w:lang w:val="en-US"/>
+              </w:rPr>
+            </w:pPr>
+            <w:r>
+              <w:rPr>
+                <w:lang w:val="en-US"/>
+              </w:rPr>
+              <w:t xml:space="preserve">[p] </w:t>
+            </w:r>
+          </w:p>
+          <w:p>
+            <w:pPr>
+              <w:rPr>
+                <w:lang w:val="en-US"/>
+              </w:rPr>
+            </w:pPr>
+            <w:r>
+              <w:rPr>
+                <w:lang w:val="en-US"/>
+              </w:rPr>
+              <w:t>[p</w:t>
+            </w:r>
+            <w:r>
+              <w:rPr>
+                <w:lang w:val="en-US"/>
+              </w:rPr>
+              <w:t>]*</w:t>
+            </w:r>
+            <w:r>
+              <w:rPr>
+                <w:lang w:val="en-US"/>
+              </w:rPr>
+              <w:t>[b]</w:t>
+            </w:r>
+            <w:r>
+              <w:rPr>
+                <w:lang w:val="en-US"/>
+              </w:rPr>
+              <w:t>Tip</w:t>
+            </w:r>
+            <w:r>
+              <w:rPr>
+                <w:lang w:val="en-US"/>
+              </w:rPr>
+              <w:t>[/b]</w:t>
+            </w:r>
+            <w:r>
+              <w:rPr>
+                <w:lang w:val="en-US"/>
+              </w:rPr>
+              <w:t xml:space="preserve">: </w:t>
+            </w:r>
+            <w:r>
+              <w:rPr>
+                <w:lang w:val="en-US"/>
+              </w:rPr>
+              <w:t>If you come across any suspicious emails</w:t>
+            </w:r>
+            <w:r>
+              <w:rPr>
+                <w:lang w:val="en-US"/>
+              </w:rPr>
+              <w:t xml:space="preserve">. </w:t>
+            </w:r>
+            <w:r>
+              <w:rPr>
+                <w:lang w:val="en-US"/>
+              </w:rPr>
+              <w:t xml:space="preserve">Click the three dots on the top right corner and </w:t>
+            </w:r>
+            <w:r>
+              <w:rPr>
+                <w:lang w:val="en-US"/>
+              </w:rPr>
+              <w:t>[b]report[/b]</w:t>
+            </w:r>
+            <w:r>
+              <w:rPr>
+                <w:lang w:val="en-US"/>
+              </w:rPr>
+              <w:t xml:space="preserve"> the email!</w:t>
+            </w:r>
+          </w:p>
+          <w:p>
+            <w:pPr>
+              <w:rPr>
+                <w:lang w:val="en-US"/>
+              </w:rPr>
+            </w:pPr>
+            <w:r>
+              <w:rPr>
+                <w:lang w:val="en-US"/>
+              </w:rPr>
+              <w:t xml:space="preserve">[p] </w:t>
+            </w:r>
+          </w:p>
+          <w:p>
+            <w:pPr>
+              <w:rPr>
+                <w:lang w:val="en-US"/>
+              </w:rPr>
+            </w:pPr>
+            <w:r>
+              <w:rPr>
+                <w:lang w:val="en-US"/>
+              </w:rPr>
+              <w:t>[p]Also beware to not report legitimate emails; this could disrupt our operations and negatively impact client experience.</w:t>
             </w:r>
           </w:p>
           <w:p>
@@ -609,8 +900,6 @@
           <w:p>
             <w:pPr>
               <w:rPr>
-                <w:b/>
-                <w:bCs/>
                 <w:lang w:val="en-US"/>
               </w:rPr>
             </w:pPr>
@@ -633,13 +922,354 @@
               <w:rPr>
                 <w:lang w:val="en-US"/>
               </w:rPr>
+              <w:t>: Message</w:t>
+            </w:r>
+          </w:p>
+          <w:p>
+            <w:pPr>
+              <w:rPr>
+                <w:lang w:val="en-US"/>
+              </w:rPr>
+            </w:pPr>
+            <w:r>
+              <w:rPr>
+                <w:b/>
+                <w:bCs/>
+                <w:lang w:val="en-US"/>
+              </w:rPr>
+              <w:t>Sender Name</w:t>
+            </w:r>
+            <w:r>
+              <w:rPr>
+                <w:lang w:val="en-US"/>
+              </w:rPr>
+              <w:t>: Blake</w:t>
+            </w:r>
+          </w:p>
+          <w:p>
+            <w:pPr>
+              <w:rPr>
+                <w:lang w:val="en-US"/>
+              </w:rPr>
+            </w:pPr>
+            <w:r>
+              <w:rPr>
+                <w:b/>
+                <w:bCs/>
+                <w:lang w:val="en-US"/>
+              </w:rPr>
+              <w:t>Sender Address</w:t>
+            </w:r>
+            <w:r>
+              <w:rPr>
+                <w:lang w:val="en-US"/>
+              </w:rPr>
               <w:t xml:space="preserve">: </w:t>
             </w:r>
-            <w:r>
-              <w:rPr>
-                <w:lang w:val="en-US"/>
-              </w:rPr>
-              <w:t>Inbound</w:t>
+            <w:hyperlink r:id="rId5" w:history="1">
+              <w:r>
+                <w:rPr>
+                  <w:rStyle w:val="Hyperlink"/>
+                  <w:lang w:val="en-US"/>
+                </w:rPr>
+                <w:t>blake@abc.com.my</w:t>
+              </w:r>
+            </w:hyperlink>
+          </w:p>
+          <w:p>
+            <w:pPr>
+              <w:rPr>
+                <w:lang w:val="en-US"/>
+              </w:rPr>
+            </w:pPr>
+            <w:r>
+              <w:rPr>
+                <w:b/>
+                <w:bCs/>
+                <w:lang w:val="en-US"/>
+              </w:rPr>
+              <w:t>To Address</w:t>
+            </w:r>
+            <w:r>
+              <w:rPr>
+                <w:lang w:val="en-US"/>
+              </w:rPr>
+              <w:t>: {</w:t>
+            </w:r>
+            <w:proofErr w:type="spellStart"/>
+            <w:r>
+              <w:rPr>
+                <w:lang w:val="en-US"/>
+              </w:rPr>
+              <w:t>player_email</w:t>
+            </w:r>
+            <w:proofErr w:type="spellEnd"/>
+            <w:r>
+              <w:rPr>
+                <w:lang w:val="en-US"/>
+              </w:rPr>
+              <w:t>}</w:t>
+            </w:r>
+          </w:p>
+          <w:p>
+            <w:pPr>
+              <w:rPr>
+                <w:lang w:val="en-US"/>
+              </w:rPr>
+            </w:pPr>
+            <w:r>
+              <w:rPr>
+                <w:b/>
+                <w:bCs/>
+                <w:lang w:val="en-US"/>
+              </w:rPr>
+              <w:lastRenderedPageBreak/>
+              <w:t>CC Address</w:t>
+            </w:r>
+            <w:r>
+              <w:rPr>
+                <w:lang w:val="en-US"/>
+              </w:rPr>
+              <w:t xml:space="preserve">: </w:t>
+            </w:r>
+          </w:p>
+          <w:p>
+            <w:pPr>
+              <w:rPr>
+                <w:lang w:val="en-US"/>
+              </w:rPr>
+            </w:pPr>
+            <w:r>
+              <w:rPr>
+                <w:b/>
+                <w:bCs/>
+                <w:lang w:val="en-US"/>
+              </w:rPr>
+              <w:t>Subject</w:t>
+            </w:r>
+            <w:r>
+              <w:rPr>
+                <w:lang w:val="en-US"/>
+              </w:rPr>
+              <w:t>: Onboarding Guide</w:t>
+            </w:r>
+            <w:r>
+              <w:rPr>
+                <w:lang w:val="en-US"/>
+              </w:rPr>
+              <w:t xml:space="preserve"> 2</w:t>
+            </w:r>
+          </w:p>
+          <w:p>
+            <w:pPr>
+              <w:rPr>
+                <w:lang w:val="en-US"/>
+              </w:rPr>
+            </w:pPr>
+          </w:p>
+        </w:tc>
+        <w:tc>
+          <w:tcPr>
+            <w:tcW w:w="5061" w:type="dxa"/>
+            <w:vAlign w:val="center"/>
+          </w:tcPr>
+          <w:p>
+            <w:pPr>
+              <w:rPr>
+                <w:lang w:val="en-US"/>
+              </w:rPr>
+            </w:pPr>
+          </w:p>
+          <w:p>
+            <w:pPr>
+              <w:rPr>
+                <w:lang w:val="en-US"/>
+              </w:rPr>
+            </w:pPr>
+            <w:r>
+              <w:rPr>
+                <w:lang w:val="en-US"/>
+              </w:rPr>
+              <w:t>Here is a list of emails our company employees, if you receive an email claiming to be a coworker but their email address doesn’t match this list, chances are they are an impersonator and need to be reported.</w:t>
+            </w:r>
+          </w:p>
+          <w:p>
+            <w:pPr>
+              <w:rPr>
+                <w:lang w:val="en-US"/>
+              </w:rPr>
+            </w:pPr>
+            <w:r>
+              <w:rPr>
+                <w:lang w:val="en-US"/>
+              </w:rPr>
+              <w:lastRenderedPageBreak/>
+              <w:t xml:space="preserve">[p] </w:t>
+            </w:r>
+          </w:p>
+          <w:p>
+            <w:pPr>
+              <w:rPr>
+                <w:lang w:val="en-US"/>
+              </w:rPr>
+            </w:pPr>
+            <w:r>
+              <w:rPr>
+                <w:lang w:val="en-US"/>
+              </w:rPr>
+              <w:t>[p]</w:t>
+            </w:r>
+            <w:hyperlink r:id="rId6" w:history="1">
+              <w:r>
+                <w:rPr>
+                  <w:rStyle w:val="Hyperlink"/>
+                  <w:lang w:val="en-US"/>
+                </w:rPr>
+                <w:t>nazrin.finance@abc.com.my</w:t>
+              </w:r>
+            </w:hyperlink>
+          </w:p>
+          <w:p>
+            <w:pPr>
+              <w:rPr>
+                <w:lang w:val="en-US"/>
+              </w:rPr>
+            </w:pPr>
+            <w:r>
+              <w:rPr>
+                <w:lang w:val="en-US"/>
+              </w:rPr>
+              <w:t>[p]</w:t>
+            </w:r>
+            <w:hyperlink r:id="rId7" w:history="1">
+              <w:r>
+                <w:rPr>
+                  <w:rStyle w:val="Hyperlink"/>
+                  <w:lang w:val="en-US"/>
+                </w:rPr>
+                <w:t>k</w:t>
+              </w:r>
+              <w:r>
+                <w:rPr>
+                  <w:rStyle w:val="Hyperlink"/>
+                </w:rPr>
+                <w:t>aijie.it</w:t>
+              </w:r>
+              <w:r>
+                <w:rPr>
+                  <w:rStyle w:val="Hyperlink"/>
+                  <w:lang w:val="en-US"/>
+                </w:rPr>
+                <w:t>@abc.com.my</w:t>
+              </w:r>
+            </w:hyperlink>
+          </w:p>
+          <w:p>
+            <w:pPr>
+              <w:rPr>
+                <w:lang w:val="en-US"/>
+              </w:rPr>
+            </w:pPr>
+            <w:r>
+              <w:rPr>
+                <w:lang w:val="en-US"/>
+              </w:rPr>
+              <w:t>[p]</w:t>
+            </w:r>
+            <w:hyperlink r:id="rId8" w:history="1">
+              <w:r>
+                <w:rPr>
+                  <w:rStyle w:val="Hyperlink"/>
+                  <w:lang w:val="en-US"/>
+                </w:rPr>
+                <w:t>dallas@abc.com.my</w:t>
+              </w:r>
+            </w:hyperlink>
+            <w:r>
+              <w:rPr>
+                <w:lang w:val="en-US"/>
+              </w:rPr>
+              <w:t xml:space="preserve"> </w:t>
+            </w:r>
+          </w:p>
+          <w:p>
+            <w:pPr>
+              <w:rPr>
+                <w:lang w:val="en-US"/>
+              </w:rPr>
+            </w:pPr>
+            <w:r>
+              <w:rPr>
+                <w:lang w:val="en-US"/>
+              </w:rPr>
+              <w:t>[p]</w:t>
+            </w:r>
+            <w:r>
+              <w:rPr>
+                <w:lang w:val="en-US"/>
+              </w:rPr>
+              <w:t xml:space="preserve"> </w:t>
+            </w:r>
+          </w:p>
+          <w:p>
+            <w:pPr>
+              <w:rPr>
+                <w:lang w:val="en-US"/>
+              </w:rPr>
+            </w:pPr>
+            <w:r>
+              <w:rPr>
+                <w:lang w:val="en-US"/>
+              </w:rPr>
+              <w:t>[p] Have fun!</w:t>
+            </w:r>
+          </w:p>
+          <w:p>
+            <w:pPr>
+              <w:rPr>
+                <w:lang w:val="en-US"/>
+              </w:rPr>
+            </w:pPr>
+          </w:p>
+        </w:tc>
+      </w:tr>
+      <w:tr>
+        <w:trPr>
+          <w:trHeight w:val="360"/>
+        </w:trPr>
+        <w:tc>
+          <w:tcPr>
+            <w:tcW w:w="3955" w:type="dxa"/>
+            <w:vAlign w:val="center"/>
+          </w:tcPr>
+          <w:p>
+            <w:pPr>
+              <w:rPr>
+                <w:b/>
+                <w:bCs/>
+                <w:lang w:val="en-US"/>
+              </w:rPr>
+            </w:pPr>
+          </w:p>
+          <w:p>
+            <w:pPr>
+              <w:rPr>
+                <w:lang w:val="en-US"/>
+              </w:rPr>
+            </w:pPr>
+            <w:r>
+              <w:rPr>
+                <w:b/>
+                <w:bCs/>
+                <w:lang w:val="en-US"/>
+              </w:rPr>
+              <w:t>Type</w:t>
+            </w:r>
+            <w:r>
+              <w:rPr>
+                <w:lang w:val="en-US"/>
+              </w:rPr>
+              <w:t>: Inbound</w:t>
             </w:r>
           </w:p>
           <w:p>
@@ -689,12 +1319,1434 @@
               </w:rPr>
               <w:t xml:space="preserve">: </w:t>
             </w:r>
-            <w:hyperlink r:id="rId6" w:history="1">
+            <w:hyperlink r:id="rId9" w:history="1">
               <w:r>
                 <w:rPr>
                   <w:rStyle w:val="Hyperlink"/>
                 </w:rPr>
                 <w:t>ongweizhe</w:t>
+              </w:r>
+              <w:r>
+                <w:rPr>
+                  <w:rStyle w:val="Hyperlink"/>
+                  <w:lang w:val="en-US"/>
+                </w:rPr>
+                <w:t>@littlegenius.com.my</w:t>
+              </w:r>
+            </w:hyperlink>
+          </w:p>
+          <w:p>
+            <w:pPr>
+              <w:rPr>
+                <w:lang w:val="en-US"/>
+              </w:rPr>
+            </w:pPr>
+            <w:r>
+              <w:rPr>
+                <w:b/>
+                <w:bCs/>
+                <w:lang w:val="en-US"/>
+              </w:rPr>
+              <w:t>To Address</w:t>
+            </w:r>
+            <w:r>
+              <w:rPr>
+                <w:lang w:val="en-US"/>
+              </w:rPr>
+              <w:t>: {</w:t>
+            </w:r>
+            <w:proofErr w:type="spellStart"/>
+            <w:r>
+              <w:rPr>
+                <w:lang w:val="en-US"/>
+              </w:rPr>
+              <w:t>player_email</w:t>
+            </w:r>
+            <w:proofErr w:type="spellEnd"/>
+            <w:r>
+              <w:rPr>
+                <w:lang w:val="en-US"/>
+              </w:rPr>
+              <w:t>}</w:t>
+            </w:r>
+          </w:p>
+          <w:p>
+            <w:pPr>
+              <w:rPr>
+                <w:lang w:val="en-US"/>
+              </w:rPr>
+            </w:pPr>
+            <w:r>
+              <w:rPr>
+                <w:b/>
+                <w:bCs/>
+                <w:lang w:val="en-US"/>
+              </w:rPr>
+              <w:t>CC Address</w:t>
+            </w:r>
+            <w:r>
+              <w:rPr>
+                <w:lang w:val="en-US"/>
+              </w:rPr>
+              <w:t xml:space="preserve">: </w:t>
+            </w:r>
+          </w:p>
+          <w:p>
+            <w:pPr>
+              <w:rPr>
+                <w:lang w:val="en-US"/>
+              </w:rPr>
+            </w:pPr>
+            <w:r>
+              <w:rPr>
+                <w:b/>
+                <w:bCs/>
+                <w:lang w:val="en-US"/>
+              </w:rPr>
+              <w:t>Subject</w:t>
+            </w:r>
+            <w:r>
+              <w:rPr>
+                <w:lang w:val="en-US"/>
+              </w:rPr>
+              <w:t xml:space="preserve">: </w:t>
+            </w:r>
+            <w:r>
+              <w:rPr>
+                <w:lang w:val="en-US"/>
+              </w:rPr>
+              <w:t>Purchase Order from Little Genius Stationery</w:t>
+            </w:r>
+          </w:p>
+          <w:p>
+            <w:pPr>
+              <w:rPr>
+                <w:b/>
+                <w:bCs/>
+                <w:lang w:val="en-US"/>
+              </w:rPr>
+            </w:pPr>
+          </w:p>
+        </w:tc>
+        <w:tc>
+          <w:tcPr>
+            <w:tcW w:w="5061" w:type="dxa"/>
+            <w:vAlign w:val="center"/>
+          </w:tcPr>
+          <w:p>
+            <w:pPr>
+              <w:rPr>
+                <w:lang w:val="en-US"/>
+              </w:rPr>
+            </w:pPr>
+          </w:p>
+          <w:p>
+            <w:pPr>
+              <w:rPr>
+                <w:lang w:val="en-US"/>
+              </w:rPr>
+            </w:pPr>
+            <w:r>
+              <w:rPr>
+                <w:lang w:val="en-US"/>
+              </w:rPr>
+              <w:t>Good morning</w:t>
+            </w:r>
+            <w:r>
+              <w:rPr>
+                <w:lang w:val="en-US"/>
+              </w:rPr>
+              <w:t>, I'd like to place a purchase order for stationeries.</w:t>
+            </w:r>
+          </w:p>
+          <w:p>
+            <w:pPr>
+              <w:rPr>
+                <w:lang w:val="en-US"/>
+              </w:rPr>
+            </w:pPr>
+            <w:r>
+              <w:rPr>
+                <w:lang w:val="en-US"/>
+              </w:rPr>
+              <w:t xml:space="preserve">[p] </w:t>
+            </w:r>
+          </w:p>
+          <w:p>
+            <w:pPr>
+              <w:rPr>
+                <w:lang w:val="en-US"/>
+              </w:rPr>
+            </w:pPr>
+            <w:proofErr w:type="gramStart"/>
+            <w:r>
+              <w:rPr>
+                <w:lang w:val="en-US"/>
+              </w:rPr>
+              <w:t>[p]</w:t>
+            </w:r>
+            <w:proofErr w:type="gramEnd"/>
+            <w:r>
+              <w:rPr>
+                <w:lang w:val="en-US"/>
+              </w:rPr>
+              <w:t>Please refer to the PO attached.</w:t>
+            </w:r>
+          </w:p>
+          <w:p>
+            <w:pPr>
+              <w:rPr>
+                <w:lang w:val="en-US"/>
+              </w:rPr>
+            </w:pPr>
+            <w:r>
+              <w:rPr>
+                <w:lang w:val="en-US"/>
+              </w:rPr>
+              <w:t xml:space="preserve">[p] </w:t>
+            </w:r>
+          </w:p>
+          <w:p>
+            <w:pPr>
+              <w:rPr>
+                <w:lang w:val="en-US"/>
+              </w:rPr>
+            </w:pPr>
+            <w:r>
+              <w:rPr>
+                <w:lang w:val="en-US"/>
+              </w:rPr>
+              <w:t xml:space="preserve">[p] </w:t>
+            </w:r>
+          </w:p>
+          <w:p>
+            <w:pPr>
+              <w:rPr>
+                <w:lang w:val="en-US"/>
+              </w:rPr>
+            </w:pPr>
+            <w:r>
+              <w:rPr>
+                <w:lang w:val="en-US"/>
+              </w:rPr>
+              <w:t>[p]</w:t>
+            </w:r>
+            <w:r>
+              <w:rPr>
+                <w:lang w:val="en-US"/>
+              </w:rPr>
+              <w:t>Ong Wei Zhe</w:t>
+            </w:r>
+          </w:p>
+          <w:p>
+            <w:pPr>
+              <w:rPr>
+                <w:lang w:val="en-US"/>
+              </w:rPr>
+            </w:pPr>
+            <w:r>
+              <w:rPr>
+                <w:lang w:val="en-US"/>
+              </w:rPr>
+              <w:t>[p]</w:t>
+            </w:r>
+            <w:r>
+              <w:rPr>
+                <w:lang w:val="en-US"/>
+              </w:rPr>
+              <w:t>Store Owner</w:t>
+            </w:r>
+          </w:p>
+          <w:p>
+            <w:pPr>
+              <w:rPr>
+                <w:lang w:val="en-US"/>
+              </w:rPr>
+            </w:pPr>
+            <w:r>
+              <w:rPr>
+                <w:lang w:val="en-US"/>
+              </w:rPr>
+              <w:t>[p]</w:t>
+            </w:r>
+            <w:r>
+              <w:rPr>
+                <w:lang w:val="en-US"/>
+              </w:rPr>
+              <w:t>Little Genius Stationery</w:t>
+            </w:r>
+          </w:p>
+          <w:p>
+            <w:pPr>
+              <w:rPr>
+                <w:rFonts w:ascii="MS Gothic" w:eastAsia="MS Gothic" w:hAnsi="MS Gothic" w:cs="MS Gothic"/>
+                <w:lang w:val="en-US"/>
+              </w:rPr>
+            </w:pPr>
+            <w:r>
+              <w:rPr>
+                <w:lang w:val="en-US"/>
+              </w:rPr>
+              <w:t>[p]</w:t>
+            </w:r>
+            <w:proofErr w:type="spellStart"/>
+            <w:r>
+              <w:rPr>
+                <w:rFonts w:ascii="MS Gothic" w:eastAsia="MS Gothic" w:hAnsi="MS Gothic" w:cs="MS Gothic" w:hint="eastAsia"/>
+                <w:lang w:val="en-US"/>
+              </w:rPr>
+              <w:t>小天才文具店</w:t>
+            </w:r>
+            <w:proofErr w:type="spellEnd"/>
+          </w:p>
+          <w:p>
+            <w:pPr>
+              <w:rPr>
+                <w:rFonts w:ascii="MS Gothic" w:eastAsia="MS Gothic" w:hAnsi="MS Gothic" w:cs="MS Gothic"/>
+                <w:lang w:val="en-US"/>
+              </w:rPr>
+            </w:pPr>
+          </w:p>
+          <w:p>
+            <w:pPr>
+              <w:rPr>
+                <w:lang w:val="en-US"/>
+              </w:rPr>
+            </w:pPr>
+          </w:p>
+        </w:tc>
+      </w:tr>
+      <w:tr>
+        <w:trPr>
+          <w:trHeight w:val="360"/>
+        </w:trPr>
+        <w:tc>
+          <w:tcPr>
+            <w:tcW w:w="3955" w:type="dxa"/>
+            <w:vAlign w:val="center"/>
+          </w:tcPr>
+          <w:p>
+            <w:pPr>
+              <w:rPr>
+                <w:lang w:val="en-US"/>
+              </w:rPr>
+            </w:pPr>
+            <w:r>
+              <w:rPr>
+                <w:b/>
+                <w:bCs/>
+                <w:lang w:val="en-US"/>
+              </w:rPr>
+              <w:t>Type</w:t>
+            </w:r>
+            <w:r>
+              <w:rPr>
+                <w:lang w:val="en-US"/>
+              </w:rPr>
+              <w:t>: Outbound</w:t>
+            </w:r>
+          </w:p>
+          <w:p>
+            <w:pPr>
+              <w:rPr>
+                <w:lang w:val="en-US"/>
+              </w:rPr>
+            </w:pPr>
+            <w:r>
+              <w:rPr>
+                <w:b/>
+                <w:bCs/>
+                <w:lang w:val="en-US"/>
+              </w:rPr>
+              <w:t>Sender Name</w:t>
+            </w:r>
+            <w:r>
+              <w:rPr>
+                <w:lang w:val="en-US"/>
+              </w:rPr>
+              <w:t xml:space="preserve">: </w:t>
+            </w:r>
+            <w:r>
+              <w:rPr>
+                <w:lang w:val="en-US"/>
+              </w:rPr>
+              <w:t>Nazrin</w:t>
+            </w:r>
+          </w:p>
+          <w:p>
+            <w:pPr>
+              <w:rPr>
+                <w:lang w:val="en-US"/>
+              </w:rPr>
+            </w:pPr>
+            <w:r>
+              <w:rPr>
+                <w:b/>
+                <w:bCs/>
+                <w:lang w:val="en-US"/>
+              </w:rPr>
+              <w:t>Sender Address</w:t>
+            </w:r>
+            <w:r>
+              <w:rPr>
+                <w:lang w:val="en-US"/>
+              </w:rPr>
+              <w:t xml:space="preserve">: </w:t>
+            </w:r>
+            <w:hyperlink r:id="rId10" w:history="1">
+              <w:r>
+                <w:rPr>
+                  <w:rStyle w:val="Hyperlink"/>
+                  <w:lang w:val="en-US"/>
+                </w:rPr>
+                <w:t>n</w:t>
+              </w:r>
+              <w:r>
+                <w:rPr>
+                  <w:rStyle w:val="Hyperlink"/>
+                </w:rPr>
+                <w:t>azrin.finance</w:t>
+              </w:r>
+              <w:r>
+                <w:rPr>
+                  <w:rStyle w:val="Hyperlink"/>
+                  <w:lang w:val="en-US"/>
+                </w:rPr>
+                <w:t>@abc.com.my</w:t>
+              </w:r>
+            </w:hyperlink>
+          </w:p>
+          <w:p>
+            <w:pPr>
+              <w:rPr>
+                <w:lang w:val="en-US"/>
+              </w:rPr>
+            </w:pPr>
+            <w:r>
+              <w:rPr>
+                <w:b/>
+                <w:bCs/>
+                <w:lang w:val="en-US"/>
+              </w:rPr>
+              <w:t>To Address</w:t>
+            </w:r>
+            <w:r>
+              <w:rPr>
+                <w:lang w:val="en-US"/>
+              </w:rPr>
+              <w:t>: {</w:t>
+            </w:r>
+            <w:proofErr w:type="spellStart"/>
+            <w:r>
+              <w:rPr>
+                <w:lang w:val="en-US"/>
+              </w:rPr>
+              <w:t>player_email</w:t>
+            </w:r>
+            <w:proofErr w:type="spellEnd"/>
+            <w:r>
+              <w:rPr>
+                <w:lang w:val="en-US"/>
+              </w:rPr>
+              <w:t>}</w:t>
+            </w:r>
+          </w:p>
+          <w:p>
+            <w:pPr>
+              <w:rPr>
+                <w:lang w:val="en-US"/>
+              </w:rPr>
+            </w:pPr>
+            <w:r>
+              <w:rPr>
+                <w:b/>
+                <w:bCs/>
+                <w:lang w:val="en-US"/>
+              </w:rPr>
+              <w:t>CC Address</w:t>
+            </w:r>
+            <w:r>
+              <w:rPr>
+                <w:lang w:val="en-US"/>
+              </w:rPr>
+              <w:t xml:space="preserve">: </w:t>
+            </w:r>
+          </w:p>
+          <w:p>
+            <w:pPr>
+              <w:rPr>
+                <w:lang w:val="en-US"/>
+              </w:rPr>
+            </w:pPr>
+            <w:r>
+              <w:rPr>
+                <w:b/>
+                <w:bCs/>
+                <w:lang w:val="en-US"/>
+              </w:rPr>
+              <w:t>Subject</w:t>
+            </w:r>
+            <w:r>
+              <w:rPr>
+                <w:lang w:val="en-US"/>
+              </w:rPr>
+              <w:t xml:space="preserve">: </w:t>
+            </w:r>
+            <w:r>
+              <w:rPr>
+                <w:lang w:val="en-US"/>
+              </w:rPr>
+              <w:t>Submit Today's Purchase Order</w:t>
+            </w:r>
+          </w:p>
+          <w:p>
+            <w:pPr>
+              <w:rPr>
+                <w:b/>
+                <w:bCs/>
+                <w:lang w:val="en-US"/>
+              </w:rPr>
+            </w:pPr>
+          </w:p>
+        </w:tc>
+        <w:tc>
+          <w:tcPr>
+            <w:tcW w:w="5061" w:type="dxa"/>
+            <w:vAlign w:val="center"/>
+          </w:tcPr>
+          <w:p>
+            <w:pPr>
+              <w:rPr>
+                <w:lang w:val="en-US"/>
+              </w:rPr>
+            </w:pPr>
+          </w:p>
+          <w:p>
+            <w:pPr>
+              <w:rPr>
+                <w:lang w:val="en-US"/>
+              </w:rPr>
+            </w:pPr>
+            <w:r>
+              <w:rPr>
+                <w:lang w:val="en-US"/>
+              </w:rPr>
+              <w:t>Hello and welcome to ABC Stationery Manufacturing, {</w:t>
+            </w:r>
+            <w:proofErr w:type="spellStart"/>
+            <w:r>
+              <w:rPr>
+                <w:lang w:val="en-US"/>
+              </w:rPr>
+              <w:t>player_name</w:t>
+            </w:r>
+            <w:proofErr w:type="spellEnd"/>
+            <w:r>
+              <w:rPr>
+                <w:lang w:val="en-US"/>
+              </w:rPr>
+              <w:t>}!</w:t>
+            </w:r>
+          </w:p>
+          <w:p>
+            <w:pPr>
+              <w:rPr>
+                <w:lang w:val="en-US"/>
+              </w:rPr>
+            </w:pPr>
+            <w:r>
+              <w:rPr>
+                <w:lang w:val="en-US"/>
+              </w:rPr>
+              <w:t xml:space="preserve">[p] </w:t>
+            </w:r>
+          </w:p>
+          <w:p>
+            <w:pPr>
+              <w:rPr>
+                <w:lang w:val="en-US"/>
+              </w:rPr>
+            </w:pPr>
+            <w:r>
+              <w:rPr>
+                <w:lang w:val="en-US"/>
+              </w:rPr>
+              <w:t>[p]I am Nazrin from Finance Department, and my email address is where you submit Purchase Orders you have received today from our clients.</w:t>
+            </w:r>
+          </w:p>
+          <w:p>
+            <w:pPr>
+              <w:rPr>
+                <w:lang w:val="en-US"/>
+              </w:rPr>
+            </w:pPr>
+            <w:r>
+              <w:rPr>
+                <w:lang w:val="en-US"/>
+              </w:rPr>
+              <w:t xml:space="preserve">[p] </w:t>
+            </w:r>
+          </w:p>
+          <w:p>
+            <w:pPr>
+              <w:rPr>
+                <w:lang w:val="en-US"/>
+              </w:rPr>
+            </w:pPr>
+            <w:r>
+              <w:rPr>
+                <w:lang w:val="en-US"/>
+              </w:rPr>
+              <w:t>[p]</w:t>
+            </w:r>
+            <w:proofErr w:type="gramStart"/>
+            <w:r>
+              <w:rPr>
+                <w:lang w:val="en-US"/>
+              </w:rPr>
+              <w:t>To</w:t>
+            </w:r>
+            <w:proofErr w:type="gramEnd"/>
+            <w:r>
+              <w:rPr>
+                <w:lang w:val="en-US"/>
+              </w:rPr>
+              <w:t xml:space="preserve"> make things easier for you, I'll send you a request email like this every day and you can just drop the files in and click send!</w:t>
+            </w:r>
+          </w:p>
+          <w:p>
+            <w:pPr>
+              <w:rPr>
+                <w:lang w:val="en-US"/>
+              </w:rPr>
+            </w:pPr>
+            <w:r>
+              <w:rPr>
+                <w:lang w:val="en-US"/>
+              </w:rPr>
+              <w:t xml:space="preserve">[p] </w:t>
+            </w:r>
+          </w:p>
+          <w:p>
+            <w:pPr>
+              <w:rPr>
+                <w:lang w:val="en-US"/>
+              </w:rPr>
+            </w:pPr>
+            <w:r>
+              <w:rPr>
+                <w:lang w:val="en-US"/>
+              </w:rPr>
+              <w:t>[p][</w:t>
+            </w:r>
+            <w:proofErr w:type="gramStart"/>
+            <w:r>
+              <w:rPr>
+                <w:lang w:val="en-US"/>
+              </w:rPr>
+              <w:t>b]Make</w:t>
+            </w:r>
+            <w:proofErr w:type="gramEnd"/>
+            <w:r>
+              <w:rPr>
+                <w:lang w:val="en-US"/>
+              </w:rPr>
+              <w:t xml:space="preserve"> sure that you have collected all the Purchase Orders sent to you today before submitting. A missed order is a missed </w:t>
+            </w:r>
+            <w:proofErr w:type="gramStart"/>
+            <w:r>
+              <w:rPr>
+                <w:lang w:val="en-US"/>
+              </w:rPr>
+              <w:t>opportunity![</w:t>
+            </w:r>
+            <w:proofErr w:type="gramEnd"/>
+            <w:r>
+              <w:rPr>
+                <w:lang w:val="en-US"/>
+              </w:rPr>
+              <w:t>/b]</w:t>
+            </w:r>
+          </w:p>
+          <w:p>
+            <w:pPr>
+              <w:rPr>
+                <w:lang w:val="en-US"/>
+              </w:rPr>
+            </w:pPr>
+            <w:r>
+              <w:rPr>
+                <w:lang w:val="en-US"/>
+              </w:rPr>
+              <w:t xml:space="preserve">[p] </w:t>
+            </w:r>
+          </w:p>
+          <w:p>
+            <w:pPr>
+              <w:rPr>
+                <w:lang w:val="en-US"/>
+              </w:rPr>
+            </w:pPr>
+            <w:r>
+              <w:rPr>
+                <w:lang w:val="en-US"/>
+              </w:rPr>
+              <w:t>[p]*</w:t>
+            </w:r>
+            <w:r>
+              <w:rPr>
+                <w:lang w:val="en-US"/>
+              </w:rPr>
+              <w:t>[b]</w:t>
+            </w:r>
+            <w:r>
+              <w:rPr>
+                <w:lang w:val="en-US"/>
+              </w:rPr>
+              <w:t>Tip</w:t>
+            </w:r>
+            <w:r>
+              <w:rPr>
+                <w:lang w:val="en-US"/>
+              </w:rPr>
+              <w:t>[/b]</w:t>
+            </w:r>
+            <w:r>
+              <w:rPr>
+                <w:lang w:val="en-US"/>
+              </w:rPr>
+              <w:t>: Open your File Explorer, drag the file over and drop it in this email. Once you've made sure all files are attached. Click send!</w:t>
+            </w:r>
+          </w:p>
+          <w:p>
+            <w:pPr>
+              <w:rPr>
+                <w:lang w:val="en-US"/>
+              </w:rPr>
+            </w:pPr>
+          </w:p>
+        </w:tc>
+      </w:tr>
+      <w:tr>
+        <w:trPr>
+          <w:trHeight w:val="360"/>
+        </w:trPr>
+        <w:tc>
+          <w:tcPr>
+            <w:tcW w:w="3955" w:type="dxa"/>
+            <w:vAlign w:val="center"/>
+          </w:tcPr>
+          <w:p>
+            <w:pPr>
+              <w:rPr>
+                <w:b/>
+                <w:bCs/>
+                <w:lang w:val="en-US"/>
+              </w:rPr>
+            </w:pPr>
+          </w:p>
+          <w:p>
+            <w:pPr>
+              <w:rPr>
+                <w:lang w:val="en-US"/>
+              </w:rPr>
+            </w:pPr>
+            <w:r>
+              <w:rPr>
+                <w:b/>
+                <w:bCs/>
+                <w:lang w:val="en-US"/>
+              </w:rPr>
+              <w:t>Type</w:t>
+            </w:r>
+            <w:r>
+              <w:rPr>
+                <w:lang w:val="en-US"/>
+              </w:rPr>
+              <w:t>: Message</w:t>
+            </w:r>
+          </w:p>
+          <w:p>
+            <w:pPr>
+              <w:rPr>
+                <w:lang w:val="en-US"/>
+              </w:rPr>
+            </w:pPr>
+            <w:r>
+              <w:rPr>
+                <w:b/>
+                <w:bCs/>
+                <w:lang w:val="en-US"/>
+              </w:rPr>
+              <w:t>Sender Name</w:t>
+            </w:r>
+            <w:r>
+              <w:rPr>
+                <w:lang w:val="en-US"/>
+              </w:rPr>
+              <w:t xml:space="preserve">: </w:t>
+            </w:r>
+            <w:r>
+              <w:rPr>
+                <w:lang w:val="en-US"/>
+              </w:rPr>
+              <w:t>Kai Jie</w:t>
+            </w:r>
+          </w:p>
+          <w:p>
+            <w:pPr>
+              <w:rPr>
+                <w:lang w:val="en-US"/>
+              </w:rPr>
+            </w:pPr>
+            <w:r>
+              <w:rPr>
+                <w:b/>
+                <w:bCs/>
+                <w:lang w:val="en-US"/>
+              </w:rPr>
+              <w:t>Sender Address</w:t>
+            </w:r>
+            <w:r>
+              <w:rPr>
+                <w:lang w:val="en-US"/>
+              </w:rPr>
+              <w:t xml:space="preserve">: </w:t>
+            </w:r>
+            <w:hyperlink r:id="rId11" w:history="1">
+              <w:r>
+                <w:rPr>
+                  <w:rStyle w:val="Hyperlink"/>
+                  <w:lang w:val="en-US"/>
+                </w:rPr>
+                <w:t>k</w:t>
+              </w:r>
+              <w:r>
+                <w:rPr>
+                  <w:rStyle w:val="Hyperlink"/>
+                </w:rPr>
+                <w:t>aijie.it</w:t>
+              </w:r>
+              <w:r>
+                <w:rPr>
+                  <w:rStyle w:val="Hyperlink"/>
+                  <w:lang w:val="en-US"/>
+                </w:rPr>
+                <w:t>@abc.com.my</w:t>
+              </w:r>
+            </w:hyperlink>
+          </w:p>
+          <w:p>
+            <w:pPr>
+              <w:rPr>
+                <w:lang w:val="en-US"/>
+              </w:rPr>
+            </w:pPr>
+            <w:r>
+              <w:rPr>
+                <w:b/>
+                <w:bCs/>
+                <w:lang w:val="en-US"/>
+              </w:rPr>
+              <w:t>To Address</w:t>
+            </w:r>
+            <w:r>
+              <w:rPr>
+                <w:lang w:val="en-US"/>
+              </w:rPr>
+              <w:t>: {</w:t>
+            </w:r>
+            <w:proofErr w:type="spellStart"/>
+            <w:r>
+              <w:rPr>
+                <w:lang w:val="en-US"/>
+              </w:rPr>
+              <w:t>player_email</w:t>
+            </w:r>
+            <w:proofErr w:type="spellEnd"/>
+            <w:r>
+              <w:rPr>
+                <w:lang w:val="en-US"/>
+              </w:rPr>
+              <w:t>}</w:t>
+            </w:r>
+          </w:p>
+          <w:p>
+            <w:pPr>
+              <w:rPr>
+                <w:lang w:val="en-US"/>
+              </w:rPr>
+            </w:pPr>
+            <w:r>
+              <w:rPr>
+                <w:b/>
+                <w:bCs/>
+                <w:lang w:val="en-US"/>
+              </w:rPr>
+              <w:t>CC Address</w:t>
+            </w:r>
+            <w:r>
+              <w:rPr>
+                <w:lang w:val="en-US"/>
+              </w:rPr>
+              <w:t xml:space="preserve">: </w:t>
+            </w:r>
+          </w:p>
+          <w:p>
+            <w:pPr>
+              <w:rPr>
+                <w:lang w:val="en-US"/>
+              </w:rPr>
+            </w:pPr>
+            <w:r>
+              <w:rPr>
+                <w:b/>
+                <w:bCs/>
+                <w:lang w:val="en-US"/>
+              </w:rPr>
+              <w:t>Subject</w:t>
+            </w:r>
+            <w:r>
+              <w:rPr>
+                <w:lang w:val="en-US"/>
+              </w:rPr>
+              <w:t xml:space="preserve">: </w:t>
+            </w:r>
+            <w:r>
+              <w:rPr>
+                <w:lang w:val="en-US"/>
+              </w:rPr>
+              <w:t>Antivirus Introduction</w:t>
+            </w:r>
+          </w:p>
+          <w:p>
+            <w:pPr>
+              <w:rPr>
+                <w:b/>
+                <w:bCs/>
+                <w:lang w:val="en-US"/>
+              </w:rPr>
+            </w:pPr>
+          </w:p>
+        </w:tc>
+        <w:tc>
+          <w:tcPr>
+            <w:tcW w:w="5061" w:type="dxa"/>
+            <w:vAlign w:val="center"/>
+          </w:tcPr>
+          <w:p>
+            <w:pPr>
+              <w:rPr>
+                <w:lang w:val="en-US"/>
+              </w:rPr>
+            </w:pPr>
+          </w:p>
+          <w:p>
+            <w:pPr>
+              <w:rPr>
+                <w:lang w:val="en-US"/>
+              </w:rPr>
+            </w:pPr>
+            <w:r>
+              <w:rPr>
+                <w:lang w:val="en-US"/>
+              </w:rPr>
+              <w:t>N</w:t>
+            </w:r>
+            <w:r>
+              <w:t>ice to meet you</w:t>
+            </w:r>
+            <w:r>
+              <w:rPr>
+                <w:lang w:val="en-US"/>
+              </w:rPr>
+              <w:t>, {</w:t>
+            </w:r>
+            <w:proofErr w:type="spellStart"/>
+            <w:r>
+              <w:rPr>
+                <w:lang w:val="en-US"/>
+              </w:rPr>
+              <w:t>player_name</w:t>
+            </w:r>
+            <w:proofErr w:type="spellEnd"/>
+            <w:r>
+              <w:rPr>
+                <w:lang w:val="en-US"/>
+              </w:rPr>
+              <w:t>}!</w:t>
+            </w:r>
+          </w:p>
+          <w:p>
+            <w:pPr>
+              <w:rPr>
+                <w:lang w:val="en-US"/>
+              </w:rPr>
+            </w:pPr>
+            <w:r>
+              <w:rPr>
+                <w:lang w:val="en-US"/>
+              </w:rPr>
+              <w:t xml:space="preserve">[p] </w:t>
+            </w:r>
+          </w:p>
+          <w:p>
+            <w:pPr>
+              <w:rPr>
+                <w:lang w:val="en-US"/>
+              </w:rPr>
+            </w:pPr>
+            <w:r>
+              <w:rPr>
+                <w:lang w:val="en-US"/>
+              </w:rPr>
+              <w:t xml:space="preserve">[p]I am </w:t>
+            </w:r>
+            <w:r>
+              <w:rPr>
+                <w:lang w:val="en-US"/>
+              </w:rPr>
+              <w:t>K</w:t>
+            </w:r>
+            <w:r>
+              <w:t>ai Jie</w:t>
+            </w:r>
+            <w:r>
+              <w:rPr>
+                <w:lang w:val="en-US"/>
+              </w:rPr>
+              <w:t xml:space="preserve"> from IT Department. </w:t>
+            </w:r>
+            <w:r>
+              <w:rPr>
+                <w:lang w:val="en-US"/>
+              </w:rPr>
+              <w:t>Our company has antivirus subscriptions for company devices to help scan and find any suspicious files it comes across.</w:t>
+            </w:r>
+          </w:p>
+          <w:p>
+            <w:pPr>
+              <w:rPr>
+                <w:lang w:val="en-US"/>
+              </w:rPr>
+            </w:pPr>
+            <w:r>
+              <w:rPr>
+                <w:lang w:val="en-US"/>
+              </w:rPr>
+              <w:t xml:space="preserve">[p] </w:t>
+            </w:r>
+          </w:p>
+          <w:p>
+            <w:pPr>
+              <w:rPr>
+                <w:lang w:val="en-US"/>
+              </w:rPr>
+            </w:pPr>
+            <w:r>
+              <w:rPr>
+                <w:lang w:val="en-US"/>
+              </w:rPr>
+              <w:t>[p]</w:t>
+            </w:r>
+            <w:r>
+              <w:rPr>
+                <w:lang w:val="en-US"/>
+              </w:rPr>
+              <w:t>*</w:t>
+            </w:r>
+            <w:r>
+              <w:rPr>
+                <w:lang w:val="en-US"/>
+              </w:rPr>
+              <w:t>[b]</w:t>
+            </w:r>
+            <w:r>
+              <w:rPr>
+                <w:lang w:val="en-US"/>
+              </w:rPr>
+              <w:t>Tip</w:t>
+            </w:r>
+            <w:r>
+              <w:rPr>
+                <w:lang w:val="en-US"/>
+              </w:rPr>
+              <w:t>[/b]</w:t>
+            </w:r>
+            <w:r>
+              <w:rPr>
+                <w:lang w:val="en-US"/>
+              </w:rPr>
+              <w:t xml:space="preserve">: </w:t>
+            </w:r>
+            <w:r>
+              <w:rPr>
+                <w:lang w:val="en-US"/>
+              </w:rPr>
+              <w:t>Find the file with the name pointed out by the antivirus and delete it.</w:t>
+            </w:r>
+          </w:p>
+          <w:p>
+            <w:pPr>
+              <w:rPr>
+                <w:lang w:val="en-US"/>
+              </w:rPr>
+            </w:pPr>
+            <w:r>
+              <w:rPr>
+                <w:lang w:val="en-US"/>
+              </w:rPr>
+              <w:t xml:space="preserve">[p] </w:t>
+            </w:r>
+          </w:p>
+          <w:p>
+            <w:pPr>
+              <w:rPr>
+                <w:lang w:val="en-US"/>
+              </w:rPr>
+            </w:pPr>
+            <w:r>
+              <w:rPr>
+                <w:lang w:val="en-US"/>
+              </w:rPr>
+              <w:t>[p]Take it easy!</w:t>
+            </w:r>
+          </w:p>
+          <w:p>
+            <w:pPr>
+              <w:rPr>
+                <w:lang w:val="en-US"/>
+              </w:rPr>
+            </w:pPr>
+          </w:p>
+        </w:tc>
+      </w:tr>
+      <w:tr>
+        <w:trPr>
+          <w:trHeight w:val="360"/>
+        </w:trPr>
+        <w:tc>
+          <w:tcPr>
+            <w:tcW w:w="3955" w:type="dxa"/>
+            <w:vAlign w:val="center"/>
+          </w:tcPr>
+          <w:p>
+            <w:pPr>
+              <w:rPr>
+                <w:b/>
+                <w:bCs/>
+                <w:lang w:val="en-US"/>
+              </w:rPr>
+            </w:pPr>
+          </w:p>
+          <w:p>
+            <w:pPr>
+              <w:rPr>
+                <w:lang w:val="en-US"/>
+              </w:rPr>
+            </w:pPr>
+            <w:r>
+              <w:rPr>
+                <w:b/>
+                <w:bCs/>
+                <w:lang w:val="en-US"/>
+              </w:rPr>
+              <w:t>Type</w:t>
+            </w:r>
+            <w:r>
+              <w:rPr>
+                <w:lang w:val="en-US"/>
+              </w:rPr>
+              <w:t>: Message</w:t>
+            </w:r>
+          </w:p>
+          <w:p>
+            <w:pPr>
+              <w:rPr>
+                <w:lang w:val="en-US"/>
+              </w:rPr>
+            </w:pPr>
+            <w:r>
+              <w:rPr>
+                <w:b/>
+                <w:bCs/>
+                <w:lang w:val="en-US"/>
+              </w:rPr>
+              <w:t>Sender Name</w:t>
+            </w:r>
+            <w:r>
+              <w:rPr>
+                <w:lang w:val="en-US"/>
+              </w:rPr>
+              <w:t xml:space="preserve">: </w:t>
+            </w:r>
+            <w:r>
+              <w:rPr>
+                <w:lang w:val="en-US"/>
+              </w:rPr>
+              <w:t>Orbit Antivirus</w:t>
+            </w:r>
+          </w:p>
+          <w:p>
+            <w:pPr>
+              <w:rPr>
+                <w:lang w:val="en-US"/>
+              </w:rPr>
+            </w:pPr>
+            <w:r>
+              <w:rPr>
+                <w:b/>
+                <w:bCs/>
+                <w:lang w:val="en-US"/>
+              </w:rPr>
+              <w:t>Sender Address</w:t>
+            </w:r>
+            <w:r>
+              <w:rPr>
+                <w:lang w:val="en-US"/>
+              </w:rPr>
+              <w:t xml:space="preserve">: </w:t>
+            </w:r>
+            <w:hyperlink r:id="rId12" w:history="1">
+              <w:r>
+                <w:rPr>
+                  <w:rStyle w:val="Hyperlink"/>
+                  <w:lang w:val="en-US"/>
+                </w:rPr>
+                <w:t>donotreply@orbit.com</w:t>
+              </w:r>
+            </w:hyperlink>
+            <w:r>
+              <w:rPr>
+                <w:lang w:val="en-US"/>
+              </w:rPr>
+              <w:t xml:space="preserve"> </w:t>
+            </w:r>
+          </w:p>
+          <w:p>
+            <w:pPr>
+              <w:rPr>
+                <w:lang w:val="en-US"/>
+              </w:rPr>
+            </w:pPr>
+            <w:r>
+              <w:rPr>
+                <w:b/>
+                <w:bCs/>
+                <w:lang w:val="en-US"/>
+              </w:rPr>
+              <w:t>To Address</w:t>
+            </w:r>
+            <w:r>
+              <w:rPr>
+                <w:lang w:val="en-US"/>
+              </w:rPr>
+              <w:t>: {</w:t>
+            </w:r>
+            <w:proofErr w:type="spellStart"/>
+            <w:r>
+              <w:rPr>
+                <w:lang w:val="en-US"/>
+              </w:rPr>
+              <w:t>player_email</w:t>
+            </w:r>
+            <w:proofErr w:type="spellEnd"/>
+            <w:r>
+              <w:rPr>
+                <w:lang w:val="en-US"/>
+              </w:rPr>
+              <w:t>}</w:t>
+            </w:r>
+          </w:p>
+          <w:p>
+            <w:pPr>
+              <w:rPr>
+                <w:lang w:val="en-US"/>
+              </w:rPr>
+            </w:pPr>
+            <w:r>
+              <w:rPr>
+                <w:b/>
+                <w:bCs/>
+                <w:lang w:val="en-US"/>
+              </w:rPr>
+              <w:t>CC Address</w:t>
+            </w:r>
+            <w:r>
+              <w:rPr>
+                <w:lang w:val="en-US"/>
+              </w:rPr>
+              <w:t xml:space="preserve">: </w:t>
+            </w:r>
+          </w:p>
+          <w:p>
+            <w:pPr>
+              <w:rPr>
+                <w:lang w:val="en-US"/>
+              </w:rPr>
+            </w:pPr>
+            <w:r>
+              <w:rPr>
+                <w:b/>
+                <w:bCs/>
+                <w:lang w:val="en-US"/>
+              </w:rPr>
+              <w:t>Subject</w:t>
+            </w:r>
+            <w:r>
+              <w:rPr>
+                <w:lang w:val="en-US"/>
+              </w:rPr>
+              <w:t xml:space="preserve">: </w:t>
+            </w:r>
+            <w:r>
+              <w:rPr>
+                <w:lang w:val="en-US"/>
+              </w:rPr>
+              <w:t>Orbit Antivirus Activated</w:t>
+            </w:r>
+          </w:p>
+          <w:p>
+            <w:pPr>
+              <w:rPr>
+                <w:b/>
+                <w:bCs/>
+                <w:lang w:val="en-US"/>
+              </w:rPr>
+            </w:pPr>
+          </w:p>
+        </w:tc>
+        <w:tc>
+          <w:tcPr>
+            <w:tcW w:w="5061" w:type="dxa"/>
+            <w:vAlign w:val="center"/>
+          </w:tcPr>
+          <w:p>
+            <w:r>
+              <w:rPr>
+                <w:lang w:val="en-US"/>
+              </w:rPr>
+              <w:t>Orbit Antivirus Service is activated on your device: DESKTOP-</w:t>
+            </w:r>
+            <w:r>
+              <w:t>BCKPG7B21L</w:t>
+            </w:r>
+            <w:r>
+              <w:t>.</w:t>
+            </w:r>
+          </w:p>
+          <w:p>
+            <w:r>
+              <w:t xml:space="preserve">[p] </w:t>
+            </w:r>
+          </w:p>
+          <w:p>
+            <w:r>
+              <w:t>[p]Thank you for choosing Orbit Antivirus!</w:t>
+            </w:r>
+          </w:p>
+        </w:tc>
+      </w:tr>
+      <w:tr>
+        <w:trPr>
+          <w:trHeight w:val="360"/>
+        </w:trPr>
+        <w:tc>
+          <w:tcPr>
+            <w:tcW w:w="3955" w:type="dxa"/>
+            <w:vAlign w:val="center"/>
+          </w:tcPr>
+          <w:p>
+            <w:pPr>
+              <w:rPr>
+                <w:b/>
+                <w:bCs/>
+                <w:lang w:val="en-US"/>
+              </w:rPr>
+            </w:pPr>
+          </w:p>
+          <w:p>
+            <w:pPr>
+              <w:rPr>
+                <w:lang w:val="en-US"/>
+              </w:rPr>
+            </w:pPr>
+            <w:r>
+              <w:rPr>
+                <w:b/>
+                <w:bCs/>
+                <w:lang w:val="en-US"/>
+              </w:rPr>
+              <w:t>Type</w:t>
+            </w:r>
+            <w:r>
+              <w:rPr>
+                <w:lang w:val="en-US"/>
+              </w:rPr>
+              <w:t>: Message</w:t>
+            </w:r>
+          </w:p>
+          <w:p>
+            <w:pPr>
+              <w:rPr>
+                <w:lang w:val="en-US"/>
+              </w:rPr>
+            </w:pPr>
+            <w:r>
+              <w:rPr>
+                <w:b/>
+                <w:bCs/>
+                <w:lang w:val="en-US"/>
+              </w:rPr>
+              <w:t>Sender Name</w:t>
+            </w:r>
+            <w:r>
+              <w:rPr>
+                <w:lang w:val="en-US"/>
+              </w:rPr>
+              <w:t xml:space="preserve">: </w:t>
+            </w:r>
+            <w:proofErr w:type="spellStart"/>
+            <w:r>
+              <w:rPr>
+                <w:lang w:val="en-US"/>
+              </w:rPr>
+              <w:t>Tripp</w:t>
+            </w:r>
+            <w:r>
+              <w:rPr>
+                <w:lang w:val="en-US"/>
+              </w:rPr>
+              <w:t>o</w:t>
+            </w:r>
+            <w:proofErr w:type="spellEnd"/>
+          </w:p>
+          <w:p>
+            <w:pPr>
+              <w:rPr>
+                <w:lang w:val="en-US"/>
+              </w:rPr>
+            </w:pPr>
+            <w:r>
+              <w:rPr>
+                <w:b/>
+                <w:bCs/>
+                <w:lang w:val="en-US"/>
+              </w:rPr>
+              <w:t>Sender Address</w:t>
+            </w:r>
+            <w:r>
+              <w:rPr>
+                <w:lang w:val="en-US"/>
+              </w:rPr>
+              <w:t xml:space="preserve">: </w:t>
+            </w:r>
+            <w:hyperlink r:id="rId13" w:history="1">
+              <w:r>
+                <w:rPr>
+                  <w:rStyle w:val="Hyperlink"/>
+                </w:rPr>
+                <w:t>advertising</w:t>
               </w:r>
               <w:r>
                 <w:rPr>
@@ -708,16 +2760,28 @@
                   <w:rStyle w:val="Hyperlink"/>
                   <w:lang w:val="en-US"/>
                 </w:rPr>
-                <w:t>littlegenius</w:t>
+                <w:t>t</w:t>
+              </w:r>
+              <w:r>
+                <w:rPr>
+                  <w:rStyle w:val="Hyperlink"/>
+                </w:rPr>
+                <w:t>rippo</w:t>
               </w:r>
               <w:r>
                 <w:rPr>
                   <w:rStyle w:val="Hyperlink"/>
                   <w:lang w:val="en-US"/>
                 </w:rPr>
-                <w:t>.com.my</w:t>
+                <w:t>.com</w:t>
               </w:r>
             </w:hyperlink>
+            <w:r>
+              <w:rPr>
+                <w:lang w:val="en-US"/>
+              </w:rPr>
+              <w:t xml:space="preserve"> </w:t>
+            </w:r>
           </w:p>
           <w:p>
             <w:pPr>
@@ -799,8 +2863,17 @@
               <w:rPr>
                 <w:lang w:val="en-US"/>
               </w:rPr>
-              <w:t>Purchase Order from Little Genius Stationery</w:t>
-            </w:r>
+              <w:t>Looking for a special place for a lovely holiday?</w:t>
+            </w:r>
+          </w:p>
+          <w:p>
+            <w:pPr>
+              <w:rPr>
+                <w:b/>
+                <w:bCs/>
+                <w:lang w:val="en-US"/>
+              </w:rPr>
+            </w:pPr>
           </w:p>
           <w:p>
             <w:pPr>
@@ -818,145 +2891,47 @@
             <w:vAlign w:val="center"/>
           </w:tcPr>
           <w:p>
-            <w:pPr>
-              <w:rPr>
-                <w:lang w:val="en-US"/>
-              </w:rPr>
-            </w:pPr>
-          </w:p>
-          <w:p>
-            <w:pPr>
-              <w:rPr>
-                <w:lang w:val="en-US"/>
-              </w:rPr>
-            </w:pPr>
-            <w:r>
-              <w:rPr>
-                <w:lang w:val="en-US"/>
-              </w:rPr>
-              <w:t>Hello, I'd like to place a purchase order for stationeries.</w:t>
-            </w:r>
-          </w:p>
-          <w:p>
-            <w:pPr>
-              <w:rPr>
-                <w:lang w:val="en-US"/>
-              </w:rPr>
-            </w:pPr>
-            <w:r>
-              <w:rPr>
-                <w:lang w:val="en-US"/>
-              </w:rPr>
+            <w:r>
+              <w:t>Join us and enjoy the wonderful offers for a trip you'll definitely remember!</w:t>
+            </w:r>
+          </w:p>
+          <w:p>
+            <w:r>
               <w:t xml:space="preserve">[p] </w:t>
             </w:r>
           </w:p>
           <w:p>
-            <w:pPr>
-              <w:rPr>
-                <w:lang w:val="en-US"/>
-              </w:rPr>
-            </w:pPr>
-            <w:r>
-              <w:rPr>
-                <w:lang w:val="en-US"/>
-              </w:rPr>
-              <w:t xml:space="preserve">[p] </w:t>
-            </w:r>
-          </w:p>
-          <w:p>
-            <w:pPr>
-              <w:rPr>
-                <w:lang w:val="en-US"/>
-              </w:rPr>
-            </w:pPr>
-            <w:r>
-              <w:rPr>
-                <w:lang w:val="en-US"/>
-              </w:rPr>
-              <w:t>[p]</w:t>
-            </w:r>
-            <w:r>
-              <w:rPr>
-                <w:lang w:val="en-US"/>
-              </w:rPr>
-              <w:t>Ong Wei Zhe</w:t>
-            </w:r>
-          </w:p>
-          <w:p>
-            <w:pPr>
-              <w:rPr>
-                <w:lang w:val="en-US"/>
-              </w:rPr>
-            </w:pPr>
-            <w:r>
-              <w:rPr>
-                <w:lang w:val="en-US"/>
-              </w:rPr>
-              <w:t>[p]</w:t>
-            </w:r>
-            <w:r>
-              <w:rPr>
-                <w:lang w:val="en-US"/>
-              </w:rPr>
-              <w:t>Store Owner</w:t>
-            </w:r>
-          </w:p>
-          <w:p>
-            <w:pPr>
-              <w:rPr>
-                <w:lang w:val="en-US"/>
-              </w:rPr>
-            </w:pPr>
-            <w:r>
-              <w:rPr>
-                <w:lang w:val="en-US"/>
-              </w:rPr>
-              <w:t>[p]</w:t>
-            </w:r>
-            <w:r>
-              <w:rPr>
-                <w:lang w:val="en-US"/>
-              </w:rPr>
-              <w:t>Little Genius Stationery</w:t>
-            </w:r>
-          </w:p>
-          <w:p>
-            <w:pPr>
-              <w:rPr>
-                <w:rFonts w:ascii="MS Gothic" w:eastAsia="MS Gothic" w:hAnsi="MS Gothic" w:cs="MS Gothic"/>
-                <w:lang w:val="en-US"/>
-              </w:rPr>
-            </w:pPr>
-            <w:r>
-              <w:rPr>
-                <w:lang w:val="en-US"/>
-              </w:rPr>
-              <w:t>[p]</w:t>
+            <w:r>
+              <w:t>[p][</w:t>
             </w:r>
             <w:proofErr w:type="spellStart"/>
             <w:r>
-              <w:rPr>
-                <w:rFonts w:ascii="MS Gothic" w:eastAsia="MS Gothic" w:hAnsi="MS Gothic" w:cs="MS Gothic" w:hint="eastAsia"/>
-                <w:lang w:val="en-US"/>
-              </w:rPr>
-              <w:t>小天才文具店</w:t>
+              <w:t>img</w:t>
             </w:r>
             <w:proofErr w:type="spellEnd"/>
-          </w:p>
-          <w:p>
-            <w:pPr>
-              <w:rPr>
-                <w:rFonts w:ascii="MS Gothic" w:eastAsia="MS Gothic" w:hAnsi="MS Gothic" w:cs="MS Gothic"/>
-                <w:lang w:val="en-US"/>
-              </w:rPr>
-            </w:pPr>
-          </w:p>
-          <w:p>
-            <w:pPr>
-              <w:rPr>
-                <w:lang w:val="en-US"/>
-              </w:rPr>
-            </w:pPr>
+            <w:r>
+              <w:t>]</w:t>
+            </w:r>
+            <w:r>
+              <w:t>tripp</w:t>
+            </w:r>
+            <w:r>
+              <w:t>o</w:t>
+            </w:r>
+            <w:r>
+              <w:t>_ad.jpg</w:t>
+            </w:r>
+            <w:r>
+              <w:t>[/</w:t>
+            </w:r>
+            <w:proofErr w:type="spellStart"/>
+            <w:r>
+              <w:t>img</w:t>
+            </w:r>
+            <w:proofErr w:type="spellEnd"/>
+            <w:r>
+              <w:t>]</w:t>
+            </w:r>
           </w:p>
         </w:tc>
       </w:tr>
@@ -972,6 +2947,15 @@
           <w:p>
             <w:pPr>
               <w:rPr>
+                <w:b/>
+                <w:bCs/>
+                <w:lang w:val="en-US"/>
+              </w:rPr>
+            </w:pPr>
+          </w:p>
+          <w:p>
+            <w:pPr>
+              <w:rPr>
                 <w:lang w:val="en-US"/>
               </w:rPr>
             </w:pPr>
@@ -993,7 +2977,7 @@
               <w:rPr>
                 <w:lang w:val="en-US"/>
               </w:rPr>
-              <w:t>Outbound</w:t>
+              <w:t>Inbound</w:t>
             </w:r>
           </w:p>
           <w:p>
@@ -1020,7 +3004,7 @@
               <w:rPr>
                 <w:lang w:val="en-US"/>
               </w:rPr>
-              <w:t>Nazrin</w:t>
+              <w:t>Ravi</w:t>
             </w:r>
           </w:p>
           <w:p>
@@ -1043,28 +3027,34 @@
               </w:rPr>
               <w:t xml:space="preserve">: </w:t>
             </w:r>
-            <w:hyperlink r:id="rId7" w:history="1">
+            <w:hyperlink r:id="rId14" w:history="1">
               <w:r>
                 <w:rPr>
                   <w:rStyle w:val="Hyperlink"/>
                   <w:lang w:val="en-US"/>
                 </w:rPr>
-                <w:t>n</w:t>
+                <w:t>h</w:t>
               </w:r>
               <w:r>
                 <w:rPr>
                   <w:rStyle w:val="Hyperlink"/>
                 </w:rPr>
-                <w:t>azrin</w:t>
+                <w:t>appyminimarket</w:t>
               </w:r>
               <w:r>
                 <w:rPr>
                   <w:rStyle w:val="Hyperlink"/>
                   <w:lang w:val="en-US"/>
                 </w:rPr>
-                <w:t>@abc.com.my</w:t>
+                <w:t>@email.com</w:t>
               </w:r>
             </w:hyperlink>
+            <w:r>
+              <w:rPr>
+                <w:lang w:val="en-US"/>
+              </w:rPr>
+              <w:t xml:space="preserve"> </w:t>
+            </w:r>
           </w:p>
           <w:p>
             <w:pPr>
@@ -1146,7 +3136,19 @@
               <w:rPr>
                 <w:lang w:val="en-US"/>
               </w:rPr>
-              <w:t>Submit Today's Purchase Order</w:t>
+              <w:t>Purchase Order for Stationeries</w:t>
+            </w:r>
+            <w:r>
+              <w:rPr>
+                <w:lang w:val="en-US"/>
+              </w:rPr>
+              <w:t xml:space="preserve"> - </w:t>
+            </w:r>
+            <w:r>
+              <w:rPr>
+                <w:lang w:val="en-US"/>
+              </w:rPr>
+              <w:t>Happy Mini Market</w:t>
             </w:r>
           </w:p>
           <w:p>
@@ -1174,21 +3176,43 @@
               <w:rPr>
                 <w:lang w:val="en-US"/>
               </w:rPr>
-              <w:t>Hello and welcome to ABC Stationery Manufacturing, {</w:t>
-            </w:r>
-            <w:proofErr w:type="spellStart"/>
-            <w:r>
-              <w:rPr>
-                <w:lang w:val="en-US"/>
-              </w:rPr>
-              <w:t>player_name</w:t>
-            </w:r>
-            <w:proofErr w:type="spellEnd"/>
-            <w:r>
-              <w:rPr>
-                <w:lang w:val="en-US"/>
-              </w:rPr>
-              <w:t>}!</w:t>
+              <w:t xml:space="preserve">Good </w:t>
+            </w:r>
+            <w:r>
+              <w:rPr>
+                <w:lang w:val="en-US"/>
+              </w:rPr>
+              <w:t>day</w:t>
+            </w:r>
+            <w:r>
+              <w:rPr>
+                <w:lang w:val="en-US"/>
+              </w:rPr>
+              <w:t xml:space="preserve">, I'd like to </w:t>
+            </w:r>
+            <w:r>
+              <w:rPr>
+                <w:lang w:val="en-US"/>
+              </w:rPr>
+              <w:t xml:space="preserve">order some </w:t>
+            </w:r>
+            <w:r>
+              <w:rPr>
+                <w:lang w:val="en-US"/>
+              </w:rPr>
+              <w:t>stationeries</w:t>
+            </w:r>
+            <w:r>
+              <w:rPr>
+                <w:lang w:val="en-US"/>
+              </w:rPr>
+              <w:t xml:space="preserve"> for my store</w:t>
+            </w:r>
+            <w:r>
+              <w:rPr>
+                <w:lang w:val="en-US"/>
+              </w:rPr>
+              <w:t>.</w:t>
             </w:r>
           </w:p>
           <w:p>
@@ -1214,7 +3238,7 @@
               <w:rPr>
                 <w:lang w:val="en-US"/>
               </w:rPr>
-              <w:t>[p]I am Nazrin from Finance Department, and my email address is where you submit Purchase Orders you have received today from our clients.</w:t>
+              <w:t>[p]PO is attached in this email.</w:t>
             </w:r>
           </w:p>
           <w:p>
@@ -1240,62 +3264,60 @@
               <w:rPr>
                 <w:lang w:val="en-US"/>
               </w:rPr>
-              <w:t>[p]To make things easier for you, I'll send you a request email like this every day and you can just drop the files in and click send!</w:t>
-            </w:r>
-          </w:p>
-          <w:p>
-            <w:pPr>
-              <w:rPr>
-                <w:lang w:val="en-US"/>
-              </w:rPr>
-            </w:pPr>
-            <w:r>
-              <w:rPr>
-                <w:lang w:val="en-US"/>
-              </w:rPr>
-              <w:lastRenderedPageBreak/>
-              <w:t xml:space="preserve">[p] </w:t>
-            </w:r>
-          </w:p>
-          <w:p>
-            <w:pPr>
-              <w:rPr>
-                <w:lang w:val="en-US"/>
-              </w:rPr>
-            </w:pPr>
-            <w:r>
-              <w:rPr>
-                <w:lang w:val="en-US"/>
-              </w:rPr>
-              <w:t>[p][b]Make sure that you have collected all the Purchase Orders sent to you today before submitting. A missed order is a missed opportunity![/b]</w:t>
-            </w:r>
-          </w:p>
-          <w:p>
-            <w:pPr>
-              <w:rPr>
-                <w:lang w:val="en-US"/>
-              </w:rPr>
-            </w:pPr>
-            <w:r>
-              <w:rPr>
-                <w:lang w:val="en-US"/>
-              </w:rPr>
-              <w:t xml:space="preserve">[p] </w:t>
-            </w:r>
-          </w:p>
-          <w:p>
-            <w:pPr>
-              <w:rPr>
-                <w:lang w:val="en-US"/>
-              </w:rPr>
-            </w:pPr>
-            <w:r>
-              <w:rPr>
-                <w:lang w:val="en-US"/>
-              </w:rPr>
-              <w:t>[p]*Tip: Open your File Explorer, drag the file over and drop it in this email. Once you've made sure all files are attached. Click send!</w:t>
-            </w:r>
-          </w:p>
+              <w:t>[p]</w:t>
+            </w:r>
+            <w:r>
+              <w:rPr>
+                <w:lang w:val="en-US"/>
+              </w:rPr>
+              <w:t>Ravi</w:t>
+            </w:r>
+          </w:p>
+          <w:p>
+            <w:pPr>
+              <w:rPr>
+                <w:lang w:val="en-US"/>
+              </w:rPr>
+            </w:pPr>
+            <w:r>
+              <w:rPr>
+                <w:lang w:val="en-US"/>
+              </w:rPr>
+              <w:t>[p]</w:t>
+            </w:r>
+            <w:r>
+              <w:rPr>
+                <w:lang w:val="en-US"/>
+              </w:rPr>
+              <w:t xml:space="preserve">Happy </w:t>
+            </w:r>
+            <w:r>
+              <w:rPr>
+                <w:lang w:val="en-US"/>
+              </w:rPr>
+              <w:t>Mini Market</w:t>
+            </w:r>
+          </w:p>
+          <w:p>
+            <w:pPr>
+              <w:rPr>
+                <w:lang w:val="en-US"/>
+              </w:rPr>
+            </w:pPr>
+            <w:r>
+              <w:rPr>
+                <w:lang w:val="en-US"/>
+              </w:rPr>
+              <w:t>[p]</w:t>
+            </w:r>
+            <w:r>
+              <w:rPr>
+                <w:lang w:val="en-US"/>
+              </w:rPr>
+              <w:t>Owner</w:t>
+            </w:r>
+          </w:p>
+          <w:p/>
         </w:tc>
       </w:tr>
       <w:tr>
@@ -1316,12 +3338,409 @@
               </w:rPr>
             </w:pPr>
           </w:p>
+          <w:p>
+            <w:pPr>
+              <w:rPr>
+                <w:lang w:val="en-US"/>
+              </w:rPr>
+            </w:pPr>
+            <w:r>
+              <w:rPr>
+                <w:b/>
+                <w:bCs/>
+                <w:lang w:val="en-US"/>
+              </w:rPr>
+              <w:t>Type</w:t>
+            </w:r>
+            <w:r>
+              <w:rPr>
+                <w:lang w:val="en-US"/>
+              </w:rPr>
+              <w:t xml:space="preserve">: </w:t>
+            </w:r>
+            <w:r>
+              <w:rPr>
+                <w:lang w:val="en-US"/>
+              </w:rPr>
+              <w:t>Message</w:t>
+            </w:r>
+          </w:p>
+          <w:p>
+            <w:pPr>
+              <w:rPr>
+                <w:lang w:val="en-US"/>
+              </w:rPr>
+            </w:pPr>
+            <w:r>
+              <w:rPr>
+                <w:b/>
+                <w:bCs/>
+                <w:lang w:val="en-US"/>
+              </w:rPr>
+              <w:t>Sender Name</w:t>
+            </w:r>
+            <w:r>
+              <w:rPr>
+                <w:lang w:val="en-US"/>
+              </w:rPr>
+              <w:t xml:space="preserve">: </w:t>
+            </w:r>
+            <w:r>
+              <w:rPr>
+                <w:lang w:val="en-US"/>
+              </w:rPr>
+              <w:t>Cyber News Daily</w:t>
+            </w:r>
+          </w:p>
+          <w:p>
+            <w:pPr>
+              <w:rPr>
+                <w:lang w:val="en-US"/>
+              </w:rPr>
+            </w:pPr>
+            <w:r>
+              <w:rPr>
+                <w:b/>
+                <w:bCs/>
+                <w:lang w:val="en-US"/>
+              </w:rPr>
+              <w:t>Sender Address</w:t>
+            </w:r>
+            <w:r>
+              <w:rPr>
+                <w:lang w:val="en-US"/>
+              </w:rPr>
+              <w:t xml:space="preserve">: </w:t>
+            </w:r>
+            <w:hyperlink r:id="rId15" w:history="1">
+              <w:r>
+                <w:rPr>
+                  <w:rStyle w:val="Hyperlink"/>
+                  <w:lang w:val="en-US"/>
+                </w:rPr>
+                <w:t>dailynews@cnd.com.my</w:t>
+              </w:r>
+            </w:hyperlink>
+            <w:r>
+              <w:rPr>
+                <w:lang w:val="en-US"/>
+              </w:rPr>
+              <w:t xml:space="preserve"> </w:t>
+            </w:r>
+            <w:r>
+              <w:rPr>
+                <w:lang w:val="en-US"/>
+              </w:rPr>
+              <w:t xml:space="preserve"> </w:t>
+            </w:r>
+          </w:p>
+          <w:p>
+            <w:pPr>
+              <w:rPr>
+                <w:lang w:val="en-US"/>
+              </w:rPr>
+            </w:pPr>
+            <w:r>
+              <w:rPr>
+                <w:b/>
+                <w:bCs/>
+                <w:lang w:val="en-US"/>
+              </w:rPr>
+              <w:t>To Address</w:t>
+            </w:r>
+            <w:r>
+              <w:rPr>
+                <w:lang w:val="en-US"/>
+              </w:rPr>
+              <w:t>: {</w:t>
+            </w:r>
+            <w:proofErr w:type="spellStart"/>
+            <w:r>
+              <w:rPr>
+                <w:lang w:val="en-US"/>
+              </w:rPr>
+              <w:t>player_email</w:t>
+            </w:r>
+            <w:proofErr w:type="spellEnd"/>
+            <w:r>
+              <w:rPr>
+                <w:lang w:val="en-US"/>
+              </w:rPr>
+              <w:t>}</w:t>
+            </w:r>
+          </w:p>
+          <w:p>
+            <w:pPr>
+              <w:rPr>
+                <w:lang w:val="en-US"/>
+              </w:rPr>
+            </w:pPr>
+            <w:r>
+              <w:rPr>
+                <w:b/>
+                <w:bCs/>
+                <w:lang w:val="en-US"/>
+              </w:rPr>
+              <w:t>CC Address</w:t>
+            </w:r>
+            <w:r>
+              <w:rPr>
+                <w:lang w:val="en-US"/>
+              </w:rPr>
+              <w:t xml:space="preserve">: </w:t>
+            </w:r>
+          </w:p>
+          <w:p>
+            <w:pPr>
+              <w:rPr>
+                <w:lang w:val="en-US"/>
+              </w:rPr>
+            </w:pPr>
+            <w:r>
+              <w:rPr>
+                <w:b/>
+                <w:bCs/>
+                <w:lang w:val="en-US"/>
+              </w:rPr>
+              <w:t>Subject</w:t>
+            </w:r>
+            <w:r>
+              <w:rPr>
+                <w:lang w:val="en-US"/>
+              </w:rPr>
+              <w:t xml:space="preserve">: </w:t>
+            </w:r>
+            <w:r>
+              <w:rPr>
+                <w:lang w:val="en-US"/>
+              </w:rPr>
+              <w:t>Phishing Emails and How to Spot Them</w:t>
+            </w:r>
+            <w:r>
+              <w:rPr>
+                <w:lang w:val="en-US"/>
+              </w:rPr>
+              <w:t>!</w:t>
+            </w:r>
+          </w:p>
+          <w:p>
+            <w:pPr>
+              <w:rPr>
+                <w:b/>
+                <w:bCs/>
+                <w:lang w:val="en-US"/>
+              </w:rPr>
+            </w:pPr>
+          </w:p>
         </w:tc>
         <w:tc>
           <w:tcPr>
             <w:tcW w:w="5061" w:type="dxa"/>
             <w:vAlign w:val="center"/>
           </w:tcPr>
+          <w:p>
+            <w:pPr>
+              <w:rPr>
+                <w:lang w:val="en-US"/>
+              </w:rPr>
+            </w:pPr>
+          </w:p>
+          <w:p>
+            <w:pPr>
+              <w:rPr>
+                <w:lang w:val="en-US"/>
+              </w:rPr>
+            </w:pPr>
+            <w:r>
+              <w:rPr>
+                <w:lang w:val="en-US"/>
+              </w:rPr>
+              <w:t>Phishing emails are designed to trick you into downloading malicious attachments or revealing sensitive information.</w:t>
+            </w:r>
+          </w:p>
+          <w:p>
+            <w:pPr>
+              <w:rPr>
+                <w:lang w:val="en-US"/>
+              </w:rPr>
+            </w:pPr>
+            <w:r>
+              <w:rPr>
+                <w:lang w:val="en-US"/>
+              </w:rPr>
+              <w:t>[p]</w:t>
+            </w:r>
+            <w:r>
+              <w:rPr>
+                <w:lang w:val="en-US"/>
+              </w:rPr>
+              <w:t xml:space="preserve"> </w:t>
+            </w:r>
+          </w:p>
+          <w:p>
+            <w:pPr>
+              <w:rPr>
+                <w:lang w:val="en-US"/>
+              </w:rPr>
+            </w:pPr>
+            <w:r>
+              <w:rPr>
+                <w:lang w:val="en-US"/>
+              </w:rPr>
+              <w:t>[p]Be extra careful with emails that:</w:t>
+            </w:r>
+          </w:p>
+          <w:p>
+            <w:pPr>
+              <w:rPr>
+                <w:lang w:val="en-US"/>
+              </w:rPr>
+            </w:pPr>
+            <w:r>
+              <w:rPr>
+                <w:lang w:val="en-US"/>
+              </w:rPr>
+              <w:t>[p]- Feel urgent or threatening</w:t>
+            </w:r>
+          </w:p>
+          <w:p>
+            <w:pPr>
+              <w:rPr>
+                <w:lang w:val="en-US"/>
+              </w:rPr>
+            </w:pPr>
+            <w:r>
+              <w:rPr>
+                <w:lang w:val="en-US"/>
+              </w:rPr>
+              <w:t>[p]- Have poor grammar</w:t>
+            </w:r>
+          </w:p>
+          <w:p>
+            <w:pPr>
+              <w:rPr>
+                <w:lang w:val="en-US"/>
+              </w:rPr>
+            </w:pPr>
+            <w:r>
+              <w:rPr>
+                <w:lang w:val="en-US"/>
+              </w:rPr>
+              <w:t xml:space="preserve">[p]- Include </w:t>
+            </w:r>
+            <w:r>
+              <w:rPr>
+                <w:lang w:val="en-US"/>
+              </w:rPr>
+              <w:t>attachments with extensions that does not match (</w:t>
+            </w:r>
+            <w:r>
+              <w:rPr>
+                <w:lang w:val="en-US"/>
+              </w:rPr>
+              <w:t xml:space="preserve">Example: </w:t>
+            </w:r>
+            <w:r>
+              <w:rPr>
+                <w:lang w:val="en-US"/>
+              </w:rPr>
+              <w:t>Invoice.pdf.exe</w:t>
+            </w:r>
+            <w:r>
+              <w:rPr>
+                <w:lang w:val="en-US"/>
+              </w:rPr>
+              <w:t xml:space="preserve"> &lt;- this is an .exe</w:t>
+            </w:r>
+            <w:r>
+              <w:rPr>
+                <w:lang w:val="en-US"/>
+              </w:rPr>
+              <w:t>,</w:t>
+            </w:r>
+            <w:r>
+              <w:rPr>
+                <w:lang w:val="en-US"/>
+              </w:rPr>
+              <w:t xml:space="preserve"> </w:t>
+            </w:r>
+            <w:r>
+              <w:rPr>
+                <w:lang w:val="en-US"/>
+              </w:rPr>
+              <w:t>not .pdf</w:t>
+            </w:r>
+            <w:r>
+              <w:rPr>
+                <w:lang w:val="en-US"/>
+              </w:rPr>
+              <w:t>)</w:t>
+            </w:r>
+          </w:p>
+          <w:p>
+            <w:pPr>
+              <w:rPr>
+                <w:lang w:val="en-US"/>
+              </w:rPr>
+            </w:pPr>
+            <w:r>
+              <w:rPr>
+                <w:lang w:val="en-US"/>
+              </w:rPr>
+              <w:t>[p]</w:t>
+            </w:r>
+            <w:r>
+              <w:rPr>
+                <w:lang w:val="en-US"/>
+              </w:rPr>
+              <w:t xml:space="preserve"> </w:t>
+            </w:r>
+          </w:p>
+          <w:p>
+            <w:pPr>
+              <w:rPr>
+                <w:lang w:val="en-US"/>
+              </w:rPr>
+            </w:pPr>
+            <w:r>
+              <w:rPr>
+                <w:lang w:val="en-US"/>
+              </w:rPr>
+              <w:t>[p]If you’re unsure, report the email and do not download or send any files.</w:t>
+            </w:r>
+          </w:p>
+          <w:p>
+            <w:pPr>
+              <w:rPr>
+                <w:lang w:val="en-US"/>
+              </w:rPr>
+            </w:pPr>
+            <w:r>
+              <w:rPr>
+                <w:lang w:val="en-US"/>
+              </w:rPr>
+              <w:t>[p]</w:t>
+            </w:r>
+            <w:r>
+              <w:rPr>
+                <w:lang w:val="en-US"/>
+              </w:rPr>
+              <w:t xml:space="preserve"> </w:t>
+            </w:r>
+          </w:p>
+          <w:p>
+            <w:pPr>
+              <w:rPr>
+                <w:lang w:val="en-US"/>
+              </w:rPr>
+            </w:pPr>
+            <w:r>
+              <w:rPr>
+                <w:lang w:val="en-US"/>
+              </w:rPr>
+              <w:t>[p]Stay alert and stay safe!</w:t>
+            </w:r>
+          </w:p>
           <w:p>
             <w:pPr>
               <w:rPr>
@@ -1349,6 +3768,205 @@
               </w:rPr>
             </w:pPr>
           </w:p>
+          <w:p>
+            <w:pPr>
+              <w:rPr>
+                <w:lang w:val="en-US"/>
+              </w:rPr>
+            </w:pPr>
+            <w:r>
+              <w:rPr>
+                <w:b/>
+                <w:bCs/>
+                <w:lang w:val="en-US"/>
+              </w:rPr>
+              <w:t>Type</w:t>
+            </w:r>
+            <w:r>
+              <w:rPr>
+                <w:lang w:val="en-US"/>
+              </w:rPr>
+              <w:t>: Inbound</w:t>
+            </w:r>
+          </w:p>
+          <w:p>
+            <w:pPr>
+              <w:rPr>
+                <w:lang w:val="en-US"/>
+              </w:rPr>
+            </w:pPr>
+            <w:r>
+              <w:rPr>
+                <w:b/>
+                <w:bCs/>
+                <w:lang w:val="en-US"/>
+              </w:rPr>
+              <w:t>Sender Name</w:t>
+            </w:r>
+            <w:r>
+              <w:rPr>
+                <w:lang w:val="en-US"/>
+              </w:rPr>
+              <w:t xml:space="preserve">: </w:t>
+            </w:r>
+            <w:proofErr w:type="spellStart"/>
+            <w:r>
+              <w:rPr>
+                <w:lang w:val="en-US"/>
+              </w:rPr>
+              <w:t>Johnn</w:t>
+            </w:r>
+            <w:r>
+              <w:rPr>
+                <w:lang w:val="en-US"/>
+              </w:rPr>
+              <w:t>n</w:t>
+            </w:r>
+            <w:proofErr w:type="spellEnd"/>
+          </w:p>
+          <w:p>
+            <w:pPr>
+              <w:rPr>
+                <w:lang w:val="en-US"/>
+              </w:rPr>
+            </w:pPr>
+            <w:r>
+              <w:rPr>
+                <w:b/>
+                <w:bCs/>
+                <w:lang w:val="en-US"/>
+              </w:rPr>
+              <w:t>Sender Address</w:t>
+            </w:r>
+            <w:r>
+              <w:rPr>
+                <w:lang w:val="en-US"/>
+              </w:rPr>
+              <w:t xml:space="preserve">: </w:t>
+            </w:r>
+            <w:hyperlink r:id="rId16" w:history="1">
+              <w:r>
+                <w:rPr>
+                  <w:rStyle w:val="Hyperlink"/>
+                </w:rPr>
+                <w:t>a4V9Bhd2</w:t>
+              </w:r>
+              <w:r>
+                <w:rPr>
+                  <w:rStyle w:val="Hyperlink"/>
+                  <w:lang w:val="en-US"/>
+                </w:rPr>
+                <w:t>@email.com</w:t>
+              </w:r>
+            </w:hyperlink>
+            <w:r>
+              <w:rPr>
+                <w:lang w:val="en-US"/>
+              </w:rPr>
+              <w:t xml:space="preserve"> </w:t>
+            </w:r>
+          </w:p>
+          <w:p>
+            <w:pPr>
+              <w:rPr>
+                <w:lang w:val="en-US"/>
+              </w:rPr>
+            </w:pPr>
+            <w:r>
+              <w:rPr>
+                <w:b/>
+                <w:bCs/>
+                <w:lang w:val="en-US"/>
+              </w:rPr>
+              <w:t>To Address</w:t>
+            </w:r>
+            <w:r>
+              <w:rPr>
+                <w:lang w:val="en-US"/>
+              </w:rPr>
+              <w:t>: {</w:t>
+            </w:r>
+            <w:proofErr w:type="spellStart"/>
+            <w:r>
+              <w:rPr>
+                <w:lang w:val="en-US"/>
+              </w:rPr>
+              <w:t>player_email</w:t>
+            </w:r>
+            <w:proofErr w:type="spellEnd"/>
+            <w:r>
+              <w:rPr>
+                <w:lang w:val="en-US"/>
+              </w:rPr>
+              <w:t>}</w:t>
+            </w:r>
+          </w:p>
+          <w:p>
+            <w:pPr>
+              <w:rPr>
+                <w:lang w:val="en-US"/>
+              </w:rPr>
+            </w:pPr>
+            <w:r>
+              <w:rPr>
+                <w:b/>
+                <w:bCs/>
+                <w:lang w:val="en-US"/>
+              </w:rPr>
+              <w:lastRenderedPageBreak/>
+              <w:t>CC Address</w:t>
+            </w:r>
+            <w:r>
+              <w:rPr>
+                <w:lang w:val="en-US"/>
+              </w:rPr>
+              <w:t xml:space="preserve">: </w:t>
+            </w:r>
+          </w:p>
+          <w:p>
+            <w:pPr>
+              <w:rPr>
+                <w:lang w:val="en-US"/>
+              </w:rPr>
+            </w:pPr>
+            <w:r>
+              <w:rPr>
+                <w:b/>
+                <w:bCs/>
+                <w:lang w:val="en-US"/>
+              </w:rPr>
+              <w:t>Subject</w:t>
+            </w:r>
+            <w:r>
+              <w:rPr>
+                <w:lang w:val="en-US"/>
+              </w:rPr>
+              <w:t xml:space="preserve">: </w:t>
+            </w:r>
+            <w:r>
+              <w:rPr>
+                <w:lang w:val="en-US"/>
+              </w:rPr>
+              <w:t>purchase order</w:t>
+            </w:r>
+          </w:p>
+          <w:p>
+            <w:pPr>
+              <w:rPr>
+                <w:b/>
+                <w:bCs/>
+              </w:rPr>
+            </w:pPr>
+          </w:p>
+          <w:p>
+            <w:pPr>
+              <w:rPr>
+                <w:b/>
+                <w:bCs/>
+                <w:lang w:val="en-US"/>
+              </w:rPr>
+            </w:pPr>
+          </w:p>
         </w:tc>
         <w:tc>
           <w:tcPr>
@@ -1361,6 +3979,348 @@
                 <w:lang w:val="en-US"/>
               </w:rPr>
             </w:pPr>
+            <w:r>
+              <w:rPr>
+                <w:lang w:val="en-US"/>
+              </w:rPr>
+              <w:lastRenderedPageBreak/>
+              <w:t xml:space="preserve">hello want to order </w:t>
+            </w:r>
+            <w:proofErr w:type="spellStart"/>
+            <w:r>
+              <w:rPr>
+                <w:lang w:val="en-US"/>
+              </w:rPr>
+              <w:t>stationarys</w:t>
+            </w:r>
+            <w:proofErr w:type="spellEnd"/>
+            <w:r>
+              <w:rPr>
+                <w:lang w:val="en-US"/>
+              </w:rPr>
+              <w:t>.</w:t>
+            </w:r>
+          </w:p>
+          <w:p>
+            <w:pPr>
+              <w:rPr>
+                <w:lang w:val="en-US"/>
+              </w:rPr>
+            </w:pPr>
+            <w:r>
+              <w:rPr>
+                <w:lang w:val="en-US"/>
+              </w:rPr>
+              <w:t xml:space="preserve">[p] </w:t>
+            </w:r>
+          </w:p>
+          <w:p>
+            <w:pPr>
+              <w:rPr>
+                <w:lang w:val="en-US"/>
+              </w:rPr>
+            </w:pPr>
+            <w:r>
+              <w:rPr>
+                <w:lang w:val="en-US"/>
+              </w:rPr>
+              <w:t>[p]Johnn</w:t>
+            </w:r>
+          </w:p>
+        </w:tc>
+      </w:tr>
+      <w:tr>
+        <w:trPr>
+          <w:trHeight w:val="360"/>
+        </w:trPr>
+        <w:tc>
+          <w:tcPr>
+            <w:tcW w:w="3955" w:type="dxa"/>
+            <w:vAlign w:val="center"/>
+          </w:tcPr>
+          <w:p>
+            <w:pPr>
+              <w:rPr>
+                <w:b/>
+                <w:bCs/>
+                <w:lang w:val="en-US"/>
+              </w:rPr>
+            </w:pPr>
+          </w:p>
+          <w:p>
+            <w:pPr>
+              <w:rPr>
+                <w:lang w:val="en-US"/>
+              </w:rPr>
+            </w:pPr>
+            <w:r>
+              <w:rPr>
+                <w:b/>
+                <w:bCs/>
+                <w:lang w:val="en-US"/>
+              </w:rPr>
+              <w:t>Type</w:t>
+            </w:r>
+            <w:r>
+              <w:rPr>
+                <w:lang w:val="en-US"/>
+              </w:rPr>
+              <w:t>: Inbound</w:t>
+            </w:r>
+          </w:p>
+          <w:p>
+            <w:pPr>
+              <w:rPr>
+                <w:lang w:val="en-US"/>
+              </w:rPr>
+            </w:pPr>
+            <w:r>
+              <w:rPr>
+                <w:b/>
+                <w:bCs/>
+                <w:lang w:val="en-US"/>
+              </w:rPr>
+              <w:t>Sender Name</w:t>
+            </w:r>
+            <w:r>
+              <w:rPr>
+                <w:lang w:val="en-US"/>
+              </w:rPr>
+              <w:t xml:space="preserve">: </w:t>
+            </w:r>
+            <w:r>
+              <w:rPr>
+                <w:lang w:val="en-US"/>
+              </w:rPr>
+              <w:t>Dallas</w:t>
+            </w:r>
+          </w:p>
+          <w:p>
+            <w:pPr>
+              <w:rPr>
+                <w:lang w:val="en-US"/>
+              </w:rPr>
+            </w:pPr>
+            <w:r>
+              <w:rPr>
+                <w:b/>
+                <w:bCs/>
+                <w:lang w:val="en-US"/>
+              </w:rPr>
+              <w:t>Sender Address</w:t>
+            </w:r>
+            <w:r>
+              <w:rPr>
+                <w:lang w:val="en-US"/>
+              </w:rPr>
+              <w:t xml:space="preserve">: </w:t>
+            </w:r>
+            <w:hyperlink r:id="rId17" w:history="1">
+              <w:r>
+                <w:rPr>
+                  <w:rStyle w:val="Hyperlink"/>
+                  <w:lang w:val="en-US"/>
+                </w:rPr>
+                <w:t>d</w:t>
+              </w:r>
+              <w:r>
+                <w:rPr>
+                  <w:rStyle w:val="Hyperlink"/>
+                </w:rPr>
+                <w:t>allas@abc.com.my</w:t>
+              </w:r>
+            </w:hyperlink>
+            <w:r>
+              <w:rPr>
+                <w:lang w:val="en-US"/>
+              </w:rPr>
+              <w:t xml:space="preserve"> </w:t>
+            </w:r>
+          </w:p>
+          <w:p>
+            <w:pPr>
+              <w:rPr>
+                <w:lang w:val="en-US"/>
+              </w:rPr>
+            </w:pPr>
+            <w:r>
+              <w:rPr>
+                <w:b/>
+                <w:bCs/>
+                <w:lang w:val="en-US"/>
+              </w:rPr>
+              <w:t>To Address</w:t>
+            </w:r>
+            <w:r>
+              <w:rPr>
+                <w:lang w:val="en-US"/>
+              </w:rPr>
+              <w:t>: {</w:t>
+            </w:r>
+            <w:proofErr w:type="spellStart"/>
+            <w:r>
+              <w:rPr>
+                <w:lang w:val="en-US"/>
+              </w:rPr>
+              <w:t>player_email</w:t>
+            </w:r>
+            <w:proofErr w:type="spellEnd"/>
+            <w:r>
+              <w:rPr>
+                <w:lang w:val="en-US"/>
+              </w:rPr>
+              <w:t>}</w:t>
+            </w:r>
+          </w:p>
+          <w:p>
+            <w:pPr>
+              <w:rPr>
+                <w:lang w:val="en-US"/>
+              </w:rPr>
+            </w:pPr>
+            <w:r>
+              <w:rPr>
+                <w:b/>
+                <w:bCs/>
+                <w:lang w:val="en-US"/>
+              </w:rPr>
+              <w:t>CC Address</w:t>
+            </w:r>
+            <w:r>
+              <w:rPr>
+                <w:lang w:val="en-US"/>
+              </w:rPr>
+              <w:t xml:space="preserve">: </w:t>
+            </w:r>
+          </w:p>
+          <w:p>
+            <w:pPr>
+              <w:rPr>
+                <w:lang w:val="en-US"/>
+              </w:rPr>
+            </w:pPr>
+            <w:r>
+              <w:rPr>
+                <w:b/>
+                <w:bCs/>
+                <w:lang w:val="en-US"/>
+              </w:rPr>
+              <w:t>Subject</w:t>
+            </w:r>
+            <w:r>
+              <w:rPr>
+                <w:lang w:val="en-US"/>
+              </w:rPr>
+              <w:t xml:space="preserve">: </w:t>
+            </w:r>
+            <w:r>
+              <w:rPr>
+                <w:lang w:val="en-US"/>
+              </w:rPr>
+              <w:t xml:space="preserve">Purchase Order </w:t>
+            </w:r>
+            <w:r>
+              <w:rPr>
+                <w:lang w:val="en-US"/>
+              </w:rPr>
+              <w:t xml:space="preserve">- </w:t>
+            </w:r>
+            <w:proofErr w:type="spellStart"/>
+            <w:r>
+              <w:rPr>
+                <w:lang w:val="en-US"/>
+              </w:rPr>
+              <w:t>PrintingPro</w:t>
+            </w:r>
+            <w:proofErr w:type="spellEnd"/>
+          </w:p>
+          <w:p>
+            <w:pPr>
+              <w:rPr>
+                <w:b/>
+                <w:bCs/>
+                <w:lang w:val="en-US"/>
+              </w:rPr>
+            </w:pPr>
+          </w:p>
+        </w:tc>
+        <w:tc>
+          <w:tcPr>
+            <w:tcW w:w="5061" w:type="dxa"/>
+            <w:vAlign w:val="center"/>
+          </w:tcPr>
+          <w:p>
+            <w:pPr>
+              <w:rPr>
+                <w:lang w:val="en-US"/>
+              </w:rPr>
+            </w:pPr>
+            <w:r>
+              <w:rPr>
+                <w:lang w:val="en-US"/>
+              </w:rPr>
+              <w:t>Hi {</w:t>
+            </w:r>
+            <w:proofErr w:type="spellStart"/>
+            <w:r>
+              <w:rPr>
+                <w:lang w:val="en-US"/>
+              </w:rPr>
+              <w:t>player_name</w:t>
+            </w:r>
+            <w:proofErr w:type="spellEnd"/>
+            <w:r>
+              <w:rPr>
+                <w:lang w:val="en-US"/>
+              </w:rPr>
+              <w:t>}!</w:t>
+            </w:r>
+          </w:p>
+          <w:p>
+            <w:pPr>
+              <w:rPr>
+                <w:lang w:val="en-US"/>
+              </w:rPr>
+            </w:pPr>
+            <w:r>
+              <w:rPr>
+                <w:lang w:val="en-US"/>
+              </w:rPr>
+              <w:t xml:space="preserve">[p] </w:t>
+            </w:r>
+          </w:p>
+          <w:p>
+            <w:pPr>
+              <w:rPr>
+                <w:lang w:val="en-US"/>
+              </w:rPr>
+            </w:pPr>
+            <w:r>
+              <w:rPr>
+                <w:lang w:val="en-US"/>
+              </w:rPr>
+              <w:t>[p]</w:t>
+            </w:r>
+            <w:r>
+              <w:rPr>
+                <w:lang w:val="en-US"/>
+              </w:rPr>
+              <w:t xml:space="preserve">This is a Purchase Order from </w:t>
+            </w:r>
+            <w:proofErr w:type="spellStart"/>
+            <w:r>
+              <w:rPr>
+                <w:lang w:val="en-US"/>
+              </w:rPr>
+              <w:t>PrintingPro</w:t>
+            </w:r>
+            <w:proofErr w:type="spellEnd"/>
+            <w:r>
+              <w:rPr>
+                <w:lang w:val="en-US"/>
+              </w:rPr>
+              <w:t>. Please help me send this to finance. Thanks!</w:t>
+            </w:r>
           </w:p>
         </w:tc>
       </w:tr>
@@ -1985,7 +4945,6 @@
   <w:style w:type="character" w:default="1" w:styleId="DefaultParagraphFont">
     <w:name w:val="Default Paragraph Font"/>
     <w:uiPriority w:val="1"/>
-    <w:semiHidden/>
     <w:unhideWhenUsed/>
   </w:style>
   <w:style w:type="table" w:default="1" w:styleId="TableNormal">
@@ -2341,6 +5300,36 @@
       <w:shd w:val="clear" w:color="auto" w:fill="E1DFDD"/>
     </w:rPr>
   </w:style>
+  <w:style w:type="paragraph" w:styleId="HTMLPreformatted">
+    <w:name w:val="HTML Preformatted"/>
+    <w:basedOn w:val="Normal"/>
+    <w:link w:val="HTMLPreformattedChar"/>
+    <w:uiPriority w:val="99"/>
+    <w:semiHidden/>
+    <w:unhideWhenUsed/>
+    <w:rsid w:val="00AB425B"/>
+    <w:pPr>
+      <w:spacing w:after="0" w:line="240" w:lineRule="auto"/>
+    </w:pPr>
+    <w:rPr>
+      <w:rFonts w:ascii="Consolas" w:hAnsi="Consolas"/>
+      <w:sz w:val="20"/>
+      <w:szCs w:val="20"/>
+    </w:rPr>
+  </w:style>
+  <w:style w:type="character" w:customStyle="1" w:styleId="HTMLPreformattedChar">
+    <w:name w:val="HTML Preformatted Char"/>
+    <w:basedOn w:val="DefaultParagraphFont"/>
+    <w:link w:val="HTMLPreformatted"/>
+    <w:uiPriority w:val="99"/>
+    <w:semiHidden/>
+    <w:rsid w:val="00AB425B"/>
+    <w:rPr>
+      <w:rFonts w:ascii="Consolas" w:hAnsi="Consolas"/>
+      <w:sz w:val="20"/>
+      <w:szCs w:val="20"/>
+    </w:rPr>
+  </w:style>
 </w:styles>
 </file>
 

</xml_diff>

<commit_message>
Update Level Data - Monday
</commit_message>
<xml_diff>
--- a/level design.docx
+++ b/level design.docx
@@ -596,6 +596,21 @@
               </w:rPr>
               <w:t xml:space="preserve">: </w:t>
             </w:r>
+            <w:hyperlink r:id="rId5" w:history="1">
+              <w:r>
+                <w:rPr>
+                  <w:rStyle w:val="Hyperlink"/>
+                  <w:lang w:val="en-US"/>
+                </w:rPr>
+                <w:t>dallas@abc.com.my</w:t>
+              </w:r>
+            </w:hyperlink>
+            <w:r>
+              <w:rPr>
+                <w:lang w:val="en-US"/>
+              </w:rPr>
+              <w:t xml:space="preserve"> </w:t>
+            </w:r>
           </w:p>
           <w:p>
             <w:pPr>
@@ -738,33 +753,31 @@
               <w:rPr>
                 <w:lang w:val="en-US"/>
               </w:rPr>
-              <w:t>[p]We have sales representatives visiting stores like retailers, bookstores, office supply stores and more.</w:t>
-            </w:r>
-          </w:p>
-          <w:p>
-            <w:pPr>
-              <w:rPr>
-                <w:lang w:val="en-US"/>
-              </w:rPr>
-            </w:pPr>
-            <w:r>
-              <w:rPr>
-                <w:lang w:val="en-US"/>
-              </w:rPr>
-              <w:t xml:space="preserve">[p] </w:t>
-            </w:r>
-          </w:p>
-          <w:p>
-            <w:pPr>
-              <w:rPr>
-                <w:lang w:val="en-US"/>
-              </w:rPr>
-            </w:pPr>
-            <w:r>
-              <w:rPr>
-                <w:lang w:val="en-US"/>
-              </w:rPr>
-              <w:t>[p]Your job is to receive documents sent from our clients, make sure it is safe before sending it to Finance, someone from there will provide further explanation to you soon.</w:t>
+              <w:t>[p]We have sales representatives visiting stores like retailers, bookstores, office supply stores and more</w:t>
+            </w:r>
+            <w:r>
+              <w:rPr>
+                <w:lang w:val="en-US"/>
+              </w:rPr>
+              <w:t>, and y</w:t>
+            </w:r>
+            <w:r>
+              <w:rPr>
+                <w:lang w:val="en-US"/>
+              </w:rPr>
+              <w:t>our job is to receive documents sent from our clients</w:t>
+            </w:r>
+            <w:r>
+              <w:rPr>
+                <w:lang w:val="en-US"/>
+              </w:rPr>
+              <w:t xml:space="preserve"> and coworkers</w:t>
+            </w:r>
+            <w:r>
+              <w:rPr>
+                <w:lang w:val="en-US"/>
+              </w:rPr>
+              <w:t>, make sure it is safe before sending it to Finance, someone from there will provide further explanation to you soon.</w:t>
             </w:r>
           </w:p>
           <w:p>
@@ -966,7 +979,7 @@
               </w:rPr>
               <w:t xml:space="preserve">: </w:t>
             </w:r>
-            <w:hyperlink r:id="rId5" w:history="1">
+            <w:hyperlink r:id="rId6" w:history="1">
               <w:r>
                 <w:rPr>
                   <w:rStyle w:val="Hyperlink"/>
@@ -1023,28 +1036,28 @@
                 <w:bCs/>
                 <w:lang w:val="en-US"/>
               </w:rPr>
+              <w:t>CC Address</w:t>
+            </w:r>
+            <w:r>
+              <w:rPr>
+                <w:lang w:val="en-US"/>
+              </w:rPr>
+              <w:t xml:space="preserve">: </w:t>
+            </w:r>
+          </w:p>
+          <w:p>
+            <w:pPr>
+              <w:rPr>
+                <w:lang w:val="en-US"/>
+              </w:rPr>
+            </w:pPr>
+            <w:r>
+              <w:rPr>
+                <w:b/>
+                <w:bCs/>
+                <w:lang w:val="en-US"/>
+              </w:rPr>
               <w:lastRenderedPageBreak/>
-              <w:t>CC Address</w:t>
-            </w:r>
-            <w:r>
-              <w:rPr>
-                <w:lang w:val="en-US"/>
-              </w:rPr>
-              <w:t xml:space="preserve">: </w:t>
-            </w:r>
-          </w:p>
-          <w:p>
-            <w:pPr>
-              <w:rPr>
-                <w:lang w:val="en-US"/>
-              </w:rPr>
-            </w:pPr>
-            <w:r>
-              <w:rPr>
-                <w:b/>
-                <w:bCs/>
-                <w:lang w:val="en-US"/>
-              </w:rPr>
               <w:t>Subject</w:t>
             </w:r>
             <w:r>
@@ -1090,7 +1103,31 @@
               <w:rPr>
                 <w:lang w:val="en-US"/>
               </w:rPr>
-              <w:t>Here is a list of emails our company employees, if you receive an email claiming to be a coworker but their email address doesn’t match this list, chances are they are an impersonator and need to be reported.</w:t>
+              <w:t xml:space="preserve">Here is a list of emails our </w:t>
+            </w:r>
+            <w:r>
+              <w:rPr>
+                <w:lang w:val="en-US"/>
+              </w:rPr>
+              <w:t>[b]</w:t>
+            </w:r>
+            <w:r>
+              <w:rPr>
+                <w:lang w:val="en-US"/>
+              </w:rPr>
+              <w:t>company employees</w:t>
+            </w:r>
+            <w:r>
+              <w:rPr>
+                <w:lang w:val="en-US"/>
+              </w:rPr>
+              <w:t>[/b]</w:t>
+            </w:r>
+            <w:r>
+              <w:rPr>
+                <w:lang w:val="en-US"/>
+              </w:rPr>
+              <w:t>, if you receive an email claiming to be a coworker but their email address doesn’t match this list, chances are they are an impersonator and need to be reported.</w:t>
             </w:r>
           </w:p>
           <w:p>
@@ -1119,7 +1156,7 @@
               </w:rPr>
               <w:t>[p]</w:t>
             </w:r>
-            <w:hyperlink r:id="rId6" w:history="1">
+            <w:hyperlink r:id="rId7" w:history="1">
               <w:r>
                 <w:rPr>
                   <w:rStyle w:val="Hyperlink"/>
@@ -1128,6 +1165,9 @@
                 <w:t>nazrin.finance@abc.com.my</w:t>
               </w:r>
             </w:hyperlink>
+            <w:r>
+              <w:t xml:space="preserve"> (Finance Dept.)</w:t>
+            </w:r>
           </w:p>
           <w:p>
             <w:pPr>
@@ -1141,7 +1181,7 @@
               </w:rPr>
               <w:t>[p]</w:t>
             </w:r>
-            <w:hyperlink r:id="rId7" w:history="1">
+            <w:hyperlink r:id="rId8" w:history="1">
               <w:r>
                 <w:rPr>
                   <w:rStyle w:val="Hyperlink"/>
@@ -1163,6 +1203,9 @@
                 <w:t>@abc.com.my</w:t>
               </w:r>
             </w:hyperlink>
+            <w:r>
+              <w:t xml:space="preserve"> (IT Dept.)</w:t>
+            </w:r>
           </w:p>
           <w:p>
             <w:pPr>
@@ -1176,7 +1219,7 @@
               </w:rPr>
               <w:t>[p]</w:t>
             </w:r>
-            <w:hyperlink r:id="rId8" w:history="1">
+            <w:hyperlink r:id="rId9" w:history="1">
               <w:r>
                 <w:rPr>
                   <w:rStyle w:val="Hyperlink"/>
@@ -1190,6 +1233,12 @@
                 <w:lang w:val="en-US"/>
               </w:rPr>
               <w:t xml:space="preserve"> </w:t>
+            </w:r>
+            <w:r>
+              <w:rPr>
+                <w:lang w:val="en-US"/>
+              </w:rPr>
+              <w:t>(Sales Rep.)</w:t>
             </w:r>
           </w:p>
           <w:p>
@@ -1319,7 +1368,7 @@
               </w:rPr>
               <w:t xml:space="preserve">: </w:t>
             </w:r>
-            <w:hyperlink r:id="rId9" w:history="1">
+            <w:hyperlink r:id="rId10" w:history="1">
               <w:r>
                 <w:rPr>
                   <w:rStyle w:val="Hyperlink"/>
@@ -1693,7 +1742,7 @@
               </w:rPr>
               <w:t xml:space="preserve">: </w:t>
             </w:r>
-            <w:hyperlink r:id="rId10" w:history="1">
+            <w:hyperlink r:id="rId11" w:history="1">
               <w:r>
                 <w:rPr>
                   <w:rStyle w:val="Hyperlink"/>
@@ -2024,6 +2073,74 @@
                 <w:lang w:val="en-US"/>
               </w:rPr>
             </w:pPr>
+            <w:r>
+              <w:rPr>
+                <w:lang w:val="en-US"/>
+              </w:rPr>
+              <w:t xml:space="preserve">[p] </w:t>
+            </w:r>
+          </w:p>
+          <w:p>
+            <w:pPr>
+              <w:rPr>
+                <w:lang w:val="en-US"/>
+              </w:rPr>
+            </w:pPr>
+            <w:r>
+              <w:rPr>
+                <w:lang w:val="en-US"/>
+              </w:rPr>
+              <w:t>[p]</w:t>
+            </w:r>
+            <w:r>
+              <w:rPr>
+                <w:lang w:val="en-US"/>
+              </w:rPr>
+              <w:t>*</w:t>
+            </w:r>
+            <w:r>
+              <w:rPr>
+                <w:lang w:val="en-US"/>
+              </w:rPr>
+              <w:t>*</w:t>
+            </w:r>
+            <w:r>
+              <w:rPr>
+                <w:lang w:val="en-US"/>
+              </w:rPr>
+              <w:t>[b]</w:t>
+            </w:r>
+            <w:r>
+              <w:rPr>
+                <w:lang w:val="en-US"/>
+              </w:rPr>
+              <w:t>Tip</w:t>
+            </w:r>
+            <w:r>
+              <w:rPr>
+                <w:lang w:val="en-US"/>
+              </w:rPr>
+              <w:t>[/b]</w:t>
+            </w:r>
+            <w:r>
+              <w:rPr>
+                <w:lang w:val="en-US"/>
+              </w:rPr>
+              <w:t xml:space="preserve">: </w:t>
+            </w:r>
+            <w:r>
+              <w:rPr>
+                <w:lang w:val="en-US"/>
+              </w:rPr>
+              <w:t>Expected file extensions: .pdf, .docx, .xlsx</w:t>
+            </w:r>
+          </w:p>
+          <w:p>
+            <w:pPr>
+              <w:rPr>
+                <w:lang w:val="en-US"/>
+              </w:rPr>
+            </w:pPr>
           </w:p>
         </w:tc>
       </w:tr>
@@ -2113,7 +2230,7 @@
               </w:rPr>
               <w:t xml:space="preserve">: </w:t>
             </w:r>
-            <w:hyperlink r:id="rId11" w:history="1">
+            <w:hyperlink r:id="rId12" w:history="1">
               <w:r>
                 <w:rPr>
                   <w:rStyle w:val="Hyperlink"/>
@@ -2347,6 +2464,7 @@
               <w:rPr>
                 <w:lang w:val="en-US"/>
               </w:rPr>
+              <w:lastRenderedPageBreak/>
               <w:t>[p]</w:t>
             </w:r>
             <w:r>
@@ -2507,7 +2625,7 @@
               </w:rPr>
               <w:t xml:space="preserve">: </w:t>
             </w:r>
-            <w:hyperlink r:id="rId12" w:history="1">
+            <w:hyperlink r:id="rId13" w:history="1">
               <w:r>
                 <w:rPr>
                   <w:rStyle w:val="Hyperlink"/>
@@ -2622,6 +2740,13 @@
             <w:vAlign w:val="center"/>
           </w:tcPr>
           <w:p>
+            <w:pPr>
+              <w:rPr>
+                <w:lang w:val="en-US"/>
+              </w:rPr>
+            </w:pPr>
+          </w:p>
+          <w:p>
             <w:r>
               <w:rPr>
                 <w:lang w:val="en-US"/>
@@ -2642,9 +2767,115 @@
           </w:p>
           <w:p>
             <w:r>
-              <w:t>[p]Thank you for choosing Orbit Antivirus!</w:t>
-            </w:r>
-          </w:p>
+              <w:t xml:space="preserve">[p] </w:t>
+            </w:r>
+          </w:p>
+          <w:p>
+            <w:r>
+              <w:t xml:space="preserve">[p] </w:t>
+            </w:r>
+          </w:p>
+          <w:p>
+            <w:r>
+              <w:t>[p]</w:t>
+            </w:r>
+            <w:r>
+              <w:t>[</w:t>
+            </w:r>
+            <w:proofErr w:type="spellStart"/>
+            <w:r>
+              <w:t>center</w:t>
+            </w:r>
+            <w:proofErr w:type="spellEnd"/>
+            <w:r>
+              <w:t>]</w:t>
+            </w:r>
+            <w:r>
+              <w:t xml:space="preserve">Thank you for choosing Orbit </w:t>
+            </w:r>
+            <w:proofErr w:type="gramStart"/>
+            <w:r>
+              <w:t>Antivirus!</w:t>
+            </w:r>
+            <w:r>
+              <w:t>[</w:t>
+            </w:r>
+            <w:proofErr w:type="gramEnd"/>
+            <w:r>
+              <w:t>/</w:t>
+            </w:r>
+            <w:proofErr w:type="spellStart"/>
+            <w:r>
+              <w:t>center</w:t>
+            </w:r>
+            <w:proofErr w:type="spellEnd"/>
+            <w:r>
+              <w:t>]</w:t>
+            </w:r>
+          </w:p>
+          <w:p>
+            <w:r>
+              <w:t xml:space="preserve">[p] </w:t>
+            </w:r>
+          </w:p>
+          <w:p>
+            <w:r>
+              <w:t>[p]</w:t>
+            </w:r>
+            <w:r>
+              <w:t>[</w:t>
+            </w:r>
+            <w:proofErr w:type="spellStart"/>
+            <w:r>
+              <w:t>center</w:t>
+            </w:r>
+            <w:proofErr w:type="spellEnd"/>
+            <w:r>
+              <w:t>]</w:t>
+            </w:r>
+            <w:r>
+              <w:t>[</w:t>
+            </w:r>
+            <w:proofErr w:type="spellStart"/>
+            <w:r>
+              <w:t>img</w:t>
+            </w:r>
+            <w:proofErr w:type="spellEnd"/>
+            <w:r>
+              <w:t>]</w:t>
+            </w:r>
+            <w:r>
+              <w:t>assets/</w:t>
+            </w:r>
+            <w:r>
+              <w:t>orbit_logo.png[/</w:t>
+            </w:r>
+            <w:proofErr w:type="spellStart"/>
+            <w:proofErr w:type="gramStart"/>
+            <w:r>
+              <w:t>img</w:t>
+            </w:r>
+            <w:proofErr w:type="spellEnd"/>
+            <w:r>
+              <w:t>]</w:t>
+            </w:r>
+            <w:r>
+              <w:t>[</w:t>
+            </w:r>
+            <w:proofErr w:type="gramEnd"/>
+            <w:r>
+              <w:t>/</w:t>
+            </w:r>
+            <w:proofErr w:type="spellStart"/>
+            <w:r>
+              <w:t>center</w:t>
+            </w:r>
+            <w:proofErr w:type="spellEnd"/>
+            <w:r>
+              <w:t>]</w:t>
+            </w:r>
+          </w:p>
+          <w:p/>
         </w:tc>
       </w:tr>
       <w:tr>
@@ -2741,7 +2972,7 @@
               </w:rPr>
               <w:t xml:space="preserve">: </w:t>
             </w:r>
-            <w:hyperlink r:id="rId13" w:history="1">
+            <w:hyperlink r:id="rId14" w:history="1">
               <w:r>
                 <w:rPr>
                   <w:rStyle w:val="Hyperlink"/>
@@ -2753,14 +2984,7 @@
                   <w:rStyle w:val="Hyperlink"/>
                   <w:lang w:val="en-US"/>
                 </w:rPr>
-                <w:t>@</w:t>
-              </w:r>
-              <w:r>
-                <w:rPr>
-                  <w:rStyle w:val="Hyperlink"/>
-                  <w:lang w:val="en-US"/>
-                </w:rPr>
-                <w:t>t</w:t>
+                <w:t>@t</w:t>
               </w:r>
               <w:r>
                 <w:rPr>
@@ -2971,28 +3195,49 @@
               <w:rPr>
                 <w:lang w:val="en-US"/>
               </w:rPr>
+              <w:t>: Inbound</w:t>
+            </w:r>
+          </w:p>
+          <w:p>
+            <w:pPr>
+              <w:rPr>
+                <w:lang w:val="en-US"/>
+              </w:rPr>
+            </w:pPr>
+            <w:r>
+              <w:rPr>
+                <w:b/>
+                <w:bCs/>
+                <w:lang w:val="en-US"/>
+              </w:rPr>
+              <w:t>Sender Name</w:t>
+            </w:r>
+            <w:r>
+              <w:rPr>
+                <w:lang w:val="en-US"/>
+              </w:rPr>
               <w:t xml:space="preserve">: </w:t>
             </w:r>
             <w:r>
               <w:rPr>
                 <w:lang w:val="en-US"/>
               </w:rPr>
-              <w:t>Inbound</w:t>
-            </w:r>
-          </w:p>
-          <w:p>
-            <w:pPr>
-              <w:rPr>
-                <w:lang w:val="en-US"/>
-              </w:rPr>
-            </w:pPr>
-            <w:r>
-              <w:rPr>
-                <w:b/>
-                <w:bCs/>
-                <w:lang w:val="en-US"/>
-              </w:rPr>
-              <w:t>Sender Name</w:t>
+              <w:t>Ravi</w:t>
+            </w:r>
+          </w:p>
+          <w:p>
+            <w:pPr>
+              <w:rPr>
+                <w:lang w:val="en-US"/>
+              </w:rPr>
+            </w:pPr>
+            <w:r>
+              <w:rPr>
+                <w:b/>
+                <w:bCs/>
+                <w:lang w:val="en-US"/>
+              </w:rPr>
+              <w:t>Sender Address</w:t>
             </w:r>
             <w:r>
               <w:rPr>
@@ -3000,34 +3245,7 @@
               </w:rPr>
               <w:t xml:space="preserve">: </w:t>
             </w:r>
-            <w:r>
-              <w:rPr>
-                <w:lang w:val="en-US"/>
-              </w:rPr>
-              <w:t>Ravi</w:t>
-            </w:r>
-          </w:p>
-          <w:p>
-            <w:pPr>
-              <w:rPr>
-                <w:lang w:val="en-US"/>
-              </w:rPr>
-            </w:pPr>
-            <w:r>
-              <w:rPr>
-                <w:b/>
-                <w:bCs/>
-                <w:lang w:val="en-US"/>
-              </w:rPr>
-              <w:t>Sender Address</w:t>
-            </w:r>
-            <w:r>
-              <w:rPr>
-                <w:lang w:val="en-US"/>
-              </w:rPr>
-              <w:t xml:space="preserve">: </w:t>
-            </w:r>
-            <w:hyperlink r:id="rId14" w:history="1">
+            <w:hyperlink r:id="rId15" w:history="1">
               <w:r>
                 <w:rPr>
                   <w:rStyle w:val="Hyperlink"/>
@@ -3142,13 +3360,7 @@
               <w:rPr>
                 <w:lang w:val="en-US"/>
               </w:rPr>
-              <w:t xml:space="preserve"> - </w:t>
-            </w:r>
-            <w:r>
-              <w:rPr>
-                <w:lang w:val="en-US"/>
-              </w:rPr>
-              <w:t>Happy Mini Market</w:t>
+              <w:t xml:space="preserve"> - Happy Mini Market</w:t>
             </w:r>
           </w:p>
           <w:p>
@@ -3264,13 +3476,7 @@
               <w:rPr>
                 <w:lang w:val="en-US"/>
               </w:rPr>
-              <w:t>[p]</w:t>
-            </w:r>
-            <w:r>
-              <w:rPr>
-                <w:lang w:val="en-US"/>
-              </w:rPr>
-              <w:t>Ravi</w:t>
+              <w:t>[p]Ravi</w:t>
             </w:r>
           </w:p>
           <w:p>
@@ -3356,28 +3562,49 @@
               <w:rPr>
                 <w:lang w:val="en-US"/>
               </w:rPr>
+              <w:t>: Message</w:t>
+            </w:r>
+          </w:p>
+          <w:p>
+            <w:pPr>
+              <w:rPr>
+                <w:lang w:val="en-US"/>
+              </w:rPr>
+            </w:pPr>
+            <w:r>
+              <w:rPr>
+                <w:b/>
+                <w:bCs/>
+                <w:lang w:val="en-US"/>
+              </w:rPr>
+              <w:t>Sender Name</w:t>
+            </w:r>
+            <w:r>
+              <w:rPr>
+                <w:lang w:val="en-US"/>
+              </w:rPr>
               <w:t xml:space="preserve">: </w:t>
             </w:r>
             <w:r>
               <w:rPr>
                 <w:lang w:val="en-US"/>
               </w:rPr>
-              <w:t>Message</w:t>
-            </w:r>
-          </w:p>
-          <w:p>
-            <w:pPr>
-              <w:rPr>
-                <w:lang w:val="en-US"/>
-              </w:rPr>
-            </w:pPr>
-            <w:r>
-              <w:rPr>
-                <w:b/>
-                <w:bCs/>
-                <w:lang w:val="en-US"/>
-              </w:rPr>
-              <w:t>Sender Name</w:t>
+              <w:t>Cyber News Daily</w:t>
+            </w:r>
+          </w:p>
+          <w:p>
+            <w:pPr>
+              <w:rPr>
+                <w:lang w:val="en-US"/>
+              </w:rPr>
+            </w:pPr>
+            <w:r>
+              <w:rPr>
+                <w:b/>
+                <w:bCs/>
+                <w:lang w:val="en-US"/>
+              </w:rPr>
+              <w:t>Sender Address</w:t>
             </w:r>
             <w:r>
               <w:rPr>
@@ -3385,34 +3612,7 @@
               </w:rPr>
               <w:t xml:space="preserve">: </w:t>
             </w:r>
-            <w:r>
-              <w:rPr>
-                <w:lang w:val="en-US"/>
-              </w:rPr>
-              <w:t>Cyber News Daily</w:t>
-            </w:r>
-          </w:p>
-          <w:p>
-            <w:pPr>
-              <w:rPr>
-                <w:lang w:val="en-US"/>
-              </w:rPr>
-            </w:pPr>
-            <w:r>
-              <w:rPr>
-                <w:b/>
-                <w:bCs/>
-                <w:lang w:val="en-US"/>
-              </w:rPr>
-              <w:t>Sender Address</w:t>
-            </w:r>
-            <w:r>
-              <w:rPr>
-                <w:lang w:val="en-US"/>
-              </w:rPr>
-              <w:t xml:space="preserve">: </w:t>
-            </w:r>
-            <w:hyperlink r:id="rId15" w:history="1">
+            <w:hyperlink r:id="rId16" w:history="1">
               <w:r>
                 <w:rPr>
                   <w:rStyle w:val="Hyperlink"/>
@@ -3425,13 +3625,7 @@
               <w:rPr>
                 <w:lang w:val="en-US"/>
               </w:rPr>
-              <w:t xml:space="preserve"> </w:t>
-            </w:r>
-            <w:r>
-              <w:rPr>
-                <w:lang w:val="en-US"/>
-              </w:rPr>
-              <w:t xml:space="preserve"> </w:t>
+              <w:t xml:space="preserve">  </w:t>
             </w:r>
           </w:p>
           <w:p>
@@ -3600,33 +3794,75 @@
               <w:rPr>
                 <w:lang w:val="en-US"/>
               </w:rPr>
-              <w:t>[p]- Feel urgent or threatening</w:t>
-            </w:r>
-          </w:p>
-          <w:p>
-            <w:pPr>
-              <w:rPr>
-                <w:lang w:val="en-US"/>
-              </w:rPr>
-            </w:pPr>
-            <w:r>
-              <w:rPr>
-                <w:lang w:val="en-US"/>
-              </w:rPr>
-              <w:t>[p]- Have poor grammar</w:t>
-            </w:r>
-          </w:p>
-          <w:p>
-            <w:pPr>
-              <w:rPr>
-                <w:lang w:val="en-US"/>
-              </w:rPr>
-            </w:pPr>
-            <w:r>
-              <w:rPr>
-                <w:lang w:val="en-US"/>
-              </w:rPr>
-              <w:t xml:space="preserve">[p]- Include </w:t>
+              <w:t>[p]</w:t>
+            </w:r>
+            <w:r>
+              <w:rPr>
+                <w:lang w:val="en-US"/>
+              </w:rPr>
+              <w:t xml:space="preserve"> </w:t>
+            </w:r>
+            <w:r>
+              <w:rPr>
+                <w:lang w:val="en-US"/>
+              </w:rPr>
+              <w:t>- Feel urgent or threatening</w:t>
+            </w:r>
+          </w:p>
+          <w:p>
+            <w:pPr>
+              <w:rPr>
+                <w:lang w:val="en-US"/>
+              </w:rPr>
+            </w:pPr>
+            <w:r>
+              <w:rPr>
+                <w:lang w:val="en-US"/>
+              </w:rPr>
+              <w:t>[p]</w:t>
+            </w:r>
+            <w:r>
+              <w:rPr>
+                <w:lang w:val="en-US"/>
+              </w:rPr>
+              <w:t xml:space="preserve"> </w:t>
+            </w:r>
+            <w:r>
+              <w:rPr>
+                <w:lang w:val="en-US"/>
+              </w:rPr>
+              <w:t>- Have poor grammar</w:t>
+            </w:r>
+            <w:r>
+              <w:rPr>
+                <w:lang w:val="en-US"/>
+              </w:rPr>
+              <w:t xml:space="preserve"> (but not always!)</w:t>
+            </w:r>
+          </w:p>
+          <w:p>
+            <w:pPr>
+              <w:rPr>
+                <w:lang w:val="en-US"/>
+              </w:rPr>
+            </w:pPr>
+            <w:r>
+              <w:rPr>
+                <w:lang w:val="en-US"/>
+              </w:rPr>
+              <w:t>[p]</w:t>
+            </w:r>
+            <w:r>
+              <w:rPr>
+                <w:lang w:val="en-US"/>
+              </w:rPr>
+              <w:t xml:space="preserve"> </w:t>
+            </w:r>
+            <w:r>
+              <w:rPr>
+                <w:lang w:val="en-US"/>
+              </w:rPr>
+              <w:t xml:space="preserve">- Include </w:t>
             </w:r>
             <w:r>
               <w:rPr>
@@ -3738,6 +3974,7 @@
               <w:rPr>
                 <w:lang w:val="en-US"/>
               </w:rPr>
+              <w:lastRenderedPageBreak/>
               <w:t>[p]Stay alert and stay safe!</w:t>
             </w:r>
           </w:p>
@@ -3844,7 +4081,7 @@
               </w:rPr>
               <w:t xml:space="preserve">: </w:t>
             </w:r>
-            <w:hyperlink r:id="rId16" w:history="1">
+            <w:hyperlink r:id="rId17" w:history="1">
               <w:r>
                 <w:rPr>
                   <w:rStyle w:val="Hyperlink"/>
@@ -3913,7 +4150,6 @@
                 <w:bCs/>
                 <w:lang w:val="en-US"/>
               </w:rPr>
-              <w:lastRenderedPageBreak/>
               <w:t>CC Address</w:t>
             </w:r>
             <w:r>
@@ -3979,12 +4215,48 @@
                 <w:lang w:val="en-US"/>
               </w:rPr>
             </w:pPr>
-            <w:r>
-              <w:rPr>
-                <w:lang w:val="en-US"/>
-              </w:rPr>
-              <w:lastRenderedPageBreak/>
-              <w:t xml:space="preserve">hello want to order </w:t>
+          </w:p>
+          <w:p>
+            <w:pPr>
+              <w:rPr>
+                <w:lang w:val="en-US"/>
+              </w:rPr>
+            </w:pPr>
+            <w:r>
+              <w:rPr>
+                <w:lang w:val="en-US"/>
+              </w:rPr>
+              <w:t>H</w:t>
+            </w:r>
+            <w:r>
+              <w:rPr>
+                <w:lang w:val="en-US"/>
+              </w:rPr>
+              <w:t>ello</w:t>
+            </w:r>
+            <w:r>
+              <w:rPr>
+                <w:lang w:val="en-US"/>
+              </w:rPr>
+              <w:t>,</w:t>
+            </w:r>
+            <w:r>
+              <w:rPr>
+                <w:lang w:val="en-US"/>
+              </w:rPr>
+              <w:t xml:space="preserve"> </w:t>
+            </w:r>
+            <w:r>
+              <w:rPr>
+                <w:lang w:val="en-US"/>
+              </w:rPr>
+              <w:t xml:space="preserve">I </w:t>
+            </w:r>
+            <w:r>
+              <w:rPr>
+                <w:lang w:val="en-US"/>
+              </w:rPr>
+              <w:t xml:space="preserve">want to order </w:t>
             </w:r>
             <w:proofErr w:type="spellStart"/>
             <w:r>
@@ -3994,6 +4266,12 @@
               <w:t>stationarys</w:t>
             </w:r>
             <w:proofErr w:type="spellEnd"/>
+            <w:r>
+              <w:rPr>
+                <w:lang w:val="en-US"/>
+              </w:rPr>
+              <w:t xml:space="preserve"> for my shop</w:t>
+            </w:r>
             <w:r>
               <w:rPr>
                 <w:lang w:val="en-US"/>
@@ -4115,7 +4393,7 @@
               </w:rPr>
               <w:t xml:space="preserve">: </w:t>
             </w:r>
-            <w:hyperlink r:id="rId17" w:history="1">
+            <w:hyperlink r:id="rId18" w:history="1">
               <w:r>
                 <w:rPr>
                   <w:rStyle w:val="Hyperlink"/>
@@ -4217,13 +4495,7 @@
               <w:rPr>
                 <w:lang w:val="en-US"/>
               </w:rPr>
-              <w:t xml:space="preserve">Purchase Order </w:t>
-            </w:r>
-            <w:r>
-              <w:rPr>
-                <w:lang w:val="en-US"/>
-              </w:rPr>
-              <w:t xml:space="preserve">- </w:t>
+              <w:t xml:space="preserve">Purchase Order - </w:t>
             </w:r>
             <w:proofErr w:type="spellStart"/>
             <w:r>
@@ -4945,6 +5217,7 @@
   <w:style w:type="character" w:default="1" w:styleId="DefaultParagraphFont">
     <w:name w:val="Default Paragraph Font"/>
     <w:uiPriority w:val="1"/>
+    <w:semiHidden/>
     <w:unhideWhenUsed/>
   </w:style>
   <w:style w:type="table" w:default="1" w:styleId="TableNormal">

</xml_diff>

<commit_message>
Level Design: Monday Update
</commit_message>
<xml_diff>
--- a/level design.docx
+++ b/level design.docx
@@ -388,8 +388,8 @@
         <w:tblLook w:val="04A0" w:firstRow="1" w:lastRow="0" w:firstColumn="1" w:lastColumn="0" w:noHBand="0" w:noVBand="1"/>
       </w:tblPr>
       <w:tblGrid>
-        <w:gridCol w:w="3955"/>
-        <w:gridCol w:w="5061"/>
+        <w:gridCol w:w="3115"/>
+        <w:gridCol w:w="5901"/>
       </w:tblGrid>
       <w:tr>
         <w:trPr>
@@ -602,7 +602,20 @@
                   <w:rStyle w:val="Hyperlink"/>
                   <w:lang w:val="en-US"/>
                 </w:rPr>
-                <w:t>dallas@abc.com.my</w:t>
+                <w:t>m</w:t>
+              </w:r>
+              <w:r>
+                <w:rPr>
+                  <w:rStyle w:val="Hyperlink"/>
+                </w:rPr>
+                <w:t>ike</w:t>
+              </w:r>
+              <w:r>
+                <w:rPr>
+                  <w:rStyle w:val="Hyperlink"/>
+                  <w:lang w:val="en-US"/>
+                </w:rPr>
+                <w:t>@abc.com.my</w:t>
               </w:r>
             </w:hyperlink>
             <w:r>
@@ -675,7 +688,19 @@
               <w:rPr>
                 <w:lang w:val="en-US"/>
               </w:rPr>
-              <w:t xml:space="preserve"> ABC Stationery, {</w:t>
+              <w:t xml:space="preserve"> ABC Stationer</w:t>
+            </w:r>
+            <w:r>
+              <w:rPr>
+                <w:lang w:val="en-US"/>
+              </w:rPr>
+              <w:t>ies</w:t>
+            </w:r>
+            <w:r>
+              <w:rPr>
+                <w:lang w:val="en-US"/>
+              </w:rPr>
+              <w:t>, {</w:t>
             </w:r>
             <w:proofErr w:type="spellStart"/>
             <w:r>
@@ -727,7 +752,31 @@
               <w:rPr>
                 <w:lang w:val="en-US"/>
               </w:rPr>
-              <w:t>I am your assigned buddy to guide you through the basic tasks you will be doing!</w:t>
+              <w:t>I</w:t>
+            </w:r>
+            <w:r>
+              <w:rPr>
+                <w:lang w:val="en-US"/>
+              </w:rPr>
+              <w:t>’m</w:t>
+            </w:r>
+            <w:r>
+              <w:rPr>
+                <w:lang w:val="en-US"/>
+              </w:rPr>
+              <w:t xml:space="preserve"> Blake,</w:t>
+            </w:r>
+            <w:r>
+              <w:rPr>
+                <w:lang w:val="en-US"/>
+              </w:rPr>
+              <w:t xml:space="preserve"> your assigned buddy to guide you through the basic</w:t>
+            </w:r>
+            <w:r>
+              <w:rPr>
+                <w:lang w:val="en-US"/>
+              </w:rPr>
+              <w:t>s!</w:t>
             </w:r>
           </w:p>
           <w:p>
@@ -777,7 +826,19 @@
               <w:rPr>
                 <w:lang w:val="en-US"/>
               </w:rPr>
-              <w:t xml:space="preserve">, make sure it is safe before sending it to </w:t>
+              <w:t>, make sure it is safe before</w:t>
+            </w:r>
+            <w:r>
+              <w:rPr>
+                <w:lang w:val="en-US"/>
+              </w:rPr>
+              <w:t xml:space="preserve"> downloading and</w:t>
+            </w:r>
+            <w:r>
+              <w:rPr>
+                <w:lang w:val="en-US"/>
+              </w:rPr>
+              <w:t xml:space="preserve"> sending it to </w:t>
             </w:r>
             <w:r>
               <w:rPr>
@@ -882,6 +943,92 @@
               <w:rPr>
                 <w:lang w:val="en-US"/>
               </w:rPr>
+              <w:t>[p]</w:t>
+            </w:r>
+            <w:r>
+              <w:rPr>
+                <w:lang w:val="en-US"/>
+              </w:rPr>
+              <w:t xml:space="preserve"> </w:t>
+            </w:r>
+          </w:p>
+          <w:p>
+            <w:pPr>
+              <w:rPr>
+                <w:lang w:val="en-US"/>
+              </w:rPr>
+            </w:pPr>
+            <w:r>
+              <w:rPr>
+                <w:lang w:val="en-US"/>
+              </w:rPr>
+              <w:t>[p]</w:t>
+            </w:r>
+            <w:r>
+              <w:rPr>
+                <w:lang w:val="en-US"/>
+              </w:rPr>
+              <w:t>[center]</w:t>
+            </w:r>
+            <w:r>
+              <w:rPr>
+                <w:lang w:val="en-US"/>
+              </w:rPr>
+              <w:t>[</w:t>
+            </w:r>
+            <w:proofErr w:type="spellStart"/>
+            <w:r>
+              <w:rPr>
+                <w:lang w:val="en-US"/>
+              </w:rPr>
+              <w:t>img</w:t>
+            </w:r>
+            <w:proofErr w:type="spellEnd"/>
+            <w:r>
+              <w:rPr>
+                <w:lang w:val="en-US"/>
+              </w:rPr>
+              <w:t>]assets/tutorial/report_email.png[/</w:t>
+            </w:r>
+            <w:proofErr w:type="spellStart"/>
+            <w:proofErr w:type="gramStart"/>
+            <w:r>
+              <w:rPr>
+                <w:lang w:val="en-US"/>
+              </w:rPr>
+              <w:t>img</w:t>
+            </w:r>
+            <w:proofErr w:type="spellEnd"/>
+            <w:r>
+              <w:rPr>
+                <w:lang w:val="en-US"/>
+              </w:rPr>
+              <w:t>]</w:t>
+            </w:r>
+            <w:r>
+              <w:rPr>
+                <w:lang w:val="en-US"/>
+              </w:rPr>
+              <w:t>[</w:t>
+            </w:r>
+            <w:proofErr w:type="gramEnd"/>
+            <w:r>
+              <w:rPr>
+                <w:lang w:val="en-US"/>
+              </w:rPr>
+              <w:t>/center]</w:t>
+            </w:r>
+          </w:p>
+          <w:p>
+            <w:pPr>
+              <w:rPr>
+                <w:lang w:val="en-US"/>
+              </w:rPr>
+            </w:pPr>
+            <w:r>
+              <w:rPr>
+                <w:lang w:val="en-US"/>
+              </w:rPr>
               <w:t xml:space="preserve">[p] </w:t>
             </w:r>
           </w:p>
@@ -895,7 +1042,31 @@
               <w:rPr>
                 <w:lang w:val="en-US"/>
               </w:rPr>
-              <w:t>[p]Also beware to not report legitimate emails; this could disrupt our operations and negatively impact client</w:t>
+              <w:t xml:space="preserve">[p]Also </w:t>
+            </w:r>
+            <w:r>
+              <w:rPr>
+                <w:lang w:val="en-US"/>
+              </w:rPr>
+              <w:t>please do</w:t>
+            </w:r>
+            <w:r>
+              <w:rPr>
+                <w:lang w:val="en-US"/>
+              </w:rPr>
+              <w:t xml:space="preserve"> not report legitimate emails; this could disrupt our operations and negatively impact</w:t>
+            </w:r>
+            <w:r>
+              <w:rPr>
+                <w:lang w:val="en-US"/>
+              </w:rPr>
+              <w:t xml:space="preserve"> our</w:t>
+            </w:r>
+            <w:r>
+              <w:rPr>
+                <w:lang w:val="en-US"/>
+              </w:rPr>
+              <w:t xml:space="preserve"> client</w:t>
             </w:r>
             <w:r>
               <w:rPr>
@@ -931,6 +1102,8 @@
           <w:p>
             <w:pPr>
               <w:rPr>
+                <w:b/>
+                <w:bCs/>
                 <w:lang w:val="en-US"/>
               </w:rPr>
             </w:pPr>
@@ -953,7 +1126,7 @@
               <w:rPr>
                 <w:lang w:val="en-US"/>
               </w:rPr>
-              <w:t>: Message</w:t>
+              <w:t>: Outbound</w:t>
             </w:r>
           </w:p>
           <w:p>
@@ -974,7 +1147,13 @@
               <w:rPr>
                 <w:lang w:val="en-US"/>
               </w:rPr>
-              <w:t>: Blake</w:t>
+              <w:t xml:space="preserve">: </w:t>
+            </w:r>
+            <w:r>
+              <w:rPr>
+                <w:lang w:val="en-US"/>
+              </w:rPr>
+              <w:t>Nazrin</w:t>
             </w:r>
           </w:p>
           <w:p>
@@ -1003,7 +1182,20 @@
                   <w:rStyle w:val="Hyperlink"/>
                   <w:lang w:val="en-US"/>
                 </w:rPr>
-                <w:t>blake@abc.com.my</w:t>
+                <w:t>n</w:t>
+              </w:r>
+              <w:r>
+                <w:rPr>
+                  <w:rStyle w:val="Hyperlink"/>
+                </w:rPr>
+                <w:t>azrin.finance</w:t>
+              </w:r>
+              <w:r>
+                <w:rPr>
+                  <w:rStyle w:val="Hyperlink"/>
+                  <w:lang w:val="en-US"/>
+                </w:rPr>
+                <w:t>@abc.com.my</w:t>
               </w:r>
             </w:hyperlink>
           </w:p>
@@ -1054,6 +1246,7 @@
                 <w:bCs/>
                 <w:lang w:val="en-US"/>
               </w:rPr>
+              <w:lastRenderedPageBreak/>
               <w:t>CC Address</w:t>
             </w:r>
             <w:r>
@@ -1081,18 +1274,20 @@
               <w:rPr>
                 <w:lang w:val="en-US"/>
               </w:rPr>
-              <w:t>: Onboarding Guide</w:t>
-            </w:r>
-            <w:r>
-              <w:rPr>
-                <w:lang w:val="en-US"/>
-              </w:rPr>
-              <w:t xml:space="preserve"> 2</w:t>
-            </w:r>
-          </w:p>
-          <w:p>
-            <w:pPr>
-              <w:rPr>
+              <w:t xml:space="preserve">: </w:t>
+            </w:r>
+            <w:r>
+              <w:rPr>
+                <w:lang w:val="en-US"/>
+              </w:rPr>
+              <w:t>Submit Today's Purchase Order</w:t>
+            </w:r>
+          </w:p>
+          <w:p>
+            <w:pPr>
+              <w:rPr>
+                <w:b/>
+                <w:bCs/>
                 <w:lang w:val="en-US"/>
               </w:rPr>
             </w:pPr>
@@ -1120,7 +1315,192 @@
               <w:rPr>
                 <w:lang w:val="en-US"/>
               </w:rPr>
-              <w:t xml:space="preserve">Here is a list of emails our </w:t>
+              <w:t>Hello and welcome to ABC Stationer</w:t>
+            </w:r>
+            <w:r>
+              <w:rPr>
+                <w:lang w:val="en-US"/>
+              </w:rPr>
+              <w:t>ies</w:t>
+            </w:r>
+            <w:r>
+              <w:rPr>
+                <w:lang w:val="en-US"/>
+              </w:rPr>
+              <w:t>, {</w:t>
+            </w:r>
+            <w:proofErr w:type="spellStart"/>
+            <w:r>
+              <w:rPr>
+                <w:lang w:val="en-US"/>
+              </w:rPr>
+              <w:t>player_name</w:t>
+            </w:r>
+            <w:proofErr w:type="spellEnd"/>
+            <w:r>
+              <w:rPr>
+                <w:lang w:val="en-US"/>
+              </w:rPr>
+              <w:t>}!</w:t>
+            </w:r>
+          </w:p>
+          <w:p>
+            <w:pPr>
+              <w:rPr>
+                <w:lang w:val="en-US"/>
+              </w:rPr>
+            </w:pPr>
+            <w:r>
+              <w:rPr>
+                <w:lang w:val="en-US"/>
+              </w:rPr>
+              <w:t xml:space="preserve">[p] </w:t>
+            </w:r>
+          </w:p>
+          <w:p>
+            <w:pPr>
+              <w:rPr>
+                <w:lang w:val="en-US"/>
+              </w:rPr>
+            </w:pPr>
+            <w:r>
+              <w:rPr>
+                <w:lang w:val="en-US"/>
+              </w:rPr>
+              <w:t>[p]</w:t>
+            </w:r>
+            <w:r>
+              <w:rPr>
+                <w:lang w:val="en-US"/>
+              </w:rPr>
+              <w:t>I am</w:t>
+            </w:r>
+            <w:r>
+              <w:rPr>
+                <w:lang w:val="en-US"/>
+              </w:rPr>
+              <w:t xml:space="preserve"> Nazrin from Finance Department, and my email address is where you submit Purchase Orders you have received today from our clients.</w:t>
+            </w:r>
+          </w:p>
+          <w:p>
+            <w:pPr>
+              <w:rPr>
+                <w:lang w:val="en-US"/>
+              </w:rPr>
+            </w:pPr>
+            <w:r>
+              <w:rPr>
+                <w:lang w:val="en-US"/>
+              </w:rPr>
+              <w:lastRenderedPageBreak/>
+              <w:t xml:space="preserve">[p] </w:t>
+            </w:r>
+          </w:p>
+          <w:p>
+            <w:pPr>
+              <w:rPr>
+                <w:lang w:val="en-US"/>
+              </w:rPr>
+            </w:pPr>
+            <w:r>
+              <w:rPr>
+                <w:lang w:val="en-US"/>
+              </w:rPr>
+              <w:t>[p]</w:t>
+            </w:r>
+            <w:proofErr w:type="gramStart"/>
+            <w:r>
+              <w:rPr>
+                <w:lang w:val="en-US"/>
+              </w:rPr>
+              <w:t>To</w:t>
+            </w:r>
+            <w:proofErr w:type="gramEnd"/>
+            <w:r>
+              <w:rPr>
+                <w:lang w:val="en-US"/>
+              </w:rPr>
+              <w:t xml:space="preserve"> make things easier for you, I'll send you a request email like this every day and you can just drop the files in and click send!</w:t>
+            </w:r>
+          </w:p>
+          <w:p>
+            <w:pPr>
+              <w:rPr>
+                <w:lang w:val="en-US"/>
+              </w:rPr>
+            </w:pPr>
+            <w:r>
+              <w:rPr>
+                <w:lang w:val="en-US"/>
+              </w:rPr>
+              <w:t xml:space="preserve">[p] </w:t>
+            </w:r>
+          </w:p>
+          <w:p>
+            <w:pPr>
+              <w:rPr>
+                <w:lang w:val="en-US"/>
+              </w:rPr>
+            </w:pPr>
+            <w:r>
+              <w:rPr>
+                <w:lang w:val="en-US"/>
+              </w:rPr>
+              <w:t>[p][</w:t>
+            </w:r>
+            <w:proofErr w:type="gramStart"/>
+            <w:r>
+              <w:rPr>
+                <w:lang w:val="en-US"/>
+              </w:rPr>
+              <w:t>b]Make</w:t>
+            </w:r>
+            <w:proofErr w:type="gramEnd"/>
+            <w:r>
+              <w:rPr>
+                <w:lang w:val="en-US"/>
+              </w:rPr>
+              <w:t xml:space="preserve"> sure that you have collected all the Purchase Orders sent to you today before submitting. A missed order is a missed </w:t>
+            </w:r>
+            <w:proofErr w:type="gramStart"/>
+            <w:r>
+              <w:rPr>
+                <w:lang w:val="en-US"/>
+              </w:rPr>
+              <w:t>opportunity![</w:t>
+            </w:r>
+            <w:proofErr w:type="gramEnd"/>
+            <w:r>
+              <w:rPr>
+                <w:lang w:val="en-US"/>
+              </w:rPr>
+              <w:t>/b]</w:t>
+            </w:r>
+          </w:p>
+          <w:p>
+            <w:pPr>
+              <w:rPr>
+                <w:lang w:val="en-US"/>
+              </w:rPr>
+            </w:pPr>
+            <w:r>
+              <w:rPr>
+                <w:lang w:val="en-US"/>
+              </w:rPr>
+              <w:t xml:space="preserve">[p] </w:t>
+            </w:r>
+          </w:p>
+          <w:p>
+            <w:pPr>
+              <w:rPr>
+                <w:lang w:val="en-US"/>
+              </w:rPr>
+            </w:pPr>
+            <w:r>
+              <w:rPr>
+                <w:lang w:val="en-US"/>
+              </w:rPr>
+              <w:t>[p]*</w:t>
             </w:r>
             <w:r>
               <w:rPr>
@@ -1132,7 +1512,7 @@
               <w:rPr>
                 <w:lang w:val="en-US"/>
               </w:rPr>
-              <w:t>company employees</w:t>
+              <w:t>Tip</w:t>
             </w:r>
             <w:r>
               <w:rPr>
@@ -1144,7 +1524,7 @@
               <w:rPr>
                 <w:lang w:val="en-US"/>
               </w:rPr>
-              <w:t>, if you receive an email claiming to be a coworker but their email address doesn’t match this list, chances are they are an impersonator and need to be reported.</w:t>
+              <w:t>: Open your File Explorer, drag the file over and drop it in this email. Once you've made sure all files are attached. Click send!</w:t>
             </w:r>
           </w:p>
           <w:p>
@@ -1172,32 +1552,133 @@
               </w:rPr>
               <w:t>[p]</w:t>
             </w:r>
+            <w:r>
+              <w:rPr>
+                <w:lang w:val="en-US"/>
+              </w:rPr>
+              <w:t>*</w:t>
+            </w:r>
+            <w:r>
+              <w:rPr>
+                <w:lang w:val="en-US"/>
+              </w:rPr>
+              <w:t>*[b]</w:t>
+            </w:r>
+            <w:r>
+              <w:rPr>
+                <w:lang w:val="en-US"/>
+              </w:rPr>
+              <w:t>Tip</w:t>
+            </w:r>
+            <w:r>
+              <w:rPr>
+                <w:lang w:val="en-US"/>
+              </w:rPr>
+              <w:t xml:space="preserve">[/b]: </w:t>
+            </w:r>
+            <w:r>
+              <w:rPr>
+                <w:lang w:val="en-US"/>
+              </w:rPr>
+              <w:t>Expected file extensions: .pdf, .docx, .xlsx</w:t>
+            </w:r>
+          </w:p>
+          <w:p>
+            <w:pPr>
+              <w:rPr>
+                <w:lang w:val="en-US"/>
+              </w:rPr>
+            </w:pPr>
+          </w:p>
+        </w:tc>
+      </w:tr>
+      <w:tr>
+        <w:trPr>
+          <w:trHeight w:val="360"/>
+        </w:trPr>
+        <w:tc>
+          <w:tcPr>
+            <w:tcW w:w="3955" w:type="dxa"/>
+            <w:vAlign w:val="center"/>
+          </w:tcPr>
+          <w:p>
+            <w:pPr>
+              <w:rPr>
+                <w:b/>
+                <w:bCs/>
+                <w:lang w:val="en-US"/>
+              </w:rPr>
+            </w:pPr>
+          </w:p>
+          <w:p>
+            <w:pPr>
+              <w:rPr>
+                <w:lang w:val="en-US"/>
+              </w:rPr>
+            </w:pPr>
+            <w:r>
+              <w:rPr>
+                <w:b/>
+                <w:bCs/>
+                <w:lang w:val="en-US"/>
+              </w:rPr>
+              <w:t>Type</w:t>
+            </w:r>
+            <w:r>
+              <w:rPr>
+                <w:lang w:val="en-US"/>
+              </w:rPr>
+              <w:t>: Message</w:t>
+            </w:r>
+          </w:p>
+          <w:p>
+            <w:pPr>
+              <w:rPr>
+                <w:lang w:val="en-US"/>
+              </w:rPr>
+            </w:pPr>
+            <w:r>
+              <w:rPr>
+                <w:b/>
+                <w:bCs/>
+                <w:lang w:val="en-US"/>
+              </w:rPr>
+              <w:t>Sender Name</w:t>
+            </w:r>
+            <w:r>
+              <w:rPr>
+                <w:lang w:val="en-US"/>
+              </w:rPr>
+              <w:t xml:space="preserve">: </w:t>
+            </w:r>
+            <w:r>
+              <w:rPr>
+                <w:lang w:val="en-US"/>
+              </w:rPr>
+              <w:t>Kai Jie</w:t>
+            </w:r>
+          </w:p>
+          <w:p>
+            <w:pPr>
+              <w:rPr>
+                <w:lang w:val="en-US"/>
+              </w:rPr>
+            </w:pPr>
+            <w:r>
+              <w:rPr>
+                <w:b/>
+                <w:bCs/>
+                <w:lang w:val="en-US"/>
+              </w:rPr>
+              <w:t>Sender Address</w:t>
+            </w:r>
+            <w:r>
+              <w:rPr>
+                <w:lang w:val="en-US"/>
+              </w:rPr>
+              <w:t xml:space="preserve">: </w:t>
+            </w:r>
             <w:hyperlink r:id="rId7" w:history="1">
-              <w:r>
-                <w:rPr>
-                  <w:rStyle w:val="Hyperlink"/>
-                  <w:lang w:val="en-US"/>
-                </w:rPr>
-                <w:t>nazrin.finance@abc.com.my</w:t>
-              </w:r>
-            </w:hyperlink>
-            <w:r>
-              <w:t xml:space="preserve"> (Finance Dept.)</w:t>
-            </w:r>
-          </w:p>
-          <w:p>
-            <w:pPr>
-              <w:rPr>
-                <w:lang w:val="en-US"/>
-              </w:rPr>
-            </w:pPr>
-            <w:r>
-              <w:rPr>
-                <w:lang w:val="en-US"/>
-              </w:rPr>
-              <w:t>[p]</w:t>
-            </w:r>
-            <w:hyperlink r:id="rId8" w:history="1">
               <w:r>
                 <w:rPr>
                   <w:rStyle w:val="Hyperlink"/>
@@ -1219,44 +1700,213 @@
                 <w:t>@abc.com.my</w:t>
               </w:r>
             </w:hyperlink>
-            <w:r>
-              <w:t xml:space="preserve"> (IT Dept.)</w:t>
-            </w:r>
-          </w:p>
-          <w:p>
-            <w:pPr>
-              <w:rPr>
-                <w:lang w:val="en-US"/>
-              </w:rPr>
-            </w:pPr>
-            <w:r>
-              <w:rPr>
-                <w:lang w:val="en-US"/>
-              </w:rPr>
-              <w:lastRenderedPageBreak/>
+          </w:p>
+          <w:p>
+            <w:pPr>
+              <w:rPr>
+                <w:lang w:val="en-US"/>
+              </w:rPr>
+            </w:pPr>
+            <w:r>
+              <w:rPr>
+                <w:b/>
+                <w:bCs/>
+                <w:lang w:val="en-US"/>
+              </w:rPr>
+              <w:t>To Address</w:t>
+            </w:r>
+            <w:r>
+              <w:rPr>
+                <w:lang w:val="en-US"/>
+              </w:rPr>
+              <w:t>: {</w:t>
+            </w:r>
+            <w:proofErr w:type="spellStart"/>
+            <w:r>
+              <w:rPr>
+                <w:lang w:val="en-US"/>
+              </w:rPr>
+              <w:t>player_email</w:t>
+            </w:r>
+            <w:proofErr w:type="spellEnd"/>
+            <w:r>
+              <w:rPr>
+                <w:lang w:val="en-US"/>
+              </w:rPr>
+              <w:t>}</w:t>
+            </w:r>
+          </w:p>
+          <w:p>
+            <w:pPr>
+              <w:rPr>
+                <w:lang w:val="en-US"/>
+              </w:rPr>
+            </w:pPr>
+            <w:r>
+              <w:rPr>
+                <w:b/>
+                <w:bCs/>
+                <w:lang w:val="en-US"/>
+              </w:rPr>
+              <w:t>CC Address</w:t>
+            </w:r>
+            <w:r>
+              <w:rPr>
+                <w:lang w:val="en-US"/>
+              </w:rPr>
+              <w:t xml:space="preserve">: </w:t>
+            </w:r>
+          </w:p>
+          <w:p>
+            <w:pPr>
+              <w:rPr>
+                <w:lang w:val="en-US"/>
+              </w:rPr>
+            </w:pPr>
+            <w:r>
+              <w:rPr>
+                <w:b/>
+                <w:bCs/>
+                <w:lang w:val="en-US"/>
+              </w:rPr>
+              <w:t>Subject</w:t>
+            </w:r>
+            <w:r>
+              <w:rPr>
+                <w:lang w:val="en-US"/>
+              </w:rPr>
+              <w:t xml:space="preserve">: </w:t>
+            </w:r>
+            <w:r>
+              <w:rPr>
+                <w:lang w:val="en-US"/>
+              </w:rPr>
+              <w:t>Antivirus Introduction</w:t>
+            </w:r>
+          </w:p>
+          <w:p>
+            <w:pPr>
+              <w:rPr>
+                <w:b/>
+                <w:bCs/>
+                <w:lang w:val="en-US"/>
+              </w:rPr>
+            </w:pPr>
+          </w:p>
+        </w:tc>
+        <w:tc>
+          <w:tcPr>
+            <w:tcW w:w="5061" w:type="dxa"/>
+            <w:vAlign w:val="center"/>
+          </w:tcPr>
+          <w:p>
+            <w:pPr>
+              <w:rPr>
+                <w:lang w:val="en-US"/>
+              </w:rPr>
+            </w:pPr>
+          </w:p>
+          <w:p>
+            <w:pPr>
+              <w:rPr>
+                <w:lang w:val="en-US"/>
+              </w:rPr>
+            </w:pPr>
+            <w:r>
+              <w:rPr>
+                <w:lang w:val="en-US"/>
+              </w:rPr>
+              <w:t>N</w:t>
+            </w:r>
+            <w:r>
+              <w:t>ice to meet you</w:t>
+            </w:r>
+            <w:r>
+              <w:rPr>
+                <w:lang w:val="en-US"/>
+              </w:rPr>
+              <w:t>, {</w:t>
+            </w:r>
+            <w:proofErr w:type="spellStart"/>
+            <w:r>
+              <w:rPr>
+                <w:lang w:val="en-US"/>
+              </w:rPr>
+              <w:t>player_name</w:t>
+            </w:r>
+            <w:proofErr w:type="spellEnd"/>
+            <w:r>
+              <w:rPr>
+                <w:lang w:val="en-US"/>
+              </w:rPr>
+              <w:t>}!</w:t>
+            </w:r>
+          </w:p>
+          <w:p>
+            <w:pPr>
+              <w:rPr>
+                <w:lang w:val="en-US"/>
+              </w:rPr>
+            </w:pPr>
+            <w:r>
+              <w:rPr>
+                <w:lang w:val="en-US"/>
+              </w:rPr>
+              <w:t xml:space="preserve">[p] </w:t>
+            </w:r>
+          </w:p>
+          <w:p>
+            <w:pPr>
+              <w:rPr>
+                <w:lang w:val="en-US"/>
+              </w:rPr>
+            </w:pPr>
+            <w:r>
+              <w:rPr>
+                <w:lang w:val="en-US"/>
+              </w:rPr>
+              <w:t xml:space="preserve">[p]I am </w:t>
+            </w:r>
+            <w:r>
+              <w:rPr>
+                <w:lang w:val="en-US"/>
+              </w:rPr>
+              <w:t>K</w:t>
+            </w:r>
+            <w:r>
+              <w:t>ai Jie</w:t>
+            </w:r>
+            <w:r>
+              <w:rPr>
+                <w:lang w:val="en-US"/>
+              </w:rPr>
+              <w:t xml:space="preserve"> from IT Department. </w:t>
+            </w:r>
+            <w:r>
+              <w:rPr>
+                <w:lang w:val="en-US"/>
+              </w:rPr>
+              <w:t>Our company has antivirus subscriptions for company devices to help scan and find any suspicious files it comes across.</w:t>
+            </w:r>
+          </w:p>
+          <w:p>
+            <w:pPr>
+              <w:rPr>
+                <w:lang w:val="en-US"/>
+              </w:rPr>
+            </w:pPr>
+            <w:r>
+              <w:rPr>
+                <w:lang w:val="en-US"/>
+              </w:rPr>
               <w:t>[p]</w:t>
             </w:r>
-            <w:hyperlink r:id="rId9" w:history="1">
-              <w:r>
-                <w:rPr>
-                  <w:rStyle w:val="Hyperlink"/>
-                  <w:lang w:val="en-US"/>
-                </w:rPr>
-                <w:t>dallas@abc.com.my</w:t>
-              </w:r>
-            </w:hyperlink>
             <w:r>
               <w:rPr>
                 <w:lang w:val="en-US"/>
               </w:rPr>
               <w:t xml:space="preserve"> </w:t>
             </w:r>
-            <w:r>
-              <w:rPr>
-                <w:lang w:val="en-US"/>
-              </w:rPr>
-              <w:t>(Sales Rep.)</w:t>
-            </w:r>
           </w:p>
           <w:p>
             <w:pPr>
@@ -1274,20 +1924,37 @@
               <w:rPr>
                 <w:lang w:val="en-US"/>
               </w:rPr>
-              <w:t xml:space="preserve"> </w:t>
-            </w:r>
-          </w:p>
-          <w:p>
-            <w:pPr>
-              <w:rPr>
-                <w:lang w:val="en-US"/>
-              </w:rPr>
-            </w:pPr>
-            <w:r>
-              <w:rPr>
-                <w:lang w:val="en-US"/>
-              </w:rPr>
-              <w:t>[p] Have fun!</w:t>
+              <w:t>*</w:t>
+            </w:r>
+            <w:r>
+              <w:rPr>
+                <w:lang w:val="en-US"/>
+              </w:rPr>
+              <w:t>[b]</w:t>
+            </w:r>
+            <w:r>
+              <w:rPr>
+                <w:lang w:val="en-US"/>
+              </w:rPr>
+              <w:t>Tip</w:t>
+            </w:r>
+            <w:r>
+              <w:rPr>
+                <w:lang w:val="en-US"/>
+              </w:rPr>
+              <w:t>[/b]</w:t>
+            </w:r>
+            <w:r>
+              <w:rPr>
+                <w:lang w:val="en-US"/>
+              </w:rPr>
+              <w:t xml:space="preserve">: </w:t>
+            </w:r>
+            <w:r>
+              <w:rPr>
+                <w:lang w:val="en-US"/>
+              </w:rPr>
+              <w:t>Find the file with the name pointed out by the antivirus and delete it.</w:t>
             </w:r>
           </w:p>
           <w:p>
@@ -1335,6 +2002,345 @@
               <w:rPr>
                 <w:lang w:val="en-US"/>
               </w:rPr>
+              <w:t>: Message</w:t>
+            </w:r>
+          </w:p>
+          <w:p>
+            <w:pPr>
+              <w:rPr>
+                <w:lang w:val="en-US"/>
+              </w:rPr>
+            </w:pPr>
+            <w:r>
+              <w:rPr>
+                <w:b/>
+                <w:bCs/>
+                <w:lang w:val="en-US"/>
+              </w:rPr>
+              <w:t>Sender Name</w:t>
+            </w:r>
+            <w:r>
+              <w:rPr>
+                <w:lang w:val="en-US"/>
+              </w:rPr>
+              <w:t xml:space="preserve">: </w:t>
+            </w:r>
+            <w:r>
+              <w:rPr>
+                <w:lang w:val="en-US"/>
+              </w:rPr>
+              <w:t>Orbit Antivirus</w:t>
+            </w:r>
+          </w:p>
+          <w:p>
+            <w:pPr>
+              <w:rPr>
+                <w:lang w:val="en-US"/>
+              </w:rPr>
+            </w:pPr>
+            <w:r>
+              <w:rPr>
+                <w:b/>
+                <w:bCs/>
+                <w:lang w:val="en-US"/>
+              </w:rPr>
+              <w:t>Sender Address</w:t>
+            </w:r>
+            <w:r>
+              <w:rPr>
+                <w:lang w:val="en-US"/>
+              </w:rPr>
+              <w:t xml:space="preserve">: </w:t>
+            </w:r>
+            <w:hyperlink r:id="rId8" w:history="1">
+              <w:r>
+                <w:rPr>
+                  <w:rStyle w:val="Hyperlink"/>
+                  <w:lang w:val="en-US"/>
+                </w:rPr>
+                <w:t>donotreply@orbit.com</w:t>
+              </w:r>
+            </w:hyperlink>
+            <w:r>
+              <w:rPr>
+                <w:lang w:val="en-US"/>
+              </w:rPr>
+              <w:t xml:space="preserve"> </w:t>
+            </w:r>
+          </w:p>
+          <w:p>
+            <w:pPr>
+              <w:rPr>
+                <w:lang w:val="en-US"/>
+              </w:rPr>
+            </w:pPr>
+            <w:r>
+              <w:rPr>
+                <w:b/>
+                <w:bCs/>
+                <w:lang w:val="en-US"/>
+              </w:rPr>
+              <w:t>To Address</w:t>
+            </w:r>
+            <w:r>
+              <w:rPr>
+                <w:lang w:val="en-US"/>
+              </w:rPr>
+              <w:t>: {</w:t>
+            </w:r>
+            <w:proofErr w:type="spellStart"/>
+            <w:r>
+              <w:rPr>
+                <w:lang w:val="en-US"/>
+              </w:rPr>
+              <w:t>player_email</w:t>
+            </w:r>
+            <w:proofErr w:type="spellEnd"/>
+            <w:r>
+              <w:rPr>
+                <w:lang w:val="en-US"/>
+              </w:rPr>
+              <w:t>}</w:t>
+            </w:r>
+          </w:p>
+          <w:p>
+            <w:pPr>
+              <w:rPr>
+                <w:lang w:val="en-US"/>
+              </w:rPr>
+            </w:pPr>
+            <w:r>
+              <w:rPr>
+                <w:b/>
+                <w:bCs/>
+                <w:lang w:val="en-US"/>
+              </w:rPr>
+              <w:t>CC Address</w:t>
+            </w:r>
+            <w:r>
+              <w:rPr>
+                <w:lang w:val="en-US"/>
+              </w:rPr>
+              <w:t xml:space="preserve">: </w:t>
+            </w:r>
+          </w:p>
+          <w:p>
+            <w:pPr>
+              <w:rPr>
+                <w:lang w:val="en-US"/>
+              </w:rPr>
+            </w:pPr>
+            <w:r>
+              <w:rPr>
+                <w:b/>
+                <w:bCs/>
+                <w:lang w:val="en-US"/>
+              </w:rPr>
+              <w:t>Subject</w:t>
+            </w:r>
+            <w:r>
+              <w:rPr>
+                <w:lang w:val="en-US"/>
+              </w:rPr>
+              <w:t xml:space="preserve">: </w:t>
+            </w:r>
+            <w:r>
+              <w:rPr>
+                <w:lang w:val="en-US"/>
+              </w:rPr>
+              <w:t>Orbit Antivirus Activated</w:t>
+            </w:r>
+          </w:p>
+          <w:p>
+            <w:pPr>
+              <w:rPr>
+                <w:b/>
+                <w:bCs/>
+                <w:lang w:val="en-US"/>
+              </w:rPr>
+            </w:pPr>
+          </w:p>
+        </w:tc>
+        <w:tc>
+          <w:tcPr>
+            <w:tcW w:w="5061" w:type="dxa"/>
+            <w:vAlign w:val="center"/>
+          </w:tcPr>
+          <w:p>
+            <w:pPr>
+              <w:rPr>
+                <w:lang w:val="en-US"/>
+              </w:rPr>
+            </w:pPr>
+          </w:p>
+          <w:p>
+            <w:r>
+              <w:rPr>
+                <w:lang w:val="en-US"/>
+              </w:rPr>
+              <w:t>Orbit Antivirus Service is activated on your device: DESKTOP-</w:t>
+            </w:r>
+            <w:r>
+              <w:t>BCKPG7B21L</w:t>
+            </w:r>
+            <w:r>
+              <w:t>.</w:t>
+            </w:r>
+          </w:p>
+          <w:p>
+            <w:r>
+              <w:t xml:space="preserve">[p] </w:t>
+            </w:r>
+          </w:p>
+          <w:p>
+            <w:r>
+              <w:t xml:space="preserve">[p] </w:t>
+            </w:r>
+          </w:p>
+          <w:p>
+            <w:r>
+              <w:t xml:space="preserve">[p] </w:t>
+            </w:r>
+          </w:p>
+          <w:p>
+            <w:r>
+              <w:t>[p]</w:t>
+            </w:r>
+            <w:r>
+              <w:t>[</w:t>
+            </w:r>
+            <w:proofErr w:type="spellStart"/>
+            <w:r>
+              <w:t>center</w:t>
+            </w:r>
+            <w:proofErr w:type="spellEnd"/>
+            <w:r>
+              <w:t>]</w:t>
+            </w:r>
+            <w:r>
+              <w:t xml:space="preserve">Thank you for choosing Orbit </w:t>
+            </w:r>
+            <w:proofErr w:type="gramStart"/>
+            <w:r>
+              <w:t>Antivirus!</w:t>
+            </w:r>
+            <w:r>
+              <w:t>[</w:t>
+            </w:r>
+            <w:proofErr w:type="gramEnd"/>
+            <w:r>
+              <w:t>/</w:t>
+            </w:r>
+            <w:proofErr w:type="spellStart"/>
+            <w:r>
+              <w:t>center</w:t>
+            </w:r>
+            <w:proofErr w:type="spellEnd"/>
+            <w:r>
+              <w:t>]</w:t>
+            </w:r>
+          </w:p>
+          <w:p>
+            <w:r>
+              <w:t xml:space="preserve">[p] </w:t>
+            </w:r>
+          </w:p>
+          <w:p>
+            <w:r>
+              <w:t>[p]</w:t>
+            </w:r>
+            <w:r>
+              <w:t>[</w:t>
+            </w:r>
+            <w:proofErr w:type="spellStart"/>
+            <w:r>
+              <w:t>center</w:t>
+            </w:r>
+            <w:proofErr w:type="spellEnd"/>
+            <w:r>
+              <w:t>]</w:t>
+            </w:r>
+            <w:r>
+              <w:t>[</w:t>
+            </w:r>
+            <w:proofErr w:type="spellStart"/>
+            <w:r>
+              <w:t>img</w:t>
+            </w:r>
+            <w:proofErr w:type="spellEnd"/>
+            <w:r>
+              <w:t>]</w:t>
+            </w:r>
+            <w:r>
+              <w:t>assets/</w:t>
+            </w:r>
+            <w:r>
+              <w:t>orbit_logo.png[/</w:t>
+            </w:r>
+            <w:proofErr w:type="spellStart"/>
+            <w:proofErr w:type="gramStart"/>
+            <w:r>
+              <w:t>img</w:t>
+            </w:r>
+            <w:proofErr w:type="spellEnd"/>
+            <w:r>
+              <w:t>]</w:t>
+            </w:r>
+            <w:r>
+              <w:t>[</w:t>
+            </w:r>
+            <w:proofErr w:type="gramEnd"/>
+            <w:r>
+              <w:t>/</w:t>
+            </w:r>
+            <w:proofErr w:type="spellStart"/>
+            <w:r>
+              <w:t>center</w:t>
+            </w:r>
+            <w:proofErr w:type="spellEnd"/>
+            <w:r>
+              <w:t>]</w:t>
+            </w:r>
+          </w:p>
+          <w:p/>
+        </w:tc>
+      </w:tr>
+      <w:tr>
+        <w:trPr>
+          <w:trHeight w:val="360"/>
+        </w:trPr>
+        <w:tc>
+          <w:tcPr>
+            <w:tcW w:w="3955" w:type="dxa"/>
+            <w:vAlign w:val="center"/>
+          </w:tcPr>
+          <w:p>
+            <w:pPr>
+              <w:rPr>
+                <w:b/>
+                <w:bCs/>
+                <w:lang w:val="en-US"/>
+              </w:rPr>
+            </w:pPr>
+          </w:p>
+          <w:p>
+            <w:pPr>
+              <w:rPr>
+                <w:lang w:val="en-US"/>
+              </w:rPr>
+            </w:pPr>
+            <w:r>
+              <w:rPr>
+                <w:b/>
+                <w:bCs/>
+                <w:lang w:val="en-US"/>
+              </w:rPr>
+              <w:t>Type</w:t>
+            </w:r>
+            <w:r>
+              <w:rPr>
+                <w:lang w:val="en-US"/>
+              </w:rPr>
               <w:t>: Inbound</w:t>
             </w:r>
           </w:p>
@@ -1385,7 +2391,7 @@
               </w:rPr>
               <w:t xml:space="preserve">: </w:t>
             </w:r>
-            <w:hyperlink r:id="rId10" w:history="1">
+            <w:hyperlink r:id="rId9" w:history="1">
               <w:r>
                 <w:rPr>
                   <w:rStyle w:val="Hyperlink"/>
@@ -1595,66 +2601,48 @@
               <w:rPr>
                 <w:lang w:val="en-US"/>
               </w:rPr>
+              <w:t>[p]Ong Wei Zhe</w:t>
+            </w:r>
+          </w:p>
+          <w:p>
+            <w:pPr>
+              <w:rPr>
+                <w:lang w:val="en-US"/>
+              </w:rPr>
+            </w:pPr>
+            <w:r>
+              <w:rPr>
+                <w:lang w:val="en-US"/>
+              </w:rPr>
+              <w:t>[p]Store Owner</w:t>
+            </w:r>
+          </w:p>
+          <w:p>
+            <w:pPr>
+              <w:rPr>
+                <w:lang w:val="en-US"/>
+              </w:rPr>
+            </w:pPr>
+            <w:r>
+              <w:rPr>
+                <w:lang w:val="en-US"/>
+              </w:rPr>
+              <w:t>[p]Little Genius Stationery</w:t>
+            </w:r>
+          </w:p>
+          <w:p>
+            <w:pPr>
+              <w:rPr>
+                <w:rFonts w:ascii="MS Gothic" w:eastAsia="MS Gothic" w:hAnsi="MS Gothic" w:cs="MS Gothic"/>
+                <w:lang w:val="en-US"/>
+              </w:rPr>
+            </w:pPr>
+            <w:r>
+              <w:rPr>
+                <w:lang w:val="en-US"/>
+              </w:rPr>
               <w:t>[p]</w:t>
             </w:r>
-            <w:r>
-              <w:rPr>
-                <w:lang w:val="en-US"/>
-              </w:rPr>
-              <w:t>Ong Wei Zhe</w:t>
-            </w:r>
-          </w:p>
-          <w:p>
-            <w:pPr>
-              <w:rPr>
-                <w:lang w:val="en-US"/>
-              </w:rPr>
-            </w:pPr>
-            <w:r>
-              <w:rPr>
-                <w:lang w:val="en-US"/>
-              </w:rPr>
-              <w:t>[p]</w:t>
-            </w:r>
-            <w:r>
-              <w:rPr>
-                <w:lang w:val="en-US"/>
-              </w:rPr>
-              <w:t>Store Owner</w:t>
-            </w:r>
-          </w:p>
-          <w:p>
-            <w:pPr>
-              <w:rPr>
-                <w:lang w:val="en-US"/>
-              </w:rPr>
-            </w:pPr>
-            <w:r>
-              <w:rPr>
-                <w:lang w:val="en-US"/>
-              </w:rPr>
-              <w:t>[p]</w:t>
-            </w:r>
-            <w:r>
-              <w:rPr>
-                <w:lang w:val="en-US"/>
-              </w:rPr>
-              <w:t>Little Genius Stationery</w:t>
-            </w:r>
-          </w:p>
-          <w:p>
-            <w:pPr>
-              <w:rPr>
-                <w:rFonts w:ascii="MS Gothic" w:eastAsia="MS Gothic" w:hAnsi="MS Gothic" w:cs="MS Gothic"/>
-                <w:lang w:val="en-US"/>
-              </w:rPr>
-            </w:pPr>
-            <w:r>
-              <w:rPr>
-                <w:lang w:val="en-US"/>
-              </w:rPr>
-              <w:t>[p]</w:t>
-            </w:r>
             <w:proofErr w:type="spellStart"/>
             <w:r>
               <w:rPr>
@@ -1664,14 +2652,6 @@
               <w:t>小天才文具店</w:t>
             </w:r>
             <w:proofErr w:type="spellEnd"/>
-          </w:p>
-          <w:p>
-            <w:pPr>
-              <w:rPr>
-                <w:rFonts w:ascii="MS Gothic" w:eastAsia="MS Gothic" w:hAnsi="MS Gothic" w:cs="MS Gothic"/>
-                <w:lang w:val="en-US"/>
-              </w:rPr>
-            </w:pPr>
           </w:p>
           <w:p>
             <w:pPr>
@@ -1694,6 +2674,15 @@
           <w:p>
             <w:pPr>
               <w:rPr>
+                <w:b/>
+                <w:bCs/>
+                <w:lang w:val="en-US"/>
+              </w:rPr>
+            </w:pPr>
+          </w:p>
+          <w:p>
+            <w:pPr>
+              <w:rPr>
                 <w:lang w:val="en-US"/>
               </w:rPr>
             </w:pPr>
@@ -1709,7 +2698,7 @@
               <w:rPr>
                 <w:lang w:val="en-US"/>
               </w:rPr>
-              <w:t>: Outbound</w:t>
+              <w:t>: Message</w:t>
             </w:r>
           </w:p>
           <w:p>
@@ -1732,25 +2721,28 @@
               </w:rPr>
               <w:t xml:space="preserve">: </w:t>
             </w:r>
-            <w:r>
-              <w:rPr>
-                <w:lang w:val="en-US"/>
-              </w:rPr>
-              <w:t>Nazrin</w:t>
-            </w:r>
-          </w:p>
-          <w:p>
-            <w:pPr>
-              <w:rPr>
-                <w:lang w:val="en-US"/>
-              </w:rPr>
-            </w:pPr>
-            <w:r>
-              <w:rPr>
-                <w:b/>
-                <w:bCs/>
-                <w:lang w:val="en-US"/>
-              </w:rPr>
+            <w:proofErr w:type="spellStart"/>
+            <w:r>
+              <w:rPr>
+                <w:lang w:val="en-US"/>
+              </w:rPr>
+              <w:t>Trippo</w:t>
+            </w:r>
+            <w:proofErr w:type="spellEnd"/>
+          </w:p>
+          <w:p>
+            <w:pPr>
+              <w:rPr>
+                <w:lang w:val="en-US"/>
+              </w:rPr>
+            </w:pPr>
+            <w:r>
+              <w:rPr>
+                <w:b/>
+                <w:bCs/>
+                <w:lang w:val="en-US"/>
+              </w:rPr>
+              <w:lastRenderedPageBreak/>
               <w:t>Sender Address</w:t>
             </w:r>
             <w:r>
@@ -1759,1307 +2751,7 @@
               </w:rPr>
               <w:t xml:space="preserve">: </w:t>
             </w:r>
-            <w:hyperlink r:id="rId11" w:history="1">
-              <w:r>
-                <w:rPr>
-                  <w:rStyle w:val="Hyperlink"/>
-                  <w:lang w:val="en-US"/>
-                </w:rPr>
-                <w:t>n</w:t>
-              </w:r>
-              <w:r>
-                <w:rPr>
-                  <w:rStyle w:val="Hyperlink"/>
-                </w:rPr>
-                <w:t>azrin.finance</w:t>
-              </w:r>
-              <w:r>
-                <w:rPr>
-                  <w:rStyle w:val="Hyperlink"/>
-                  <w:lang w:val="en-US"/>
-                </w:rPr>
-                <w:t>@abc.com.my</w:t>
-              </w:r>
-            </w:hyperlink>
-          </w:p>
-          <w:p>
-            <w:pPr>
-              <w:rPr>
-                <w:lang w:val="en-US"/>
-              </w:rPr>
-            </w:pPr>
-            <w:r>
-              <w:rPr>
-                <w:b/>
-                <w:bCs/>
-                <w:lang w:val="en-US"/>
-              </w:rPr>
-              <w:t>To Address</w:t>
-            </w:r>
-            <w:r>
-              <w:rPr>
-                <w:lang w:val="en-US"/>
-              </w:rPr>
-              <w:t>: {</w:t>
-            </w:r>
-            <w:proofErr w:type="spellStart"/>
-            <w:r>
-              <w:rPr>
-                <w:lang w:val="en-US"/>
-              </w:rPr>
-              <w:t>player_email</w:t>
-            </w:r>
-            <w:proofErr w:type="spellEnd"/>
-            <w:r>
-              <w:rPr>
-                <w:lang w:val="en-US"/>
-              </w:rPr>
-              <w:t>}</w:t>
-            </w:r>
-          </w:p>
-          <w:p>
-            <w:pPr>
-              <w:rPr>
-                <w:lang w:val="en-US"/>
-              </w:rPr>
-            </w:pPr>
-            <w:r>
-              <w:rPr>
-                <w:b/>
-                <w:bCs/>
-                <w:lang w:val="en-US"/>
-              </w:rPr>
-              <w:t>CC Address</w:t>
-            </w:r>
-            <w:r>
-              <w:rPr>
-                <w:lang w:val="en-US"/>
-              </w:rPr>
-              <w:t xml:space="preserve">: </w:t>
-            </w:r>
-          </w:p>
-          <w:p>
-            <w:pPr>
-              <w:rPr>
-                <w:lang w:val="en-US"/>
-              </w:rPr>
-            </w:pPr>
-            <w:r>
-              <w:rPr>
-                <w:b/>
-                <w:bCs/>
-                <w:lang w:val="en-US"/>
-              </w:rPr>
-              <w:t>Subject</w:t>
-            </w:r>
-            <w:r>
-              <w:rPr>
-                <w:lang w:val="en-US"/>
-              </w:rPr>
-              <w:t xml:space="preserve">: </w:t>
-            </w:r>
-            <w:r>
-              <w:rPr>
-                <w:lang w:val="en-US"/>
-              </w:rPr>
-              <w:t>Submit Today's Purchase Order</w:t>
-            </w:r>
-          </w:p>
-          <w:p>
-            <w:pPr>
-              <w:rPr>
-                <w:b/>
-                <w:bCs/>
-                <w:lang w:val="en-US"/>
-              </w:rPr>
-            </w:pPr>
-          </w:p>
-        </w:tc>
-        <w:tc>
-          <w:tcPr>
-            <w:tcW w:w="5061" w:type="dxa"/>
-            <w:vAlign w:val="center"/>
-          </w:tcPr>
-          <w:p>
-            <w:pPr>
-              <w:rPr>
-                <w:lang w:val="en-US"/>
-              </w:rPr>
-            </w:pPr>
-          </w:p>
-          <w:p>
-            <w:pPr>
-              <w:rPr>
-                <w:lang w:val="en-US"/>
-              </w:rPr>
-            </w:pPr>
-            <w:r>
-              <w:rPr>
-                <w:lang w:val="en-US"/>
-              </w:rPr>
-              <w:t>Hello and welcome to ABC Stationer</w:t>
-            </w:r>
-            <w:r>
-              <w:rPr>
-                <w:lang w:val="en-US"/>
-              </w:rPr>
-              <w:t>ies</w:t>
-            </w:r>
-            <w:r>
-              <w:rPr>
-                <w:lang w:val="en-US"/>
-              </w:rPr>
-              <w:t>, {</w:t>
-            </w:r>
-            <w:proofErr w:type="spellStart"/>
-            <w:r>
-              <w:rPr>
-                <w:lang w:val="en-US"/>
-              </w:rPr>
-              <w:t>player_name</w:t>
-            </w:r>
-            <w:proofErr w:type="spellEnd"/>
-            <w:r>
-              <w:rPr>
-                <w:lang w:val="en-US"/>
-              </w:rPr>
-              <w:t>}!</w:t>
-            </w:r>
-          </w:p>
-          <w:p>
-            <w:pPr>
-              <w:rPr>
-                <w:lang w:val="en-US"/>
-              </w:rPr>
-            </w:pPr>
-            <w:r>
-              <w:rPr>
-                <w:lang w:val="en-US"/>
-              </w:rPr>
-              <w:t xml:space="preserve">[p] </w:t>
-            </w:r>
-          </w:p>
-          <w:p>
-            <w:pPr>
-              <w:rPr>
-                <w:lang w:val="en-US"/>
-              </w:rPr>
-            </w:pPr>
-            <w:r>
-              <w:rPr>
-                <w:lang w:val="en-US"/>
-              </w:rPr>
-              <w:t>[p]I am Nazrin from Finance Department, and my email address is where you submit Purchase Orders you have received today from our clients.</w:t>
-            </w:r>
-          </w:p>
-          <w:p>
-            <w:pPr>
-              <w:rPr>
-                <w:lang w:val="en-US"/>
-              </w:rPr>
-            </w:pPr>
-            <w:r>
-              <w:rPr>
-                <w:lang w:val="en-US"/>
-              </w:rPr>
-              <w:t xml:space="preserve">[p] </w:t>
-            </w:r>
-          </w:p>
-          <w:p>
-            <w:pPr>
-              <w:rPr>
-                <w:lang w:val="en-US"/>
-              </w:rPr>
-            </w:pPr>
-            <w:r>
-              <w:rPr>
-                <w:lang w:val="en-US"/>
-              </w:rPr>
-              <w:t>[p]</w:t>
-            </w:r>
-            <w:proofErr w:type="gramStart"/>
-            <w:r>
-              <w:rPr>
-                <w:lang w:val="en-US"/>
-              </w:rPr>
-              <w:t>To</w:t>
-            </w:r>
-            <w:proofErr w:type="gramEnd"/>
-            <w:r>
-              <w:rPr>
-                <w:lang w:val="en-US"/>
-              </w:rPr>
-              <w:t xml:space="preserve"> make things easier for you, I'll send you a request email like this every day and you can just drop the files in and click send!</w:t>
-            </w:r>
-          </w:p>
-          <w:p>
-            <w:pPr>
-              <w:rPr>
-                <w:lang w:val="en-US"/>
-              </w:rPr>
-            </w:pPr>
-            <w:r>
-              <w:rPr>
-                <w:lang w:val="en-US"/>
-              </w:rPr>
-              <w:t xml:space="preserve">[p] </w:t>
-            </w:r>
-          </w:p>
-          <w:p>
-            <w:pPr>
-              <w:rPr>
-                <w:lang w:val="en-US"/>
-              </w:rPr>
-            </w:pPr>
-            <w:r>
-              <w:rPr>
-                <w:lang w:val="en-US"/>
-              </w:rPr>
-              <w:t>[p][</w:t>
-            </w:r>
-            <w:proofErr w:type="gramStart"/>
-            <w:r>
-              <w:rPr>
-                <w:lang w:val="en-US"/>
-              </w:rPr>
-              <w:t>b]Make</w:t>
-            </w:r>
-            <w:proofErr w:type="gramEnd"/>
-            <w:r>
-              <w:rPr>
-                <w:lang w:val="en-US"/>
-              </w:rPr>
-              <w:t xml:space="preserve"> sure that you have collected all the Purchase Orders sent to you today before submitting. A missed order is a missed </w:t>
-            </w:r>
-            <w:proofErr w:type="gramStart"/>
-            <w:r>
-              <w:rPr>
-                <w:lang w:val="en-US"/>
-              </w:rPr>
-              <w:t>opportunity![</w:t>
-            </w:r>
-            <w:proofErr w:type="gramEnd"/>
-            <w:r>
-              <w:rPr>
-                <w:lang w:val="en-US"/>
-              </w:rPr>
-              <w:t>/b]</w:t>
-            </w:r>
-          </w:p>
-          <w:p>
-            <w:pPr>
-              <w:rPr>
-                <w:lang w:val="en-US"/>
-              </w:rPr>
-            </w:pPr>
-            <w:r>
-              <w:rPr>
-                <w:lang w:val="en-US"/>
-              </w:rPr>
-              <w:t xml:space="preserve">[p] </w:t>
-            </w:r>
-          </w:p>
-          <w:p>
-            <w:pPr>
-              <w:rPr>
-                <w:lang w:val="en-US"/>
-              </w:rPr>
-            </w:pPr>
-            <w:r>
-              <w:rPr>
-                <w:lang w:val="en-US"/>
-              </w:rPr>
-              <w:t>[p]*</w:t>
-            </w:r>
-            <w:r>
-              <w:rPr>
-                <w:lang w:val="en-US"/>
-              </w:rPr>
-              <w:t>[b]</w:t>
-            </w:r>
-            <w:r>
-              <w:rPr>
-                <w:lang w:val="en-US"/>
-              </w:rPr>
-              <w:t>Tip</w:t>
-            </w:r>
-            <w:r>
-              <w:rPr>
-                <w:lang w:val="en-US"/>
-              </w:rPr>
-              <w:t>[/b]</w:t>
-            </w:r>
-            <w:r>
-              <w:rPr>
-                <w:lang w:val="en-US"/>
-              </w:rPr>
-              <w:t>: Open your File Explorer, drag the file over and drop it in this email. Once you've made sure all files are attached. Click send!</w:t>
-            </w:r>
-          </w:p>
-          <w:p>
-            <w:pPr>
-              <w:rPr>
-                <w:lang w:val="en-US"/>
-              </w:rPr>
-            </w:pPr>
-            <w:r>
-              <w:rPr>
-                <w:lang w:val="en-US"/>
-              </w:rPr>
-              <w:t xml:space="preserve">[p] </w:t>
-            </w:r>
-          </w:p>
-          <w:p>
-            <w:pPr>
-              <w:rPr>
-                <w:lang w:val="en-US"/>
-              </w:rPr>
-            </w:pPr>
-            <w:r>
-              <w:rPr>
-                <w:lang w:val="en-US"/>
-              </w:rPr>
-              <w:t>[p]</w:t>
-            </w:r>
-            <w:r>
-              <w:rPr>
-                <w:lang w:val="en-US"/>
-              </w:rPr>
-              <w:t>*</w:t>
-            </w:r>
-            <w:r>
-              <w:rPr>
-                <w:lang w:val="en-US"/>
-              </w:rPr>
-              <w:t>*[b]</w:t>
-            </w:r>
-            <w:r>
-              <w:rPr>
-                <w:lang w:val="en-US"/>
-              </w:rPr>
-              <w:t>Tip</w:t>
-            </w:r>
-            <w:r>
-              <w:rPr>
-                <w:lang w:val="en-US"/>
-              </w:rPr>
-              <w:t xml:space="preserve">[/b]: </w:t>
-            </w:r>
-            <w:r>
-              <w:rPr>
-                <w:lang w:val="en-US"/>
-              </w:rPr>
-              <w:t>Expected file extensions: .pdf, .docx, .xlsx</w:t>
-            </w:r>
-          </w:p>
-          <w:p>
-            <w:pPr>
-              <w:rPr>
-                <w:lang w:val="en-US"/>
-              </w:rPr>
-            </w:pPr>
-          </w:p>
-        </w:tc>
-      </w:tr>
-      <w:tr>
-        <w:trPr>
-          <w:trHeight w:val="360"/>
-        </w:trPr>
-        <w:tc>
-          <w:tcPr>
-            <w:tcW w:w="3955" w:type="dxa"/>
-            <w:vAlign w:val="center"/>
-          </w:tcPr>
-          <w:p>
-            <w:pPr>
-              <w:rPr>
-                <w:b/>
-                <w:bCs/>
-                <w:lang w:val="en-US"/>
-              </w:rPr>
-            </w:pPr>
-          </w:p>
-          <w:p>
-            <w:pPr>
-              <w:rPr>
-                <w:lang w:val="en-US"/>
-              </w:rPr>
-            </w:pPr>
-            <w:r>
-              <w:rPr>
-                <w:b/>
-                <w:bCs/>
-                <w:lang w:val="en-US"/>
-              </w:rPr>
-              <w:t>Type</w:t>
-            </w:r>
-            <w:r>
-              <w:rPr>
-                <w:lang w:val="en-US"/>
-              </w:rPr>
-              <w:t>: Message</w:t>
-            </w:r>
-          </w:p>
-          <w:p>
-            <w:pPr>
-              <w:rPr>
-                <w:lang w:val="en-US"/>
-              </w:rPr>
-            </w:pPr>
-            <w:r>
-              <w:rPr>
-                <w:b/>
-                <w:bCs/>
-                <w:lang w:val="en-US"/>
-              </w:rPr>
-              <w:t>Sender Name</w:t>
-            </w:r>
-            <w:r>
-              <w:rPr>
-                <w:lang w:val="en-US"/>
-              </w:rPr>
-              <w:t xml:space="preserve">: </w:t>
-            </w:r>
-            <w:r>
-              <w:rPr>
-                <w:lang w:val="en-US"/>
-              </w:rPr>
-              <w:t>Kai Jie</w:t>
-            </w:r>
-          </w:p>
-          <w:p>
-            <w:pPr>
-              <w:rPr>
-                <w:lang w:val="en-US"/>
-              </w:rPr>
-            </w:pPr>
-            <w:r>
-              <w:rPr>
-                <w:b/>
-                <w:bCs/>
-                <w:lang w:val="en-US"/>
-              </w:rPr>
-              <w:t>Sender Address</w:t>
-            </w:r>
-            <w:r>
-              <w:rPr>
-                <w:lang w:val="en-US"/>
-              </w:rPr>
-              <w:t xml:space="preserve">: </w:t>
-            </w:r>
-            <w:hyperlink r:id="rId12" w:history="1">
-              <w:r>
-                <w:rPr>
-                  <w:rStyle w:val="Hyperlink"/>
-                  <w:lang w:val="en-US"/>
-                </w:rPr>
-                <w:t>k</w:t>
-              </w:r>
-              <w:r>
-                <w:rPr>
-                  <w:rStyle w:val="Hyperlink"/>
-                </w:rPr>
-                <w:t>aijie.it</w:t>
-              </w:r>
-              <w:r>
-                <w:rPr>
-                  <w:rStyle w:val="Hyperlink"/>
-                  <w:lang w:val="en-US"/>
-                </w:rPr>
-                <w:t>@abc.com.my</w:t>
-              </w:r>
-            </w:hyperlink>
-          </w:p>
-          <w:p>
-            <w:pPr>
-              <w:rPr>
-                <w:lang w:val="en-US"/>
-              </w:rPr>
-            </w:pPr>
-            <w:r>
-              <w:rPr>
-                <w:b/>
-                <w:bCs/>
-                <w:lang w:val="en-US"/>
-              </w:rPr>
-              <w:t>To Address</w:t>
-            </w:r>
-            <w:r>
-              <w:rPr>
-                <w:lang w:val="en-US"/>
-              </w:rPr>
-              <w:t>: {</w:t>
-            </w:r>
-            <w:proofErr w:type="spellStart"/>
-            <w:r>
-              <w:rPr>
-                <w:lang w:val="en-US"/>
-              </w:rPr>
-              <w:t>player_email</w:t>
-            </w:r>
-            <w:proofErr w:type="spellEnd"/>
-            <w:r>
-              <w:rPr>
-                <w:lang w:val="en-US"/>
-              </w:rPr>
-              <w:t>}</w:t>
-            </w:r>
-          </w:p>
-          <w:p>
-            <w:pPr>
-              <w:rPr>
-                <w:lang w:val="en-US"/>
-              </w:rPr>
-            </w:pPr>
-            <w:r>
-              <w:rPr>
-                <w:b/>
-                <w:bCs/>
-                <w:lang w:val="en-US"/>
-              </w:rPr>
-              <w:t>CC Address</w:t>
-            </w:r>
-            <w:r>
-              <w:rPr>
-                <w:lang w:val="en-US"/>
-              </w:rPr>
-              <w:t xml:space="preserve">: </w:t>
-            </w:r>
-          </w:p>
-          <w:p>
-            <w:pPr>
-              <w:rPr>
-                <w:lang w:val="en-US"/>
-              </w:rPr>
-            </w:pPr>
-            <w:r>
-              <w:rPr>
-                <w:b/>
-                <w:bCs/>
-                <w:lang w:val="en-US"/>
-              </w:rPr>
-              <w:t>Subject</w:t>
-            </w:r>
-            <w:r>
-              <w:rPr>
-                <w:lang w:val="en-US"/>
-              </w:rPr>
-              <w:t xml:space="preserve">: </w:t>
-            </w:r>
-            <w:r>
-              <w:rPr>
-                <w:lang w:val="en-US"/>
-              </w:rPr>
-              <w:t>Antivirus Introduction</w:t>
-            </w:r>
-          </w:p>
-          <w:p>
-            <w:pPr>
-              <w:rPr>
-                <w:b/>
-                <w:bCs/>
-                <w:lang w:val="en-US"/>
-              </w:rPr>
-            </w:pPr>
-          </w:p>
-        </w:tc>
-        <w:tc>
-          <w:tcPr>
-            <w:tcW w:w="5061" w:type="dxa"/>
-            <w:vAlign w:val="center"/>
-          </w:tcPr>
-          <w:p>
-            <w:pPr>
-              <w:rPr>
-                <w:lang w:val="en-US"/>
-              </w:rPr>
-            </w:pPr>
-          </w:p>
-          <w:p>
-            <w:pPr>
-              <w:rPr>
-                <w:lang w:val="en-US"/>
-              </w:rPr>
-            </w:pPr>
-            <w:r>
-              <w:rPr>
-                <w:lang w:val="en-US"/>
-              </w:rPr>
-              <w:t>N</w:t>
-            </w:r>
-            <w:r>
-              <w:t>ice to meet you</w:t>
-            </w:r>
-            <w:r>
-              <w:rPr>
-                <w:lang w:val="en-US"/>
-              </w:rPr>
-              <w:t>, {</w:t>
-            </w:r>
-            <w:proofErr w:type="spellStart"/>
-            <w:r>
-              <w:rPr>
-                <w:lang w:val="en-US"/>
-              </w:rPr>
-              <w:t>player_name</w:t>
-            </w:r>
-            <w:proofErr w:type="spellEnd"/>
-            <w:r>
-              <w:rPr>
-                <w:lang w:val="en-US"/>
-              </w:rPr>
-              <w:t>}!</w:t>
-            </w:r>
-          </w:p>
-          <w:p>
-            <w:pPr>
-              <w:rPr>
-                <w:lang w:val="en-US"/>
-              </w:rPr>
-            </w:pPr>
-            <w:r>
-              <w:rPr>
-                <w:lang w:val="en-US"/>
-              </w:rPr>
-              <w:t xml:space="preserve">[p] </w:t>
-            </w:r>
-          </w:p>
-          <w:p>
-            <w:pPr>
-              <w:rPr>
-                <w:lang w:val="en-US"/>
-              </w:rPr>
-            </w:pPr>
-            <w:r>
-              <w:rPr>
-                <w:lang w:val="en-US"/>
-              </w:rPr>
-              <w:t xml:space="preserve">[p]I am </w:t>
-            </w:r>
-            <w:r>
-              <w:rPr>
-                <w:lang w:val="en-US"/>
-              </w:rPr>
-              <w:t>K</w:t>
-            </w:r>
-            <w:r>
-              <w:t>ai Jie</w:t>
-            </w:r>
-            <w:r>
-              <w:rPr>
-                <w:lang w:val="en-US"/>
-              </w:rPr>
-              <w:t xml:space="preserve"> from IT Department. </w:t>
-            </w:r>
-            <w:r>
-              <w:rPr>
-                <w:lang w:val="en-US"/>
-              </w:rPr>
-              <w:t>Our company has antivirus subscriptions for company devices to help scan and find any suspicious files it comes across.</w:t>
-            </w:r>
-          </w:p>
-          <w:p>
-            <w:pPr>
-              <w:rPr>
-                <w:lang w:val="en-US"/>
-              </w:rPr>
-            </w:pPr>
-            <w:r>
-              <w:rPr>
-                <w:lang w:val="en-US"/>
-              </w:rPr>
-              <w:t xml:space="preserve">[p] </w:t>
-            </w:r>
-          </w:p>
-          <w:p>
-            <w:pPr>
-              <w:rPr>
-                <w:lang w:val="en-US"/>
-              </w:rPr>
-            </w:pPr>
-            <w:r>
-              <w:rPr>
-                <w:lang w:val="en-US"/>
-              </w:rPr>
-              <w:t>[p]</w:t>
-            </w:r>
-            <w:r>
-              <w:rPr>
-                <w:lang w:val="en-US"/>
-              </w:rPr>
-              <w:t xml:space="preserve">Unfortunately the company went with the cheapest option so the </w:t>
-            </w:r>
-            <w:r>
-              <w:rPr>
-                <w:lang w:val="en-US"/>
-              </w:rPr>
-              <w:t>[b]</w:t>
-            </w:r>
-            <w:r>
-              <w:rPr>
-                <w:lang w:val="en-US"/>
-              </w:rPr>
-              <w:t xml:space="preserve">Antivirus only points out 1 file even if there are </w:t>
-            </w:r>
-            <w:proofErr w:type="gramStart"/>
-            <w:r>
-              <w:rPr>
-                <w:lang w:val="en-US"/>
-              </w:rPr>
-              <w:t>multiple.</w:t>
-            </w:r>
-            <w:r>
-              <w:rPr>
-                <w:lang w:val="en-US"/>
-              </w:rPr>
-              <w:t>[</w:t>
-            </w:r>
-            <w:proofErr w:type="gramEnd"/>
-            <w:r>
-              <w:rPr>
-                <w:lang w:val="en-US"/>
-              </w:rPr>
-              <w:t>/b]</w:t>
-            </w:r>
-          </w:p>
-          <w:p>
-            <w:pPr>
-              <w:rPr>
-                <w:lang w:val="en-US"/>
-              </w:rPr>
-            </w:pPr>
-            <w:r>
-              <w:rPr>
-                <w:lang w:val="en-US"/>
-              </w:rPr>
-              <w:t>[p]</w:t>
-            </w:r>
-            <w:r>
-              <w:rPr>
-                <w:lang w:val="en-US"/>
-              </w:rPr>
-              <w:t xml:space="preserve"> </w:t>
-            </w:r>
-          </w:p>
-          <w:p>
-            <w:pPr>
-              <w:rPr>
-                <w:lang w:val="en-US"/>
-              </w:rPr>
-            </w:pPr>
-            <w:r>
-              <w:rPr>
-                <w:lang w:val="en-US"/>
-              </w:rPr>
-              <w:lastRenderedPageBreak/>
-              <w:t>[p]</w:t>
-            </w:r>
-            <w:r>
-              <w:rPr>
-                <w:lang w:val="en-US"/>
-              </w:rPr>
-              <w:t>*</w:t>
-            </w:r>
-            <w:r>
-              <w:rPr>
-                <w:lang w:val="en-US"/>
-              </w:rPr>
-              <w:t>[b]</w:t>
-            </w:r>
-            <w:r>
-              <w:rPr>
-                <w:lang w:val="en-US"/>
-              </w:rPr>
-              <w:t>Tip</w:t>
-            </w:r>
-            <w:r>
-              <w:rPr>
-                <w:lang w:val="en-US"/>
-              </w:rPr>
-              <w:t>[/b]</w:t>
-            </w:r>
-            <w:r>
-              <w:rPr>
-                <w:lang w:val="en-US"/>
-              </w:rPr>
-              <w:t xml:space="preserve">: </w:t>
-            </w:r>
-            <w:r>
-              <w:rPr>
-                <w:lang w:val="en-US"/>
-              </w:rPr>
-              <w:t>Find the file with the name pointed out by the antivirus and delete it.</w:t>
-            </w:r>
-          </w:p>
-          <w:p>
-            <w:pPr>
-              <w:rPr>
-                <w:lang w:val="en-US"/>
-              </w:rPr>
-            </w:pPr>
-            <w:r>
-              <w:rPr>
-                <w:lang w:val="en-US"/>
-              </w:rPr>
-              <w:t xml:space="preserve">[p] </w:t>
-            </w:r>
-          </w:p>
-          <w:p>
-            <w:pPr>
-              <w:rPr>
-                <w:lang w:val="en-US"/>
-              </w:rPr>
-            </w:pPr>
-            <w:r>
-              <w:rPr>
-                <w:lang w:val="en-US"/>
-              </w:rPr>
-              <w:t>[p]Take it easy!</w:t>
-            </w:r>
-          </w:p>
-          <w:p>
-            <w:pPr>
-              <w:rPr>
-                <w:lang w:val="en-US"/>
-              </w:rPr>
-            </w:pPr>
-          </w:p>
-        </w:tc>
-      </w:tr>
-      <w:tr>
-        <w:trPr>
-          <w:trHeight w:val="360"/>
-        </w:trPr>
-        <w:tc>
-          <w:tcPr>
-            <w:tcW w:w="3955" w:type="dxa"/>
-            <w:vAlign w:val="center"/>
-          </w:tcPr>
-          <w:p>
-            <w:pPr>
-              <w:rPr>
-                <w:b/>
-                <w:bCs/>
-                <w:lang w:val="en-US"/>
-              </w:rPr>
-            </w:pPr>
-          </w:p>
-          <w:p>
-            <w:pPr>
-              <w:rPr>
-                <w:lang w:val="en-US"/>
-              </w:rPr>
-            </w:pPr>
-            <w:r>
-              <w:rPr>
-                <w:b/>
-                <w:bCs/>
-                <w:lang w:val="en-US"/>
-              </w:rPr>
-              <w:t>Type</w:t>
-            </w:r>
-            <w:r>
-              <w:rPr>
-                <w:lang w:val="en-US"/>
-              </w:rPr>
-              <w:t>: Message</w:t>
-            </w:r>
-          </w:p>
-          <w:p>
-            <w:pPr>
-              <w:rPr>
-                <w:lang w:val="en-US"/>
-              </w:rPr>
-            </w:pPr>
-            <w:r>
-              <w:rPr>
-                <w:b/>
-                <w:bCs/>
-                <w:lang w:val="en-US"/>
-              </w:rPr>
-              <w:t>Sender Name</w:t>
-            </w:r>
-            <w:r>
-              <w:rPr>
-                <w:lang w:val="en-US"/>
-              </w:rPr>
-              <w:t xml:space="preserve">: </w:t>
-            </w:r>
-            <w:r>
-              <w:rPr>
-                <w:lang w:val="en-US"/>
-              </w:rPr>
-              <w:t>Orbit Antivirus</w:t>
-            </w:r>
-          </w:p>
-          <w:p>
-            <w:pPr>
-              <w:rPr>
-                <w:lang w:val="en-US"/>
-              </w:rPr>
-            </w:pPr>
-            <w:r>
-              <w:rPr>
-                <w:b/>
-                <w:bCs/>
-                <w:lang w:val="en-US"/>
-              </w:rPr>
-              <w:t>Sender Address</w:t>
-            </w:r>
-            <w:r>
-              <w:rPr>
-                <w:lang w:val="en-US"/>
-              </w:rPr>
-              <w:t xml:space="preserve">: </w:t>
-            </w:r>
-            <w:hyperlink r:id="rId13" w:history="1">
-              <w:r>
-                <w:rPr>
-                  <w:rStyle w:val="Hyperlink"/>
-                  <w:lang w:val="en-US"/>
-                </w:rPr>
-                <w:t>donotreply@orbit.com</w:t>
-              </w:r>
-            </w:hyperlink>
-            <w:r>
-              <w:rPr>
-                <w:lang w:val="en-US"/>
-              </w:rPr>
-              <w:t xml:space="preserve"> </w:t>
-            </w:r>
-          </w:p>
-          <w:p>
-            <w:pPr>
-              <w:rPr>
-                <w:lang w:val="en-US"/>
-              </w:rPr>
-            </w:pPr>
-            <w:r>
-              <w:rPr>
-                <w:b/>
-                <w:bCs/>
-                <w:lang w:val="en-US"/>
-              </w:rPr>
-              <w:t>To Address</w:t>
-            </w:r>
-            <w:r>
-              <w:rPr>
-                <w:lang w:val="en-US"/>
-              </w:rPr>
-              <w:t>: {</w:t>
-            </w:r>
-            <w:proofErr w:type="spellStart"/>
-            <w:r>
-              <w:rPr>
-                <w:lang w:val="en-US"/>
-              </w:rPr>
-              <w:t>player_email</w:t>
-            </w:r>
-            <w:proofErr w:type="spellEnd"/>
-            <w:r>
-              <w:rPr>
-                <w:lang w:val="en-US"/>
-              </w:rPr>
-              <w:t>}</w:t>
-            </w:r>
-          </w:p>
-          <w:p>
-            <w:pPr>
-              <w:rPr>
-                <w:lang w:val="en-US"/>
-              </w:rPr>
-            </w:pPr>
-            <w:r>
-              <w:rPr>
-                <w:b/>
-                <w:bCs/>
-                <w:lang w:val="en-US"/>
-              </w:rPr>
-              <w:t>CC Address</w:t>
-            </w:r>
-            <w:r>
-              <w:rPr>
-                <w:lang w:val="en-US"/>
-              </w:rPr>
-              <w:t xml:space="preserve">: </w:t>
-            </w:r>
-          </w:p>
-          <w:p>
-            <w:pPr>
-              <w:rPr>
-                <w:lang w:val="en-US"/>
-              </w:rPr>
-            </w:pPr>
-            <w:r>
-              <w:rPr>
-                <w:b/>
-                <w:bCs/>
-                <w:lang w:val="en-US"/>
-              </w:rPr>
-              <w:t>Subject</w:t>
-            </w:r>
-            <w:r>
-              <w:rPr>
-                <w:lang w:val="en-US"/>
-              </w:rPr>
-              <w:t xml:space="preserve">: </w:t>
-            </w:r>
-            <w:r>
-              <w:rPr>
-                <w:lang w:val="en-US"/>
-              </w:rPr>
-              <w:t>Orbit Antivirus Activated</w:t>
-            </w:r>
-          </w:p>
-          <w:p>
-            <w:pPr>
-              <w:rPr>
-                <w:b/>
-                <w:bCs/>
-                <w:lang w:val="en-US"/>
-              </w:rPr>
-            </w:pPr>
-          </w:p>
-        </w:tc>
-        <w:tc>
-          <w:tcPr>
-            <w:tcW w:w="5061" w:type="dxa"/>
-            <w:vAlign w:val="center"/>
-          </w:tcPr>
-          <w:p>
-            <w:pPr>
-              <w:rPr>
-                <w:lang w:val="en-US"/>
-              </w:rPr>
-            </w:pPr>
-          </w:p>
-          <w:p>
-            <w:r>
-              <w:rPr>
-                <w:lang w:val="en-US"/>
-              </w:rPr>
-              <w:t>Orbit Antivirus Service is activated on your device: DESKTOP-</w:t>
-            </w:r>
-            <w:r>
-              <w:t>BCKPG7B21L</w:t>
-            </w:r>
-            <w:r>
-              <w:t>.</w:t>
-            </w:r>
-          </w:p>
-          <w:p>
-            <w:r>
-              <w:t xml:space="preserve">[p] </w:t>
-            </w:r>
-          </w:p>
-          <w:p>
-            <w:r>
-              <w:t xml:space="preserve">[p] </w:t>
-            </w:r>
-          </w:p>
-          <w:p>
-            <w:r>
-              <w:t xml:space="preserve">[p] </w:t>
-            </w:r>
-          </w:p>
-          <w:p>
-            <w:r>
-              <w:t>[p]</w:t>
-            </w:r>
-            <w:r>
-              <w:t>[</w:t>
-            </w:r>
-            <w:proofErr w:type="spellStart"/>
-            <w:r>
-              <w:t>center</w:t>
-            </w:r>
-            <w:proofErr w:type="spellEnd"/>
-            <w:r>
-              <w:t>]</w:t>
-            </w:r>
-            <w:r>
-              <w:t xml:space="preserve">Thank you for choosing Orbit </w:t>
-            </w:r>
-            <w:proofErr w:type="gramStart"/>
-            <w:r>
-              <w:t>Antivirus!</w:t>
-            </w:r>
-            <w:r>
-              <w:t>[</w:t>
-            </w:r>
-            <w:proofErr w:type="gramEnd"/>
-            <w:r>
-              <w:t>/</w:t>
-            </w:r>
-            <w:proofErr w:type="spellStart"/>
-            <w:r>
-              <w:t>center</w:t>
-            </w:r>
-            <w:proofErr w:type="spellEnd"/>
-            <w:r>
-              <w:t>]</w:t>
-            </w:r>
-          </w:p>
-          <w:p>
-            <w:r>
-              <w:t xml:space="preserve">[p] </w:t>
-            </w:r>
-          </w:p>
-          <w:p>
-            <w:r>
-              <w:t>[p]</w:t>
-            </w:r>
-            <w:r>
-              <w:t>[</w:t>
-            </w:r>
-            <w:proofErr w:type="spellStart"/>
-            <w:r>
-              <w:t>center</w:t>
-            </w:r>
-            <w:proofErr w:type="spellEnd"/>
-            <w:r>
-              <w:t>]</w:t>
-            </w:r>
-            <w:r>
-              <w:t>[</w:t>
-            </w:r>
-            <w:proofErr w:type="spellStart"/>
-            <w:r>
-              <w:t>img</w:t>
-            </w:r>
-            <w:proofErr w:type="spellEnd"/>
-            <w:r>
-              <w:t>]</w:t>
-            </w:r>
-            <w:r>
-              <w:t>assets/</w:t>
-            </w:r>
-            <w:r>
-              <w:t>orbit_logo.png[/</w:t>
-            </w:r>
-            <w:proofErr w:type="spellStart"/>
-            <w:proofErr w:type="gramStart"/>
-            <w:r>
-              <w:t>img</w:t>
-            </w:r>
-            <w:proofErr w:type="spellEnd"/>
-            <w:r>
-              <w:t>]</w:t>
-            </w:r>
-            <w:r>
-              <w:t>[</w:t>
-            </w:r>
-            <w:proofErr w:type="gramEnd"/>
-            <w:r>
-              <w:t>/</w:t>
-            </w:r>
-            <w:proofErr w:type="spellStart"/>
-            <w:r>
-              <w:t>center</w:t>
-            </w:r>
-            <w:proofErr w:type="spellEnd"/>
-            <w:r>
-              <w:t>]</w:t>
-            </w:r>
-          </w:p>
-          <w:p/>
-        </w:tc>
-      </w:tr>
-      <w:tr>
-        <w:trPr>
-          <w:trHeight w:val="360"/>
-        </w:trPr>
-        <w:tc>
-          <w:tcPr>
-            <w:tcW w:w="3955" w:type="dxa"/>
-            <w:vAlign w:val="center"/>
-          </w:tcPr>
-          <w:p>
-            <w:pPr>
-              <w:rPr>
-                <w:b/>
-                <w:bCs/>
-                <w:lang w:val="en-US"/>
-              </w:rPr>
-            </w:pPr>
-          </w:p>
-          <w:p>
-            <w:pPr>
-              <w:rPr>
-                <w:lang w:val="en-US"/>
-              </w:rPr>
-            </w:pPr>
-            <w:r>
-              <w:rPr>
-                <w:b/>
-                <w:bCs/>
-                <w:lang w:val="en-US"/>
-              </w:rPr>
-              <w:t>Type</w:t>
-            </w:r>
-            <w:r>
-              <w:rPr>
-                <w:lang w:val="en-US"/>
-              </w:rPr>
-              <w:t>: Message</w:t>
-            </w:r>
-          </w:p>
-          <w:p>
-            <w:pPr>
-              <w:rPr>
-                <w:lang w:val="en-US"/>
-              </w:rPr>
-            </w:pPr>
-            <w:r>
-              <w:rPr>
-                <w:b/>
-                <w:bCs/>
-                <w:lang w:val="en-US"/>
-              </w:rPr>
-              <w:t>Sender Name</w:t>
-            </w:r>
-            <w:r>
-              <w:rPr>
-                <w:lang w:val="en-US"/>
-              </w:rPr>
-              <w:t xml:space="preserve">: </w:t>
-            </w:r>
-            <w:proofErr w:type="spellStart"/>
-            <w:r>
-              <w:rPr>
-                <w:lang w:val="en-US"/>
-              </w:rPr>
-              <w:t>Tripp</w:t>
-            </w:r>
-            <w:r>
-              <w:rPr>
-                <w:lang w:val="en-US"/>
-              </w:rPr>
-              <w:t>o</w:t>
-            </w:r>
-            <w:proofErr w:type="spellEnd"/>
-          </w:p>
-          <w:p>
-            <w:pPr>
-              <w:rPr>
-                <w:lang w:val="en-US"/>
-              </w:rPr>
-            </w:pPr>
-            <w:r>
-              <w:rPr>
-                <w:b/>
-                <w:bCs/>
-                <w:lang w:val="en-US"/>
-              </w:rPr>
-              <w:t>Sender Address</w:t>
-            </w:r>
-            <w:r>
-              <w:rPr>
-                <w:lang w:val="en-US"/>
-              </w:rPr>
-              <w:t xml:space="preserve">: </w:t>
-            </w:r>
-            <w:hyperlink r:id="rId14" w:history="1">
+            <w:hyperlink r:id="rId10" w:history="1">
               <w:r>
                 <w:rPr>
                   <w:rStyle w:val="Hyperlink"/>
@@ -3203,6 +2895,7 @@
           </w:tcPr>
           <w:p>
             <w:r>
+              <w:lastRenderedPageBreak/>
               <w:t>Join us and enjoy the wonderful offers for a trip you'll definitely remember!</w:t>
             </w:r>
           </w:p>
@@ -3213,10 +2906,24 @@
           </w:p>
           <w:p>
             <w:r>
-              <w:t>[p][</w:t>
+              <w:t>[p]</w:t>
+            </w:r>
+            <w:r>
+              <w:t>[</w:t>
             </w:r>
             <w:proofErr w:type="spellStart"/>
             <w:r>
+              <w:t>center</w:t>
+            </w:r>
+            <w:proofErr w:type="spellEnd"/>
+            <w:r>
+              <w:t>]</w:t>
+            </w:r>
+            <w:r>
+              <w:t>[</w:t>
+            </w:r>
+            <w:proofErr w:type="spellStart"/>
+            <w:r>
               <w:t>img</w:t>
             </w:r>
             <w:proofErr w:type="spellEnd"/>
@@ -3224,20 +2931,30 @@
               <w:t>]</w:t>
             </w:r>
             <w:r>
-              <w:t>tripp</w:t>
-            </w:r>
-            <w:r>
-              <w:t>o</w:t>
-            </w:r>
-            <w:r>
-              <w:t>_ad.jpg</w:t>
-            </w:r>
-            <w:r>
-              <w:t>[/</w:t>
+              <w:t>assets/adware/</w:t>
+            </w:r>
+            <w:r>
+              <w:t>trippo_ad.jpg[/</w:t>
             </w:r>
             <w:proofErr w:type="spellStart"/>
+            <w:proofErr w:type="gramStart"/>
             <w:r>
               <w:t>img</w:t>
+            </w:r>
+            <w:proofErr w:type="spellEnd"/>
+            <w:r>
+              <w:t>]</w:t>
+            </w:r>
+            <w:r>
+              <w:t>[</w:t>
+            </w:r>
+            <w:proofErr w:type="gramEnd"/>
+            <w:r>
+              <w:t>/</w:t>
+            </w:r>
+            <w:proofErr w:type="spellStart"/>
+            <w:r>
+              <w:t>center</w:t>
             </w:r>
             <w:proofErr w:type="spellEnd"/>
             <w:r>
@@ -3332,7 +3049,7 @@
               </w:rPr>
               <w:t xml:space="preserve">: </w:t>
             </w:r>
-            <w:hyperlink r:id="rId15" w:history="1">
+            <w:hyperlink r:id="rId11" w:history="1">
               <w:r>
                 <w:rPr>
                   <w:rStyle w:val="Hyperlink"/>
@@ -3441,13 +3158,7 @@
               <w:rPr>
                 <w:lang w:val="en-US"/>
               </w:rPr>
-              <w:t>Purchase Order for Stationeries</w:t>
-            </w:r>
-            <w:r>
-              <w:rPr>
-                <w:lang w:val="en-US"/>
-              </w:rPr>
-              <w:t xml:space="preserve"> - Happy Mini Market</w:t>
+              <w:t>Purchase Order for Stationeries - Happy Mini Market</w:t>
             </w:r>
           </w:p>
           <w:p>
@@ -3475,13 +3186,7 @@
               <w:rPr>
                 <w:lang w:val="en-US"/>
               </w:rPr>
-              <w:t xml:space="preserve">Good </w:t>
-            </w:r>
-            <w:r>
-              <w:rPr>
-                <w:lang w:val="en-US"/>
-              </w:rPr>
-              <w:t>day</w:t>
+              <w:t>Good day</w:t>
             </w:r>
             <w:r>
               <w:rPr>
@@ -3576,38 +3281,20 @@
               <w:rPr>
                 <w:lang w:val="en-US"/>
               </w:rPr>
-              <w:t>[p]</w:t>
-            </w:r>
-            <w:r>
-              <w:rPr>
-                <w:lang w:val="en-US"/>
-              </w:rPr>
-              <w:t xml:space="preserve">Happy </w:t>
-            </w:r>
-            <w:r>
-              <w:rPr>
-                <w:lang w:val="en-US"/>
-              </w:rPr>
-              <w:t>Mini Market</w:t>
-            </w:r>
-          </w:p>
-          <w:p>
-            <w:pPr>
-              <w:rPr>
-                <w:lang w:val="en-US"/>
-              </w:rPr>
-            </w:pPr>
-            <w:r>
-              <w:rPr>
-                <w:lang w:val="en-US"/>
-              </w:rPr>
-              <w:t>[p]</w:t>
-            </w:r>
-            <w:r>
-              <w:rPr>
-                <w:lang w:val="en-US"/>
-              </w:rPr>
-              <w:t>Owner</w:t>
+              <w:t>[p]Happy Mini Market</w:t>
+            </w:r>
+          </w:p>
+          <w:p>
+            <w:pPr>
+              <w:rPr>
+                <w:lang w:val="en-US"/>
+              </w:rPr>
+            </w:pPr>
+            <w:r>
+              <w:rPr>
+                <w:lang w:val="en-US"/>
+              </w:rPr>
+              <w:t>[p]Owner</w:t>
             </w:r>
           </w:p>
           <w:p/>
@@ -3699,13 +3386,13 @@
               </w:rPr>
               <w:t xml:space="preserve">: </w:t>
             </w:r>
-            <w:hyperlink r:id="rId16" w:history="1">
+            <w:hyperlink r:id="rId12" w:history="1">
               <w:r>
                 <w:rPr>
                   <w:rStyle w:val="Hyperlink"/>
                   <w:lang w:val="en-US"/>
                 </w:rPr>
-                <w:t>dailynews@cnd.com.my</w:t>
+                <w:t>dailynews@cnd.com</w:t>
               </w:r>
             </w:hyperlink>
             <w:r>
@@ -3714,6 +3401,12 @@
               </w:rPr>
               <w:t xml:space="preserve">  </w:t>
             </w:r>
+            <w:r>
+              <w:rPr>
+                <w:lang w:val="en-US"/>
+              </w:rPr>
+              <w:t xml:space="preserve"> </w:t>
+            </w:r>
           </w:p>
           <w:p>
             <w:pPr>
@@ -3795,13 +3488,7 @@
               <w:rPr>
                 <w:lang w:val="en-US"/>
               </w:rPr>
-              <w:t>Phishing Emails and How to Spot Them</w:t>
-            </w:r>
-            <w:r>
-              <w:rPr>
-                <w:lang w:val="en-US"/>
-              </w:rPr>
-              <w:t>!</w:t>
+              <w:t>Phishing Emails and How to Spot Them!</w:t>
             </w:r>
           </w:p>
           <w:p>
@@ -3893,7 +3580,44 @@
               <w:rPr>
                 <w:lang w:val="en-US"/>
               </w:rPr>
-              <w:t>- Feel urgent or threatening</w:t>
+              <w:t xml:space="preserve">- </w:t>
+            </w:r>
+            <w:r>
+              <w:rPr>
+                <w:lang w:val="en-US"/>
+              </w:rPr>
+              <w:t>Sounds</w:t>
+            </w:r>
+            <w:r>
+              <w:rPr>
+                <w:lang w:val="en-US"/>
+              </w:rPr>
+              <w:t xml:space="preserve"> urgent or threatening</w:t>
+            </w:r>
+            <w:r>
+              <w:rPr>
+                <w:lang w:val="en-US"/>
+              </w:rPr>
+              <w:t>.</w:t>
+            </w:r>
+          </w:p>
+          <w:p>
+            <w:pPr>
+              <w:rPr>
+                <w:lang w:val="en-US"/>
+              </w:rPr>
+            </w:pPr>
+            <w:r>
+              <w:rPr>
+                <w:lang w:val="en-US"/>
+              </w:rPr>
+              <w:t>[p] - Have poor grammar (but not always)</w:t>
+            </w:r>
+            <w:r>
+              <w:rPr>
+                <w:lang w:val="en-US"/>
+              </w:rPr>
+              <w:t>.</w:t>
             </w:r>
           </w:p>
           <w:p>
@@ -3918,13 +3642,32 @@
               <w:rPr>
                 <w:lang w:val="en-US"/>
               </w:rPr>
-              <w:t>- Have poor grammar</w:t>
-            </w:r>
-            <w:r>
-              <w:rPr>
-                <w:lang w:val="en-US"/>
-              </w:rPr>
-              <w:t xml:space="preserve"> (but not always!)</w:t>
+              <w:t xml:space="preserve">- Include </w:t>
+            </w:r>
+            <w:r>
+              <w:rPr>
+                <w:lang w:val="en-US"/>
+              </w:rPr>
+              <w:t>attachments with extensions that does not match (Example: Invoice.pdf.exe &lt;- this is an .exe file, not .pdf)</w:t>
+            </w:r>
+          </w:p>
+          <w:p>
+            <w:pPr>
+              <w:rPr>
+                <w:lang w:val="en-US"/>
+              </w:rPr>
+            </w:pPr>
+            <w:r>
+              <w:rPr>
+                <w:lang w:val="en-US"/>
+              </w:rPr>
+              <w:t xml:space="preserve">[p] </w:t>
+            </w:r>
+            <w:r>
+              <w:rPr>
+                <w:lang w:val="en-US"/>
+              </w:rPr>
+              <w:t>*add images</w:t>
             </w:r>
           </w:p>
           <w:p>
@@ -3945,47 +3688,43 @@
               </w:rPr>
               <w:t xml:space="preserve"> </w:t>
             </w:r>
-            <w:r>
-              <w:rPr>
-                <w:lang w:val="en-US"/>
-              </w:rPr>
-              <w:t xml:space="preserve">- Include </w:t>
-            </w:r>
-            <w:r>
-              <w:rPr>
-                <w:lang w:val="en-US"/>
-              </w:rPr>
-              <w:t>attachments with extensions that does not match (</w:t>
-            </w:r>
-            <w:r>
-              <w:rPr>
-                <w:lang w:val="en-US"/>
-              </w:rPr>
-              <w:t xml:space="preserve">Example: </w:t>
-            </w:r>
-            <w:r>
-              <w:rPr>
-                <w:lang w:val="en-US"/>
-              </w:rPr>
-              <w:t>Invoice.pdf.exe</w:t>
-            </w:r>
-            <w:r>
-              <w:rPr>
-                <w:lang w:val="en-US"/>
-              </w:rPr>
-              <w:t xml:space="preserve"> &lt;- this is an .exe</w:t>
-            </w:r>
-            <w:r>
-              <w:rPr>
-                <w:lang w:val="en-US"/>
-              </w:rPr>
-              <w:t xml:space="preserve"> file</w:t>
-            </w:r>
-            <w:r>
-              <w:rPr>
-                <w:lang w:val="en-US"/>
-              </w:rPr>
-              <w:t>,</w:t>
+          </w:p>
+          <w:p>
+            <w:pPr>
+              <w:rPr>
+                <w:lang w:val="en-US"/>
+              </w:rPr>
+            </w:pPr>
+            <w:r>
+              <w:rPr>
+                <w:lang w:val="en-US"/>
+              </w:rPr>
+              <w:t>[p]</w:t>
+            </w:r>
+            <w:r>
+              <w:rPr>
+                <w:lang w:val="en-US"/>
+              </w:rPr>
+              <w:t>Report any suspicious emails you come across</w:t>
+            </w:r>
+            <w:r>
+              <w:rPr>
+                <w:lang w:val="en-US"/>
+              </w:rPr>
+              <w:t xml:space="preserve"> and do not download or send any files.</w:t>
+            </w:r>
+          </w:p>
+          <w:p>
+            <w:pPr>
+              <w:rPr>
+                <w:lang w:val="en-US"/>
+              </w:rPr>
+            </w:pPr>
+            <w:r>
+              <w:rPr>
+                <w:lang w:val="en-US"/>
+              </w:rPr>
+              <w:t>[p]</w:t>
             </w:r>
             <w:r>
               <w:rPr>
@@ -3993,87 +3732,17 @@
               </w:rPr>
               <w:t xml:space="preserve"> </w:t>
             </w:r>
-            <w:r>
-              <w:rPr>
-                <w:lang w:val="en-US"/>
-              </w:rPr>
-              <w:t>not .pdf</w:t>
-            </w:r>
-            <w:r>
-              <w:rPr>
-                <w:lang w:val="en-US"/>
-              </w:rPr>
-              <w:t>)</w:t>
-            </w:r>
-            <w:r>
-              <w:rPr>
-                <w:lang w:val="en-US"/>
-              </w:rPr>
-              <w:t xml:space="preserve"> *add images</w:t>
-            </w:r>
-          </w:p>
-          <w:p>
-            <w:pPr>
-              <w:rPr>
-                <w:lang w:val="en-US"/>
-              </w:rPr>
-            </w:pPr>
-            <w:r>
-              <w:rPr>
-                <w:lang w:val="en-US"/>
-              </w:rPr>
-              <w:t>[p]</w:t>
-            </w:r>
-            <w:r>
-              <w:rPr>
-                <w:lang w:val="en-US"/>
-              </w:rPr>
-              <w:t xml:space="preserve"> </w:t>
-            </w:r>
-          </w:p>
-          <w:p>
-            <w:pPr>
-              <w:rPr>
-                <w:lang w:val="en-US"/>
-              </w:rPr>
-            </w:pPr>
-            <w:r>
-              <w:rPr>
-                <w:lang w:val="en-US"/>
-              </w:rPr>
-              <w:t>[p]If you’re unsure, report the email and do not download or send any files.</w:t>
-            </w:r>
-          </w:p>
-          <w:p>
-            <w:pPr>
-              <w:rPr>
-                <w:lang w:val="en-US"/>
-              </w:rPr>
-            </w:pPr>
-            <w:r>
-              <w:rPr>
-                <w:lang w:val="en-US"/>
-              </w:rPr>
-              <w:t>[p]</w:t>
-            </w:r>
-            <w:r>
-              <w:rPr>
-                <w:lang w:val="en-US"/>
-              </w:rPr>
-              <w:t xml:space="preserve"> </w:t>
-            </w:r>
-          </w:p>
-          <w:p>
-            <w:pPr>
-              <w:rPr>
-                <w:lang w:val="en-US"/>
-              </w:rPr>
-            </w:pPr>
-            <w:r>
-              <w:rPr>
-                <w:lang w:val="en-US"/>
-              </w:rPr>
-              <w:lastRenderedPageBreak/>
+          </w:p>
+          <w:p>
+            <w:pPr>
+              <w:rPr>
+                <w:lang w:val="en-US"/>
+              </w:rPr>
+            </w:pPr>
+            <w:r>
+              <w:rPr>
+                <w:lang w:val="en-US"/>
+              </w:rPr>
               <w:t>[p]Stay alert and stay safe!</w:t>
             </w:r>
           </w:p>
@@ -4145,12 +3814,11 @@
               </w:rPr>
               <w:t xml:space="preserve">: </w:t>
             </w:r>
-            <w:proofErr w:type="spellStart"/>
-            <w:r>
-              <w:rPr>
-                <w:lang w:val="en-US"/>
-              </w:rPr>
-              <w:t>Johnn</w:t>
+            <w:r>
+              <w:rPr>
+                <w:lang w:val="en-US"/>
+              </w:rPr>
+              <w:t>John</w:t>
             </w:r>
             <w:r>
               <w:rPr>
@@ -4158,7 +3826,6 @@
               </w:rPr>
               <w:t>n</w:t>
             </w:r>
-            <w:proofErr w:type="spellEnd"/>
           </w:p>
           <w:p>
             <w:pPr>
@@ -4180,7 +3847,7 @@
               </w:rPr>
               <w:t xml:space="preserve">: </w:t>
             </w:r>
-            <w:hyperlink r:id="rId17" w:history="1">
+            <w:hyperlink r:id="rId13" w:history="1">
               <w:r>
                 <w:rPr>
                   <w:rStyle w:val="Hyperlink"/>
@@ -4325,49 +3992,7 @@
               <w:rPr>
                 <w:lang w:val="en-US"/>
               </w:rPr>
-              <w:t>H</w:t>
-            </w:r>
-            <w:r>
-              <w:rPr>
-                <w:lang w:val="en-US"/>
-              </w:rPr>
-              <w:t>ello</w:t>
-            </w:r>
-            <w:r>
-              <w:rPr>
-                <w:lang w:val="en-US"/>
-              </w:rPr>
-              <w:t>,</w:t>
-            </w:r>
-            <w:r>
-              <w:rPr>
-                <w:lang w:val="en-US"/>
-              </w:rPr>
-              <w:t xml:space="preserve"> </w:t>
-            </w:r>
-            <w:r>
-              <w:rPr>
-                <w:lang w:val="en-US"/>
-              </w:rPr>
-              <w:t xml:space="preserve">I </w:t>
-            </w:r>
-            <w:r>
-              <w:rPr>
-                <w:lang w:val="en-US"/>
-              </w:rPr>
-              <w:t>want to order</w:t>
-            </w:r>
-            <w:r>
-              <w:rPr>
-                <w:lang w:val="en-US"/>
-              </w:rPr>
-              <w:t xml:space="preserve"> some</w:t>
-            </w:r>
-            <w:r>
-              <w:rPr>
-                <w:lang w:val="en-US"/>
-              </w:rPr>
-              <w:t xml:space="preserve"> </w:t>
+              <w:t xml:space="preserve">Hello, I want to order some </w:t>
             </w:r>
             <w:proofErr w:type="spellStart"/>
             <w:r>
@@ -4381,39 +4006,51 @@
               <w:rPr>
                 <w:lang w:val="en-US"/>
               </w:rPr>
-              <w:t xml:space="preserve"> for my shop</w:t>
+              <w:t xml:space="preserve"> for my shop.</w:t>
+            </w:r>
+          </w:p>
+          <w:p>
+            <w:pPr>
+              <w:rPr>
+                <w:lang w:val="en-US"/>
+              </w:rPr>
+            </w:pPr>
+            <w:r>
+              <w:rPr>
+                <w:lang w:val="en-US"/>
+              </w:rPr>
+              <w:t xml:space="preserve">[p] </w:t>
+            </w:r>
+          </w:p>
+          <w:p>
+            <w:pPr>
+              <w:rPr>
+                <w:lang w:val="en-US"/>
+              </w:rPr>
+            </w:pPr>
+            <w:r>
+              <w:rPr>
+                <w:lang w:val="en-US"/>
+              </w:rPr>
+              <w:t>[p]PO is attache</w:t>
+            </w:r>
+            <w:r>
+              <w:rPr>
+                <w:lang w:val="en-US"/>
+              </w:rPr>
+              <w:t>d</w:t>
+            </w:r>
+            <w:r>
+              <w:rPr>
+                <w:lang w:val="en-US"/>
+              </w:rPr>
+              <w:t>, please download to view</w:t>
             </w:r>
             <w:r>
               <w:rPr>
                 <w:lang w:val="en-US"/>
               </w:rPr>
               <w:t>.</w:t>
-            </w:r>
-          </w:p>
-          <w:p>
-            <w:pPr>
-              <w:rPr>
-                <w:lang w:val="en-US"/>
-              </w:rPr>
-            </w:pPr>
-            <w:r>
-              <w:rPr>
-                <w:lang w:val="en-US"/>
-              </w:rPr>
-              <w:t xml:space="preserve">[p] </w:t>
-            </w:r>
-          </w:p>
-          <w:p>
-            <w:pPr>
-              <w:rPr>
-                <w:lang w:val="en-US"/>
-              </w:rPr>
-            </w:pPr>
-            <w:r>
-              <w:rPr>
-                <w:lang w:val="en-US"/>
-              </w:rPr>
-              <w:t>[p]PO is attached in this email.</w:t>
             </w:r>
           </w:p>
           <w:p>
@@ -4507,7 +4144,7 @@
               <w:rPr>
                 <w:lang w:val="en-US"/>
               </w:rPr>
-              <w:t>Dallas</w:t>
+              <w:t>Mike</w:t>
             </w:r>
           </w:p>
           <w:p>
@@ -4530,19 +4167,19 @@
               </w:rPr>
               <w:t xml:space="preserve">: </w:t>
             </w:r>
-            <w:hyperlink r:id="rId18" w:history="1">
+            <w:hyperlink r:id="rId14" w:history="1">
               <w:r>
                 <w:rPr>
                   <w:rStyle w:val="Hyperlink"/>
                   <w:lang w:val="en-US"/>
                 </w:rPr>
-                <w:t>d</w:t>
+                <w:t>m</w:t>
               </w:r>
               <w:r>
                 <w:rPr>
                   <w:rStyle w:val="Hyperlink"/>
                 </w:rPr>
-                <w:t>allas@abc.com.my</w:t>
+                <w:t>ike@abc.com.my</w:t>
               </w:r>
             </w:hyperlink>
             <w:r>
@@ -4599,6 +4236,7 @@
                 <w:bCs/>
                 <w:lang w:val="en-US"/>
               </w:rPr>
+              <w:lastRenderedPageBreak/>
               <w:t>CC Address</w:t>
             </w:r>
             <w:r>
@@ -4668,6 +4306,7 @@
               <w:rPr>
                 <w:lang w:val="en-US"/>
               </w:rPr>
+              <w:lastRenderedPageBreak/>
               <w:t>Hi {</w:t>
             </w:r>
             <w:proofErr w:type="spellStart"/>
@@ -4684,6 +4323,12 @@
               </w:rPr>
               <w:t>}!</w:t>
             </w:r>
+            <w:r>
+              <w:rPr>
+                <w:lang w:val="en-US"/>
+              </w:rPr>
+              <w:t xml:space="preserve"> It’s Mike! I’m usually out of office doing visits looking for potential clients.</w:t>
+            </w:r>
           </w:p>
           <w:p>
             <w:pPr>
@@ -4708,13 +4353,7 @@
               <w:rPr>
                 <w:lang w:val="en-US"/>
               </w:rPr>
-              <w:t>[p]</w:t>
-            </w:r>
-            <w:r>
-              <w:rPr>
-                <w:lang w:val="en-US"/>
-              </w:rPr>
-              <w:t xml:space="preserve">This is a Purchase Order from </w:t>
+              <w:t xml:space="preserve">[p]This is a Purchase Order from </w:t>
             </w:r>
             <w:proofErr w:type="spellStart"/>
             <w:r>

</xml_diff>

<commit_message>
Level Design: File Icons Update
</commit_message>
<xml_diff>
--- a/level design.docx
+++ b/level design.docx
@@ -381,6 +381,481 @@
         </w:rPr>
       </w:pPr>
     </w:p>
+    <w:p>
+      <w:pPr>
+        <w:rPr>
+          <w:lang w:val="en-US"/>
+        </w:rPr>
+      </w:pPr>
+      <w:r>
+        <w:rPr>
+          <w:lang w:val="en-US"/>
+        </w:rPr>
+        <w:t>Level Name</w:t>
+      </w:r>
+    </w:p>
+    <w:tbl>
+      <w:tblPr>
+        <w:tblStyle w:val="TableGrid"/>
+        <w:tblW w:w="0" w:type="auto"/>
+        <w:tblLook w:val="04A0" w:firstRow="1" w:lastRow="0" w:firstColumn="1" w:lastColumn="0" w:noHBand="0" w:noVBand="1"/>
+      </w:tblPr>
+      <w:tblGrid>
+        <w:gridCol w:w="3955"/>
+        <w:gridCol w:w="5061"/>
+      </w:tblGrid>
+      <w:tr>
+        <w:trPr>
+          <w:trHeight w:val="360"/>
+        </w:trPr>
+        <w:tc>
+          <w:tcPr>
+            <w:tcW w:w="3955" w:type="dxa"/>
+            <w:vAlign w:val="center"/>
+          </w:tcPr>
+          <w:p>
+            <w:pPr>
+              <w:jc w:val="center"/>
+              <w:rPr>
+                <w:b/>
+                <w:bCs/>
+                <w:lang w:val="en-US"/>
+              </w:rPr>
+            </w:pPr>
+            <w:r>
+              <w:rPr>
+                <w:b/>
+                <w:bCs/>
+                <w:lang w:val="en-US"/>
+              </w:rPr>
+              <w:t>D</w:t>
+            </w:r>
+            <w:proofErr w:type="spellStart"/>
+            <w:r>
+              <w:rPr>
+                <w:b/>
+                <w:bCs/>
+              </w:rPr>
+              <w:t>etails</w:t>
+            </w:r>
+            <w:proofErr w:type="spellEnd"/>
+          </w:p>
+        </w:tc>
+        <w:tc>
+          <w:tcPr>
+            <w:tcW w:w="5061" w:type="dxa"/>
+            <w:vAlign w:val="center"/>
+          </w:tcPr>
+          <w:p>
+            <w:pPr>
+              <w:jc w:val="center"/>
+              <w:rPr>
+                <w:b/>
+                <w:bCs/>
+                <w:lang w:val="en-US"/>
+              </w:rPr>
+            </w:pPr>
+            <w:r>
+              <w:rPr>
+                <w:b/>
+                <w:bCs/>
+                <w:lang w:val="en-US"/>
+              </w:rPr>
+              <w:t>MONDAY</w:t>
+            </w:r>
+          </w:p>
+        </w:tc>
+      </w:tr>
+      <w:tr>
+        <w:trPr>
+          <w:trHeight w:val="360"/>
+        </w:trPr>
+        <w:tc>
+          <w:tcPr>
+            <w:tcW w:w="3955" w:type="dxa"/>
+            <w:vAlign w:val="center"/>
+          </w:tcPr>
+          <w:p>
+            <w:pPr>
+              <w:rPr>
+                <w:b/>
+                <w:bCs/>
+                <w:lang w:val="en-US"/>
+              </w:rPr>
+            </w:pPr>
+          </w:p>
+          <w:p>
+            <w:pPr>
+              <w:rPr>
+                <w:lang w:val="en-US"/>
+              </w:rPr>
+            </w:pPr>
+            <w:r>
+              <w:rPr>
+                <w:b/>
+                <w:bCs/>
+                <w:lang w:val="en-US"/>
+              </w:rPr>
+              <w:t>Type</w:t>
+            </w:r>
+            <w:r>
+              <w:rPr>
+                <w:lang w:val="en-US"/>
+              </w:rPr>
+              <w:t>: Message</w:t>
+            </w:r>
+          </w:p>
+          <w:p>
+            <w:pPr>
+              <w:rPr>
+                <w:lang w:val="en-US"/>
+              </w:rPr>
+            </w:pPr>
+            <w:r>
+              <w:rPr>
+                <w:b/>
+                <w:bCs/>
+                <w:lang w:val="en-US"/>
+              </w:rPr>
+              <w:t>Sender Name</w:t>
+            </w:r>
+            <w:r>
+              <w:rPr>
+                <w:lang w:val="en-US"/>
+              </w:rPr>
+              <w:t xml:space="preserve">: </w:t>
+            </w:r>
+          </w:p>
+          <w:p>
+            <w:pPr>
+              <w:rPr>
+                <w:lang w:val="en-US"/>
+              </w:rPr>
+            </w:pPr>
+            <w:r>
+              <w:rPr>
+                <w:b/>
+                <w:bCs/>
+                <w:lang w:val="en-US"/>
+              </w:rPr>
+              <w:t>Sender Address</w:t>
+            </w:r>
+            <w:r>
+              <w:rPr>
+                <w:lang w:val="en-US"/>
+              </w:rPr>
+              <w:t xml:space="preserve">: </w:t>
+            </w:r>
+          </w:p>
+          <w:p>
+            <w:pPr>
+              <w:rPr>
+                <w:lang w:val="en-US"/>
+              </w:rPr>
+            </w:pPr>
+            <w:r>
+              <w:rPr>
+                <w:b/>
+                <w:bCs/>
+                <w:lang w:val="en-US"/>
+              </w:rPr>
+              <w:t>To Address</w:t>
+            </w:r>
+            <w:r>
+              <w:rPr>
+                <w:lang w:val="en-US"/>
+              </w:rPr>
+              <w:t>: {</w:t>
+            </w:r>
+            <w:proofErr w:type="spellStart"/>
+            <w:r>
+              <w:rPr>
+                <w:lang w:val="en-US"/>
+              </w:rPr>
+              <w:t>player_email</w:t>
+            </w:r>
+            <w:proofErr w:type="spellEnd"/>
+            <w:r>
+              <w:rPr>
+                <w:lang w:val="en-US"/>
+              </w:rPr>
+              <w:t>}</w:t>
+            </w:r>
+          </w:p>
+          <w:p>
+            <w:pPr>
+              <w:rPr>
+                <w:lang w:val="en-US"/>
+              </w:rPr>
+            </w:pPr>
+            <w:r>
+              <w:rPr>
+                <w:b/>
+                <w:bCs/>
+                <w:lang w:val="en-US"/>
+              </w:rPr>
+              <w:t>CC Address</w:t>
+            </w:r>
+            <w:r>
+              <w:rPr>
+                <w:lang w:val="en-US"/>
+              </w:rPr>
+              <w:t xml:space="preserve">: </w:t>
+            </w:r>
+          </w:p>
+          <w:p>
+            <w:pPr>
+              <w:rPr>
+                <w:lang w:val="en-US"/>
+              </w:rPr>
+            </w:pPr>
+            <w:r>
+              <w:rPr>
+                <w:b/>
+                <w:bCs/>
+                <w:lang w:val="en-US"/>
+              </w:rPr>
+              <w:t>Subject</w:t>
+            </w:r>
+            <w:r>
+              <w:rPr>
+                <w:lang w:val="en-US"/>
+              </w:rPr>
+              <w:t xml:space="preserve">: </w:t>
+            </w:r>
+          </w:p>
+          <w:p>
+            <w:pPr>
+              <w:rPr>
+                <w:lang w:val="en-US"/>
+              </w:rPr>
+            </w:pPr>
+          </w:p>
+        </w:tc>
+        <w:tc>
+          <w:tcPr>
+            <w:tcW w:w="5061" w:type="dxa"/>
+            <w:vAlign w:val="center"/>
+          </w:tcPr>
+          <w:p>
+            <w:pPr>
+              <w:rPr>
+                <w:lang w:val="en-US"/>
+              </w:rPr>
+            </w:pPr>
+          </w:p>
+        </w:tc>
+      </w:tr>
+      <w:tr>
+        <w:trPr>
+          <w:trHeight w:val="360"/>
+        </w:trPr>
+        <w:tc>
+          <w:tcPr>
+            <w:tcW w:w="3955" w:type="dxa"/>
+            <w:vAlign w:val="center"/>
+          </w:tcPr>
+          <w:p>
+            <w:pPr>
+              <w:rPr>
+                <w:b/>
+                <w:bCs/>
+                <w:lang w:val="en-US"/>
+              </w:rPr>
+            </w:pPr>
+          </w:p>
+          <w:p>
+            <w:pPr>
+              <w:rPr>
+                <w:lang w:val="en-US"/>
+              </w:rPr>
+            </w:pPr>
+            <w:r>
+              <w:rPr>
+                <w:b/>
+                <w:bCs/>
+                <w:lang w:val="en-US"/>
+              </w:rPr>
+              <w:t>Type</w:t>
+            </w:r>
+            <w:r>
+              <w:rPr>
+                <w:lang w:val="en-US"/>
+              </w:rPr>
+              <w:t>: Message</w:t>
+            </w:r>
+          </w:p>
+          <w:p>
+            <w:pPr>
+              <w:rPr>
+                <w:lang w:val="en-US"/>
+              </w:rPr>
+            </w:pPr>
+            <w:r>
+              <w:rPr>
+                <w:b/>
+                <w:bCs/>
+                <w:lang w:val="en-US"/>
+              </w:rPr>
+              <w:t>Sender Name</w:t>
+            </w:r>
+            <w:r>
+              <w:rPr>
+                <w:lang w:val="en-US"/>
+              </w:rPr>
+              <w:t xml:space="preserve">: </w:t>
+            </w:r>
+          </w:p>
+          <w:p>
+            <w:pPr>
+              <w:rPr>
+                <w:lang w:val="en-US"/>
+              </w:rPr>
+            </w:pPr>
+            <w:r>
+              <w:rPr>
+                <w:b/>
+                <w:bCs/>
+                <w:lang w:val="en-US"/>
+              </w:rPr>
+              <w:t>Sender Address</w:t>
+            </w:r>
+            <w:r>
+              <w:rPr>
+                <w:lang w:val="en-US"/>
+              </w:rPr>
+              <w:t xml:space="preserve">: </w:t>
+            </w:r>
+          </w:p>
+          <w:p>
+            <w:pPr>
+              <w:rPr>
+                <w:lang w:val="en-US"/>
+              </w:rPr>
+            </w:pPr>
+            <w:r>
+              <w:rPr>
+                <w:b/>
+                <w:bCs/>
+                <w:lang w:val="en-US"/>
+              </w:rPr>
+              <w:t>To Address</w:t>
+            </w:r>
+            <w:r>
+              <w:rPr>
+                <w:lang w:val="en-US"/>
+              </w:rPr>
+              <w:t>: {</w:t>
+            </w:r>
+            <w:proofErr w:type="spellStart"/>
+            <w:r>
+              <w:rPr>
+                <w:lang w:val="en-US"/>
+              </w:rPr>
+              <w:t>player_email</w:t>
+            </w:r>
+            <w:proofErr w:type="spellEnd"/>
+            <w:r>
+              <w:rPr>
+                <w:lang w:val="en-US"/>
+              </w:rPr>
+              <w:t>}</w:t>
+            </w:r>
+          </w:p>
+          <w:p>
+            <w:pPr>
+              <w:rPr>
+                <w:lang w:val="en-US"/>
+              </w:rPr>
+            </w:pPr>
+            <w:r>
+              <w:rPr>
+                <w:b/>
+                <w:bCs/>
+                <w:lang w:val="en-US"/>
+              </w:rPr>
+              <w:t>CC Address</w:t>
+            </w:r>
+            <w:r>
+              <w:rPr>
+                <w:lang w:val="en-US"/>
+              </w:rPr>
+              <w:t xml:space="preserve">: </w:t>
+            </w:r>
+          </w:p>
+          <w:p>
+            <w:pPr>
+              <w:rPr>
+                <w:lang w:val="en-US"/>
+              </w:rPr>
+            </w:pPr>
+            <w:r>
+              <w:rPr>
+                <w:b/>
+                <w:bCs/>
+                <w:lang w:val="en-US"/>
+              </w:rPr>
+              <w:t>Subject</w:t>
+            </w:r>
+            <w:r>
+              <w:rPr>
+                <w:lang w:val="en-US"/>
+              </w:rPr>
+              <w:t xml:space="preserve">: </w:t>
+            </w:r>
+          </w:p>
+          <w:p>
+            <w:pPr>
+              <w:rPr>
+                <w:b/>
+                <w:bCs/>
+                <w:lang w:val="en-US"/>
+              </w:rPr>
+            </w:pPr>
+          </w:p>
+        </w:tc>
+        <w:tc>
+          <w:tcPr>
+            <w:tcW w:w="5061" w:type="dxa"/>
+            <w:vAlign w:val="center"/>
+          </w:tcPr>
+          <w:p>
+            <w:pPr>
+              <w:rPr>
+                <w:lang w:val="en-US"/>
+              </w:rPr>
+            </w:pPr>
+          </w:p>
+        </w:tc>
+      </w:tr>
+    </w:tbl>
+    <w:p>
+      <w:pPr>
+        <w:rPr>
+          <w:lang w:val="en-US"/>
+        </w:rPr>
+      </w:pPr>
+      <w:r>
+        <w:rPr>
+          <w:lang w:val="en-US"/>
+        </w:rPr>
+        <w:br w:type="page"/>
+      </w:r>
+    </w:p>
+    <w:p>
+      <w:pPr>
+        <w:rPr>
+          <w:lang w:val="en-US"/>
+        </w:rPr>
+      </w:pPr>
+      <w:r>
+        <w:rPr>
+          <w:lang w:val="en-US"/>
+        </w:rPr>
+        <w:lastRenderedPageBreak/>
+        <w:t>Monday</w:t>
+      </w:r>
+    </w:p>
     <w:tbl>
       <w:tblPr>
         <w:tblStyle w:val="TableGrid"/>
@@ -1246,7 +1721,6 @@
                 <w:bCs/>
                 <w:lang w:val="en-US"/>
               </w:rPr>
-              <w:lastRenderedPageBreak/>
               <w:t>CC Address</w:t>
             </w:r>
             <w:r>
@@ -1392,7 +1866,6 @@
               <w:rPr>
                 <w:lang w:val="en-US"/>
               </w:rPr>
-              <w:lastRenderedPageBreak/>
               <w:t xml:space="preserve">[p] </w:t>
             </w:r>
           </w:p>
@@ -1748,6 +2221,7 @@
                 <w:bCs/>
                 <w:lang w:val="en-US"/>
               </w:rPr>
+              <w:lastRenderedPageBreak/>
               <w:t>CC Address</w:t>
             </w:r>
             <w:r>
@@ -1899,6 +2373,7 @@
               <w:rPr>
                 <w:lang w:val="en-US"/>
               </w:rPr>
+              <w:lastRenderedPageBreak/>
               <w:t>[p]</w:t>
             </w:r>
             <w:r>
@@ -2742,7 +3217,6 @@
                 <w:bCs/>
                 <w:lang w:val="en-US"/>
               </w:rPr>
-              <w:lastRenderedPageBreak/>
               <w:t>Sender Address</w:t>
             </w:r>
             <w:r>
@@ -2895,7 +3369,6 @@
           </w:tcPr>
           <w:p>
             <w:r>
-              <w:lastRenderedPageBreak/>
               <w:t>Join us and enjoy the wonderful offers for a trip you'll definitely remember!</w:t>
             </w:r>
           </w:p>
@@ -3378,6 +3851,7 @@
                 <w:bCs/>
                 <w:lang w:val="en-US"/>
               </w:rPr>
+              <w:lastRenderedPageBreak/>
               <w:t>Sender Address</w:t>
             </w:r>
             <w:r>
@@ -3536,6 +4010,7 @@
               <w:rPr>
                 <w:lang w:val="en-US"/>
               </w:rPr>
+              <w:lastRenderedPageBreak/>
               <w:t>[p]</w:t>
             </w:r>
             <w:r>
@@ -4236,7 +4711,6 @@
                 <w:bCs/>
                 <w:lang w:val="en-US"/>
               </w:rPr>
-              <w:lastRenderedPageBreak/>
               <w:t>CC Address</w:t>
             </w:r>
             <w:r>
@@ -4306,69 +4780,542 @@
               <w:rPr>
                 <w:lang w:val="en-US"/>
               </w:rPr>
+              <w:t>Hi {</w:t>
+            </w:r>
+            <w:proofErr w:type="spellStart"/>
+            <w:r>
+              <w:rPr>
+                <w:lang w:val="en-US"/>
+              </w:rPr>
+              <w:t>player_name</w:t>
+            </w:r>
+            <w:proofErr w:type="spellEnd"/>
+            <w:r>
+              <w:rPr>
+                <w:lang w:val="en-US"/>
+              </w:rPr>
+              <w:t>}!</w:t>
+            </w:r>
+            <w:r>
+              <w:rPr>
+                <w:lang w:val="en-US"/>
+              </w:rPr>
+              <w:t xml:space="preserve"> It’s Mike! I’m usually out of office doing visits looking for potential clients.</w:t>
+            </w:r>
+          </w:p>
+          <w:p>
+            <w:pPr>
+              <w:rPr>
+                <w:lang w:val="en-US"/>
+              </w:rPr>
+            </w:pPr>
+            <w:r>
+              <w:rPr>
+                <w:lang w:val="en-US"/>
+              </w:rPr>
+              <w:t xml:space="preserve">[p] </w:t>
+            </w:r>
+          </w:p>
+          <w:p>
+            <w:pPr>
+              <w:rPr>
+                <w:lang w:val="en-US"/>
+              </w:rPr>
+            </w:pPr>
+            <w:r>
+              <w:rPr>
+                <w:lang w:val="en-US"/>
+              </w:rPr>
+              <w:t xml:space="preserve">[p]This is a Purchase Order from </w:t>
+            </w:r>
+            <w:proofErr w:type="spellStart"/>
+            <w:r>
+              <w:rPr>
+                <w:lang w:val="en-US"/>
+              </w:rPr>
+              <w:t>PrintingPro</w:t>
+            </w:r>
+            <w:proofErr w:type="spellEnd"/>
+            <w:r>
+              <w:rPr>
+                <w:lang w:val="en-US"/>
+              </w:rPr>
+              <w:t>. Please help me send this to finance. Thanks!</w:t>
+            </w:r>
+          </w:p>
+        </w:tc>
+      </w:tr>
+    </w:tbl>
+    <w:p>
+      <w:pPr>
+        <w:rPr>
+          <w:lang w:val="en-US"/>
+        </w:rPr>
+      </w:pPr>
+    </w:p>
+    <w:p>
+      <w:pPr>
+        <w:rPr>
+          <w:lang w:val="en-US"/>
+        </w:rPr>
+      </w:pPr>
+      <w:r>
+        <w:rPr>
+          <w:lang w:val="en-US"/>
+        </w:rPr>
+        <w:br w:type="page"/>
+      </w:r>
+    </w:p>
+    <w:tbl>
+      <w:tblPr>
+        <w:tblStyle w:val="TableGrid"/>
+        <w:tblW w:w="0" w:type="auto"/>
+        <w:tblLook w:val="04A0" w:firstRow="1" w:lastRow="0" w:firstColumn="1" w:lastColumn="0" w:noHBand="0" w:noVBand="1"/>
+      </w:tblPr>
+      <w:tblGrid>
+        <w:gridCol w:w="3955"/>
+        <w:gridCol w:w="5061"/>
+      </w:tblGrid>
+      <w:tr>
+        <w:trPr>
+          <w:trHeight w:val="360"/>
+        </w:trPr>
+        <w:tc>
+          <w:tcPr>
+            <w:tcW w:w="3955" w:type="dxa"/>
+            <w:vAlign w:val="center"/>
+          </w:tcPr>
+          <w:p>
+            <w:pPr>
+              <w:jc w:val="center"/>
+              <w:rPr>
+                <w:b/>
+                <w:bCs/>
+                <w:lang w:val="en-US"/>
+              </w:rPr>
+            </w:pPr>
+            <w:r>
+              <w:rPr>
+                <w:b/>
+                <w:bCs/>
+                <w:lang w:val="en-US"/>
+              </w:rPr>
               <w:lastRenderedPageBreak/>
-              <w:t>Hi {</w:t>
+              <w:t>D</w:t>
             </w:r>
             <w:proofErr w:type="spellStart"/>
             <w:r>
               <w:rPr>
-                <w:lang w:val="en-US"/>
-              </w:rPr>
-              <w:t>player_name</w:t>
+                <w:b/>
+                <w:bCs/>
+              </w:rPr>
+              <w:t>etails</w:t>
             </w:r>
             <w:proofErr w:type="spellEnd"/>
-            <w:r>
-              <w:rPr>
-                <w:lang w:val="en-US"/>
-              </w:rPr>
-              <w:t>}!</w:t>
-            </w:r>
-            <w:r>
-              <w:rPr>
-                <w:lang w:val="en-US"/>
-              </w:rPr>
-              <w:t xml:space="preserve"> It’s Mike! I’m usually out of office doing visits looking for potential clients.</w:t>
-            </w:r>
-          </w:p>
-          <w:p>
-            <w:pPr>
-              <w:rPr>
-                <w:lang w:val="en-US"/>
-              </w:rPr>
-            </w:pPr>
-            <w:r>
-              <w:rPr>
-                <w:lang w:val="en-US"/>
-              </w:rPr>
-              <w:t xml:space="preserve">[p] </w:t>
-            </w:r>
-          </w:p>
-          <w:p>
-            <w:pPr>
-              <w:rPr>
-                <w:lang w:val="en-US"/>
-              </w:rPr>
-            </w:pPr>
-            <w:r>
-              <w:rPr>
-                <w:lang w:val="en-US"/>
-              </w:rPr>
-              <w:t xml:space="preserve">[p]This is a Purchase Order from </w:t>
+          </w:p>
+        </w:tc>
+        <w:tc>
+          <w:tcPr>
+            <w:tcW w:w="5061" w:type="dxa"/>
+            <w:vAlign w:val="center"/>
+          </w:tcPr>
+          <w:p>
+            <w:pPr>
+              <w:jc w:val="center"/>
+              <w:rPr>
+                <w:b/>
+                <w:bCs/>
+                <w:lang w:val="en-US"/>
+              </w:rPr>
+            </w:pPr>
+            <w:r>
+              <w:rPr>
+                <w:b/>
+                <w:bCs/>
+                <w:lang w:val="en-US"/>
+              </w:rPr>
+              <w:t>TUESDAY</w:t>
+            </w:r>
+          </w:p>
+        </w:tc>
+      </w:tr>
+      <w:tr>
+        <w:trPr>
+          <w:trHeight w:val="360"/>
+        </w:trPr>
+        <w:tc>
+          <w:tcPr>
+            <w:tcW w:w="3955" w:type="dxa"/>
+            <w:vAlign w:val="center"/>
+          </w:tcPr>
+          <w:p>
+            <w:pPr>
+              <w:rPr>
+                <w:b/>
+                <w:bCs/>
+                <w:lang w:val="en-US"/>
+              </w:rPr>
+            </w:pPr>
+          </w:p>
+          <w:p>
+            <w:pPr>
+              <w:rPr>
+                <w:lang w:val="en-US"/>
+              </w:rPr>
+            </w:pPr>
+            <w:r>
+              <w:rPr>
+                <w:b/>
+                <w:bCs/>
+                <w:lang w:val="en-US"/>
+              </w:rPr>
+              <w:t>Type</w:t>
+            </w:r>
+            <w:r>
+              <w:rPr>
+                <w:lang w:val="en-US"/>
+              </w:rPr>
+              <w:t>: Message</w:t>
+            </w:r>
+          </w:p>
+          <w:p>
+            <w:pPr>
+              <w:rPr>
+                <w:lang w:val="en-US"/>
+              </w:rPr>
+            </w:pPr>
+            <w:r>
+              <w:rPr>
+                <w:b/>
+                <w:bCs/>
+                <w:lang w:val="en-US"/>
+              </w:rPr>
+              <w:t>Sender Name</w:t>
+            </w:r>
+            <w:r>
+              <w:rPr>
+                <w:lang w:val="en-US"/>
+              </w:rPr>
+              <w:t xml:space="preserve">: </w:t>
+            </w:r>
+            <w:r>
+              <w:rPr>
+                <w:lang w:val="en-US"/>
+              </w:rPr>
+              <w:t>Blake</w:t>
+            </w:r>
+          </w:p>
+          <w:p>
+            <w:pPr>
+              <w:rPr>
+                <w:lang w:val="en-US"/>
+              </w:rPr>
+            </w:pPr>
+            <w:r>
+              <w:rPr>
+                <w:b/>
+                <w:bCs/>
+                <w:lang w:val="en-US"/>
+              </w:rPr>
+              <w:t>Sender Address</w:t>
+            </w:r>
+            <w:r>
+              <w:rPr>
+                <w:lang w:val="en-US"/>
+              </w:rPr>
+              <w:t xml:space="preserve">: </w:t>
+            </w:r>
+            <w:r>
+              <w:rPr>
+                <w:lang w:val="en-US"/>
+              </w:rPr>
+              <w:t>blake@abc.com.my</w:t>
+            </w:r>
+          </w:p>
+          <w:p>
+            <w:pPr>
+              <w:rPr>
+                <w:lang w:val="en-US"/>
+              </w:rPr>
+            </w:pPr>
+            <w:r>
+              <w:rPr>
+                <w:b/>
+                <w:bCs/>
+                <w:lang w:val="en-US"/>
+              </w:rPr>
+              <w:t>To Address</w:t>
+            </w:r>
+            <w:r>
+              <w:rPr>
+                <w:lang w:val="en-US"/>
+              </w:rPr>
+              <w:t>: {</w:t>
             </w:r>
             <w:proofErr w:type="spellStart"/>
             <w:r>
               <w:rPr>
                 <w:lang w:val="en-US"/>
               </w:rPr>
-              <w:t>PrintingPro</w:t>
+              <w:t>player_email</w:t>
             </w:r>
             <w:proofErr w:type="spellEnd"/>
             <w:r>
               <w:rPr>
                 <w:lang w:val="en-US"/>
               </w:rPr>
-              <w:t>. Please help me send this to finance. Thanks!</w:t>
-            </w:r>
+              <w:t>}</w:t>
+            </w:r>
+          </w:p>
+          <w:p>
+            <w:pPr>
+              <w:rPr>
+                <w:lang w:val="en-US"/>
+              </w:rPr>
+            </w:pPr>
+            <w:r>
+              <w:rPr>
+                <w:b/>
+                <w:bCs/>
+                <w:lang w:val="en-US"/>
+              </w:rPr>
+              <w:t>CC Address</w:t>
+            </w:r>
+            <w:r>
+              <w:rPr>
+                <w:lang w:val="en-US"/>
+              </w:rPr>
+              <w:t xml:space="preserve">: </w:t>
+            </w:r>
+          </w:p>
+          <w:p>
+            <w:pPr>
+              <w:rPr>
+                <w:lang w:val="en-US"/>
+              </w:rPr>
+            </w:pPr>
+            <w:r>
+              <w:rPr>
+                <w:b/>
+                <w:bCs/>
+                <w:lang w:val="en-US"/>
+              </w:rPr>
+              <w:t>Subject</w:t>
+            </w:r>
+            <w:r>
+              <w:rPr>
+                <w:lang w:val="en-US"/>
+              </w:rPr>
+              <w:t xml:space="preserve">: </w:t>
+            </w:r>
+            <w:r>
+              <w:rPr>
+                <w:lang w:val="en-US"/>
+              </w:rPr>
+              <w:t>Watch out for Impersonation</w:t>
+            </w:r>
+          </w:p>
+          <w:p>
+            <w:pPr>
+              <w:rPr>
+                <w:lang w:val="en-US"/>
+              </w:rPr>
+            </w:pPr>
+          </w:p>
+        </w:tc>
+        <w:tc>
+          <w:tcPr>
+            <w:tcW w:w="5061" w:type="dxa"/>
+            <w:vAlign w:val="center"/>
+          </w:tcPr>
+          <w:p>
+            <w:pPr>
+              <w:rPr>
+                <w:lang w:val="en-US"/>
+              </w:rPr>
+            </w:pPr>
+          </w:p>
+        </w:tc>
+      </w:tr>
+      <w:tr>
+        <w:trPr>
+          <w:trHeight w:val="360"/>
+        </w:trPr>
+        <w:tc>
+          <w:tcPr>
+            <w:tcW w:w="3955" w:type="dxa"/>
+            <w:vAlign w:val="center"/>
+          </w:tcPr>
+          <w:p>
+            <w:pPr>
+              <w:rPr>
+                <w:b/>
+                <w:bCs/>
+                <w:lang w:val="en-US"/>
+              </w:rPr>
+            </w:pPr>
+          </w:p>
+          <w:p>
+            <w:pPr>
+              <w:rPr>
+                <w:lang w:val="en-US"/>
+              </w:rPr>
+            </w:pPr>
+            <w:r>
+              <w:rPr>
+                <w:b/>
+                <w:bCs/>
+                <w:lang w:val="en-US"/>
+              </w:rPr>
+              <w:t>Type</w:t>
+            </w:r>
+            <w:r>
+              <w:rPr>
+                <w:lang w:val="en-US"/>
+              </w:rPr>
+              <w:t>: Message</w:t>
+            </w:r>
+          </w:p>
+          <w:p>
+            <w:pPr>
+              <w:rPr>
+                <w:lang w:val="en-US"/>
+              </w:rPr>
+            </w:pPr>
+            <w:r>
+              <w:rPr>
+                <w:b/>
+                <w:bCs/>
+                <w:lang w:val="en-US"/>
+              </w:rPr>
+              <w:t>Sender Name</w:t>
+            </w:r>
+            <w:r>
+              <w:rPr>
+                <w:lang w:val="en-US"/>
+              </w:rPr>
+              <w:t xml:space="preserve">: </w:t>
+            </w:r>
+          </w:p>
+          <w:p>
+            <w:pPr>
+              <w:rPr>
+                <w:lang w:val="en-US"/>
+              </w:rPr>
+            </w:pPr>
+            <w:r>
+              <w:rPr>
+                <w:b/>
+                <w:bCs/>
+                <w:lang w:val="en-US"/>
+              </w:rPr>
+              <w:t>Sender Address</w:t>
+            </w:r>
+            <w:r>
+              <w:rPr>
+                <w:lang w:val="en-US"/>
+              </w:rPr>
+              <w:t xml:space="preserve">: </w:t>
+            </w:r>
+          </w:p>
+          <w:p>
+            <w:pPr>
+              <w:rPr>
+                <w:lang w:val="en-US"/>
+              </w:rPr>
+            </w:pPr>
+            <w:r>
+              <w:rPr>
+                <w:b/>
+                <w:bCs/>
+                <w:lang w:val="en-US"/>
+              </w:rPr>
+              <w:t>To Address</w:t>
+            </w:r>
+            <w:r>
+              <w:rPr>
+                <w:lang w:val="en-US"/>
+              </w:rPr>
+              <w:t>: {</w:t>
+            </w:r>
+            <w:proofErr w:type="spellStart"/>
+            <w:r>
+              <w:rPr>
+                <w:lang w:val="en-US"/>
+              </w:rPr>
+              <w:t>player_email</w:t>
+            </w:r>
+            <w:proofErr w:type="spellEnd"/>
+            <w:r>
+              <w:rPr>
+                <w:lang w:val="en-US"/>
+              </w:rPr>
+              <w:t>}</w:t>
+            </w:r>
+          </w:p>
+          <w:p>
+            <w:pPr>
+              <w:rPr>
+                <w:lang w:val="en-US"/>
+              </w:rPr>
+            </w:pPr>
+            <w:r>
+              <w:rPr>
+                <w:b/>
+                <w:bCs/>
+                <w:lang w:val="en-US"/>
+              </w:rPr>
+              <w:t>CC Address</w:t>
+            </w:r>
+            <w:r>
+              <w:rPr>
+                <w:lang w:val="en-US"/>
+              </w:rPr>
+              <w:t xml:space="preserve">: </w:t>
+            </w:r>
+          </w:p>
+          <w:p>
+            <w:pPr>
+              <w:rPr>
+                <w:lang w:val="en-US"/>
+              </w:rPr>
+            </w:pPr>
+            <w:r>
+              <w:rPr>
+                <w:b/>
+                <w:bCs/>
+                <w:lang w:val="en-US"/>
+              </w:rPr>
+              <w:t>Subject</w:t>
+            </w:r>
+            <w:r>
+              <w:rPr>
+                <w:lang w:val="en-US"/>
+              </w:rPr>
+              <w:t xml:space="preserve">: </w:t>
+            </w:r>
+          </w:p>
+          <w:p>
+            <w:pPr>
+              <w:rPr>
+                <w:b/>
+                <w:bCs/>
+                <w:lang w:val="en-US"/>
+              </w:rPr>
+            </w:pPr>
+          </w:p>
+        </w:tc>
+        <w:tc>
+          <w:tcPr>
+            <w:tcW w:w="5061" w:type="dxa"/>
+            <w:vAlign w:val="center"/>
+          </w:tcPr>
+          <w:p>
+            <w:pPr>
+              <w:rPr>
+                <w:lang w:val="en-US"/>
+              </w:rPr>
+            </w:pPr>
           </w:p>
         </w:tc>
       </w:tr>

</xml_diff>

<commit_message>
Update: Tuesday Level Design in Word
</commit_message>
<xml_diff>
--- a/level design.docx
+++ b/level design.docx
@@ -430,7 +430,6 @@
               </w:rPr>
               <w:t>D</w:t>
             </w:r>
-            <w:proofErr w:type="spellStart"/>
             <w:r>
               <w:rPr>
                 <w:b/>
@@ -438,7 +437,6 @@
               </w:rPr>
               <w:t>etails</w:t>
             </w:r>
-            <w:proofErr w:type="spellEnd"/>
           </w:p>
         </w:tc>
         <w:tc>
@@ -565,21 +563,7 @@
               <w:rPr>
                 <w:lang w:val="en-US"/>
               </w:rPr>
-              <w:t>: {</w:t>
-            </w:r>
-            <w:proofErr w:type="spellStart"/>
-            <w:r>
-              <w:rPr>
-                <w:lang w:val="en-US"/>
-              </w:rPr>
-              <w:t>player_email</w:t>
-            </w:r>
-            <w:proofErr w:type="spellEnd"/>
-            <w:r>
-              <w:rPr>
-                <w:lang w:val="en-US"/>
-              </w:rPr>
-              <w:t>}</w:t>
+              <w:t>: {player_email}</w:t>
             </w:r>
           </w:p>
           <w:p>
@@ -745,21 +729,7 @@
               <w:rPr>
                 <w:lang w:val="en-US"/>
               </w:rPr>
-              <w:t>: {</w:t>
-            </w:r>
-            <w:proofErr w:type="spellStart"/>
-            <w:r>
-              <w:rPr>
-                <w:lang w:val="en-US"/>
-              </w:rPr>
-              <w:t>player_email</w:t>
-            </w:r>
-            <w:proofErr w:type="spellEnd"/>
-            <w:r>
-              <w:rPr>
-                <w:lang w:val="en-US"/>
-              </w:rPr>
-              <w:t>}</w:t>
+              <w:t>: {player_email}</w:t>
             </w:r>
           </w:p>
           <w:p>
@@ -892,7 +862,6 @@
               </w:rPr>
               <w:t>D</w:t>
             </w:r>
-            <w:proofErr w:type="spellStart"/>
             <w:r>
               <w:rPr>
                 <w:b/>
@@ -900,7 +869,6 @@
               </w:rPr>
               <w:t>etails</w:t>
             </w:r>
-            <w:proofErr w:type="spellEnd"/>
           </w:p>
         </w:tc>
         <w:tc>
@@ -1034,21 +1002,7 @@
               <w:rPr>
                 <w:lang w:val="en-US"/>
               </w:rPr>
-              <w:t>: {</w:t>
-            </w:r>
-            <w:proofErr w:type="spellStart"/>
-            <w:r>
-              <w:rPr>
-                <w:lang w:val="en-US"/>
-              </w:rPr>
-              <w:t>player_email</w:t>
-            </w:r>
-            <w:proofErr w:type="spellEnd"/>
-            <w:r>
-              <w:rPr>
-                <w:lang w:val="en-US"/>
-              </w:rPr>
-              <w:t>}</w:t>
+              <w:t>: {player_email}</w:t>
             </w:r>
           </w:p>
           <w:p>
@@ -1175,21 +1129,7 @@
               <w:rPr>
                 <w:lang w:val="en-US"/>
               </w:rPr>
-              <w:t>, {</w:t>
-            </w:r>
-            <w:proofErr w:type="spellStart"/>
-            <w:r>
-              <w:rPr>
-                <w:lang w:val="en-US"/>
-              </w:rPr>
-              <w:t>player_name</w:t>
-            </w:r>
-            <w:proofErr w:type="spellEnd"/>
-            <w:r>
-              <w:rPr>
-                <w:lang w:val="en-US"/>
-              </w:rPr>
-              <w:t>}</w:t>
+              <w:t>, {player_name}</w:t>
             </w:r>
             <w:r>
               <w:rPr>
@@ -1449,49 +1389,13 @@
               <w:rPr>
                 <w:lang w:val="en-US"/>
               </w:rPr>
-              <w:t>[</w:t>
-            </w:r>
-            <w:proofErr w:type="spellStart"/>
-            <w:r>
-              <w:rPr>
-                <w:lang w:val="en-US"/>
-              </w:rPr>
-              <w:t>img</w:t>
-            </w:r>
-            <w:proofErr w:type="spellEnd"/>
-            <w:r>
-              <w:rPr>
-                <w:lang w:val="en-US"/>
-              </w:rPr>
-              <w:t>]assets/tutorial/report_email.png[/</w:t>
-            </w:r>
-            <w:proofErr w:type="spellStart"/>
-            <w:proofErr w:type="gramStart"/>
-            <w:r>
-              <w:rPr>
-                <w:lang w:val="en-US"/>
-              </w:rPr>
-              <w:t>img</w:t>
-            </w:r>
-            <w:proofErr w:type="spellEnd"/>
-            <w:r>
-              <w:rPr>
-                <w:lang w:val="en-US"/>
-              </w:rPr>
-              <w:t>]</w:t>
-            </w:r>
-            <w:r>
-              <w:rPr>
-                <w:lang w:val="en-US"/>
-              </w:rPr>
-              <w:t>[</w:t>
-            </w:r>
-            <w:proofErr w:type="gramEnd"/>
-            <w:r>
-              <w:rPr>
-                <w:lang w:val="en-US"/>
-              </w:rPr>
-              <w:t>/center]</w:t>
+              <w:t>[img]assets/tutorial/report_email.png[/img]</w:t>
+            </w:r>
+            <w:r>
+              <w:rPr>
+                <w:lang w:val="en-US"/>
+              </w:rPr>
+              <w:t>[/center]</w:t>
             </w:r>
           </w:p>
           <w:p>
@@ -1692,21 +1596,7 @@
               <w:rPr>
                 <w:lang w:val="en-US"/>
               </w:rPr>
-              <w:t>: {</w:t>
-            </w:r>
-            <w:proofErr w:type="spellStart"/>
-            <w:r>
-              <w:rPr>
-                <w:lang w:val="en-US"/>
-              </w:rPr>
-              <w:t>player_email</w:t>
-            </w:r>
-            <w:proofErr w:type="spellEnd"/>
-            <w:r>
-              <w:rPr>
-                <w:lang w:val="en-US"/>
-              </w:rPr>
-              <w:t>}</w:t>
+              <w:t>: {player_email}</w:t>
             </w:r>
           </w:p>
           <w:p>
@@ -1801,21 +1691,7 @@
               <w:rPr>
                 <w:lang w:val="en-US"/>
               </w:rPr>
-              <w:t>, {</w:t>
-            </w:r>
-            <w:proofErr w:type="spellStart"/>
-            <w:r>
-              <w:rPr>
-                <w:lang w:val="en-US"/>
-              </w:rPr>
-              <w:t>player_name</w:t>
-            </w:r>
-            <w:proofErr w:type="spellEnd"/>
-            <w:r>
-              <w:rPr>
-                <w:lang w:val="en-US"/>
-              </w:rPr>
-              <w:t>}!</w:t>
+              <w:t>, {player_name}!</w:t>
             </w:r>
           </w:p>
           <w:p>
@@ -1879,21 +1755,7 @@
               <w:rPr>
                 <w:lang w:val="en-US"/>
               </w:rPr>
-              <w:t>[p]</w:t>
-            </w:r>
-            <w:proofErr w:type="gramStart"/>
-            <w:r>
-              <w:rPr>
-                <w:lang w:val="en-US"/>
-              </w:rPr>
-              <w:t>To</w:t>
-            </w:r>
-            <w:proofErr w:type="gramEnd"/>
-            <w:r>
-              <w:rPr>
-                <w:lang w:val="en-US"/>
-              </w:rPr>
-              <w:t xml:space="preserve"> make things easier for you, I'll send you a request email like this every day and you can just drop the files in and click send!</w:t>
+              <w:t>[p]To make things easier for you, I'll send you a request email like this every day and you can just drop the files in and click send!</w:t>
             </w:r>
           </w:p>
           <w:p>
@@ -1919,35 +1781,7 @@
               <w:rPr>
                 <w:lang w:val="en-US"/>
               </w:rPr>
-              <w:t>[p][</w:t>
-            </w:r>
-            <w:proofErr w:type="gramStart"/>
-            <w:r>
-              <w:rPr>
-                <w:lang w:val="en-US"/>
-              </w:rPr>
-              <w:t>b]Make</w:t>
-            </w:r>
-            <w:proofErr w:type="gramEnd"/>
-            <w:r>
-              <w:rPr>
-                <w:lang w:val="en-US"/>
-              </w:rPr>
-              <w:t xml:space="preserve"> sure that you have collected all the Purchase Orders sent to you today before submitting. A missed order is a missed </w:t>
-            </w:r>
-            <w:proofErr w:type="gramStart"/>
-            <w:r>
-              <w:rPr>
-                <w:lang w:val="en-US"/>
-              </w:rPr>
-              <w:t>opportunity![</w:t>
-            </w:r>
-            <w:proofErr w:type="gramEnd"/>
-            <w:r>
-              <w:rPr>
-                <w:lang w:val="en-US"/>
-              </w:rPr>
-              <w:t>/b]</w:t>
+              <w:t>[p][b]Make sure that you have collected all the Purchase Orders sent to you today before submitting. A missed order is a missed opportunity![/b]</w:t>
             </w:r>
           </w:p>
           <w:p>
@@ -2192,21 +2026,7 @@
               <w:rPr>
                 <w:lang w:val="en-US"/>
               </w:rPr>
-              <w:t>: {</w:t>
-            </w:r>
-            <w:proofErr w:type="spellStart"/>
-            <w:r>
-              <w:rPr>
-                <w:lang w:val="en-US"/>
-              </w:rPr>
-              <w:t>player_email</w:t>
-            </w:r>
-            <w:proofErr w:type="spellEnd"/>
-            <w:r>
-              <w:rPr>
-                <w:lang w:val="en-US"/>
-              </w:rPr>
-              <w:t>}</w:t>
+              <w:t>: {player_email}</w:t>
             </w:r>
           </w:p>
           <w:p>
@@ -2299,21 +2119,7 @@
               <w:rPr>
                 <w:lang w:val="en-US"/>
               </w:rPr>
-              <w:t>, {</w:t>
-            </w:r>
-            <w:proofErr w:type="spellStart"/>
-            <w:r>
-              <w:rPr>
-                <w:lang w:val="en-US"/>
-              </w:rPr>
-              <w:t>player_name</w:t>
-            </w:r>
-            <w:proofErr w:type="spellEnd"/>
-            <w:r>
-              <w:rPr>
-                <w:lang w:val="en-US"/>
-              </w:rPr>
-              <w:t>}!</w:t>
+              <w:t>, {player_name}!</w:t>
             </w:r>
           </w:p>
           <w:p>
@@ -2561,21 +2367,7 @@
               <w:rPr>
                 <w:lang w:val="en-US"/>
               </w:rPr>
-              <w:t>: {</w:t>
-            </w:r>
-            <w:proofErr w:type="spellStart"/>
-            <w:r>
-              <w:rPr>
-                <w:lang w:val="en-US"/>
-              </w:rPr>
-              <w:t>player_email</w:t>
-            </w:r>
-            <w:proofErr w:type="spellEnd"/>
-            <w:r>
-              <w:rPr>
-                <w:lang w:val="en-US"/>
-              </w:rPr>
-              <w:t>}</w:t>
+              <w:t>: {player_email}</w:t>
             </w:r>
           </w:p>
           <w:p>
@@ -2682,37 +2474,13 @@
               <w:t>[p]</w:t>
             </w:r>
             <w:r>
-              <w:t>[</w:t>
-            </w:r>
-            <w:proofErr w:type="spellStart"/>
-            <w:r>
-              <w:t>center</w:t>
-            </w:r>
-            <w:proofErr w:type="spellEnd"/>
-            <w:r>
-              <w:t>]</w:t>
-            </w:r>
-            <w:r>
-              <w:t xml:space="preserve">Thank you for choosing Orbit </w:t>
-            </w:r>
-            <w:proofErr w:type="gramStart"/>
-            <w:r>
-              <w:t>Antivirus!</w:t>
-            </w:r>
-            <w:r>
-              <w:t>[</w:t>
-            </w:r>
-            <w:proofErr w:type="gramEnd"/>
-            <w:r>
-              <w:t>/</w:t>
-            </w:r>
-            <w:proofErr w:type="spellStart"/>
-            <w:r>
-              <w:t>center</w:t>
-            </w:r>
-            <w:proofErr w:type="spellEnd"/>
-            <w:r>
-              <w:t>]</w:t>
+              <w:t>[center]</w:t>
+            </w:r>
+            <w:r>
+              <w:t>Thank you for choosing Orbit Antivirus!</w:t>
+            </w:r>
+            <w:r>
+              <w:t>[/center]</w:t>
             </w:r>
           </w:p>
           <w:p>
@@ -2725,56 +2493,19 @@
               <w:t>[p]</w:t>
             </w:r>
             <w:r>
-              <w:t>[</w:t>
-            </w:r>
-            <w:proofErr w:type="spellStart"/>
-            <w:r>
-              <w:t>center</w:t>
-            </w:r>
-            <w:proofErr w:type="spellEnd"/>
-            <w:r>
-              <w:t>]</w:t>
-            </w:r>
-            <w:r>
-              <w:t>[</w:t>
-            </w:r>
-            <w:proofErr w:type="spellStart"/>
-            <w:r>
-              <w:t>img</w:t>
-            </w:r>
-            <w:proofErr w:type="spellEnd"/>
-            <w:r>
-              <w:t>]</w:t>
+              <w:t>[center]</w:t>
+            </w:r>
+            <w:r>
+              <w:t>[img]</w:t>
             </w:r>
             <w:r>
               <w:t>assets/</w:t>
             </w:r>
             <w:r>
-              <w:t>orbit_logo.png[/</w:t>
-            </w:r>
-            <w:proofErr w:type="spellStart"/>
-            <w:proofErr w:type="gramStart"/>
-            <w:r>
-              <w:t>img</w:t>
-            </w:r>
-            <w:proofErr w:type="spellEnd"/>
-            <w:r>
-              <w:t>]</w:t>
-            </w:r>
-            <w:r>
-              <w:t>[</w:t>
-            </w:r>
-            <w:proofErr w:type="gramEnd"/>
-            <w:r>
-              <w:t>/</w:t>
-            </w:r>
-            <w:proofErr w:type="spellStart"/>
-            <w:r>
-              <w:t>center</w:t>
-            </w:r>
-            <w:proofErr w:type="spellEnd"/>
-            <w:r>
-              <w:t>]</w:t>
+              <w:t>orbit_logo.png[/img]</w:t>
+            </w:r>
+            <w:r>
+              <w:t>[/center]</w:t>
             </w:r>
           </w:p>
           <w:p/>
@@ -2900,21 +2631,7 @@
               <w:rPr>
                 <w:lang w:val="en-US"/>
               </w:rPr>
-              <w:t>: {</w:t>
-            </w:r>
-            <w:proofErr w:type="spellStart"/>
-            <w:r>
-              <w:rPr>
-                <w:lang w:val="en-US"/>
-              </w:rPr>
-              <w:t>player_email</w:t>
-            </w:r>
-            <w:proofErr w:type="spellEnd"/>
-            <w:r>
-              <w:rPr>
-                <w:lang w:val="en-US"/>
-              </w:rPr>
-              <w:t>}</w:t>
+              <w:t>: {player_email}</w:t>
             </w:r>
           </w:p>
           <w:p>
@@ -3025,100 +2742,91 @@
                 <w:lang w:val="en-US"/>
               </w:rPr>
             </w:pPr>
-            <w:proofErr w:type="gramStart"/>
+            <w:r>
+              <w:rPr>
+                <w:lang w:val="en-US"/>
+              </w:rPr>
+              <w:t>[p]Please refer to the PO attached.</w:t>
+            </w:r>
+          </w:p>
+          <w:p>
+            <w:pPr>
+              <w:rPr>
+                <w:lang w:val="en-US"/>
+              </w:rPr>
+            </w:pPr>
+            <w:r>
+              <w:rPr>
+                <w:lang w:val="en-US"/>
+              </w:rPr>
+              <w:t xml:space="preserve">[p] </w:t>
+            </w:r>
+          </w:p>
+          <w:p>
+            <w:pPr>
+              <w:rPr>
+                <w:lang w:val="en-US"/>
+              </w:rPr>
+            </w:pPr>
+            <w:r>
+              <w:rPr>
+                <w:lang w:val="en-US"/>
+              </w:rPr>
+              <w:t xml:space="preserve">[p] </w:t>
+            </w:r>
+          </w:p>
+          <w:p>
+            <w:pPr>
+              <w:rPr>
+                <w:lang w:val="en-US"/>
+              </w:rPr>
+            </w:pPr>
+            <w:r>
+              <w:rPr>
+                <w:lang w:val="en-US"/>
+              </w:rPr>
+              <w:t>[p]Ong Wei Zhe</w:t>
+            </w:r>
+          </w:p>
+          <w:p>
+            <w:pPr>
+              <w:rPr>
+                <w:lang w:val="en-US"/>
+              </w:rPr>
+            </w:pPr>
+            <w:r>
+              <w:rPr>
+                <w:lang w:val="en-US"/>
+              </w:rPr>
+              <w:t>[p]Store Owner</w:t>
+            </w:r>
+          </w:p>
+          <w:p>
+            <w:pPr>
+              <w:rPr>
+                <w:lang w:val="en-US"/>
+              </w:rPr>
+            </w:pPr>
+            <w:r>
+              <w:rPr>
+                <w:lang w:val="en-US"/>
+              </w:rPr>
+              <w:t>[p]Little Genius Stationery</w:t>
+            </w:r>
+          </w:p>
+          <w:p>
+            <w:pPr>
+              <w:rPr>
+                <w:rFonts w:ascii="MS Gothic" w:eastAsia="MS Gothic" w:hAnsi="MS Gothic" w:cs="MS Gothic"/>
+                <w:lang w:val="en-US"/>
+              </w:rPr>
+            </w:pPr>
             <w:r>
               <w:rPr>
                 <w:lang w:val="en-US"/>
               </w:rPr>
               <w:t>[p]</w:t>
             </w:r>
-            <w:proofErr w:type="gramEnd"/>
-            <w:r>
-              <w:rPr>
-                <w:lang w:val="en-US"/>
-              </w:rPr>
-              <w:t>Please refer to the PO attached.</w:t>
-            </w:r>
-          </w:p>
-          <w:p>
-            <w:pPr>
-              <w:rPr>
-                <w:lang w:val="en-US"/>
-              </w:rPr>
-            </w:pPr>
-            <w:r>
-              <w:rPr>
-                <w:lang w:val="en-US"/>
-              </w:rPr>
-              <w:t xml:space="preserve">[p] </w:t>
-            </w:r>
-          </w:p>
-          <w:p>
-            <w:pPr>
-              <w:rPr>
-                <w:lang w:val="en-US"/>
-              </w:rPr>
-            </w:pPr>
-            <w:r>
-              <w:rPr>
-                <w:lang w:val="en-US"/>
-              </w:rPr>
-              <w:t xml:space="preserve">[p] </w:t>
-            </w:r>
-          </w:p>
-          <w:p>
-            <w:pPr>
-              <w:rPr>
-                <w:lang w:val="en-US"/>
-              </w:rPr>
-            </w:pPr>
-            <w:r>
-              <w:rPr>
-                <w:lang w:val="en-US"/>
-              </w:rPr>
-              <w:t>[p]Ong Wei Zhe</w:t>
-            </w:r>
-          </w:p>
-          <w:p>
-            <w:pPr>
-              <w:rPr>
-                <w:lang w:val="en-US"/>
-              </w:rPr>
-            </w:pPr>
-            <w:r>
-              <w:rPr>
-                <w:lang w:val="en-US"/>
-              </w:rPr>
-              <w:t>[p]Store Owner</w:t>
-            </w:r>
-          </w:p>
-          <w:p>
-            <w:pPr>
-              <w:rPr>
-                <w:lang w:val="en-US"/>
-              </w:rPr>
-            </w:pPr>
-            <w:r>
-              <w:rPr>
-                <w:lang w:val="en-US"/>
-              </w:rPr>
-              <w:t>[p]Little Genius Stationery</w:t>
-            </w:r>
-          </w:p>
-          <w:p>
-            <w:pPr>
-              <w:rPr>
-                <w:rFonts w:ascii="MS Gothic" w:eastAsia="MS Gothic" w:hAnsi="MS Gothic" w:cs="MS Gothic"/>
-                <w:lang w:val="en-US"/>
-              </w:rPr>
-            </w:pPr>
-            <w:r>
-              <w:rPr>
-                <w:lang w:val="en-US"/>
-              </w:rPr>
-              <w:t>[p]</w:t>
-            </w:r>
-            <w:proofErr w:type="spellStart"/>
             <w:r>
               <w:rPr>
                 <w:rFonts w:ascii="MS Gothic" w:eastAsia="MS Gothic" w:hAnsi="MS Gothic" w:cs="MS Gothic" w:hint="eastAsia"/>
@@ -3126,7 +2834,6 @@
               </w:rPr>
               <w:t>小天才文具店</w:t>
             </w:r>
-            <w:proofErr w:type="spellEnd"/>
           </w:p>
           <w:p>
             <w:pPr>
@@ -3196,14 +2903,12 @@
               </w:rPr>
               <w:t xml:space="preserve">: </w:t>
             </w:r>
-            <w:proofErr w:type="spellStart"/>
             <w:r>
               <w:rPr>
                 <w:lang w:val="en-US"/>
               </w:rPr>
               <w:t>Trippo</w:t>
             </w:r>
-            <w:proofErr w:type="spellEnd"/>
           </w:p>
           <w:p>
             <w:pPr>
@@ -3278,21 +2983,7 @@
               <w:rPr>
                 <w:lang w:val="en-US"/>
               </w:rPr>
-              <w:t>: {</w:t>
-            </w:r>
-            <w:proofErr w:type="spellStart"/>
-            <w:r>
-              <w:rPr>
-                <w:lang w:val="en-US"/>
-              </w:rPr>
-              <w:t>player_email</w:t>
-            </w:r>
-            <w:proofErr w:type="spellEnd"/>
-            <w:r>
-              <w:rPr>
-                <w:lang w:val="en-US"/>
-              </w:rPr>
-              <w:t>}</w:t>
+              <w:t>: {player_email}</w:t>
             </w:r>
           </w:p>
           <w:p>
@@ -3382,56 +3073,19 @@
               <w:t>[p]</w:t>
             </w:r>
             <w:r>
-              <w:t>[</w:t>
-            </w:r>
-            <w:proofErr w:type="spellStart"/>
-            <w:r>
-              <w:t>center</w:t>
-            </w:r>
-            <w:proofErr w:type="spellEnd"/>
-            <w:r>
-              <w:t>]</w:t>
-            </w:r>
-            <w:r>
-              <w:t>[</w:t>
-            </w:r>
-            <w:proofErr w:type="spellStart"/>
-            <w:r>
-              <w:t>img</w:t>
-            </w:r>
-            <w:proofErr w:type="spellEnd"/>
-            <w:r>
-              <w:t>]</w:t>
+              <w:t>[center]</w:t>
+            </w:r>
+            <w:r>
+              <w:t>[img]</w:t>
             </w:r>
             <w:r>
               <w:t>assets/adware/</w:t>
             </w:r>
             <w:r>
-              <w:t>trippo_ad.jpg[/</w:t>
-            </w:r>
-            <w:proofErr w:type="spellStart"/>
-            <w:proofErr w:type="gramStart"/>
-            <w:r>
-              <w:t>img</w:t>
-            </w:r>
-            <w:proofErr w:type="spellEnd"/>
-            <w:r>
-              <w:t>]</w:t>
-            </w:r>
-            <w:r>
-              <w:t>[</w:t>
-            </w:r>
-            <w:proofErr w:type="gramEnd"/>
-            <w:r>
-              <w:t>/</w:t>
-            </w:r>
-            <w:proofErr w:type="spellStart"/>
-            <w:r>
-              <w:t>center</w:t>
-            </w:r>
-            <w:proofErr w:type="spellEnd"/>
-            <w:r>
-              <w:t>]</w:t>
+              <w:t>trippo_ad.jpg[/img]</w:t>
+            </w:r>
+            <w:r>
+              <w:t>[/center]</w:t>
             </w:r>
           </w:p>
         </w:tc>
@@ -3569,21 +3223,7 @@
               <w:rPr>
                 <w:lang w:val="en-US"/>
               </w:rPr>
-              <w:t>: {</w:t>
-            </w:r>
-            <w:proofErr w:type="spellStart"/>
-            <w:r>
-              <w:rPr>
-                <w:lang w:val="en-US"/>
-              </w:rPr>
-              <w:t>player_email</w:t>
-            </w:r>
-            <w:proofErr w:type="spellEnd"/>
-            <w:r>
-              <w:rPr>
-                <w:lang w:val="en-US"/>
-              </w:rPr>
-              <w:t>}</w:t>
+              <w:t>: {player_email}</w:t>
             </w:r>
           </w:p>
           <w:p>
@@ -3900,21 +3540,7 @@
               <w:rPr>
                 <w:lang w:val="en-US"/>
               </w:rPr>
-              <w:t>: {</w:t>
-            </w:r>
-            <w:proofErr w:type="spellStart"/>
-            <w:r>
-              <w:rPr>
-                <w:lang w:val="en-US"/>
-              </w:rPr>
-              <w:t>player_email</w:t>
-            </w:r>
-            <w:proofErr w:type="spellEnd"/>
-            <w:r>
-              <w:rPr>
-                <w:lang w:val="en-US"/>
-              </w:rPr>
-              <w:t>}</w:t>
+              <w:t>: {player_email}</w:t>
             </w:r>
           </w:p>
           <w:p>
@@ -4362,21 +3988,7 @@
               <w:rPr>
                 <w:lang w:val="en-US"/>
               </w:rPr>
-              <w:t>: {</w:t>
-            </w:r>
-            <w:proofErr w:type="spellStart"/>
-            <w:r>
-              <w:rPr>
-                <w:lang w:val="en-US"/>
-              </w:rPr>
-              <w:t>player_email</w:t>
-            </w:r>
-            <w:proofErr w:type="spellEnd"/>
-            <w:r>
-              <w:rPr>
-                <w:lang w:val="en-US"/>
-              </w:rPr>
-              <w:t>}</w:t>
+              <w:t>: {player_email}</w:t>
             </w:r>
           </w:p>
           <w:p>
@@ -4467,21 +4079,7 @@
               <w:rPr>
                 <w:lang w:val="en-US"/>
               </w:rPr>
-              <w:t xml:space="preserve">Hello, I want to order some </w:t>
-            </w:r>
-            <w:proofErr w:type="spellStart"/>
-            <w:r>
-              <w:rPr>
-                <w:lang w:val="en-US"/>
-              </w:rPr>
-              <w:t>stationarys</w:t>
-            </w:r>
-            <w:proofErr w:type="spellEnd"/>
-            <w:r>
-              <w:rPr>
-                <w:lang w:val="en-US"/>
-              </w:rPr>
-              <w:t xml:space="preserve"> for my shop.</w:t>
+              <w:t>Hello, I want to order some stationarys for my shop.</w:t>
             </w:r>
           </w:p>
           <w:p>
@@ -4682,21 +4280,7 @@
               <w:rPr>
                 <w:lang w:val="en-US"/>
               </w:rPr>
-              <w:t>: {</w:t>
-            </w:r>
-            <w:proofErr w:type="spellStart"/>
-            <w:r>
-              <w:rPr>
-                <w:lang w:val="en-US"/>
-              </w:rPr>
-              <w:t>player_email</w:t>
-            </w:r>
-            <w:proofErr w:type="spellEnd"/>
-            <w:r>
-              <w:rPr>
-                <w:lang w:val="en-US"/>
-              </w:rPr>
-              <w:t>}</w:t>
+              <w:t>: {player_email}</w:t>
             </w:r>
           </w:p>
           <w:p>
@@ -4744,16 +4328,8 @@
               <w:rPr>
                 <w:lang w:val="en-US"/>
               </w:rPr>
-              <w:t xml:space="preserve">Purchase Order - </w:t>
-            </w:r>
-            <w:proofErr w:type="spellStart"/>
-            <w:r>
-              <w:rPr>
-                <w:lang w:val="en-US"/>
-              </w:rPr>
-              <w:t>PrintingPro</w:t>
-            </w:r>
-            <w:proofErr w:type="spellEnd"/>
+              <w:t>Purchase Order - PrintingPro</w:t>
+            </w:r>
           </w:p>
           <w:p>
             <w:pPr>
@@ -4780,21 +4356,7 @@
               <w:rPr>
                 <w:lang w:val="en-US"/>
               </w:rPr>
-              <w:t>Hi {</w:t>
-            </w:r>
-            <w:proofErr w:type="spellStart"/>
-            <w:r>
-              <w:rPr>
-                <w:lang w:val="en-US"/>
-              </w:rPr>
-              <w:t>player_name</w:t>
-            </w:r>
-            <w:proofErr w:type="spellEnd"/>
-            <w:r>
-              <w:rPr>
-                <w:lang w:val="en-US"/>
-              </w:rPr>
-              <w:t>}!</w:t>
+              <w:t>Hi {player_name}!</w:t>
             </w:r>
             <w:r>
               <w:rPr>
@@ -4826,21 +4388,7 @@
               <w:rPr>
                 <w:lang w:val="en-US"/>
               </w:rPr>
-              <w:t xml:space="preserve">[p]This is a Purchase Order from </w:t>
-            </w:r>
-            <w:proofErr w:type="spellStart"/>
-            <w:r>
-              <w:rPr>
-                <w:lang w:val="en-US"/>
-              </w:rPr>
-              <w:t>PrintingPro</w:t>
-            </w:r>
-            <w:proofErr w:type="spellEnd"/>
-            <w:r>
-              <w:rPr>
-                <w:lang w:val="en-US"/>
-              </w:rPr>
-              <w:t>. Please help me send this to finance. Thanks!</w:t>
+              <w:t>[p]This is a Purchase Order from PrintingPro. Please help me send this to finance. Thanks!</w:t>
             </w:r>
           </w:p>
         </w:tc>
@@ -4903,7 +4451,6 @@
               <w:lastRenderedPageBreak/>
               <w:t>D</w:t>
             </w:r>
-            <w:proofErr w:type="spellStart"/>
             <w:r>
               <w:rPr>
                 <w:b/>
@@ -4911,7 +4458,6 @@
               </w:rPr>
               <w:t>etails</w:t>
             </w:r>
-            <w:proofErr w:type="spellEnd"/>
           </w:p>
         </w:tc>
         <w:tc>
@@ -5050,21 +4596,7 @@
               <w:rPr>
                 <w:lang w:val="en-US"/>
               </w:rPr>
-              <w:t>: {</w:t>
-            </w:r>
-            <w:proofErr w:type="spellStart"/>
-            <w:r>
-              <w:rPr>
-                <w:lang w:val="en-US"/>
-              </w:rPr>
-              <w:t>player_email</w:t>
-            </w:r>
-            <w:proofErr w:type="spellEnd"/>
-            <w:r>
-              <w:rPr>
-                <w:lang w:val="en-US"/>
-              </w:rPr>
-              <w:t>}</w:t>
+              <w:t>: {player_email}</w:t>
             </w:r>
           </w:p>
           <w:p>
@@ -5113,6 +4645,12 @@
                 <w:lang w:val="en-US"/>
               </w:rPr>
               <w:t>Watch out for Impersonation</w:t>
+            </w:r>
+            <w:r>
+              <w:rPr>
+                <w:lang w:val="en-US"/>
+              </w:rPr>
+              <w:t>s</w:t>
             </w:r>
           </w:p>
           <w:p>
@@ -5128,6 +4666,142 @@
             <w:tcW w:w="5061" w:type="dxa"/>
             <w:vAlign w:val="center"/>
           </w:tcPr>
+          <w:p>
+            <w:pPr>
+              <w:rPr>
+                <w:lang w:val="en-US"/>
+              </w:rPr>
+            </w:pPr>
+          </w:p>
+          <w:p>
+            <w:pPr>
+              <w:rPr>
+                <w:lang w:val="en-US"/>
+              </w:rPr>
+            </w:pPr>
+            <w:r>
+              <w:rPr>
+                <w:lang w:val="en-US"/>
+              </w:rPr>
+              <w:t>Good morning,</w:t>
+            </w:r>
+            <w:r>
+              <w:rPr>
+                <w:lang w:val="en-US"/>
+              </w:rPr>
+              <w:t xml:space="preserve"> {player_name}!</w:t>
+            </w:r>
+          </w:p>
+          <w:p>
+            <w:pPr>
+              <w:rPr>
+                <w:lang w:val="en-US"/>
+              </w:rPr>
+            </w:pPr>
+            <w:r>
+              <w:rPr>
+                <w:lang w:val="en-US"/>
+              </w:rPr>
+              <w:t xml:space="preserve">[p] </w:t>
+            </w:r>
+          </w:p>
+          <w:p>
+            <w:pPr>
+              <w:rPr>
+                <w:lang w:val="en-US"/>
+              </w:rPr>
+            </w:pPr>
+            <w:r>
+              <w:rPr>
+                <w:lang w:val="en-US"/>
+              </w:rPr>
+              <w:t>[p]Yesterday one of our HR team received an email from an unknown sender impersonating a co-worker, and almost handed over some pretty sensitive data!</w:t>
+            </w:r>
+          </w:p>
+          <w:p>
+            <w:pPr>
+              <w:rPr>
+                <w:lang w:val="en-US"/>
+              </w:rPr>
+            </w:pPr>
+            <w:r>
+              <w:rPr>
+                <w:lang w:val="en-US"/>
+              </w:rPr>
+              <w:t xml:space="preserve">[p] </w:t>
+            </w:r>
+          </w:p>
+          <w:p>
+            <w:pPr>
+              <w:rPr>
+                <w:lang w:val="en-US"/>
+              </w:rPr>
+            </w:pPr>
+            <w:r>
+              <w:rPr>
+                <w:lang w:val="en-US"/>
+              </w:rPr>
+              <w:t>[p]Learning from that incident, we have to look very closely at the sender’s email address if they are legitimate. Those malicious actors have sneaky tricks up their sleeves!</w:t>
+            </w:r>
+          </w:p>
+          <w:p>
+            <w:pPr>
+              <w:rPr>
+                <w:lang w:val="en-US"/>
+              </w:rPr>
+            </w:pPr>
+            <w:r>
+              <w:rPr>
+                <w:lang w:val="en-US"/>
+              </w:rPr>
+              <w:t xml:space="preserve">[p] </w:t>
+            </w:r>
+          </w:p>
+          <w:p>
+            <w:pPr>
+              <w:rPr>
+                <w:lang w:val="en-US"/>
+              </w:rPr>
+            </w:pPr>
+            <w:r>
+              <w:rPr>
+                <w:lang w:val="en-US"/>
+              </w:rPr>
+              <w:t xml:space="preserve">[p]Fear not! I also have a trick to share: Hover over the email address. Click, hold and slowly drag over each letter, </w:t>
+            </w:r>
+            <w:r>
+              <w:rPr>
+                <w:lang w:val="en-US"/>
+              </w:rPr>
+              <w:t>sometimes they’ll reveal some spelling tricks the malicious actors used!</w:t>
+            </w:r>
+          </w:p>
+          <w:p>
+            <w:pPr>
+              <w:rPr>
+                <w:lang w:val="en-US"/>
+              </w:rPr>
+            </w:pPr>
+            <w:r>
+              <w:rPr>
+                <w:lang w:val="en-US"/>
+              </w:rPr>
+              <w:t xml:space="preserve">[p] </w:t>
+            </w:r>
+          </w:p>
+          <w:p>
+            <w:pPr>
+              <w:rPr>
+                <w:lang w:val="en-US"/>
+              </w:rPr>
+            </w:pPr>
+            <w:r>
+              <w:rPr>
+                <w:lang w:val="en-US"/>
+              </w:rPr>
+              <w:t>[p] IMG</w:t>
+            </w:r>
+          </w:p>
           <w:p>
             <w:pPr>
               <w:rPr>
@@ -5173,7 +4847,7 @@
               <w:rPr>
                 <w:lang w:val="en-US"/>
               </w:rPr>
-              <w:t>: Message</w:t>
+              <w:t>: Outbound</w:t>
             </w:r>
           </w:p>
           <w:p>
@@ -5196,6 +4870,12 @@
               </w:rPr>
               <w:t xml:space="preserve">: </w:t>
             </w:r>
+            <w:r>
+              <w:rPr>
+                <w:lang w:val="en-US"/>
+              </w:rPr>
+              <w:t>Nazrin</w:t>
+            </w:r>
           </w:p>
           <w:p>
             <w:pPr>
@@ -5217,6 +4897,28 @@
               </w:rPr>
               <w:t xml:space="preserve">: </w:t>
             </w:r>
+            <w:hyperlink r:id="rId15" w:history="1">
+              <w:r>
+                <w:rPr>
+                  <w:rStyle w:val="Hyperlink"/>
+                  <w:lang w:val="en-US"/>
+                </w:rPr>
+                <w:t>n</w:t>
+              </w:r>
+              <w:r>
+                <w:rPr>
+                  <w:rStyle w:val="Hyperlink"/>
+                </w:rPr>
+                <w:t>azrin.finance</w:t>
+              </w:r>
+              <w:r>
+                <w:rPr>
+                  <w:rStyle w:val="Hyperlink"/>
+                  <w:lang w:val="en-US"/>
+                </w:rPr>
+                <w:t>@abc.com.my</w:t>
+              </w:r>
+            </w:hyperlink>
           </w:p>
           <w:p>
             <w:pPr>
@@ -5236,21 +4938,7 @@
               <w:rPr>
                 <w:lang w:val="en-US"/>
               </w:rPr>
-              <w:t>: {</w:t>
-            </w:r>
-            <w:proofErr w:type="spellStart"/>
-            <w:r>
-              <w:rPr>
-                <w:lang w:val="en-US"/>
-              </w:rPr>
-              <w:t>player_email</w:t>
-            </w:r>
-            <w:proofErr w:type="spellEnd"/>
-            <w:r>
-              <w:rPr>
-                <w:lang w:val="en-US"/>
-              </w:rPr>
-              <w:t>}</w:t>
+              <w:t>: {player_email}</w:t>
             </w:r>
           </w:p>
           <w:p>
@@ -5293,6 +4981,12 @@
                 <w:lang w:val="en-US"/>
               </w:rPr>
               <w:t xml:space="preserve">: </w:t>
+            </w:r>
+            <w:r>
+              <w:rPr>
+                <w:lang w:val="en-US"/>
+              </w:rPr>
+              <w:t>Submit Today's Purchase Order</w:t>
             </w:r>
           </w:p>
           <w:p>
@@ -5316,6 +5010,2496 @@
                 <w:lang w:val="en-US"/>
               </w:rPr>
             </w:pPr>
+          </w:p>
+          <w:p>
+            <w:pPr>
+              <w:rPr>
+                <w:lang w:val="en-US"/>
+              </w:rPr>
+            </w:pPr>
+            <w:r>
+              <w:rPr>
+                <w:lang w:val="en-US"/>
+              </w:rPr>
+              <w:t>Please be careful, there are people impersonating us by using email addresses with similar spelling.</w:t>
+            </w:r>
+          </w:p>
+          <w:p>
+            <w:pPr>
+              <w:rPr>
+                <w:lang w:val="en-US"/>
+              </w:rPr>
+            </w:pPr>
+            <w:r>
+              <w:rPr>
+                <w:lang w:val="en-US"/>
+              </w:rPr>
+              <w:t xml:space="preserve">[p] </w:t>
+            </w:r>
+          </w:p>
+          <w:p>
+            <w:pPr>
+              <w:rPr>
+                <w:lang w:val="en-US"/>
+              </w:rPr>
+            </w:pPr>
+            <w:r>
+              <w:rPr>
+                <w:lang w:val="en-US"/>
+              </w:rPr>
+              <w:t>[p]Remember, our email domain is (name)@abc.com.my, if you received an email from someone claiming to be a co-worker but their domain is different, report them.</w:t>
+            </w:r>
+          </w:p>
+          <w:p>
+            <w:pPr>
+              <w:rPr>
+                <w:lang w:val="en-US"/>
+              </w:rPr>
+            </w:pPr>
+          </w:p>
+        </w:tc>
+      </w:tr>
+      <w:tr>
+        <w:trPr>
+          <w:trHeight w:val="360"/>
+        </w:trPr>
+        <w:tc>
+          <w:tcPr>
+            <w:tcW w:w="3955" w:type="dxa"/>
+            <w:vAlign w:val="center"/>
+          </w:tcPr>
+          <w:p>
+            <w:pPr>
+              <w:rPr>
+                <w:b/>
+                <w:bCs/>
+                <w:lang w:val="en-US"/>
+              </w:rPr>
+            </w:pPr>
+          </w:p>
+          <w:p>
+            <w:pPr>
+              <w:rPr>
+                <w:lang w:val="en-US"/>
+              </w:rPr>
+            </w:pPr>
+            <w:r>
+              <w:rPr>
+                <w:b/>
+                <w:bCs/>
+                <w:lang w:val="en-US"/>
+              </w:rPr>
+              <w:t>Type</w:t>
+            </w:r>
+            <w:r>
+              <w:rPr>
+                <w:lang w:val="en-US"/>
+              </w:rPr>
+              <w:t>: Message</w:t>
+            </w:r>
+          </w:p>
+          <w:p>
+            <w:pPr>
+              <w:rPr>
+                <w:lang w:val="en-US"/>
+              </w:rPr>
+            </w:pPr>
+            <w:r>
+              <w:rPr>
+                <w:b/>
+                <w:bCs/>
+                <w:lang w:val="en-US"/>
+              </w:rPr>
+              <w:t>Sender Name</w:t>
+            </w:r>
+            <w:r>
+              <w:rPr>
+                <w:lang w:val="en-US"/>
+              </w:rPr>
+              <w:t xml:space="preserve">: </w:t>
+            </w:r>
+            <w:r>
+              <w:rPr>
+                <w:lang w:val="en-US"/>
+              </w:rPr>
+              <w:t>Cyber News Daily</w:t>
+            </w:r>
+          </w:p>
+          <w:p>
+            <w:pPr>
+              <w:rPr>
+                <w:lang w:val="en-US"/>
+              </w:rPr>
+            </w:pPr>
+            <w:r>
+              <w:rPr>
+                <w:b/>
+                <w:bCs/>
+                <w:lang w:val="en-US"/>
+              </w:rPr>
+              <w:t>Sender Address</w:t>
+            </w:r>
+            <w:r>
+              <w:rPr>
+                <w:lang w:val="en-US"/>
+              </w:rPr>
+              <w:t xml:space="preserve">: </w:t>
+            </w:r>
+            <w:hyperlink r:id="rId16" w:history="1">
+              <w:r>
+                <w:rPr>
+                  <w:rStyle w:val="Hyperlink"/>
+                  <w:lang w:val="en-US"/>
+                </w:rPr>
+                <w:t>dailynews@cnd.com</w:t>
+              </w:r>
+            </w:hyperlink>
+            <w:r>
+              <w:rPr>
+                <w:lang w:val="en-US"/>
+              </w:rPr>
+              <w:t xml:space="preserve">   </w:t>
+            </w:r>
+          </w:p>
+          <w:p>
+            <w:pPr>
+              <w:rPr>
+                <w:lang w:val="en-US"/>
+              </w:rPr>
+            </w:pPr>
+            <w:r>
+              <w:rPr>
+                <w:b/>
+                <w:bCs/>
+                <w:lang w:val="en-US"/>
+              </w:rPr>
+              <w:t>To Address</w:t>
+            </w:r>
+            <w:r>
+              <w:rPr>
+                <w:lang w:val="en-US"/>
+              </w:rPr>
+              <w:t>: {player_email}</w:t>
+            </w:r>
+          </w:p>
+          <w:p>
+            <w:pPr>
+              <w:rPr>
+                <w:lang w:val="en-US"/>
+              </w:rPr>
+            </w:pPr>
+            <w:r>
+              <w:rPr>
+                <w:b/>
+                <w:bCs/>
+                <w:lang w:val="en-US"/>
+              </w:rPr>
+              <w:t>CC Address</w:t>
+            </w:r>
+            <w:r>
+              <w:rPr>
+                <w:lang w:val="en-US"/>
+              </w:rPr>
+              <w:t xml:space="preserve">: </w:t>
+            </w:r>
+          </w:p>
+          <w:p>
+            <w:pPr>
+              <w:rPr>
+                <w:lang w:val="en-US"/>
+              </w:rPr>
+            </w:pPr>
+            <w:r>
+              <w:rPr>
+                <w:b/>
+                <w:bCs/>
+                <w:lang w:val="en-US"/>
+              </w:rPr>
+              <w:t>Subject</w:t>
+            </w:r>
+            <w:r>
+              <w:rPr>
+                <w:lang w:val="en-US"/>
+              </w:rPr>
+              <w:t xml:space="preserve">: </w:t>
+            </w:r>
+            <w:r>
+              <w:rPr>
+                <w:lang w:val="en-US"/>
+              </w:rPr>
+              <w:t>Malwares: What are they?</w:t>
+            </w:r>
+          </w:p>
+          <w:p>
+            <w:pPr>
+              <w:rPr>
+                <w:b/>
+                <w:bCs/>
+                <w:lang w:val="en-US"/>
+              </w:rPr>
+            </w:pPr>
+          </w:p>
+        </w:tc>
+        <w:tc>
+          <w:tcPr>
+            <w:tcW w:w="5061" w:type="dxa"/>
+            <w:vAlign w:val="center"/>
+          </w:tcPr>
+          <w:p>
+            <w:pPr>
+              <w:rPr>
+                <w:lang w:val="en-US"/>
+              </w:rPr>
+            </w:pPr>
+          </w:p>
+          <w:p>
+            <w:pPr>
+              <w:rPr>
+                <w:lang w:val="en-US"/>
+              </w:rPr>
+            </w:pPr>
+            <w:r>
+              <w:rPr>
+                <w:lang w:val="en-US"/>
+              </w:rPr>
+              <w:t>Malware, short for ‘Malicious Software’, is a file containing scripts or commands that would run on your device after you downloaded it.</w:t>
+            </w:r>
+          </w:p>
+          <w:p>
+            <w:pPr>
+              <w:rPr>
+                <w:lang w:val="en-US"/>
+              </w:rPr>
+            </w:pPr>
+            <w:r>
+              <w:rPr>
+                <w:lang w:val="en-US"/>
+              </w:rPr>
+              <w:t xml:space="preserve">[p] </w:t>
+            </w:r>
+          </w:p>
+          <w:p>
+            <w:pPr>
+              <w:rPr>
+                <w:lang w:val="en-US"/>
+              </w:rPr>
+            </w:pPr>
+            <w:r>
+              <w:rPr>
+                <w:lang w:val="en-US"/>
+              </w:rPr>
+              <w:t>Today we will talk about 3 types of malwares:</w:t>
+            </w:r>
+          </w:p>
+          <w:p>
+            <w:pPr>
+              <w:rPr>
+                <w:lang w:val="en-US"/>
+              </w:rPr>
+            </w:pPr>
+            <w:r>
+              <w:rPr>
+                <w:lang w:val="en-US"/>
+              </w:rPr>
+              <w:t xml:space="preserve">[p] </w:t>
+            </w:r>
+          </w:p>
+          <w:p>
+            <w:r>
+              <w:rPr>
+                <w:lang w:val="en-US"/>
+              </w:rPr>
+              <w:t>[p]</w:t>
+            </w:r>
+            <w:r>
+              <w:rPr>
+                <w:lang w:val="en-US"/>
+              </w:rPr>
+              <w:t>[b]</w:t>
+            </w:r>
+            <w:r>
+              <w:t>Malware</w:t>
+            </w:r>
+            <w:r>
+              <w:t>[/b] :</w:t>
+            </w:r>
+            <w:r>
+              <w:t xml:space="preserve"> Software that runs in the background silently. They have various goals, such as recording what you type, </w:t>
+            </w:r>
+            <w:r>
+              <w:t>stealing personal information or spy on you.</w:t>
+            </w:r>
+          </w:p>
+          <w:p>
+            <w:pPr>
+              <w:rPr>
+                <w:lang w:val="en-US"/>
+              </w:rPr>
+            </w:pPr>
+            <w:r>
+              <w:rPr>
+                <w:lang w:val="en-US"/>
+              </w:rPr>
+              <w:t xml:space="preserve">[p] </w:t>
+            </w:r>
+          </w:p>
+          <w:p>
+            <w:r>
+              <w:rPr>
+                <w:lang w:val="en-US"/>
+              </w:rPr>
+              <w:t>[p][b]</w:t>
+            </w:r>
+            <w:r>
+              <w:t xml:space="preserve">Adware[/b] </w:t>
+            </w:r>
+            <w:r>
+              <w:t>:</w:t>
+            </w:r>
+            <w:r>
+              <w:t xml:space="preserve"> If it exists in your device, you will get spammed by various advertisements which can be very distracting.</w:t>
+            </w:r>
+          </w:p>
+          <w:p>
+            <w:pPr>
+              <w:rPr>
+                <w:lang w:val="en-US"/>
+              </w:rPr>
+            </w:pPr>
+            <w:r>
+              <w:rPr>
+                <w:lang w:val="en-US"/>
+              </w:rPr>
+              <w:t xml:space="preserve">[p] </w:t>
+            </w:r>
+          </w:p>
+          <w:p>
+            <w:r>
+              <w:rPr>
+                <w:lang w:val="en-US"/>
+              </w:rPr>
+              <w:t>[p]</w:t>
+            </w:r>
+            <w:r>
+              <w:rPr>
+                <w:lang w:val="en-US"/>
+              </w:rPr>
+              <w:t>[b]</w:t>
+            </w:r>
+            <w:r>
+              <w:t>Ransomware</w:t>
+            </w:r>
+            <w:r>
+              <w:t>[/b] :</w:t>
+            </w:r>
+            <w:r>
+              <w:t xml:space="preserve"> One of the most dangerous software to have in your device. It will lock your files and demand a large sum of money to unlock your files. Do not pay the ransom, it will not guarantee your files return.</w:t>
+            </w:r>
+          </w:p>
+          <w:p>
+            <w:pPr>
+              <w:rPr>
+                <w:lang w:val="en-US"/>
+              </w:rPr>
+            </w:pPr>
+            <w:r>
+              <w:rPr>
+                <w:lang w:val="en-US"/>
+              </w:rPr>
+              <w:t xml:space="preserve">[p] </w:t>
+            </w:r>
+          </w:p>
+          <w:p>
+            <w:pPr>
+              <w:rPr>
+                <w:lang w:val="en-US"/>
+              </w:rPr>
+            </w:pPr>
+            <w:r>
+              <w:rPr>
+                <w:lang w:val="en-US"/>
+              </w:rPr>
+              <w:lastRenderedPageBreak/>
+              <w:t>[p]Be careful of what you download</w:t>
+            </w:r>
+            <w:r>
+              <w:rPr>
+                <w:lang w:val="en-US"/>
+              </w:rPr>
+              <w:t>, and act quickly if your antivirus found any threats!</w:t>
+            </w:r>
+          </w:p>
+          <w:p>
+            <w:pPr>
+              <w:rPr>
+                <w:lang w:val="en-US"/>
+              </w:rPr>
+            </w:pPr>
+          </w:p>
+        </w:tc>
+      </w:tr>
+      <w:tr>
+        <w:trPr>
+          <w:trHeight w:val="360"/>
+        </w:trPr>
+        <w:tc>
+          <w:tcPr>
+            <w:tcW w:w="3955" w:type="dxa"/>
+            <w:vAlign w:val="center"/>
+          </w:tcPr>
+          <w:p>
+            <w:pPr>
+              <w:rPr>
+                <w:b/>
+                <w:bCs/>
+                <w:lang w:val="en-US"/>
+              </w:rPr>
+            </w:pPr>
+          </w:p>
+          <w:p>
+            <w:pPr>
+              <w:rPr>
+                <w:lang w:val="en-US"/>
+              </w:rPr>
+            </w:pPr>
+            <w:r>
+              <w:rPr>
+                <w:b/>
+                <w:bCs/>
+                <w:lang w:val="en-US"/>
+              </w:rPr>
+              <w:t>Type</w:t>
+            </w:r>
+            <w:r>
+              <w:rPr>
+                <w:lang w:val="en-US"/>
+              </w:rPr>
+              <w:t xml:space="preserve">: </w:t>
+            </w:r>
+            <w:r>
+              <w:rPr>
+                <w:lang w:val="en-US"/>
+              </w:rPr>
+              <w:t>Inbound</w:t>
+            </w:r>
+          </w:p>
+          <w:p>
+            <w:pPr>
+              <w:rPr>
+                <w:lang w:val="en-US"/>
+              </w:rPr>
+            </w:pPr>
+            <w:r>
+              <w:rPr>
+                <w:b/>
+                <w:bCs/>
+                <w:lang w:val="en-US"/>
+              </w:rPr>
+              <w:t>Sender Name</w:t>
+            </w:r>
+            <w:r>
+              <w:rPr>
+                <w:lang w:val="en-US"/>
+              </w:rPr>
+              <w:t xml:space="preserve">: </w:t>
+            </w:r>
+            <w:r>
+              <w:rPr>
+                <w:lang w:val="en-US"/>
+              </w:rPr>
+              <w:t>Jusco</w:t>
+            </w:r>
+            <w:r>
+              <w:rPr>
+                <w:lang w:val="en-US"/>
+              </w:rPr>
+              <w:t xml:space="preserve"> Kinta City</w:t>
+            </w:r>
+          </w:p>
+          <w:p>
+            <w:pPr>
+              <w:rPr>
+                <w:lang w:val="en-US"/>
+              </w:rPr>
+            </w:pPr>
+            <w:r>
+              <w:rPr>
+                <w:b/>
+                <w:bCs/>
+                <w:lang w:val="en-US"/>
+              </w:rPr>
+              <w:t>Sender Address</w:t>
+            </w:r>
+            <w:r>
+              <w:rPr>
+                <w:lang w:val="en-US"/>
+              </w:rPr>
+              <w:t xml:space="preserve">: </w:t>
+            </w:r>
+            <w:r>
+              <w:rPr>
+                <w:lang w:val="en-US"/>
+              </w:rPr>
+              <w:t>kinta@jusco.com</w:t>
+            </w:r>
+          </w:p>
+          <w:p>
+            <w:pPr>
+              <w:rPr>
+                <w:lang w:val="en-US"/>
+              </w:rPr>
+            </w:pPr>
+            <w:r>
+              <w:rPr>
+                <w:b/>
+                <w:bCs/>
+                <w:lang w:val="en-US"/>
+              </w:rPr>
+              <w:t>To Address</w:t>
+            </w:r>
+            <w:r>
+              <w:rPr>
+                <w:lang w:val="en-US"/>
+              </w:rPr>
+              <w:t>: {player_email}</w:t>
+            </w:r>
+          </w:p>
+          <w:p>
+            <w:pPr>
+              <w:rPr>
+                <w:lang w:val="en-US"/>
+              </w:rPr>
+            </w:pPr>
+            <w:r>
+              <w:rPr>
+                <w:b/>
+                <w:bCs/>
+                <w:lang w:val="en-US"/>
+              </w:rPr>
+              <w:t>CC Address</w:t>
+            </w:r>
+            <w:r>
+              <w:rPr>
+                <w:lang w:val="en-US"/>
+              </w:rPr>
+              <w:t xml:space="preserve">: </w:t>
+            </w:r>
+          </w:p>
+          <w:p>
+            <w:pPr>
+              <w:rPr>
+                <w:lang w:val="en-US"/>
+              </w:rPr>
+            </w:pPr>
+            <w:r>
+              <w:rPr>
+                <w:b/>
+                <w:bCs/>
+                <w:lang w:val="en-US"/>
+              </w:rPr>
+              <w:t>Subject</w:t>
+            </w:r>
+            <w:r>
+              <w:rPr>
+                <w:lang w:val="en-US"/>
+              </w:rPr>
+              <w:t xml:space="preserve">: </w:t>
+            </w:r>
+            <w:r>
+              <w:rPr>
+                <w:lang w:val="en-US"/>
+              </w:rPr>
+              <w:t>Order for Stationeries</w:t>
+            </w:r>
+          </w:p>
+          <w:p>
+            <w:pPr>
+              <w:rPr>
+                <w:b/>
+                <w:bCs/>
+                <w:lang w:val="en-US"/>
+              </w:rPr>
+            </w:pPr>
+          </w:p>
+        </w:tc>
+        <w:tc>
+          <w:tcPr>
+            <w:tcW w:w="5061" w:type="dxa"/>
+            <w:vAlign w:val="center"/>
+          </w:tcPr>
+          <w:p>
+            <w:pPr>
+              <w:rPr>
+                <w:lang w:val="en-US"/>
+              </w:rPr>
+            </w:pPr>
+          </w:p>
+          <w:p>
+            <w:pPr>
+              <w:rPr>
+                <w:lang w:val="en-US"/>
+              </w:rPr>
+            </w:pPr>
+            <w:r>
+              <w:rPr>
+                <w:lang w:val="en-US"/>
+              </w:rPr>
+              <w:t>Dear ABC Stationeries,</w:t>
+            </w:r>
+          </w:p>
+          <w:p>
+            <w:pPr>
+              <w:rPr>
+                <w:lang w:val="en-US"/>
+              </w:rPr>
+            </w:pPr>
+            <w:r>
+              <w:rPr>
+                <w:lang w:val="en-US"/>
+              </w:rPr>
+              <w:t xml:space="preserve">[p] </w:t>
+            </w:r>
+          </w:p>
+          <w:p>
+            <w:r>
+              <w:rPr>
+                <w:lang w:val="en-US"/>
+              </w:rPr>
+              <w:t xml:space="preserve">[p]Our Purchase Order </w:t>
+            </w:r>
+            <w:r>
+              <w:rPr>
+                <w:lang w:val="en-US"/>
+              </w:rPr>
+              <w:t xml:space="preserve">for various stationeries </w:t>
+            </w:r>
+            <w:r>
+              <w:rPr>
+                <w:lang w:val="en-US"/>
+              </w:rPr>
+              <w:t xml:space="preserve">is attached in this email. </w:t>
+            </w:r>
+            <w:r>
+              <w:t>If there are any issues with fulfilling this request, please contact us immediately.</w:t>
+            </w:r>
+          </w:p>
+          <w:p>
+            <w:r>
+              <w:t xml:space="preserve">[p] </w:t>
+            </w:r>
+          </w:p>
+          <w:p>
+            <w:r>
+              <w:t xml:space="preserve">[p] </w:t>
+            </w:r>
+          </w:p>
+          <w:p>
+            <w:r>
+              <w:t>[p]Regards,</w:t>
+            </w:r>
+          </w:p>
+          <w:p>
+            <w:pPr>
+              <w:rPr>
+                <w:lang w:val="en-US"/>
+              </w:rPr>
+            </w:pPr>
+            <w:r>
+              <w:rPr>
+                <w:lang w:val="en-US"/>
+              </w:rPr>
+              <w:t xml:space="preserve">[p] </w:t>
+            </w:r>
+          </w:p>
+          <w:p>
+            <w:pPr>
+              <w:rPr>
+                <w:lang w:val="en-US"/>
+              </w:rPr>
+            </w:pPr>
+            <w:r>
+              <w:rPr>
+                <w:lang w:val="en-US"/>
+              </w:rPr>
+              <w:t>[p]</w:t>
+            </w:r>
+            <w:r>
+              <w:rPr>
+                <w:lang w:val="en-US"/>
+              </w:rPr>
+              <w:t>Jane Navarednam</w:t>
+            </w:r>
+          </w:p>
+          <w:p>
+            <w:pPr>
+              <w:rPr>
+                <w:lang w:val="en-US"/>
+              </w:rPr>
+            </w:pPr>
+            <w:r>
+              <w:rPr>
+                <w:lang w:val="en-US"/>
+              </w:rPr>
+              <w:t>[p]Purchasing Officer</w:t>
+            </w:r>
+          </w:p>
+          <w:p>
+            <w:pPr>
+              <w:rPr>
+                <w:lang w:val="en-US"/>
+              </w:rPr>
+            </w:pPr>
+          </w:p>
+        </w:tc>
+      </w:tr>
+      <w:tr>
+        <w:trPr>
+          <w:trHeight w:val="360"/>
+        </w:trPr>
+        <w:tc>
+          <w:tcPr>
+            <w:tcW w:w="3955" w:type="dxa"/>
+            <w:vAlign w:val="center"/>
+          </w:tcPr>
+          <w:p>
+            <w:pPr>
+              <w:rPr>
+                <w:b/>
+                <w:bCs/>
+                <w:lang w:val="en-US"/>
+              </w:rPr>
+            </w:pPr>
+          </w:p>
+          <w:p>
+            <w:pPr>
+              <w:rPr>
+                <w:lang w:val="en-US"/>
+              </w:rPr>
+            </w:pPr>
+            <w:r>
+              <w:rPr>
+                <w:b/>
+                <w:bCs/>
+                <w:lang w:val="en-US"/>
+              </w:rPr>
+              <w:t>Type</w:t>
+            </w:r>
+            <w:r>
+              <w:rPr>
+                <w:lang w:val="en-US"/>
+              </w:rPr>
+              <w:t xml:space="preserve">: </w:t>
+            </w:r>
+            <w:r>
+              <w:rPr>
+                <w:lang w:val="en-US"/>
+              </w:rPr>
+              <w:t>Message</w:t>
+            </w:r>
+          </w:p>
+          <w:p>
+            <w:pPr>
+              <w:rPr>
+                <w:lang w:val="en-US"/>
+              </w:rPr>
+            </w:pPr>
+            <w:r>
+              <w:rPr>
+                <w:b/>
+                <w:bCs/>
+                <w:lang w:val="en-US"/>
+              </w:rPr>
+              <w:t>Sender Name</w:t>
+            </w:r>
+            <w:r>
+              <w:rPr>
+                <w:lang w:val="en-US"/>
+              </w:rPr>
+              <w:t xml:space="preserve">: </w:t>
+            </w:r>
+            <w:r>
+              <w:rPr>
+                <w:lang w:val="en-US"/>
+              </w:rPr>
+              <w:t>C17</w:t>
+            </w:r>
+          </w:p>
+          <w:p>
+            <w:pPr>
+              <w:rPr>
+                <w:lang w:val="en-US"/>
+              </w:rPr>
+            </w:pPr>
+            <w:r>
+              <w:rPr>
+                <w:b/>
+                <w:bCs/>
+                <w:lang w:val="en-US"/>
+              </w:rPr>
+              <w:t>Sender Address</w:t>
+            </w:r>
+            <w:r>
+              <w:rPr>
+                <w:lang w:val="en-US"/>
+              </w:rPr>
+              <w:t xml:space="preserve">: </w:t>
+            </w:r>
+            <w:r>
+              <w:rPr>
+                <w:lang w:val="en-US"/>
+              </w:rPr>
+              <w:t>recruiting@c17.com</w:t>
+            </w:r>
+          </w:p>
+          <w:p>
+            <w:pPr>
+              <w:rPr>
+                <w:lang w:val="en-US"/>
+              </w:rPr>
+            </w:pPr>
+            <w:r>
+              <w:rPr>
+                <w:b/>
+                <w:bCs/>
+                <w:lang w:val="en-US"/>
+              </w:rPr>
+              <w:t>To Address</w:t>
+            </w:r>
+            <w:r>
+              <w:rPr>
+                <w:lang w:val="en-US"/>
+              </w:rPr>
+              <w:t>: {player_email}</w:t>
+            </w:r>
+          </w:p>
+          <w:p>
+            <w:pPr>
+              <w:rPr>
+                <w:lang w:val="en-US"/>
+              </w:rPr>
+            </w:pPr>
+            <w:r>
+              <w:rPr>
+                <w:b/>
+                <w:bCs/>
+                <w:lang w:val="en-US"/>
+              </w:rPr>
+              <w:t>CC Address</w:t>
+            </w:r>
+            <w:r>
+              <w:rPr>
+                <w:lang w:val="en-US"/>
+              </w:rPr>
+              <w:t xml:space="preserve">: </w:t>
+            </w:r>
+          </w:p>
+          <w:p>
+            <w:pPr>
+              <w:rPr>
+                <w:lang w:val="en-US"/>
+              </w:rPr>
+            </w:pPr>
+            <w:r>
+              <w:rPr>
+                <w:b/>
+                <w:bCs/>
+                <w:lang w:val="en-US"/>
+              </w:rPr>
+              <w:t>Subject</w:t>
+            </w:r>
+            <w:r>
+              <w:rPr>
+                <w:lang w:val="en-US"/>
+              </w:rPr>
+              <w:t xml:space="preserve">: </w:t>
+            </w:r>
+            <w:r>
+              <w:rPr>
+                <w:lang w:val="en-US"/>
+              </w:rPr>
+              <w:t>Work at C17 Stationeries!</w:t>
+            </w:r>
+          </w:p>
+          <w:p>
+            <w:pPr>
+              <w:rPr>
+                <w:b/>
+                <w:bCs/>
+                <w:lang w:val="en-US"/>
+              </w:rPr>
+            </w:pPr>
+          </w:p>
+        </w:tc>
+        <w:tc>
+          <w:tcPr>
+            <w:tcW w:w="5061" w:type="dxa"/>
+            <w:vAlign w:val="center"/>
+          </w:tcPr>
+          <w:p>
+            <w:pPr>
+              <w:rPr>
+                <w:lang w:val="en-US"/>
+              </w:rPr>
+            </w:pPr>
+            <w:r>
+              <w:rPr>
+                <w:lang w:val="en-US"/>
+              </w:rPr>
+              <w:t>Image of recruiting</w:t>
+            </w:r>
+          </w:p>
+          <w:p>
+            <w:pPr>
+              <w:rPr>
+                <w:lang w:val="en-US"/>
+              </w:rPr>
+            </w:pPr>
+            <w:r>
+              <w:rPr>
+                <w:lang w:val="en-US"/>
+              </w:rPr>
+              <w:t>C17</w:t>
+            </w:r>
+          </w:p>
+          <w:p>
+            <w:pPr>
+              <w:rPr>
+                <w:lang w:val="en-US"/>
+              </w:rPr>
+            </w:pPr>
+            <w:r>
+              <w:rPr>
+                <w:lang w:val="en-US"/>
+              </w:rPr>
+              <w:t>Sub brand of parent company: The Combine Group</w:t>
+            </w:r>
+          </w:p>
+        </w:tc>
+      </w:tr>
+      <w:tr>
+        <w:trPr>
+          <w:trHeight w:val="360"/>
+        </w:trPr>
+        <w:tc>
+          <w:tcPr>
+            <w:tcW w:w="3955" w:type="dxa"/>
+            <w:vAlign w:val="center"/>
+          </w:tcPr>
+          <w:p>
+            <w:pPr>
+              <w:rPr>
+                <w:b/>
+                <w:bCs/>
+                <w:lang w:val="en-US"/>
+              </w:rPr>
+            </w:pPr>
+          </w:p>
+          <w:p>
+            <w:pPr>
+              <w:rPr>
+                <w:lang w:val="en-US"/>
+              </w:rPr>
+            </w:pPr>
+            <w:r>
+              <w:rPr>
+                <w:b/>
+                <w:bCs/>
+                <w:lang w:val="en-US"/>
+              </w:rPr>
+              <w:t>Type</w:t>
+            </w:r>
+            <w:r>
+              <w:rPr>
+                <w:lang w:val="en-US"/>
+              </w:rPr>
+              <w:t xml:space="preserve">: </w:t>
+            </w:r>
+            <w:r>
+              <w:rPr>
+                <w:lang w:val="en-US"/>
+              </w:rPr>
+              <w:t>Inbound</w:t>
+            </w:r>
+          </w:p>
+          <w:p>
+            <w:pPr>
+              <w:rPr>
+                <w:lang w:val="en-US"/>
+              </w:rPr>
+            </w:pPr>
+            <w:r>
+              <w:rPr>
+                <w:b/>
+                <w:bCs/>
+                <w:lang w:val="en-US"/>
+              </w:rPr>
+              <w:t>Sender Name</w:t>
+            </w:r>
+            <w:r>
+              <w:rPr>
+                <w:lang w:val="en-US"/>
+              </w:rPr>
+              <w:t xml:space="preserve">: </w:t>
+            </w:r>
+            <w:r>
+              <w:rPr>
+                <w:lang w:val="en-US"/>
+              </w:rPr>
+              <w:t>Mike</w:t>
+            </w:r>
+          </w:p>
+          <w:p>
+            <w:pPr>
+              <w:rPr>
+                <w:lang w:val="en-US"/>
+              </w:rPr>
+            </w:pPr>
+            <w:r>
+              <w:rPr>
+                <w:b/>
+                <w:bCs/>
+                <w:lang w:val="en-US"/>
+              </w:rPr>
+              <w:t>Sender Address</w:t>
+            </w:r>
+            <w:r>
+              <w:rPr>
+                <w:lang w:val="en-US"/>
+              </w:rPr>
+              <w:t xml:space="preserve">: </w:t>
+            </w:r>
+            <w:r>
+              <w:rPr>
+                <w:lang w:val="en-US"/>
+              </w:rPr>
+              <w:t>mike</w:t>
+            </w:r>
+            <w:r>
+              <w:rPr>
+                <w:lang w:val="en-US"/>
+              </w:rPr>
+              <w:t>17</w:t>
+            </w:r>
+            <w:r>
+              <w:rPr>
+                <w:lang w:val="en-US"/>
+              </w:rPr>
+              <w:t>854</w:t>
+            </w:r>
+            <w:r>
+              <w:rPr>
+                <w:lang w:val="en-US"/>
+              </w:rPr>
+              <w:t>@</w:t>
+            </w:r>
+            <w:r>
+              <w:rPr>
+                <w:lang w:val="en-US"/>
+              </w:rPr>
+              <w:t>email</w:t>
+            </w:r>
+            <w:r>
+              <w:rPr>
+                <w:lang w:val="en-US"/>
+              </w:rPr>
+              <w:t>.com</w:t>
+            </w:r>
+          </w:p>
+          <w:p>
+            <w:pPr>
+              <w:rPr>
+                <w:lang w:val="en-US"/>
+              </w:rPr>
+            </w:pPr>
+            <w:r>
+              <w:rPr>
+                <w:b/>
+                <w:bCs/>
+                <w:lang w:val="en-US"/>
+              </w:rPr>
+              <w:t>To Address</w:t>
+            </w:r>
+            <w:r>
+              <w:rPr>
+                <w:lang w:val="en-US"/>
+              </w:rPr>
+              <w:t>: {player_email}</w:t>
+            </w:r>
+          </w:p>
+          <w:p>
+            <w:pPr>
+              <w:rPr>
+                <w:lang w:val="en-US"/>
+              </w:rPr>
+            </w:pPr>
+            <w:r>
+              <w:rPr>
+                <w:b/>
+                <w:bCs/>
+                <w:lang w:val="en-US"/>
+              </w:rPr>
+              <w:t>CC Address</w:t>
+            </w:r>
+            <w:r>
+              <w:rPr>
+                <w:lang w:val="en-US"/>
+              </w:rPr>
+              <w:t xml:space="preserve">: </w:t>
+            </w:r>
+          </w:p>
+          <w:p>
+            <w:pPr>
+              <w:rPr>
+                <w:lang w:val="en-US"/>
+              </w:rPr>
+            </w:pPr>
+            <w:r>
+              <w:rPr>
+                <w:b/>
+                <w:bCs/>
+                <w:lang w:val="en-US"/>
+              </w:rPr>
+              <w:t>Subject</w:t>
+            </w:r>
+            <w:r>
+              <w:rPr>
+                <w:lang w:val="en-US"/>
+              </w:rPr>
+              <w:t xml:space="preserve">: </w:t>
+            </w:r>
+            <w:r>
+              <w:rPr>
+                <w:lang w:val="en-US"/>
+              </w:rPr>
+              <w:t xml:space="preserve">New </w:t>
+            </w:r>
+            <w:r>
+              <w:rPr>
+                <w:lang w:val="en-US"/>
+              </w:rPr>
+              <w:t>Purchase Order</w:t>
+            </w:r>
+          </w:p>
+          <w:p>
+            <w:pPr>
+              <w:rPr>
+                <w:b/>
+                <w:bCs/>
+                <w:lang w:val="en-US"/>
+              </w:rPr>
+            </w:pPr>
+          </w:p>
+        </w:tc>
+        <w:tc>
+          <w:tcPr>
+            <w:tcW w:w="5061" w:type="dxa"/>
+            <w:vAlign w:val="center"/>
+          </w:tcPr>
+          <w:p>
+            <w:pPr>
+              <w:rPr>
+                <w:lang w:val="en-US"/>
+              </w:rPr>
+            </w:pPr>
+          </w:p>
+          <w:p>
+            <w:pPr>
+              <w:rPr>
+                <w:lang w:val="en-US"/>
+              </w:rPr>
+            </w:pPr>
+            <w:r>
+              <w:rPr>
+                <w:lang w:val="en-US"/>
+              </w:rPr>
+              <w:t>Hi {player_name}! I am Mike!</w:t>
+            </w:r>
+          </w:p>
+          <w:p>
+            <w:pPr>
+              <w:rPr>
+                <w:lang w:val="en-US"/>
+              </w:rPr>
+            </w:pPr>
+            <w:r>
+              <w:rPr>
+                <w:lang w:val="en-US"/>
+              </w:rPr>
+              <w:t xml:space="preserve">[p] </w:t>
+            </w:r>
+          </w:p>
+          <w:p>
+            <w:pPr>
+              <w:rPr>
+                <w:lang w:val="en-US"/>
+              </w:rPr>
+            </w:pPr>
+            <w:r>
+              <w:rPr>
+                <w:lang w:val="en-US"/>
+              </w:rPr>
+              <w:t>[p]Please download and send the purchas order attach</w:t>
+            </w:r>
+            <w:r>
+              <w:rPr>
+                <w:lang w:val="en-US"/>
+              </w:rPr>
+              <w:t xml:space="preserve"> in this email</w:t>
+            </w:r>
+            <w:r>
+              <w:rPr>
+                <w:lang w:val="en-US"/>
+              </w:rPr>
+              <w:t xml:space="preserve"> and send to finance.</w:t>
+            </w:r>
+          </w:p>
+          <w:p>
+            <w:pPr>
+              <w:rPr>
+                <w:lang w:val="en-US"/>
+              </w:rPr>
+            </w:pPr>
+            <w:r>
+              <w:rPr>
+                <w:lang w:val="en-US"/>
+              </w:rPr>
+              <w:t xml:space="preserve">[p] </w:t>
+            </w:r>
+          </w:p>
+          <w:p>
+            <w:pPr>
+              <w:rPr>
+                <w:lang w:val="en-US"/>
+              </w:rPr>
+            </w:pPr>
+            <w:r>
+              <w:rPr>
+                <w:lang w:val="en-US"/>
+              </w:rPr>
+              <w:t>[p]Regards,</w:t>
+            </w:r>
+          </w:p>
+          <w:p>
+            <w:pPr>
+              <w:rPr>
+                <w:lang w:val="en-US"/>
+              </w:rPr>
+            </w:pPr>
+            <w:r>
+              <w:rPr>
+                <w:lang w:val="en-US"/>
+              </w:rPr>
+              <w:t>[p]Mike</w:t>
+            </w:r>
+          </w:p>
+          <w:p>
+            <w:pPr>
+              <w:rPr>
+                <w:lang w:val="en-US"/>
+              </w:rPr>
+            </w:pPr>
+          </w:p>
+        </w:tc>
+      </w:tr>
+      <w:tr>
+        <w:trPr>
+          <w:trHeight w:val="360"/>
+        </w:trPr>
+        <w:tc>
+          <w:tcPr>
+            <w:tcW w:w="3955" w:type="dxa"/>
+            <w:vAlign w:val="center"/>
+          </w:tcPr>
+          <w:p>
+            <w:pPr>
+              <w:rPr>
+                <w:b/>
+                <w:bCs/>
+                <w:lang w:val="en-US"/>
+              </w:rPr>
+            </w:pPr>
+          </w:p>
+          <w:p>
+            <w:pPr>
+              <w:rPr>
+                <w:lang w:val="en-US"/>
+              </w:rPr>
+            </w:pPr>
+            <w:r>
+              <w:rPr>
+                <w:b/>
+                <w:bCs/>
+                <w:lang w:val="en-US"/>
+              </w:rPr>
+              <w:t>Type</w:t>
+            </w:r>
+            <w:r>
+              <w:rPr>
+                <w:lang w:val="en-US"/>
+              </w:rPr>
+              <w:t>: Inbound</w:t>
+            </w:r>
+          </w:p>
+          <w:p>
+            <w:pPr>
+              <w:rPr>
+                <w:lang w:val="en-US"/>
+              </w:rPr>
+            </w:pPr>
+            <w:r>
+              <w:rPr>
+                <w:b/>
+                <w:bCs/>
+                <w:lang w:val="en-US"/>
+              </w:rPr>
+              <w:t>Sender Name</w:t>
+            </w:r>
+            <w:r>
+              <w:rPr>
+                <w:lang w:val="en-US"/>
+              </w:rPr>
+              <w:t xml:space="preserve">: </w:t>
+            </w:r>
+            <w:r>
+              <w:rPr>
+                <w:lang w:val="en-US"/>
+              </w:rPr>
+              <w:t>MengHong Chan</w:t>
+            </w:r>
+          </w:p>
+          <w:p>
+            <w:pPr>
+              <w:rPr>
+                <w:lang w:val="en-US"/>
+              </w:rPr>
+            </w:pPr>
+            <w:r>
+              <w:rPr>
+                <w:b/>
+                <w:bCs/>
+                <w:lang w:val="en-US"/>
+              </w:rPr>
+              <w:t>Sender Address</w:t>
+            </w:r>
+            <w:r>
+              <w:rPr>
+                <w:lang w:val="en-US"/>
+              </w:rPr>
+              <w:t xml:space="preserve">: </w:t>
+            </w:r>
+            <w:r>
+              <w:rPr>
+                <w:lang w:val="en-US"/>
+              </w:rPr>
+              <w:t>menghong23@email.com</w:t>
+            </w:r>
+          </w:p>
+          <w:p>
+            <w:pPr>
+              <w:rPr>
+                <w:lang w:val="en-US"/>
+              </w:rPr>
+            </w:pPr>
+            <w:r>
+              <w:rPr>
+                <w:b/>
+                <w:bCs/>
+                <w:lang w:val="en-US"/>
+              </w:rPr>
+              <w:t>To Address</w:t>
+            </w:r>
+            <w:r>
+              <w:rPr>
+                <w:lang w:val="en-US"/>
+              </w:rPr>
+              <w:t>: {player_email}</w:t>
+            </w:r>
+          </w:p>
+          <w:p>
+            <w:pPr>
+              <w:rPr>
+                <w:lang w:val="en-US"/>
+              </w:rPr>
+            </w:pPr>
+            <w:r>
+              <w:rPr>
+                <w:b/>
+                <w:bCs/>
+                <w:lang w:val="en-US"/>
+              </w:rPr>
+              <w:t>CC Address</w:t>
+            </w:r>
+            <w:r>
+              <w:rPr>
+                <w:lang w:val="en-US"/>
+              </w:rPr>
+              <w:t xml:space="preserve">: </w:t>
+            </w:r>
+          </w:p>
+          <w:p>
+            <w:pPr>
+              <w:rPr>
+                <w:lang w:val="en-US"/>
+              </w:rPr>
+            </w:pPr>
+            <w:r>
+              <w:rPr>
+                <w:b/>
+                <w:bCs/>
+                <w:lang w:val="en-US"/>
+              </w:rPr>
+              <w:t>Subject</w:t>
+            </w:r>
+            <w:r>
+              <w:rPr>
+                <w:lang w:val="en-US"/>
+              </w:rPr>
+              <w:t xml:space="preserve">: </w:t>
+            </w:r>
+            <w:r>
+              <w:rPr>
+                <w:lang w:val="en-US"/>
+              </w:rPr>
+              <w:t>Buying Stationeries for Koperasi</w:t>
+            </w:r>
+          </w:p>
+          <w:p>
+            <w:pPr>
+              <w:rPr>
+                <w:b/>
+                <w:bCs/>
+                <w:lang w:val="en-US"/>
+              </w:rPr>
+            </w:pPr>
+          </w:p>
+        </w:tc>
+        <w:tc>
+          <w:tcPr>
+            <w:tcW w:w="5061" w:type="dxa"/>
+            <w:vAlign w:val="center"/>
+          </w:tcPr>
+          <w:p>
+            <w:pPr>
+              <w:rPr>
+                <w:lang w:val="en-US"/>
+              </w:rPr>
+            </w:pPr>
+          </w:p>
+          <w:p>
+            <w:pPr>
+              <w:rPr>
+                <w:lang w:val="en-US"/>
+              </w:rPr>
+            </w:pPr>
+            <w:r>
+              <w:rPr>
+                <w:lang w:val="en-US"/>
+              </w:rPr>
+              <w:t>Dear ABC Stationeries,</w:t>
+            </w:r>
+          </w:p>
+          <w:p>
+            <w:pPr>
+              <w:rPr>
+                <w:lang w:val="en-US"/>
+              </w:rPr>
+            </w:pPr>
+            <w:r>
+              <w:rPr>
+                <w:lang w:val="en-US"/>
+              </w:rPr>
+              <w:t xml:space="preserve">[p] </w:t>
+            </w:r>
+          </w:p>
+          <w:p>
+            <w:pPr>
+              <w:rPr>
+                <w:lang w:val="en-US"/>
+              </w:rPr>
+            </w:pPr>
+            <w:r>
+              <w:rPr>
+                <w:lang w:val="en-US"/>
+              </w:rPr>
+              <w:t>[p]Attached in this email is a purchase order for Black, Blue and Red pens 100 each.</w:t>
+            </w:r>
+            <w:r>
+              <w:rPr>
+                <w:lang w:val="en-US"/>
+              </w:rPr>
+              <w:t xml:space="preserve"> Correction Tape 50 units.</w:t>
+            </w:r>
+          </w:p>
+          <w:p>
+            <w:pPr>
+              <w:rPr>
+                <w:lang w:val="en-US"/>
+              </w:rPr>
+            </w:pPr>
+            <w:r>
+              <w:rPr>
+                <w:lang w:val="en-US"/>
+              </w:rPr>
+              <w:t xml:space="preserve">[p] </w:t>
+            </w:r>
+          </w:p>
+          <w:p>
+            <w:pPr>
+              <w:rPr>
+                <w:lang w:val="en-US"/>
+              </w:rPr>
+            </w:pPr>
+            <w:r>
+              <w:rPr>
+                <w:lang w:val="en-US"/>
+              </w:rPr>
+              <w:t>[p]</w:t>
+            </w:r>
+            <w:r>
+              <w:rPr>
+                <w:lang w:val="en-US"/>
+              </w:rPr>
+              <w:t>Please contact me if there are any issues.</w:t>
+            </w:r>
+          </w:p>
+          <w:p>
+            <w:pPr>
+              <w:rPr>
+                <w:lang w:val="en-US"/>
+              </w:rPr>
+            </w:pPr>
+            <w:r>
+              <w:rPr>
+                <w:lang w:val="en-US"/>
+              </w:rPr>
+              <w:t xml:space="preserve">[p] </w:t>
+            </w:r>
+          </w:p>
+          <w:p>
+            <w:pPr>
+              <w:rPr>
+                <w:lang w:val="en-US"/>
+              </w:rPr>
+            </w:pPr>
+            <w:r>
+              <w:rPr>
+                <w:lang w:val="en-US"/>
+              </w:rPr>
+              <w:t>[p]- Chan Meng Hong</w:t>
+            </w:r>
+          </w:p>
+          <w:p>
+            <w:pPr>
+              <w:rPr>
+                <w:lang w:val="en-US"/>
+              </w:rPr>
+            </w:pPr>
+            <w:r>
+              <w:rPr>
+                <w:lang w:val="en-US"/>
+              </w:rPr>
+              <w:t>[p]SMJKC Poi Lam</w:t>
+            </w:r>
+          </w:p>
+          <w:p>
+            <w:pPr>
+              <w:rPr>
+                <w:lang w:val="en-US"/>
+              </w:rPr>
+            </w:pPr>
+          </w:p>
+        </w:tc>
+      </w:tr>
+      <w:tr>
+        <w:trPr>
+          <w:trHeight w:val="360"/>
+        </w:trPr>
+        <w:tc>
+          <w:tcPr>
+            <w:tcW w:w="3955" w:type="dxa"/>
+            <w:vAlign w:val="center"/>
+          </w:tcPr>
+          <w:p>
+            <w:pPr>
+              <w:rPr>
+                <w:b/>
+                <w:bCs/>
+                <w:lang w:val="en-US"/>
+              </w:rPr>
+            </w:pPr>
+          </w:p>
+          <w:p>
+            <w:pPr>
+              <w:rPr>
+                <w:lang w:val="en-US"/>
+              </w:rPr>
+            </w:pPr>
+            <w:r>
+              <w:rPr>
+                <w:b/>
+                <w:bCs/>
+                <w:lang w:val="en-US"/>
+              </w:rPr>
+              <w:t>Type</w:t>
+            </w:r>
+            <w:r>
+              <w:rPr>
+                <w:lang w:val="en-US"/>
+              </w:rPr>
+              <w:t>: Inbound</w:t>
+            </w:r>
+          </w:p>
+          <w:p>
+            <w:pPr>
+              <w:rPr>
+                <w:lang w:val="en-US"/>
+              </w:rPr>
+            </w:pPr>
+            <w:r>
+              <w:rPr>
+                <w:b/>
+                <w:bCs/>
+                <w:lang w:val="en-US"/>
+              </w:rPr>
+              <w:t>Sender Name</w:t>
+            </w:r>
+            <w:r>
+              <w:rPr>
+                <w:lang w:val="en-US"/>
+              </w:rPr>
+              <w:t xml:space="preserve">: </w:t>
+            </w:r>
+            <w:r>
+              <w:rPr>
+                <w:lang w:val="en-US"/>
+              </w:rPr>
+              <w:t>Jackson</w:t>
+            </w:r>
+          </w:p>
+          <w:p>
+            <w:pPr>
+              <w:rPr>
+                <w:lang w:val="en-US"/>
+              </w:rPr>
+            </w:pPr>
+            <w:r>
+              <w:rPr>
+                <w:b/>
+                <w:bCs/>
+                <w:lang w:val="en-US"/>
+              </w:rPr>
+              <w:t>Sender Address</w:t>
+            </w:r>
+            <w:r>
+              <w:rPr>
+                <w:lang w:val="en-US"/>
+              </w:rPr>
+              <w:t xml:space="preserve">: </w:t>
+            </w:r>
+            <w:r>
+              <w:rPr>
+                <w:lang w:val="en-US"/>
+              </w:rPr>
+              <w:t>jackson@lighthouse.com</w:t>
+            </w:r>
+          </w:p>
+          <w:p>
+            <w:pPr>
+              <w:rPr>
+                <w:lang w:val="en-US"/>
+              </w:rPr>
+            </w:pPr>
+            <w:r>
+              <w:rPr>
+                <w:b/>
+                <w:bCs/>
+                <w:lang w:val="en-US"/>
+              </w:rPr>
+              <w:t>To Address</w:t>
+            </w:r>
+            <w:r>
+              <w:rPr>
+                <w:lang w:val="en-US"/>
+              </w:rPr>
+              <w:t>: {player_email}</w:t>
+            </w:r>
+          </w:p>
+          <w:p>
+            <w:pPr>
+              <w:rPr>
+                <w:lang w:val="en-US"/>
+              </w:rPr>
+            </w:pPr>
+            <w:r>
+              <w:rPr>
+                <w:b/>
+                <w:bCs/>
+                <w:lang w:val="en-US"/>
+              </w:rPr>
+              <w:t>CC Address</w:t>
+            </w:r>
+            <w:r>
+              <w:rPr>
+                <w:lang w:val="en-US"/>
+              </w:rPr>
+              <w:t xml:space="preserve">: </w:t>
+            </w:r>
+            <w:r>
+              <w:rPr>
+                <w:lang w:val="en-US"/>
+              </w:rPr>
+              <w:t>alex</w:t>
+            </w:r>
+            <w:r>
+              <w:rPr>
+                <w:lang w:val="en-US"/>
+              </w:rPr>
+              <w:t>.ng</w:t>
+            </w:r>
+            <w:r>
+              <w:rPr>
+                <w:lang w:val="en-US"/>
+              </w:rPr>
+              <w:t>@lighthouse.com</w:t>
+            </w:r>
+          </w:p>
+          <w:p>
+            <w:pPr>
+              <w:rPr>
+                <w:lang w:val="en-US"/>
+              </w:rPr>
+            </w:pPr>
+            <w:r>
+              <w:rPr>
+                <w:b/>
+                <w:bCs/>
+                <w:lang w:val="en-US"/>
+              </w:rPr>
+              <w:lastRenderedPageBreak/>
+              <w:t>Subject</w:t>
+            </w:r>
+            <w:r>
+              <w:rPr>
+                <w:lang w:val="en-US"/>
+              </w:rPr>
+              <w:t xml:space="preserve">: </w:t>
+            </w:r>
+            <w:r>
+              <w:rPr>
+                <w:lang w:val="en-US"/>
+              </w:rPr>
+              <w:t>Order for Office Supplies</w:t>
+            </w:r>
+          </w:p>
+          <w:p>
+            <w:pPr>
+              <w:rPr>
+                <w:b/>
+                <w:bCs/>
+                <w:lang w:val="en-US"/>
+              </w:rPr>
+            </w:pPr>
+          </w:p>
+          <w:p>
+            <w:pPr>
+              <w:rPr>
+                <w:b/>
+                <w:bCs/>
+                <w:lang w:val="en-US"/>
+              </w:rPr>
+            </w:pPr>
+          </w:p>
+        </w:tc>
+        <w:tc>
+          <w:tcPr>
+            <w:tcW w:w="5061" w:type="dxa"/>
+            <w:vAlign w:val="center"/>
+          </w:tcPr>
+          <w:p>
+            <w:pPr>
+              <w:rPr>
+                <w:lang w:val="en-US"/>
+              </w:rPr>
+            </w:pPr>
+          </w:p>
+          <w:p>
+            <w:pPr>
+              <w:rPr>
+                <w:lang w:val="en-US"/>
+              </w:rPr>
+            </w:pPr>
+            <w:r>
+              <w:rPr>
+                <w:lang w:val="en-US"/>
+              </w:rPr>
+              <w:t>We would like to order the Office Supplies listed below:</w:t>
+            </w:r>
+          </w:p>
+          <w:p>
+            <w:pPr>
+              <w:rPr>
+                <w:lang w:val="en-US"/>
+              </w:rPr>
+            </w:pPr>
+            <w:r>
+              <w:rPr>
+                <w:lang w:val="en-US"/>
+              </w:rPr>
+              <w:t xml:space="preserve">[p] </w:t>
+            </w:r>
+          </w:p>
+          <w:p>
+            <w:pPr>
+              <w:rPr>
+                <w:lang w:val="en-US"/>
+              </w:rPr>
+            </w:pPr>
+            <w:r>
+              <w:rPr>
+                <w:lang w:val="en-US"/>
+              </w:rPr>
+              <w:t>[p]Blue Pens = 100 units</w:t>
+            </w:r>
+          </w:p>
+          <w:p>
+            <w:pPr>
+              <w:rPr>
+                <w:lang w:val="en-US"/>
+              </w:rPr>
+            </w:pPr>
+            <w:r>
+              <w:rPr>
+                <w:lang w:val="en-US"/>
+              </w:rPr>
+              <w:t>[p]Red Pens = 100 units</w:t>
+            </w:r>
+          </w:p>
+          <w:p>
+            <w:pPr>
+              <w:rPr>
+                <w:lang w:val="en-US"/>
+              </w:rPr>
+            </w:pPr>
+            <w:r>
+              <w:rPr>
+                <w:lang w:val="en-US"/>
+              </w:rPr>
+              <w:t>[p]</w:t>
+            </w:r>
+            <w:r>
+              <w:rPr>
+                <w:lang w:val="en-US"/>
+              </w:rPr>
+              <w:t>Liquid Paper = 80 units</w:t>
+            </w:r>
+          </w:p>
+          <w:p>
+            <w:pPr>
+              <w:rPr>
+                <w:lang w:val="en-US"/>
+              </w:rPr>
+            </w:pPr>
+            <w:r>
+              <w:rPr>
+                <w:lang w:val="en-US"/>
+              </w:rPr>
+              <w:lastRenderedPageBreak/>
+              <w:t xml:space="preserve">[p]Stapler = </w:t>
+            </w:r>
+            <w:r>
+              <w:rPr>
+                <w:lang w:val="en-US"/>
+              </w:rPr>
+              <w:t>3</w:t>
+            </w:r>
+            <w:r>
+              <w:rPr>
+                <w:lang w:val="en-US"/>
+              </w:rPr>
+              <w:t>0 units</w:t>
+            </w:r>
+          </w:p>
+          <w:p>
+            <w:pPr>
+              <w:rPr>
+                <w:lang w:val="en-US"/>
+              </w:rPr>
+            </w:pPr>
+            <w:r>
+              <w:rPr>
+                <w:lang w:val="en-US"/>
+              </w:rPr>
+              <w:t xml:space="preserve">[p]Stapler </w:t>
+            </w:r>
+            <w:r>
+              <w:rPr>
+                <w:lang w:val="en-US"/>
+              </w:rPr>
+              <w:t>Refills = 10 boxes</w:t>
+            </w:r>
+          </w:p>
+          <w:p>
+            <w:pPr>
+              <w:rPr>
+                <w:lang w:val="en-US"/>
+              </w:rPr>
+            </w:pPr>
+            <w:r>
+              <w:rPr>
+                <w:lang w:val="en-US"/>
+              </w:rPr>
+              <w:t xml:space="preserve">[p] </w:t>
+            </w:r>
+          </w:p>
+          <w:p>
+            <w:pPr>
+              <w:rPr>
+                <w:lang w:val="en-US"/>
+              </w:rPr>
+            </w:pPr>
+            <w:r>
+              <w:rPr>
+                <w:lang w:val="en-US"/>
+              </w:rPr>
+              <w:t>[p]The Purchase Order is attached in this email. Please forward it to the appropriate recipient. Thank you in advance.</w:t>
+            </w:r>
+          </w:p>
+          <w:p>
+            <w:pPr>
+              <w:rPr>
+                <w:lang w:val="en-US"/>
+              </w:rPr>
+            </w:pPr>
+            <w:r>
+              <w:rPr>
+                <w:lang w:val="en-US"/>
+              </w:rPr>
+              <w:t xml:space="preserve">[p] </w:t>
+            </w:r>
+          </w:p>
+          <w:p>
+            <w:pPr>
+              <w:rPr>
+                <w:lang w:val="en-US"/>
+              </w:rPr>
+            </w:pPr>
+            <w:r>
+              <w:rPr>
+                <w:lang w:val="en-US"/>
+              </w:rPr>
+              <w:t xml:space="preserve">[p] </w:t>
+            </w:r>
+          </w:p>
+          <w:p>
+            <w:pPr>
+              <w:rPr>
+                <w:lang w:val="en-US"/>
+              </w:rPr>
+            </w:pPr>
+            <w:r>
+              <w:rPr>
+                <w:lang w:val="en-US"/>
+              </w:rPr>
+              <w:t>[p]-Jackson</w:t>
+            </w:r>
+          </w:p>
+          <w:p>
+            <w:pPr>
+              <w:rPr>
+                <w:lang w:val="en-US"/>
+              </w:rPr>
+            </w:pPr>
+          </w:p>
+        </w:tc>
+      </w:tr>
+      <w:tr>
+        <w:trPr>
+          <w:trHeight w:val="360"/>
+        </w:trPr>
+        <w:tc>
+          <w:tcPr>
+            <w:tcW w:w="3955" w:type="dxa"/>
+            <w:vAlign w:val="center"/>
+          </w:tcPr>
+          <w:p>
+            <w:pPr>
+              <w:rPr>
+                <w:b/>
+                <w:bCs/>
+                <w:lang w:val="en-US"/>
+              </w:rPr>
+            </w:pPr>
+          </w:p>
+          <w:p>
+            <w:pPr>
+              <w:rPr>
+                <w:lang w:val="en-US"/>
+              </w:rPr>
+            </w:pPr>
+            <w:r>
+              <w:rPr>
+                <w:b/>
+                <w:bCs/>
+                <w:lang w:val="en-US"/>
+              </w:rPr>
+              <w:t>Type</w:t>
+            </w:r>
+            <w:r>
+              <w:rPr>
+                <w:lang w:val="en-US"/>
+              </w:rPr>
+              <w:t>: Inbound</w:t>
+            </w:r>
+          </w:p>
+          <w:p>
+            <w:pPr>
+              <w:rPr>
+                <w:lang w:val="en-US"/>
+              </w:rPr>
+            </w:pPr>
+            <w:r>
+              <w:rPr>
+                <w:b/>
+                <w:bCs/>
+                <w:lang w:val="en-US"/>
+              </w:rPr>
+              <w:t>Sender Name</w:t>
+            </w:r>
+            <w:r>
+              <w:rPr>
+                <w:lang w:val="en-US"/>
+              </w:rPr>
+              <w:t xml:space="preserve">: </w:t>
+            </w:r>
+            <w:r>
+              <w:rPr>
+                <w:lang w:val="en-US"/>
+              </w:rPr>
+              <w:t>Mike</w:t>
+            </w:r>
+          </w:p>
+          <w:p>
+            <w:pPr>
+              <w:rPr>
+                <w:lang w:val="en-US"/>
+              </w:rPr>
+            </w:pPr>
+            <w:r>
+              <w:rPr>
+                <w:b/>
+                <w:bCs/>
+                <w:lang w:val="en-US"/>
+              </w:rPr>
+              <w:t>Sender Address</w:t>
+            </w:r>
+            <w:r>
+              <w:rPr>
+                <w:lang w:val="en-US"/>
+              </w:rPr>
+              <w:t xml:space="preserve">: </w:t>
+            </w:r>
+            <w:r>
+              <w:rPr>
+                <w:lang w:val="en-US"/>
+              </w:rPr>
+              <w:t>mike</w:t>
+            </w:r>
+            <w:r>
+              <w:rPr>
+                <w:lang w:val="en-US"/>
+              </w:rPr>
+              <w:t>@</w:t>
+            </w:r>
+            <w:r>
+              <w:rPr>
+                <w:lang w:val="en-US"/>
+              </w:rPr>
+              <w:t>abc</w:t>
+            </w:r>
+            <w:r>
+              <w:rPr>
+                <w:lang w:val="en-US"/>
+              </w:rPr>
+              <w:t>.com</w:t>
+            </w:r>
+            <w:r>
+              <w:rPr>
+                <w:lang w:val="en-US"/>
+              </w:rPr>
+              <w:t>.my</w:t>
+            </w:r>
+          </w:p>
+          <w:p>
+            <w:pPr>
+              <w:rPr>
+                <w:lang w:val="en-US"/>
+              </w:rPr>
+            </w:pPr>
+            <w:r>
+              <w:rPr>
+                <w:b/>
+                <w:bCs/>
+                <w:lang w:val="en-US"/>
+              </w:rPr>
+              <w:t>To Address</w:t>
+            </w:r>
+            <w:r>
+              <w:rPr>
+                <w:lang w:val="en-US"/>
+              </w:rPr>
+              <w:t>: {player_email}</w:t>
+            </w:r>
+          </w:p>
+          <w:p>
+            <w:pPr>
+              <w:rPr>
+                <w:lang w:val="en-US"/>
+              </w:rPr>
+            </w:pPr>
+            <w:r>
+              <w:rPr>
+                <w:b/>
+                <w:bCs/>
+                <w:lang w:val="en-US"/>
+              </w:rPr>
+              <w:t>CC Address</w:t>
+            </w:r>
+            <w:r>
+              <w:rPr>
+                <w:lang w:val="en-US"/>
+              </w:rPr>
+              <w:t xml:space="preserve">: </w:t>
+            </w:r>
+          </w:p>
+          <w:p>
+            <w:pPr>
+              <w:rPr>
+                <w:lang w:val="en-US"/>
+              </w:rPr>
+            </w:pPr>
+            <w:r>
+              <w:rPr>
+                <w:b/>
+                <w:bCs/>
+                <w:lang w:val="en-US"/>
+              </w:rPr>
+              <w:t>Subject</w:t>
+            </w:r>
+            <w:r>
+              <w:rPr>
+                <w:lang w:val="en-US"/>
+              </w:rPr>
+              <w:t xml:space="preserve">: </w:t>
+            </w:r>
+            <w:r>
+              <w:rPr>
+                <w:lang w:val="en-US"/>
+              </w:rPr>
+              <w:t>Multiple Purchase Orders</w:t>
+            </w:r>
+          </w:p>
+          <w:p>
+            <w:pPr>
+              <w:rPr>
+                <w:b/>
+                <w:bCs/>
+                <w:lang w:val="en-US"/>
+              </w:rPr>
+            </w:pPr>
+          </w:p>
+        </w:tc>
+        <w:tc>
+          <w:tcPr>
+            <w:tcW w:w="5061" w:type="dxa"/>
+            <w:vAlign w:val="center"/>
+          </w:tcPr>
+          <w:p>
+            <w:pPr>
+              <w:rPr>
+                <w:lang w:val="en-US"/>
+              </w:rPr>
+            </w:pPr>
+            <w:r>
+              <w:rPr>
+                <w:lang w:val="en-US"/>
+              </w:rPr>
+              <w:t>Hey {player_name}!</w:t>
+            </w:r>
+          </w:p>
+          <w:p>
+            <w:pPr>
+              <w:rPr>
+                <w:lang w:val="en-US"/>
+              </w:rPr>
+            </w:pPr>
+            <w:r>
+              <w:rPr>
+                <w:lang w:val="en-US"/>
+              </w:rPr>
+              <w:t xml:space="preserve">[p] </w:t>
+            </w:r>
+          </w:p>
+          <w:p>
+            <w:pPr>
+              <w:rPr>
+                <w:lang w:val="en-US"/>
+              </w:rPr>
+            </w:pPr>
+            <w:r>
+              <w:rPr>
+                <w:lang w:val="en-US"/>
+              </w:rPr>
+              <w:t>[p]Was really busy today and found a lot of new clients! Here are the purchase orders</w:t>
+            </w:r>
+            <w:r>
+              <w:rPr>
+                <w:lang w:val="en-US"/>
+              </w:rPr>
+              <w:t>, like usual please help me send them to Finance.</w:t>
+            </w:r>
+            <w:r>
+              <w:rPr>
+                <w:lang w:val="en-US"/>
+              </w:rPr>
+              <w:t xml:space="preserve"> Thanks!</w:t>
+            </w:r>
+          </w:p>
+        </w:tc>
+      </w:tr>
+      <w:tr>
+        <w:trPr>
+          <w:trHeight w:val="360"/>
+        </w:trPr>
+        <w:tc>
+          <w:tcPr>
+            <w:tcW w:w="3955" w:type="dxa"/>
+            <w:vAlign w:val="center"/>
+          </w:tcPr>
+          <w:p>
+            <w:pPr>
+              <w:rPr>
+                <w:b/>
+                <w:bCs/>
+                <w:lang w:val="en-US"/>
+              </w:rPr>
+            </w:pPr>
+          </w:p>
+          <w:p>
+            <w:pPr>
+              <w:rPr>
+                <w:lang w:val="en-US"/>
+              </w:rPr>
+            </w:pPr>
+            <w:r>
+              <w:rPr>
+                <w:b/>
+                <w:bCs/>
+                <w:lang w:val="en-US"/>
+              </w:rPr>
+              <w:t>Type</w:t>
+            </w:r>
+            <w:r>
+              <w:rPr>
+                <w:lang w:val="en-US"/>
+              </w:rPr>
+              <w:t>: Message</w:t>
+            </w:r>
+          </w:p>
+          <w:p>
+            <w:pPr>
+              <w:rPr>
+                <w:lang w:val="en-US"/>
+              </w:rPr>
+            </w:pPr>
+            <w:r>
+              <w:rPr>
+                <w:b/>
+                <w:bCs/>
+                <w:lang w:val="en-US"/>
+              </w:rPr>
+              <w:t>Sender Name</w:t>
+            </w:r>
+            <w:r>
+              <w:rPr>
+                <w:lang w:val="en-US"/>
+              </w:rPr>
+              <w:t xml:space="preserve">: </w:t>
+            </w:r>
+            <w:r>
+              <w:rPr>
+                <w:lang w:val="en-US"/>
+              </w:rPr>
+              <w:t>C17</w:t>
+            </w:r>
+          </w:p>
+          <w:p>
+            <w:pPr>
+              <w:rPr>
+                <w:lang w:val="en-US"/>
+              </w:rPr>
+            </w:pPr>
+            <w:r>
+              <w:rPr>
+                <w:b/>
+                <w:bCs/>
+                <w:lang w:val="en-US"/>
+              </w:rPr>
+              <w:t>Sender Address</w:t>
+            </w:r>
+            <w:r>
+              <w:rPr>
+                <w:lang w:val="en-US"/>
+              </w:rPr>
+              <w:t xml:space="preserve">: </w:t>
+            </w:r>
+            <w:r>
+              <w:rPr>
+                <w:lang w:val="en-US"/>
+              </w:rPr>
+              <w:t>recruiting@c17.com</w:t>
+            </w:r>
+          </w:p>
+          <w:p>
+            <w:pPr>
+              <w:rPr>
+                <w:lang w:val="en-US"/>
+              </w:rPr>
+            </w:pPr>
+            <w:r>
+              <w:rPr>
+                <w:b/>
+                <w:bCs/>
+                <w:lang w:val="en-US"/>
+              </w:rPr>
+              <w:t>To Address</w:t>
+            </w:r>
+            <w:r>
+              <w:rPr>
+                <w:lang w:val="en-US"/>
+              </w:rPr>
+              <w:t>: {player_email}</w:t>
+            </w:r>
+          </w:p>
+          <w:p>
+            <w:pPr>
+              <w:rPr>
+                <w:lang w:val="en-US"/>
+              </w:rPr>
+            </w:pPr>
+            <w:r>
+              <w:rPr>
+                <w:b/>
+                <w:bCs/>
+                <w:lang w:val="en-US"/>
+              </w:rPr>
+              <w:t>CC Address</w:t>
+            </w:r>
+            <w:r>
+              <w:rPr>
+                <w:lang w:val="en-US"/>
+              </w:rPr>
+              <w:t xml:space="preserve">: </w:t>
+            </w:r>
+          </w:p>
+          <w:p>
+            <w:pPr>
+              <w:rPr>
+                <w:lang w:val="en-US"/>
+              </w:rPr>
+            </w:pPr>
+            <w:r>
+              <w:rPr>
+                <w:b/>
+                <w:bCs/>
+                <w:lang w:val="en-US"/>
+              </w:rPr>
+              <w:t>Subject</w:t>
+            </w:r>
+            <w:r>
+              <w:rPr>
+                <w:lang w:val="en-US"/>
+              </w:rPr>
+              <w:t xml:space="preserve">: </w:t>
+            </w:r>
+            <w:r>
+              <w:rPr>
+                <w:lang w:val="en-US"/>
+              </w:rPr>
+              <w:t>Join us</w:t>
+            </w:r>
+            <w:r>
+              <w:rPr>
+                <w:lang w:val="en-US"/>
+              </w:rPr>
+              <w:t xml:space="preserve"> at C17 Stationeries!</w:t>
+            </w:r>
+          </w:p>
+          <w:p>
+            <w:pPr>
+              <w:rPr>
+                <w:b/>
+                <w:bCs/>
+                <w:lang w:val="en-US"/>
+              </w:rPr>
+            </w:pPr>
+          </w:p>
+        </w:tc>
+        <w:tc>
+          <w:tcPr>
+            <w:tcW w:w="5061" w:type="dxa"/>
+            <w:vAlign w:val="center"/>
+          </w:tcPr>
+          <w:p>
+            <w:pPr>
+              <w:rPr>
+                <w:lang w:val="en-US"/>
+              </w:rPr>
+            </w:pPr>
+            <w:r>
+              <w:rPr>
+                <w:lang w:val="en-US"/>
+              </w:rPr>
+              <w:t>Image of recruiting</w:t>
+            </w:r>
+          </w:p>
+          <w:p>
+            <w:pPr>
+              <w:rPr>
+                <w:lang w:val="en-US"/>
+              </w:rPr>
+            </w:pPr>
+            <w:r>
+              <w:rPr>
+                <w:lang w:val="en-US"/>
+              </w:rPr>
+              <w:t>C17</w:t>
+            </w:r>
+          </w:p>
+          <w:p>
+            <w:pPr>
+              <w:rPr>
+                <w:lang w:val="en-US"/>
+              </w:rPr>
+            </w:pPr>
+            <w:r>
+              <w:rPr>
+                <w:lang w:val="en-US"/>
+              </w:rPr>
+              <w:t>Sub brand of parent company: The Combine Group</w:t>
+            </w:r>
+          </w:p>
+          <w:p>
+            <w:pPr>
+              <w:rPr>
+                <w:lang w:val="en-US"/>
+              </w:rPr>
+            </w:pPr>
+            <w:r>
+              <w:rPr>
+                <w:lang w:val="en-US"/>
+              </w:rPr>
+              <w:t>This time more threatening</w:t>
+            </w:r>
           </w:p>
         </w:tc>
       </w:tr>
@@ -5940,7 +8124,6 @@
   <w:style w:type="character" w:default="1" w:styleId="DefaultParagraphFont">
     <w:name w:val="Default Paragraph Font"/>
     <w:uiPriority w:val="1"/>
-    <w:semiHidden/>
     <w:unhideWhenUsed/>
   </w:style>
   <w:style w:type="table" w:default="1" w:styleId="TableNormal">

</xml_diff>

<commit_message>
Level Design: Tuesday Emails & Files
</commit_message>
<xml_diff>
--- a/level design.docx
+++ b/level design.docx
@@ -430,6 +430,7 @@
               </w:rPr>
               <w:t>D</w:t>
             </w:r>
+            <w:proofErr w:type="spellStart"/>
             <w:r>
               <w:rPr>
                 <w:b/>
@@ -437,6 +438,7 @@
               </w:rPr>
               <w:t>etails</w:t>
             </w:r>
+            <w:proofErr w:type="spellEnd"/>
           </w:p>
         </w:tc>
         <w:tc>
@@ -563,7 +565,21 @@
               <w:rPr>
                 <w:lang w:val="en-US"/>
               </w:rPr>
-              <w:t>: {player_email}</w:t>
+              <w:t>: {</w:t>
+            </w:r>
+            <w:proofErr w:type="spellStart"/>
+            <w:r>
+              <w:rPr>
+                <w:lang w:val="en-US"/>
+              </w:rPr>
+              <w:t>player_email</w:t>
+            </w:r>
+            <w:proofErr w:type="spellEnd"/>
+            <w:r>
+              <w:rPr>
+                <w:lang w:val="en-US"/>
+              </w:rPr>
+              <w:t>}</w:t>
             </w:r>
           </w:p>
           <w:p>
@@ -729,7 +745,21 @@
               <w:rPr>
                 <w:lang w:val="en-US"/>
               </w:rPr>
-              <w:t>: {player_email}</w:t>
+              <w:t>: {</w:t>
+            </w:r>
+            <w:proofErr w:type="spellStart"/>
+            <w:r>
+              <w:rPr>
+                <w:lang w:val="en-US"/>
+              </w:rPr>
+              <w:t>player_email</w:t>
+            </w:r>
+            <w:proofErr w:type="spellEnd"/>
+            <w:r>
+              <w:rPr>
+                <w:lang w:val="en-US"/>
+              </w:rPr>
+              <w:t>}</w:t>
             </w:r>
           </w:p>
           <w:p>
@@ -862,6 +892,7 @@
               </w:rPr>
               <w:t>D</w:t>
             </w:r>
+            <w:proofErr w:type="spellStart"/>
             <w:r>
               <w:rPr>
                 <w:b/>
@@ -869,6 +900,7 @@
               </w:rPr>
               <w:t>etails</w:t>
             </w:r>
+            <w:proofErr w:type="spellEnd"/>
           </w:p>
         </w:tc>
         <w:tc>
@@ -1002,7 +1034,21 @@
               <w:rPr>
                 <w:lang w:val="en-US"/>
               </w:rPr>
-              <w:t>: {player_email}</w:t>
+              <w:t>: {</w:t>
+            </w:r>
+            <w:proofErr w:type="spellStart"/>
+            <w:r>
+              <w:rPr>
+                <w:lang w:val="en-US"/>
+              </w:rPr>
+              <w:t>player_email</w:t>
+            </w:r>
+            <w:proofErr w:type="spellEnd"/>
+            <w:r>
+              <w:rPr>
+                <w:lang w:val="en-US"/>
+              </w:rPr>
+              <w:t>}</w:t>
             </w:r>
           </w:p>
           <w:p>
@@ -1129,7 +1175,21 @@
               <w:rPr>
                 <w:lang w:val="en-US"/>
               </w:rPr>
-              <w:t>, {player_name}</w:t>
+              <w:t>, {</w:t>
+            </w:r>
+            <w:proofErr w:type="spellStart"/>
+            <w:r>
+              <w:rPr>
+                <w:lang w:val="en-US"/>
+              </w:rPr>
+              <w:t>player_name</w:t>
+            </w:r>
+            <w:proofErr w:type="spellEnd"/>
+            <w:r>
+              <w:rPr>
+                <w:lang w:val="en-US"/>
+              </w:rPr>
+              <w:t>}</w:t>
             </w:r>
             <w:r>
               <w:rPr>
@@ -1389,7 +1449,35 @@
               <w:rPr>
                 <w:lang w:val="en-US"/>
               </w:rPr>
-              <w:t>[img]assets/tutorial/report_email.png[/img]</w:t>
+              <w:t>[</w:t>
+            </w:r>
+            <w:proofErr w:type="spellStart"/>
+            <w:r>
+              <w:rPr>
+                <w:lang w:val="en-US"/>
+              </w:rPr>
+              <w:t>img</w:t>
+            </w:r>
+            <w:proofErr w:type="spellEnd"/>
+            <w:r>
+              <w:rPr>
+                <w:lang w:val="en-US"/>
+              </w:rPr>
+              <w:t>]assets/tutorial/report_email.png[/</w:t>
+            </w:r>
+            <w:proofErr w:type="spellStart"/>
+            <w:r>
+              <w:rPr>
+                <w:lang w:val="en-US"/>
+              </w:rPr>
+              <w:t>img</w:t>
+            </w:r>
+            <w:proofErr w:type="spellEnd"/>
+            <w:r>
+              <w:rPr>
+                <w:lang w:val="en-US"/>
+              </w:rPr>
+              <w:t>]</w:t>
             </w:r>
             <w:r>
               <w:rPr>
@@ -1596,7 +1684,21 @@
               <w:rPr>
                 <w:lang w:val="en-US"/>
               </w:rPr>
-              <w:t>: {player_email}</w:t>
+              <w:t>: {</w:t>
+            </w:r>
+            <w:proofErr w:type="spellStart"/>
+            <w:r>
+              <w:rPr>
+                <w:lang w:val="en-US"/>
+              </w:rPr>
+              <w:t>player_email</w:t>
+            </w:r>
+            <w:proofErr w:type="spellEnd"/>
+            <w:r>
+              <w:rPr>
+                <w:lang w:val="en-US"/>
+              </w:rPr>
+              <w:t>}</w:t>
             </w:r>
           </w:p>
           <w:p>
@@ -1691,7 +1793,21 @@
               <w:rPr>
                 <w:lang w:val="en-US"/>
               </w:rPr>
-              <w:t>, {player_name}!</w:t>
+              <w:t>, {</w:t>
+            </w:r>
+            <w:proofErr w:type="spellStart"/>
+            <w:r>
+              <w:rPr>
+                <w:lang w:val="en-US"/>
+              </w:rPr>
+              <w:t>player_name</w:t>
+            </w:r>
+            <w:proofErr w:type="spellEnd"/>
+            <w:r>
+              <w:rPr>
+                <w:lang w:val="en-US"/>
+              </w:rPr>
+              <w:t>}!</w:t>
             </w:r>
           </w:p>
           <w:p>
@@ -2026,7 +2142,21 @@
               <w:rPr>
                 <w:lang w:val="en-US"/>
               </w:rPr>
-              <w:t>: {player_email}</w:t>
+              <w:t>: {</w:t>
+            </w:r>
+            <w:proofErr w:type="spellStart"/>
+            <w:r>
+              <w:rPr>
+                <w:lang w:val="en-US"/>
+              </w:rPr>
+              <w:t>player_email</w:t>
+            </w:r>
+            <w:proofErr w:type="spellEnd"/>
+            <w:r>
+              <w:rPr>
+                <w:lang w:val="en-US"/>
+              </w:rPr>
+              <w:t>}</w:t>
             </w:r>
           </w:p>
           <w:p>
@@ -2119,7 +2249,21 @@
               <w:rPr>
                 <w:lang w:val="en-US"/>
               </w:rPr>
-              <w:t>, {player_name}!</w:t>
+              <w:t>, {</w:t>
+            </w:r>
+            <w:proofErr w:type="spellStart"/>
+            <w:r>
+              <w:rPr>
+                <w:lang w:val="en-US"/>
+              </w:rPr>
+              <w:t>player_name</w:t>
+            </w:r>
+            <w:proofErr w:type="spellEnd"/>
+            <w:r>
+              <w:rPr>
+                <w:lang w:val="en-US"/>
+              </w:rPr>
+              <w:t>}!</w:t>
             </w:r>
           </w:p>
           <w:p>
@@ -2367,7 +2511,21 @@
               <w:rPr>
                 <w:lang w:val="en-US"/>
               </w:rPr>
-              <w:t>: {player_email}</w:t>
+              <w:t>: {</w:t>
+            </w:r>
+            <w:proofErr w:type="spellStart"/>
+            <w:r>
+              <w:rPr>
+                <w:lang w:val="en-US"/>
+              </w:rPr>
+              <w:t>player_email</w:t>
+            </w:r>
+            <w:proofErr w:type="spellEnd"/>
+            <w:r>
+              <w:rPr>
+                <w:lang w:val="en-US"/>
+              </w:rPr>
+              <w:t>}</w:t>
             </w:r>
           </w:p>
           <w:p>
@@ -2474,13 +2632,29 @@
               <w:t>[p]</w:t>
             </w:r>
             <w:r>
-              <w:t>[center]</w:t>
+              <w:t>[</w:t>
+            </w:r>
+            <w:proofErr w:type="spellStart"/>
+            <w:r>
+              <w:t>center</w:t>
+            </w:r>
+            <w:proofErr w:type="spellEnd"/>
+            <w:r>
+              <w:t>]</w:t>
             </w:r>
             <w:r>
               <w:t>Thank you for choosing Orbit Antivirus!</w:t>
             </w:r>
             <w:r>
-              <w:t>[/center]</w:t>
+              <w:t>[/</w:t>
+            </w:r>
+            <w:proofErr w:type="spellStart"/>
+            <w:r>
+              <w:t>center</w:t>
+            </w:r>
+            <w:proofErr w:type="spellEnd"/>
+            <w:r>
+              <w:t>]</w:t>
             </w:r>
           </w:p>
           <w:p>
@@ -2493,19 +2667,51 @@
               <w:t>[p]</w:t>
             </w:r>
             <w:r>
-              <w:t>[center]</w:t>
-            </w:r>
-            <w:r>
-              <w:t>[img]</w:t>
+              <w:t>[</w:t>
+            </w:r>
+            <w:proofErr w:type="spellStart"/>
+            <w:r>
+              <w:t>center</w:t>
+            </w:r>
+            <w:proofErr w:type="spellEnd"/>
+            <w:r>
+              <w:t>]</w:t>
+            </w:r>
+            <w:r>
+              <w:t>[</w:t>
+            </w:r>
+            <w:proofErr w:type="spellStart"/>
+            <w:r>
+              <w:t>img</w:t>
+            </w:r>
+            <w:proofErr w:type="spellEnd"/>
+            <w:r>
+              <w:t>]</w:t>
             </w:r>
             <w:r>
               <w:t>assets/</w:t>
             </w:r>
             <w:r>
-              <w:t>orbit_logo.png[/img]</w:t>
-            </w:r>
-            <w:r>
-              <w:t>[/center]</w:t>
+              <w:t>orbit_logo.png[/</w:t>
+            </w:r>
+            <w:proofErr w:type="spellStart"/>
+            <w:r>
+              <w:t>img</w:t>
+            </w:r>
+            <w:proofErr w:type="spellEnd"/>
+            <w:r>
+              <w:t>]</w:t>
+            </w:r>
+            <w:r>
+              <w:t>[/</w:t>
+            </w:r>
+            <w:proofErr w:type="spellStart"/>
+            <w:r>
+              <w:t>center</w:t>
+            </w:r>
+            <w:proofErr w:type="spellEnd"/>
+            <w:r>
+              <w:t>]</w:t>
             </w:r>
           </w:p>
           <w:p/>
@@ -2631,7 +2837,21 @@
               <w:rPr>
                 <w:lang w:val="en-US"/>
               </w:rPr>
-              <w:t>: {player_email}</w:t>
+              <w:t>: {</w:t>
+            </w:r>
+            <w:proofErr w:type="spellStart"/>
+            <w:r>
+              <w:rPr>
+                <w:lang w:val="en-US"/>
+              </w:rPr>
+              <w:t>player_email</w:t>
+            </w:r>
+            <w:proofErr w:type="spellEnd"/>
+            <w:r>
+              <w:rPr>
+                <w:lang w:val="en-US"/>
+              </w:rPr>
+              <w:t>}</w:t>
             </w:r>
           </w:p>
           <w:p>
@@ -2827,6 +3047,7 @@
               </w:rPr>
               <w:t>[p]</w:t>
             </w:r>
+            <w:proofErr w:type="spellStart"/>
             <w:r>
               <w:rPr>
                 <w:rFonts w:ascii="MS Gothic" w:eastAsia="MS Gothic" w:hAnsi="MS Gothic" w:cs="MS Gothic" w:hint="eastAsia"/>
@@ -2834,6 +3055,7 @@
               </w:rPr>
               <w:t>小天才文具店</w:t>
             </w:r>
+            <w:proofErr w:type="spellEnd"/>
           </w:p>
           <w:p>
             <w:pPr>
@@ -2903,12 +3125,14 @@
               </w:rPr>
               <w:t xml:space="preserve">: </w:t>
             </w:r>
+            <w:proofErr w:type="spellStart"/>
             <w:r>
               <w:rPr>
                 <w:lang w:val="en-US"/>
               </w:rPr>
               <w:t>Trippo</w:t>
             </w:r>
+            <w:proofErr w:type="spellEnd"/>
           </w:p>
           <w:p>
             <w:pPr>
@@ -2983,7 +3207,21 @@
               <w:rPr>
                 <w:lang w:val="en-US"/>
               </w:rPr>
-              <w:t>: {player_email}</w:t>
+              <w:t>: {</w:t>
+            </w:r>
+            <w:proofErr w:type="spellStart"/>
+            <w:r>
+              <w:rPr>
+                <w:lang w:val="en-US"/>
+              </w:rPr>
+              <w:t>player_email</w:t>
+            </w:r>
+            <w:proofErr w:type="spellEnd"/>
+            <w:r>
+              <w:rPr>
+                <w:lang w:val="en-US"/>
+              </w:rPr>
+              <w:t>}</w:t>
             </w:r>
           </w:p>
           <w:p>
@@ -3073,19 +3311,51 @@
               <w:t>[p]</w:t>
             </w:r>
             <w:r>
-              <w:t>[center]</w:t>
-            </w:r>
-            <w:r>
-              <w:t>[img]</w:t>
+              <w:t>[</w:t>
+            </w:r>
+            <w:proofErr w:type="spellStart"/>
+            <w:r>
+              <w:t>center</w:t>
+            </w:r>
+            <w:proofErr w:type="spellEnd"/>
+            <w:r>
+              <w:t>]</w:t>
+            </w:r>
+            <w:r>
+              <w:t>[</w:t>
+            </w:r>
+            <w:proofErr w:type="spellStart"/>
+            <w:r>
+              <w:t>img</w:t>
+            </w:r>
+            <w:proofErr w:type="spellEnd"/>
+            <w:r>
+              <w:t>]</w:t>
             </w:r>
             <w:r>
               <w:t>assets/adware/</w:t>
             </w:r>
             <w:r>
-              <w:t>trippo_ad.jpg[/img]</w:t>
-            </w:r>
-            <w:r>
-              <w:t>[/center]</w:t>
+              <w:t>trippo_ad.jpg[/</w:t>
+            </w:r>
+            <w:proofErr w:type="spellStart"/>
+            <w:r>
+              <w:t>img</w:t>
+            </w:r>
+            <w:proofErr w:type="spellEnd"/>
+            <w:r>
+              <w:t>]</w:t>
+            </w:r>
+            <w:r>
+              <w:t>[/</w:t>
+            </w:r>
+            <w:proofErr w:type="spellStart"/>
+            <w:r>
+              <w:t>center</w:t>
+            </w:r>
+            <w:proofErr w:type="spellEnd"/>
+            <w:r>
+              <w:t>]</w:t>
             </w:r>
           </w:p>
         </w:tc>
@@ -3223,7 +3493,21 @@
               <w:rPr>
                 <w:lang w:val="en-US"/>
               </w:rPr>
-              <w:t>: {player_email}</w:t>
+              <w:t>: {</w:t>
+            </w:r>
+            <w:proofErr w:type="spellStart"/>
+            <w:r>
+              <w:rPr>
+                <w:lang w:val="en-US"/>
+              </w:rPr>
+              <w:t>player_email</w:t>
+            </w:r>
+            <w:proofErr w:type="spellEnd"/>
+            <w:r>
+              <w:rPr>
+                <w:lang w:val="en-US"/>
+              </w:rPr>
+              <w:t>}</w:t>
             </w:r>
           </w:p>
           <w:p>
@@ -3540,7 +3824,21 @@
               <w:rPr>
                 <w:lang w:val="en-US"/>
               </w:rPr>
-              <w:t>: {player_email}</w:t>
+              <w:t>: {</w:t>
+            </w:r>
+            <w:proofErr w:type="spellStart"/>
+            <w:r>
+              <w:rPr>
+                <w:lang w:val="en-US"/>
+              </w:rPr>
+              <w:t>player_email</w:t>
+            </w:r>
+            <w:proofErr w:type="spellEnd"/>
+            <w:r>
+              <w:rPr>
+                <w:lang w:val="en-US"/>
+              </w:rPr>
+              <w:t>}</w:t>
             </w:r>
           </w:p>
           <w:p>
@@ -3988,7 +4286,21 @@
               <w:rPr>
                 <w:lang w:val="en-US"/>
               </w:rPr>
-              <w:t>: {player_email}</w:t>
+              <w:t>: {</w:t>
+            </w:r>
+            <w:proofErr w:type="spellStart"/>
+            <w:r>
+              <w:rPr>
+                <w:lang w:val="en-US"/>
+              </w:rPr>
+              <w:t>player_email</w:t>
+            </w:r>
+            <w:proofErr w:type="spellEnd"/>
+            <w:r>
+              <w:rPr>
+                <w:lang w:val="en-US"/>
+              </w:rPr>
+              <w:t>}</w:t>
             </w:r>
           </w:p>
           <w:p>
@@ -4079,7 +4391,21 @@
               <w:rPr>
                 <w:lang w:val="en-US"/>
               </w:rPr>
-              <w:t>Hello, I want to order some stationarys for my shop.</w:t>
+              <w:t xml:space="preserve">Hello, I want to order some </w:t>
+            </w:r>
+            <w:proofErr w:type="spellStart"/>
+            <w:r>
+              <w:rPr>
+                <w:lang w:val="en-US"/>
+              </w:rPr>
+              <w:t>stationarys</w:t>
+            </w:r>
+            <w:proofErr w:type="spellEnd"/>
+            <w:r>
+              <w:rPr>
+                <w:lang w:val="en-US"/>
+              </w:rPr>
+              <w:t xml:space="preserve"> for my shop.</w:t>
             </w:r>
           </w:p>
           <w:p>
@@ -4280,7 +4606,21 @@
               <w:rPr>
                 <w:lang w:val="en-US"/>
               </w:rPr>
-              <w:t>: {player_email}</w:t>
+              <w:t>: {</w:t>
+            </w:r>
+            <w:proofErr w:type="spellStart"/>
+            <w:r>
+              <w:rPr>
+                <w:lang w:val="en-US"/>
+              </w:rPr>
+              <w:t>player_email</w:t>
+            </w:r>
+            <w:proofErr w:type="spellEnd"/>
+            <w:r>
+              <w:rPr>
+                <w:lang w:val="en-US"/>
+              </w:rPr>
+              <w:t>}</w:t>
             </w:r>
           </w:p>
           <w:p>
@@ -4328,8 +4668,16 @@
               <w:rPr>
                 <w:lang w:val="en-US"/>
               </w:rPr>
-              <w:t>Purchase Order - PrintingPro</w:t>
-            </w:r>
+              <w:t xml:space="preserve">Purchase Order - </w:t>
+            </w:r>
+            <w:proofErr w:type="spellStart"/>
+            <w:r>
+              <w:rPr>
+                <w:lang w:val="en-US"/>
+              </w:rPr>
+              <w:t>PrintingPro</w:t>
+            </w:r>
+            <w:proofErr w:type="spellEnd"/>
           </w:p>
           <w:p>
             <w:pPr>
@@ -4356,7 +4704,21 @@
               <w:rPr>
                 <w:lang w:val="en-US"/>
               </w:rPr>
-              <w:t>Hi {player_name}!</w:t>
+              <w:t>Hi {</w:t>
+            </w:r>
+            <w:proofErr w:type="spellStart"/>
+            <w:r>
+              <w:rPr>
+                <w:lang w:val="en-US"/>
+              </w:rPr>
+              <w:t>player_name</w:t>
+            </w:r>
+            <w:proofErr w:type="spellEnd"/>
+            <w:r>
+              <w:rPr>
+                <w:lang w:val="en-US"/>
+              </w:rPr>
+              <w:t>}!</w:t>
             </w:r>
             <w:r>
               <w:rPr>
@@ -4388,7 +4750,21 @@
               <w:rPr>
                 <w:lang w:val="en-US"/>
               </w:rPr>
-              <w:t>[p]This is a Purchase Order from PrintingPro. Please help me send this to finance. Thanks!</w:t>
+              <w:t xml:space="preserve">[p]This is a Purchase Order from </w:t>
+            </w:r>
+            <w:proofErr w:type="spellStart"/>
+            <w:r>
+              <w:rPr>
+                <w:lang w:val="en-US"/>
+              </w:rPr>
+              <w:t>PrintingPro</w:t>
+            </w:r>
+            <w:proofErr w:type="spellEnd"/>
+            <w:r>
+              <w:rPr>
+                <w:lang w:val="en-US"/>
+              </w:rPr>
+              <w:t>. Please help me send this to finance. Thanks!</w:t>
             </w:r>
           </w:p>
         </w:tc>
@@ -4421,8 +4797,8 @@
         <w:tblLook w:val="04A0" w:firstRow="1" w:lastRow="0" w:firstColumn="1" w:lastColumn="0" w:noHBand="0" w:noVBand="1"/>
       </w:tblPr>
       <w:tblGrid>
-        <w:gridCol w:w="3955"/>
-        <w:gridCol w:w="5061"/>
+        <w:gridCol w:w="2734"/>
+        <w:gridCol w:w="6282"/>
       </w:tblGrid>
       <w:tr>
         <w:trPr>
@@ -4451,6 +4827,7 @@
               <w:lastRenderedPageBreak/>
               <w:t>D</w:t>
             </w:r>
+            <w:proofErr w:type="spellStart"/>
             <w:r>
               <w:rPr>
                 <w:b/>
@@ -4458,6 +4835,7 @@
               </w:rPr>
               <w:t>etails</w:t>
             </w:r>
+            <w:proofErr w:type="spellEnd"/>
           </w:p>
         </w:tc>
         <w:tc>
@@ -4596,7 +4974,21 @@
               <w:rPr>
                 <w:lang w:val="en-US"/>
               </w:rPr>
-              <w:t>: {player_email}</w:t>
+              <w:t>: {</w:t>
+            </w:r>
+            <w:proofErr w:type="spellStart"/>
+            <w:r>
+              <w:rPr>
+                <w:lang w:val="en-US"/>
+              </w:rPr>
+              <w:t>player_email</w:t>
+            </w:r>
+            <w:proofErr w:type="spellEnd"/>
+            <w:r>
+              <w:rPr>
+                <w:lang w:val="en-US"/>
+              </w:rPr>
+              <w:t>}</w:t>
             </w:r>
           </w:p>
           <w:p>
@@ -4689,7 +5081,21 @@
               <w:rPr>
                 <w:lang w:val="en-US"/>
               </w:rPr>
-              <w:t xml:space="preserve"> {player_name}!</w:t>
+              <w:t xml:space="preserve"> {</w:t>
+            </w:r>
+            <w:proofErr w:type="spellStart"/>
+            <w:r>
+              <w:rPr>
+                <w:lang w:val="en-US"/>
+              </w:rPr>
+              <w:t>player_name</w:t>
+            </w:r>
+            <w:proofErr w:type="spellEnd"/>
+            <w:r>
+              <w:rPr>
+                <w:lang w:val="en-US"/>
+              </w:rPr>
+              <w:t>}!</w:t>
             </w:r>
           </w:p>
           <w:p>
@@ -4799,7 +5205,139 @@
               <w:rPr>
                 <w:lang w:val="en-US"/>
               </w:rPr>
-              <w:t>[p] IMG</w:t>
+              <w:t>[p]</w:t>
+            </w:r>
+            <w:r>
+              <w:rPr>
+                <w:lang w:val="en-US"/>
+              </w:rPr>
+              <w:t>[</w:t>
+            </w:r>
+            <w:proofErr w:type="spellStart"/>
+            <w:r>
+              <w:rPr>
+                <w:lang w:val="en-US"/>
+              </w:rPr>
+              <w:t>img</w:t>
+            </w:r>
+            <w:proofErr w:type="spellEnd"/>
+            <w:r>
+              <w:rPr>
+                <w:lang w:val="en-US"/>
+              </w:rPr>
+              <w:t>]assets/tutorial/highlight1.png[/</w:t>
+            </w:r>
+            <w:proofErr w:type="spellStart"/>
+            <w:r>
+              <w:rPr>
+                <w:lang w:val="en-US"/>
+              </w:rPr>
+              <w:t>img</w:t>
+            </w:r>
+            <w:proofErr w:type="spellEnd"/>
+            <w:r>
+              <w:rPr>
+                <w:lang w:val="en-US"/>
+              </w:rPr>
+              <w:t xml:space="preserve">] </w:t>
+            </w:r>
+            <w:r>
+              <w:rPr>
+                <w:lang w:val="en-US"/>
+              </w:rPr>
+              <w:t>[</w:t>
+            </w:r>
+            <w:proofErr w:type="spellStart"/>
+            <w:r>
+              <w:rPr>
+                <w:lang w:val="en-US"/>
+              </w:rPr>
+              <w:t>img</w:t>
+            </w:r>
+            <w:proofErr w:type="spellEnd"/>
+            <w:r>
+              <w:rPr>
+                <w:lang w:val="en-US"/>
+              </w:rPr>
+              <w:t>]assets/tutorial/highlight</w:t>
+            </w:r>
+            <w:r>
+              <w:rPr>
+                <w:lang w:val="en-US"/>
+              </w:rPr>
+              <w:t>2</w:t>
+            </w:r>
+            <w:r>
+              <w:rPr>
+                <w:lang w:val="en-US"/>
+              </w:rPr>
+              <w:t>.png[/</w:t>
+            </w:r>
+            <w:proofErr w:type="spellStart"/>
+            <w:r>
+              <w:rPr>
+                <w:lang w:val="en-US"/>
+              </w:rPr>
+              <w:t>img</w:t>
+            </w:r>
+            <w:proofErr w:type="spellEnd"/>
+            <w:r>
+              <w:rPr>
+                <w:lang w:val="en-US"/>
+              </w:rPr>
+              <w:t>]</w:t>
+            </w:r>
+            <w:r>
+              <w:rPr>
+                <w:lang w:val="en-US"/>
+              </w:rPr>
+              <w:t xml:space="preserve"> </w:t>
+            </w:r>
+            <w:r>
+              <w:rPr>
+                <w:lang w:val="en-US"/>
+              </w:rPr>
+              <w:t>[</w:t>
+            </w:r>
+            <w:proofErr w:type="spellStart"/>
+            <w:r>
+              <w:rPr>
+                <w:lang w:val="en-US"/>
+              </w:rPr>
+              <w:t>img</w:t>
+            </w:r>
+            <w:proofErr w:type="spellEnd"/>
+            <w:r>
+              <w:rPr>
+                <w:lang w:val="en-US"/>
+              </w:rPr>
+              <w:t>]assets/tutorial/highlight</w:t>
+            </w:r>
+            <w:r>
+              <w:rPr>
+                <w:lang w:val="en-US"/>
+              </w:rPr>
+              <w:t>3</w:t>
+            </w:r>
+            <w:r>
+              <w:rPr>
+                <w:lang w:val="en-US"/>
+              </w:rPr>
+              <w:t>.png[/</w:t>
+            </w:r>
+            <w:proofErr w:type="spellStart"/>
+            <w:r>
+              <w:rPr>
+                <w:lang w:val="en-US"/>
+              </w:rPr>
+              <w:t>img</w:t>
+            </w:r>
+            <w:proofErr w:type="spellEnd"/>
+            <w:r>
+              <w:rPr>
+                <w:lang w:val="en-US"/>
+              </w:rPr>
+              <w:t>]</w:t>
             </w:r>
           </w:p>
           <w:p>
@@ -4938,7 +5476,21 @@
               <w:rPr>
                 <w:lang w:val="en-US"/>
               </w:rPr>
-              <w:t>: {player_email}</w:t>
+              <w:t>: {</w:t>
+            </w:r>
+            <w:proofErr w:type="spellStart"/>
+            <w:r>
+              <w:rPr>
+                <w:lang w:val="en-US"/>
+              </w:rPr>
+              <w:t>player_email</w:t>
+            </w:r>
+            <w:proofErr w:type="spellEnd"/>
+            <w:r>
+              <w:rPr>
+                <w:lang w:val="en-US"/>
+              </w:rPr>
+              <w:t>}</w:t>
             </w:r>
           </w:p>
           <w:p>
@@ -5179,7 +5731,21 @@
               <w:rPr>
                 <w:lang w:val="en-US"/>
               </w:rPr>
-              <w:t>: {player_email}</w:t>
+              <w:t>: {</w:t>
+            </w:r>
+            <w:proofErr w:type="spellStart"/>
+            <w:r>
+              <w:rPr>
+                <w:lang w:val="en-US"/>
+              </w:rPr>
+              <w:t>player_email</w:t>
+            </w:r>
+            <w:proofErr w:type="spellEnd"/>
+            <w:r>
+              <w:rPr>
+                <w:lang w:val="en-US"/>
+              </w:rPr>
+              <w:t>}</w:t>
             </w:r>
           </w:p>
           <w:p>
@@ -5561,7 +6127,21 @@
               <w:rPr>
                 <w:lang w:val="en-US"/>
               </w:rPr>
-              <w:t>: {player_email}</w:t>
+              <w:t>: {</w:t>
+            </w:r>
+            <w:proofErr w:type="spellStart"/>
+            <w:r>
+              <w:rPr>
+                <w:lang w:val="en-US"/>
+              </w:rPr>
+              <w:t>player_email</w:t>
+            </w:r>
+            <w:proofErr w:type="spellEnd"/>
+            <w:r>
+              <w:rPr>
+                <w:lang w:val="en-US"/>
+              </w:rPr>
+              <w:t>}</w:t>
             </w:r>
           </w:p>
           <w:p>
@@ -5727,8 +6307,16 @@
               <w:rPr>
                 <w:lang w:val="en-US"/>
               </w:rPr>
-              <w:t>Jane Navarednam</w:t>
-            </w:r>
+              <w:t xml:space="preserve">Jane </w:t>
+            </w:r>
+            <w:proofErr w:type="spellStart"/>
+            <w:r>
+              <w:rPr>
+                <w:lang w:val="en-US"/>
+              </w:rPr>
+              <w:t>Navarednam</w:t>
+            </w:r>
+            <w:proofErr w:type="spellEnd"/>
           </w:p>
           <w:p>
             <w:pPr>
@@ -5869,7 +6457,21 @@
               <w:rPr>
                 <w:lang w:val="en-US"/>
               </w:rPr>
-              <w:t>: {player_email}</w:t>
+              <w:t>: {</w:t>
+            </w:r>
+            <w:proofErr w:type="spellStart"/>
+            <w:r>
+              <w:rPr>
+                <w:lang w:val="en-US"/>
+              </w:rPr>
+              <w:t>player_email</w:t>
+            </w:r>
+            <w:proofErr w:type="spellEnd"/>
+            <w:r>
+              <w:rPr>
+                <w:lang w:val="en-US"/>
+              </w:rPr>
+              <w:t>}</w:t>
             </w:r>
           </w:p>
           <w:p>
@@ -5945,33 +6547,31 @@
               <w:rPr>
                 <w:lang w:val="en-US"/>
               </w:rPr>
-              <w:t>Image of recruiting</w:t>
-            </w:r>
-          </w:p>
-          <w:p>
-            <w:pPr>
-              <w:rPr>
-                <w:lang w:val="en-US"/>
-              </w:rPr>
-            </w:pPr>
-            <w:r>
-              <w:rPr>
-                <w:lang w:val="en-US"/>
-              </w:rPr>
-              <w:t>C17</w:t>
-            </w:r>
-          </w:p>
-          <w:p>
-            <w:pPr>
-              <w:rPr>
-                <w:lang w:val="en-US"/>
-              </w:rPr>
-            </w:pPr>
-            <w:r>
-              <w:rPr>
-                <w:lang w:val="en-US"/>
-              </w:rPr>
-              <w:t>Sub brand of parent company: The Combine Group</w:t>
+              <w:t>[center]</w:t>
+            </w:r>
+            <w:r>
+              <w:rPr>
+                <w:lang w:val="en-US"/>
+              </w:rPr>
+              <w:t>[img</w:t>
+            </w:r>
+            <w:r>
+              <w:rPr>
+                <w:lang w:val="en-US"/>
+              </w:rPr>
+              <w:t>=500x500</w:t>
+            </w:r>
+            <w:r>
+              <w:rPr>
+                <w:lang w:val="en-US"/>
+              </w:rPr>
+              <w:t>]assets/adware/c17_recruit.jpg[/img]</w:t>
+            </w:r>
+            <w:r>
+              <w:rPr>
+                <w:lang w:val="en-US"/>
+              </w:rPr>
+              <w:t>[/center]</w:t>
             </w:r>
           </w:p>
         </w:tc>
@@ -6078,13 +6678,7 @@
               <w:rPr>
                 <w:lang w:val="en-US"/>
               </w:rPr>
-              <w:t>17</w:t>
-            </w:r>
-            <w:r>
-              <w:rPr>
-                <w:lang w:val="en-US"/>
-              </w:rPr>
-              <w:t>854</w:t>
+              <w:t>17856</w:t>
             </w:r>
             <w:r>
               <w:rPr>
@@ -6123,7 +6717,21 @@
               <w:rPr>
                 <w:lang w:val="en-US"/>
               </w:rPr>
-              <w:t>: {player_email}</w:t>
+              <w:t>: {</w:t>
+            </w:r>
+            <w:proofErr w:type="spellStart"/>
+            <w:r>
+              <w:rPr>
+                <w:lang w:val="en-US"/>
+              </w:rPr>
+              <w:t>player_email</w:t>
+            </w:r>
+            <w:proofErr w:type="spellEnd"/>
+            <w:r>
+              <w:rPr>
+                <w:lang w:val="en-US"/>
+              </w:rPr>
+              <w:t>}</w:t>
             </w:r>
           </w:p>
           <w:p>
@@ -6212,7 +6820,21 @@
               <w:rPr>
                 <w:lang w:val="en-US"/>
               </w:rPr>
-              <w:t>Hi {player_name}! I am Mike!</w:t>
+              <w:t>Hi {</w:t>
+            </w:r>
+            <w:proofErr w:type="spellStart"/>
+            <w:r>
+              <w:rPr>
+                <w:lang w:val="en-US"/>
+              </w:rPr>
+              <w:t>player_name</w:t>
+            </w:r>
+            <w:proofErr w:type="spellEnd"/>
+            <w:r>
+              <w:rPr>
+                <w:lang w:val="en-US"/>
+              </w:rPr>
+              <w:t>}! I am Mike!</w:t>
             </w:r>
           </w:p>
           <w:p>
@@ -6238,7 +6860,21 @@
               <w:rPr>
                 <w:lang w:val="en-US"/>
               </w:rPr>
-              <w:t>[p]Please download and send the purchas order attach</w:t>
+              <w:t xml:space="preserve">[p]Please download and send the </w:t>
+            </w:r>
+            <w:proofErr w:type="spellStart"/>
+            <w:r>
+              <w:rPr>
+                <w:lang w:val="en-US"/>
+              </w:rPr>
+              <w:t>purchas</w:t>
+            </w:r>
+            <w:proofErr w:type="spellEnd"/>
+            <w:r>
+              <w:rPr>
+                <w:lang w:val="en-US"/>
+              </w:rPr>
+              <w:t xml:space="preserve"> order attach</w:t>
             </w:r>
             <w:r>
               <w:rPr>
@@ -6360,11 +6996,19 @@
               </w:rPr>
               <w:t xml:space="preserve">: </w:t>
             </w:r>
-            <w:r>
-              <w:rPr>
-                <w:lang w:val="en-US"/>
-              </w:rPr>
-              <w:t>MengHong Chan</w:t>
+            <w:proofErr w:type="spellStart"/>
+            <w:r>
+              <w:rPr>
+                <w:lang w:val="en-US"/>
+              </w:rPr>
+              <w:t>MengHong</w:t>
+            </w:r>
+            <w:proofErr w:type="spellEnd"/>
+            <w:r>
+              <w:rPr>
+                <w:lang w:val="en-US"/>
+              </w:rPr>
+              <w:t xml:space="preserve"> Chan</w:t>
             </w:r>
           </w:p>
           <w:p>
@@ -6412,7 +7056,21 @@
               <w:rPr>
                 <w:lang w:val="en-US"/>
               </w:rPr>
-              <w:t>: {player_email}</w:t>
+              <w:t>: {</w:t>
+            </w:r>
+            <w:proofErr w:type="spellStart"/>
+            <w:r>
+              <w:rPr>
+                <w:lang w:val="en-US"/>
+              </w:rPr>
+              <w:t>player_email</w:t>
+            </w:r>
+            <w:proofErr w:type="spellEnd"/>
+            <w:r>
+              <w:rPr>
+                <w:lang w:val="en-US"/>
+              </w:rPr>
+              <w:t>}</w:t>
             </w:r>
           </w:p>
           <w:p>
@@ -6460,8 +7118,16 @@
               <w:rPr>
                 <w:lang w:val="en-US"/>
               </w:rPr>
-              <w:t>Buying Stationeries for Koperasi</w:t>
-            </w:r>
+              <w:t xml:space="preserve">Buying Stationeries for </w:t>
+            </w:r>
+            <w:proofErr w:type="spellStart"/>
+            <w:r>
+              <w:rPr>
+                <w:lang w:val="en-US"/>
+              </w:rPr>
+              <w:t>Koperasi</w:t>
+            </w:r>
+            <w:proofErr w:type="spellEnd"/>
           </w:p>
           <w:p>
             <w:pPr>
@@ -6598,7 +7264,21 @@
               <w:rPr>
                 <w:lang w:val="en-US"/>
               </w:rPr>
-              <w:t>[p]SMJKC Poi Lam</w:t>
+              <w:t>[p]</w:t>
+            </w:r>
+            <w:proofErr w:type="spellStart"/>
+            <w:r>
+              <w:rPr>
+                <w:lang w:val="en-US"/>
+              </w:rPr>
+              <w:t>SMJKC</w:t>
+            </w:r>
+            <w:proofErr w:type="spellEnd"/>
+            <w:r>
+              <w:rPr>
+                <w:lang w:val="en-US"/>
+              </w:rPr>
+              <w:t xml:space="preserve"> Poi Lam</w:t>
             </w:r>
           </w:p>
           <w:p>
@@ -6688,6 +7368,7 @@
                 <w:bCs/>
                 <w:lang w:val="en-US"/>
               </w:rPr>
+              <w:lastRenderedPageBreak/>
               <w:t>Sender Address</w:t>
             </w:r>
             <w:r>
@@ -6721,7 +7402,21 @@
               <w:rPr>
                 <w:lang w:val="en-US"/>
               </w:rPr>
-              <w:t>: {player_email}</w:t>
+              <w:t>: {</w:t>
+            </w:r>
+            <w:proofErr w:type="spellStart"/>
+            <w:r>
+              <w:rPr>
+                <w:lang w:val="en-US"/>
+              </w:rPr>
+              <w:t>player_email</w:t>
+            </w:r>
+            <w:proofErr w:type="spellEnd"/>
+            <w:r>
+              <w:rPr>
+                <w:lang w:val="en-US"/>
+              </w:rPr>
+              <w:t>}</w:t>
             </w:r>
           </w:p>
           <w:p>
@@ -6775,7 +7470,6 @@
                 <w:bCs/>
                 <w:lang w:val="en-US"/>
               </w:rPr>
-              <w:lastRenderedPageBreak/>
               <w:t>Subject</w:t>
             </w:r>
             <w:r>
@@ -6871,6 +7565,7 @@
               <w:rPr>
                 <w:lang w:val="en-US"/>
               </w:rPr>
+              <w:lastRenderedPageBreak/>
               <w:t>[p]Red Pens = 100 units</w:t>
             </w:r>
           </w:p>
@@ -6903,7 +7598,6 @@
               <w:rPr>
                 <w:lang w:val="en-US"/>
               </w:rPr>
-              <w:lastRenderedPageBreak/>
               <w:t xml:space="preserve">[p]Stapler = </w:t>
             </w:r>
             <w:r>
@@ -7102,31 +7796,13 @@
               <w:rPr>
                 <w:lang w:val="en-US"/>
               </w:rPr>
-              <w:t>mike</w:t>
-            </w:r>
-            <w:r>
-              <w:rPr>
-                <w:lang w:val="en-US"/>
-              </w:rPr>
-              <w:t>@</w:t>
-            </w:r>
-            <w:r>
-              <w:rPr>
-                <w:lang w:val="en-US"/>
-              </w:rPr>
-              <w:t>abc</w:t>
-            </w:r>
-            <w:r>
-              <w:rPr>
-                <w:lang w:val="en-US"/>
-              </w:rPr>
-              <w:t>.com</w:t>
-            </w:r>
-            <w:r>
-              <w:rPr>
-                <w:lang w:val="en-US"/>
-              </w:rPr>
-              <w:t>.my</w:t>
+              <w:t>rnike</w:t>
+            </w:r>
+            <w:r>
+              <w:rPr>
+                <w:lang w:val="en-US"/>
+              </w:rPr>
+              <w:t>@email.com</w:t>
             </w:r>
           </w:p>
           <w:p>
@@ -7147,7 +7823,21 @@
               <w:rPr>
                 <w:lang w:val="en-US"/>
               </w:rPr>
-              <w:t>: {player_email}</w:t>
+              <w:t>: {</w:t>
+            </w:r>
+            <w:proofErr w:type="spellStart"/>
+            <w:r>
+              <w:rPr>
+                <w:lang w:val="en-US"/>
+              </w:rPr>
+              <w:t>player_email</w:t>
+            </w:r>
+            <w:proofErr w:type="spellEnd"/>
+            <w:r>
+              <w:rPr>
+                <w:lang w:val="en-US"/>
+              </w:rPr>
+              <w:t>}</w:t>
             </w:r>
           </w:p>
           <w:p>
@@ -7195,7 +7885,7 @@
               <w:rPr>
                 <w:lang w:val="en-US"/>
               </w:rPr>
-              <w:t>Multiple Purchase Orders</w:t>
+              <w:t>New Purchase Order</w:t>
             </w:r>
           </w:p>
           <w:p>
@@ -7219,11 +7909,50 @@
                 <w:lang w:val="en-US"/>
               </w:rPr>
             </w:pPr>
-            <w:r>
-              <w:rPr>
-                <w:lang w:val="en-US"/>
-              </w:rPr>
-              <w:t>Hey {player_name}!</w:t>
+          </w:p>
+          <w:p>
+            <w:pPr>
+              <w:rPr>
+                <w:lang w:val="en-US"/>
+              </w:rPr>
+            </w:pPr>
+            <w:r>
+              <w:rPr>
+                <w:lang w:val="en-US"/>
+              </w:rPr>
+              <w:t>Hi {</w:t>
+            </w:r>
+            <w:proofErr w:type="spellStart"/>
+            <w:r>
+              <w:rPr>
+                <w:lang w:val="en-US"/>
+              </w:rPr>
+              <w:t>player_name</w:t>
+            </w:r>
+            <w:proofErr w:type="spellEnd"/>
+            <w:r>
+              <w:rPr>
+                <w:lang w:val="en-US"/>
+              </w:rPr>
+              <w:t xml:space="preserve">}! </w:t>
+            </w:r>
+            <w:r>
+              <w:rPr>
+                <w:lang w:val="en-US"/>
+              </w:rPr>
+              <w:t>It’s</w:t>
+            </w:r>
+            <w:r>
+              <w:rPr>
+                <w:lang w:val="en-US"/>
+              </w:rPr>
+              <w:t xml:space="preserve"> me,</w:t>
+            </w:r>
+            <w:r>
+              <w:rPr>
+                <w:lang w:val="en-US"/>
+              </w:rPr>
+              <w:t xml:space="preserve"> Mike!</w:t>
             </w:r>
           </w:p>
           <w:p>
@@ -7249,20 +7978,84 @@
               <w:rPr>
                 <w:lang w:val="en-US"/>
               </w:rPr>
-              <w:t>[p]Was really busy today and found a lot of new clients! Here are the purchase orders</w:t>
-            </w:r>
-            <w:r>
-              <w:rPr>
-                <w:lang w:val="en-US"/>
-              </w:rPr>
-              <w:t>, like usual please help me send them to Finance.</w:t>
-            </w:r>
-            <w:r>
-              <w:rPr>
-                <w:lang w:val="en-US"/>
-              </w:rPr>
-              <w:t xml:space="preserve"> Thanks!</w:t>
-            </w:r>
+              <w:t xml:space="preserve">[p]Please download </w:t>
+            </w:r>
+            <w:r>
+              <w:rPr>
+                <w:lang w:val="en-US"/>
+              </w:rPr>
+              <w:t xml:space="preserve">the purchase orders </w:t>
+            </w:r>
+            <w:r>
+              <w:rPr>
+                <w:lang w:val="en-US"/>
+              </w:rPr>
+              <w:t xml:space="preserve">and </w:t>
+            </w:r>
+            <w:r>
+              <w:rPr>
+                <w:lang w:val="en-US"/>
+              </w:rPr>
+              <w:t xml:space="preserve">send it </w:t>
+            </w:r>
+            <w:r>
+              <w:rPr>
+                <w:lang w:val="en-US"/>
+              </w:rPr>
+              <w:t>to finance.</w:t>
+            </w:r>
+          </w:p>
+          <w:p>
+            <w:pPr>
+              <w:rPr>
+                <w:lang w:val="en-US"/>
+              </w:rPr>
+            </w:pPr>
+            <w:r>
+              <w:rPr>
+                <w:lang w:val="en-US"/>
+              </w:rPr>
+              <w:t xml:space="preserve">[p] </w:t>
+            </w:r>
+          </w:p>
+          <w:p>
+            <w:pPr>
+              <w:rPr>
+                <w:lang w:val="en-US"/>
+              </w:rPr>
+            </w:pPr>
+            <w:r>
+              <w:rPr>
+                <w:lang w:val="en-US"/>
+              </w:rPr>
+              <w:t>[p]</w:t>
+            </w:r>
+            <w:r>
+              <w:rPr>
+                <w:lang w:val="en-US"/>
+              </w:rPr>
+              <w:t>From,</w:t>
+            </w:r>
+          </w:p>
+          <w:p>
+            <w:pPr>
+              <w:rPr>
+                <w:lang w:val="en-US"/>
+              </w:rPr>
+            </w:pPr>
+            <w:r>
+              <w:rPr>
+                <w:lang w:val="en-US"/>
+              </w:rPr>
+              <w:t>[p]Mike</w:t>
+            </w:r>
+          </w:p>
+          <w:p>
+            <w:pPr>
+              <w:rPr>
+                <w:lang w:val="en-US"/>
+              </w:rPr>
+            </w:pPr>
           </w:p>
         </w:tc>
       </w:tr>
@@ -7302,7 +8095,7 @@
               <w:rPr>
                 <w:lang w:val="en-US"/>
               </w:rPr>
-              <w:t>: Message</w:t>
+              <w:t>: Inbound</w:t>
             </w:r>
           </w:p>
           <w:p>
@@ -7329,7 +8122,7 @@
               <w:rPr>
                 <w:lang w:val="en-US"/>
               </w:rPr>
-              <w:t>C17</w:t>
+              <w:t>Mike</w:t>
             </w:r>
           </w:p>
           <w:p>
@@ -7356,7 +8149,31 @@
               <w:rPr>
                 <w:lang w:val="en-US"/>
               </w:rPr>
-              <w:t>recruiting@c17.com</w:t>
+              <w:t>mike</w:t>
+            </w:r>
+            <w:r>
+              <w:rPr>
+                <w:lang w:val="en-US"/>
+              </w:rPr>
+              <w:t>@</w:t>
+            </w:r>
+            <w:r>
+              <w:rPr>
+                <w:lang w:val="en-US"/>
+              </w:rPr>
+              <w:t>abc</w:t>
+            </w:r>
+            <w:r>
+              <w:rPr>
+                <w:lang w:val="en-US"/>
+              </w:rPr>
+              <w:t>.com</w:t>
+            </w:r>
+            <w:r>
+              <w:rPr>
+                <w:lang w:val="en-US"/>
+              </w:rPr>
+              <w:t>.my</w:t>
             </w:r>
           </w:p>
           <w:p>
@@ -7377,7 +8194,21 @@
               <w:rPr>
                 <w:lang w:val="en-US"/>
               </w:rPr>
-              <w:t>: {player_email}</w:t>
+              <w:t>: {</w:t>
+            </w:r>
+            <w:proofErr w:type="spellStart"/>
+            <w:r>
+              <w:rPr>
+                <w:lang w:val="en-US"/>
+              </w:rPr>
+              <w:t>player_email</w:t>
+            </w:r>
+            <w:proofErr w:type="spellEnd"/>
+            <w:r>
+              <w:rPr>
+                <w:lang w:val="en-US"/>
+              </w:rPr>
+              <w:t>}</w:t>
             </w:r>
           </w:p>
           <w:p>
@@ -7425,13 +8256,7 @@
               <w:rPr>
                 <w:lang w:val="en-US"/>
               </w:rPr>
-              <w:t>Join us</w:t>
-            </w:r>
-            <w:r>
-              <w:rPr>
-                <w:lang w:val="en-US"/>
-              </w:rPr>
-              <w:t xml:space="preserve"> at C17 Stationeries!</w:t>
+              <w:t>Multiple Purchase Orders</w:t>
             </w:r>
           </w:p>
           <w:p>
@@ -7459,46 +8284,47 @@
               <w:rPr>
                 <w:lang w:val="en-US"/>
               </w:rPr>
-              <w:t>Image of recruiting</w:t>
-            </w:r>
-          </w:p>
-          <w:p>
-            <w:pPr>
-              <w:rPr>
-                <w:lang w:val="en-US"/>
-              </w:rPr>
-            </w:pPr>
-            <w:r>
-              <w:rPr>
-                <w:lang w:val="en-US"/>
-              </w:rPr>
-              <w:t>C17</w:t>
-            </w:r>
-          </w:p>
-          <w:p>
-            <w:pPr>
-              <w:rPr>
-                <w:lang w:val="en-US"/>
-              </w:rPr>
-            </w:pPr>
-            <w:r>
-              <w:rPr>
-                <w:lang w:val="en-US"/>
-              </w:rPr>
-              <w:t>Sub brand of parent company: The Combine Group</w:t>
-            </w:r>
-          </w:p>
-          <w:p>
-            <w:pPr>
-              <w:rPr>
-                <w:lang w:val="en-US"/>
-              </w:rPr>
-            </w:pPr>
-            <w:r>
-              <w:rPr>
-                <w:lang w:val="en-US"/>
-              </w:rPr>
-              <w:t>This time more threatening</w:t>
+              <w:t>Hey {</w:t>
+            </w:r>
+            <w:proofErr w:type="spellStart"/>
+            <w:r>
+              <w:rPr>
+                <w:lang w:val="en-US"/>
+              </w:rPr>
+              <w:t>player_name</w:t>
+            </w:r>
+            <w:proofErr w:type="spellEnd"/>
+            <w:r>
+              <w:rPr>
+                <w:lang w:val="en-US"/>
+              </w:rPr>
+              <w:t>}!</w:t>
+            </w:r>
+          </w:p>
+          <w:p>
+            <w:pPr>
+              <w:rPr>
+                <w:lang w:val="en-US"/>
+              </w:rPr>
+            </w:pPr>
+            <w:r>
+              <w:rPr>
+                <w:lang w:val="en-US"/>
+              </w:rPr>
+              <w:t xml:space="preserve">[p] </w:t>
+            </w:r>
+          </w:p>
+          <w:p>
+            <w:pPr>
+              <w:rPr>
+                <w:lang w:val="en-US"/>
+              </w:rPr>
+            </w:pPr>
+            <w:r>
+              <w:rPr>
+                <w:lang w:val="en-US"/>
+              </w:rPr>
+              <w:t>[p]Was really busy today and found a lot of new clients! Here are the purchase orders, like usual please help me send them to Finance. Thanks!</w:t>
             </w:r>
           </w:p>
         </w:tc>

</xml_diff>

<commit_message>
Update: Tuesday Level Correction
</commit_message>
<xml_diff>
--- a/level design.docx
+++ b/level design.docx
@@ -1466,6 +1466,7 @@
               <w:t>]assets/tutorial/report_email.png[/</w:t>
             </w:r>
             <w:proofErr w:type="spellStart"/>
+            <w:proofErr w:type="gramStart"/>
             <w:r>
               <w:rPr>
                 <w:lang w:val="en-US"/>
@@ -1483,7 +1484,14 @@
               <w:rPr>
                 <w:lang w:val="en-US"/>
               </w:rPr>
-              <w:t>[/center]</w:t>
+              <w:t>[</w:t>
+            </w:r>
+            <w:proofErr w:type="gramEnd"/>
+            <w:r>
+              <w:rPr>
+                <w:lang w:val="en-US"/>
+              </w:rPr>
+              <w:t>/center]</w:t>
             </w:r>
           </w:p>
           <w:p>
@@ -1871,7 +1879,21 @@
               <w:rPr>
                 <w:lang w:val="en-US"/>
               </w:rPr>
-              <w:t>[p]To make things easier for you, I'll send you a request email like this every day and you can just drop the files in and click send!</w:t>
+              <w:t>[p]</w:t>
+            </w:r>
+            <w:proofErr w:type="gramStart"/>
+            <w:r>
+              <w:rPr>
+                <w:lang w:val="en-US"/>
+              </w:rPr>
+              <w:t>To</w:t>
+            </w:r>
+            <w:proofErr w:type="gramEnd"/>
+            <w:r>
+              <w:rPr>
+                <w:lang w:val="en-US"/>
+              </w:rPr>
+              <w:t xml:space="preserve"> make things easier for you, I'll send you a request email like this every day and you can just drop the files in and click send!</w:t>
             </w:r>
           </w:p>
           <w:p>
@@ -1897,7 +1919,35 @@
               <w:rPr>
                 <w:lang w:val="en-US"/>
               </w:rPr>
-              <w:t>[p][b]Make sure that you have collected all the Purchase Orders sent to you today before submitting. A missed order is a missed opportunity![/b]</w:t>
+              <w:t>[p][</w:t>
+            </w:r>
+            <w:proofErr w:type="gramStart"/>
+            <w:r>
+              <w:rPr>
+                <w:lang w:val="en-US"/>
+              </w:rPr>
+              <w:t>b]Make</w:t>
+            </w:r>
+            <w:proofErr w:type="gramEnd"/>
+            <w:r>
+              <w:rPr>
+                <w:lang w:val="en-US"/>
+              </w:rPr>
+              <w:t xml:space="preserve"> sure that you have collected all the Purchase Orders sent to you today before submitting. A missed order is a missed </w:t>
+            </w:r>
+            <w:proofErr w:type="gramStart"/>
+            <w:r>
+              <w:rPr>
+                <w:lang w:val="en-US"/>
+              </w:rPr>
+              <w:t>opportunity![</w:t>
+            </w:r>
+            <w:proofErr w:type="gramEnd"/>
+            <w:r>
+              <w:rPr>
+                <w:lang w:val="en-US"/>
+              </w:rPr>
+              <w:t>/b]</w:t>
             </w:r>
           </w:p>
           <w:p>
@@ -2643,10 +2693,18 @@
               <w:t>]</w:t>
             </w:r>
             <w:r>
-              <w:t>Thank you for choosing Orbit Antivirus!</w:t>
-            </w:r>
-            <w:r>
-              <w:t>[/</w:t>
+              <w:t xml:space="preserve">Thank you for choosing Orbit </w:t>
+            </w:r>
+            <w:proofErr w:type="gramStart"/>
+            <w:r>
+              <w:t>Antivirus!</w:t>
+            </w:r>
+            <w:r>
+              <w:t>[</w:t>
+            </w:r>
+            <w:proofErr w:type="gramEnd"/>
+            <w:r>
+              <w:t>/</w:t>
             </w:r>
             <w:proofErr w:type="spellStart"/>
             <w:r>
@@ -2695,6 +2753,7 @@
               <w:t>orbit_logo.png[/</w:t>
             </w:r>
             <w:proofErr w:type="spellStart"/>
+            <w:proofErr w:type="gramStart"/>
             <w:r>
               <w:t>img</w:t>
             </w:r>
@@ -2703,7 +2762,11 @@
               <w:t>]</w:t>
             </w:r>
             <w:r>
-              <w:t>[/</w:t>
+              <w:t>[</w:t>
+            </w:r>
+            <w:proofErr w:type="gramEnd"/>
+            <w:r>
+              <w:t>/</w:t>
             </w:r>
             <w:proofErr w:type="spellStart"/>
             <w:r>
@@ -2962,11 +3025,19 @@
                 <w:lang w:val="en-US"/>
               </w:rPr>
             </w:pPr>
-            <w:r>
-              <w:rPr>
-                <w:lang w:val="en-US"/>
-              </w:rPr>
-              <w:t>[p]Please refer to the PO attached.</w:t>
+            <w:proofErr w:type="gramStart"/>
+            <w:r>
+              <w:rPr>
+                <w:lang w:val="en-US"/>
+              </w:rPr>
+              <w:t>[p]</w:t>
+            </w:r>
+            <w:proofErr w:type="gramEnd"/>
+            <w:r>
+              <w:rPr>
+                <w:lang w:val="en-US"/>
+              </w:rPr>
+              <w:t>Please refer to the PO attached.</w:t>
             </w:r>
           </w:p>
           <w:p>
@@ -3339,6 +3410,7 @@
               <w:t>trippo_ad.jpg[/</w:t>
             </w:r>
             <w:proofErr w:type="spellStart"/>
+            <w:proofErr w:type="gramStart"/>
             <w:r>
               <w:t>img</w:t>
             </w:r>
@@ -3347,7 +3419,11 @@
               <w:t>]</w:t>
             </w:r>
             <w:r>
-              <w:t>[/</w:t>
+              <w:t>[</w:t>
+            </w:r>
+            <w:proofErr w:type="gramEnd"/>
+            <w:r>
+              <w:t>/</w:t>
             </w:r>
             <w:proofErr w:type="spellStart"/>
             <w:r>
@@ -5881,14 +5957,27 @@
               <w:rPr>
                 <w:lang w:val="en-US"/>
               </w:rPr>
-              <w:t>[b]</w:t>
+              <w:t>[</w:t>
+            </w:r>
+            <w:proofErr w:type="gramStart"/>
+            <w:r>
+              <w:rPr>
+                <w:lang w:val="en-US"/>
+              </w:rPr>
+              <w:t>b]</w:t>
             </w:r>
             <w:r>
               <w:t>Malware</w:t>
             </w:r>
-            <w:r>
-              <w:t>[/b] :</w:t>
-            </w:r>
+            <w:proofErr w:type="gramEnd"/>
+            <w:r>
+              <w:t>[/b</w:t>
+            </w:r>
+            <w:proofErr w:type="gramStart"/>
+            <w:r>
+              <w:t>] :</w:t>
+            </w:r>
+            <w:proofErr w:type="gramEnd"/>
             <w:r>
               <w:t xml:space="preserve"> Software that runs in the background silently. They have various goals, such as recording what you type, </w:t>
             </w:r>
@@ -5914,14 +6003,30 @@
               <w:rPr>
                 <w:lang w:val="en-US"/>
               </w:rPr>
-              <w:t>[p][b]</w:t>
-            </w:r>
-            <w:r>
-              <w:t xml:space="preserve">Adware[/b] </w:t>
+              <w:t>[p][</w:t>
+            </w:r>
+            <w:proofErr w:type="gramStart"/>
+            <w:r>
+              <w:rPr>
+                <w:lang w:val="en-US"/>
+              </w:rPr>
+              <w:t>b]</w:t>
+            </w:r>
+            <w:r>
+              <w:t>Adware</w:t>
+            </w:r>
+            <w:proofErr w:type="gramEnd"/>
+            <w:r>
+              <w:t>[/b</w:t>
+            </w:r>
+            <w:proofErr w:type="gramStart"/>
+            <w:r>
+              <w:t xml:space="preserve">] </w:t>
             </w:r>
             <w:r>
               <w:t>:</w:t>
             </w:r>
+            <w:proofErr w:type="gramEnd"/>
             <w:r>
               <w:t xml:space="preserve"> If it exists in your device, you will get spammed by various advertisements which can be very distracting.</w:t>
             </w:r>
@@ -5950,14 +6055,27 @@
               <w:rPr>
                 <w:lang w:val="en-US"/>
               </w:rPr>
-              <w:t>[b]</w:t>
+              <w:t>[</w:t>
+            </w:r>
+            <w:proofErr w:type="gramStart"/>
+            <w:r>
+              <w:rPr>
+                <w:lang w:val="en-US"/>
+              </w:rPr>
+              <w:t>b]</w:t>
             </w:r>
             <w:r>
               <w:t>Ransomware</w:t>
             </w:r>
-            <w:r>
-              <w:t>[/b] :</w:t>
-            </w:r>
+            <w:proofErr w:type="gramEnd"/>
+            <w:r>
+              <w:t>[/b</w:t>
+            </w:r>
+            <w:proofErr w:type="gramStart"/>
+            <w:r>
+              <w:t>] :</w:t>
+            </w:r>
+            <w:proofErr w:type="gramEnd"/>
             <w:r>
               <w:t xml:space="preserve"> One of the most dangerous software to have in your device. It will lock your files and demand a large sum of money to unlock your files. Do not pay the ransom, it will not guarantee your files return.</w:t>
             </w:r>
@@ -6559,19 +6677,47 @@
               <w:rPr>
                 <w:lang w:val="en-US"/>
               </w:rPr>
-              <w:t>=500x500</w:t>
-            </w:r>
-            <w:r>
-              <w:rPr>
-                <w:lang w:val="en-US"/>
-              </w:rPr>
-              <w:t>]assets/adware/c17_recruit.jpg[/img]</w:t>
-            </w:r>
-            <w:r>
-              <w:rPr>
-                <w:lang w:val="en-US"/>
-              </w:rPr>
-              <w:t>[/center]</w:t>
+              <w:t>=500x</w:t>
+            </w:r>
+            <w:proofErr w:type="gramStart"/>
+            <w:r>
+              <w:rPr>
+                <w:lang w:val="en-US"/>
+              </w:rPr>
+              <w:t>500</w:t>
+            </w:r>
+            <w:r>
+              <w:rPr>
+                <w:lang w:val="en-US"/>
+              </w:rPr>
+              <w:t>]assets/adware/c17_recruit.jpg</w:t>
+            </w:r>
+            <w:proofErr w:type="gramEnd"/>
+            <w:r>
+              <w:rPr>
+                <w:lang w:val="en-US"/>
+              </w:rPr>
+              <w:t>[/</w:t>
+            </w:r>
+            <w:proofErr w:type="gramStart"/>
+            <w:r>
+              <w:rPr>
+                <w:lang w:val="en-US"/>
+              </w:rPr>
+              <w:t>img]</w:t>
+            </w:r>
+            <w:r>
+              <w:rPr>
+                <w:lang w:val="en-US"/>
+              </w:rPr>
+              <w:t>[</w:t>
+            </w:r>
+            <w:proofErr w:type="gramEnd"/>
+            <w:r>
+              <w:rPr>
+                <w:lang w:val="en-US"/>
+              </w:rPr>
+              <w:t>/center]</w:t>
             </w:r>
           </w:p>
         </w:tc>
@@ -6856,11 +7002,19 @@
                 <w:lang w:val="en-US"/>
               </w:rPr>
             </w:pPr>
-            <w:r>
-              <w:rPr>
-                <w:lang w:val="en-US"/>
-              </w:rPr>
-              <w:t xml:space="preserve">[p]Please download and send the </w:t>
+            <w:proofErr w:type="gramStart"/>
+            <w:r>
+              <w:rPr>
+                <w:lang w:val="en-US"/>
+              </w:rPr>
+              <w:t>[p]</w:t>
+            </w:r>
+            <w:proofErr w:type="gramEnd"/>
+            <w:r>
+              <w:rPr>
+                <w:lang w:val="en-US"/>
+              </w:rPr>
+              <w:t xml:space="preserve">Please download and send the </w:t>
             </w:r>
             <w:proofErr w:type="spellStart"/>
             <w:r>
@@ -7215,12 +7369,14 @@
                 <w:lang w:val="en-US"/>
               </w:rPr>
             </w:pPr>
+            <w:proofErr w:type="gramStart"/>
             <w:r>
               <w:rPr>
                 <w:lang w:val="en-US"/>
               </w:rPr>
               <w:t>[p]</w:t>
             </w:r>
+            <w:proofErr w:type="gramEnd"/>
             <w:r>
               <w:rPr>
                 <w:lang w:val="en-US"/>
@@ -7974,11 +8130,19 @@
                 <w:lang w:val="en-US"/>
               </w:rPr>
             </w:pPr>
-            <w:r>
-              <w:rPr>
-                <w:lang w:val="en-US"/>
-              </w:rPr>
-              <w:t xml:space="preserve">[p]Please download </w:t>
+            <w:proofErr w:type="gramStart"/>
+            <w:r>
+              <w:rPr>
+                <w:lang w:val="en-US"/>
+              </w:rPr>
+              <w:t>[p]</w:t>
+            </w:r>
+            <w:proofErr w:type="gramEnd"/>
+            <w:r>
+              <w:rPr>
+                <w:lang w:val="en-US"/>
+              </w:rPr>
+              <w:t xml:space="preserve">Please download </w:t>
             </w:r>
             <w:r>
               <w:rPr>

</xml_diff>

<commit_message>
Debug: Outbound File Container
- changed ownership of outbound files from UI to EmailData itself
</commit_message>
<xml_diff>
--- a/level design.docx
+++ b/level design.docx
@@ -844,12 +844,17 @@
     </w:p>
     <w:p>
       <w:pPr>
+        <w:pStyle w:val="Heading1"/>
         <w:rPr>
+          <w:b/>
+          <w:bCs/>
           <w:lang w:val="en-US"/>
         </w:rPr>
       </w:pPr>
       <w:r>
         <w:rPr>
+          <w:b/>
+          <w:bCs/>
           <w:lang w:val="en-US"/>
         </w:rPr>
         <w:lastRenderedPageBreak/>
@@ -1466,7 +1471,6 @@
               <w:t>]assets/tutorial/report_email.png[/</w:t>
             </w:r>
             <w:proofErr w:type="spellStart"/>
-            <w:proofErr w:type="gramStart"/>
             <w:r>
               <w:rPr>
                 <w:lang w:val="en-US"/>
@@ -1484,14 +1488,7 @@
               <w:rPr>
                 <w:lang w:val="en-US"/>
               </w:rPr>
-              <w:t>[</w:t>
-            </w:r>
-            <w:proofErr w:type="gramEnd"/>
-            <w:r>
-              <w:rPr>
-                <w:lang w:val="en-US"/>
-              </w:rPr>
-              <w:t>/center]</w:t>
+              <w:t>[/center]</w:t>
             </w:r>
           </w:p>
           <w:p>
@@ -1879,21 +1876,7 @@
               <w:rPr>
                 <w:lang w:val="en-US"/>
               </w:rPr>
-              <w:t>[p]</w:t>
-            </w:r>
-            <w:proofErr w:type="gramStart"/>
-            <w:r>
-              <w:rPr>
-                <w:lang w:val="en-US"/>
-              </w:rPr>
-              <w:t>To</w:t>
-            </w:r>
-            <w:proofErr w:type="gramEnd"/>
-            <w:r>
-              <w:rPr>
-                <w:lang w:val="en-US"/>
-              </w:rPr>
-              <w:t xml:space="preserve"> make things easier for you, I'll send you a request email like this every day and you can just drop the files in and click send!</w:t>
+              <w:t>[p]To make things easier for you, I'll send you a request email like this every day and you can just drop the files in and click send!</w:t>
             </w:r>
           </w:p>
           <w:p>
@@ -1919,35 +1902,7 @@
               <w:rPr>
                 <w:lang w:val="en-US"/>
               </w:rPr>
-              <w:t>[p][</w:t>
-            </w:r>
-            <w:proofErr w:type="gramStart"/>
-            <w:r>
-              <w:rPr>
-                <w:lang w:val="en-US"/>
-              </w:rPr>
-              <w:t>b]Make</w:t>
-            </w:r>
-            <w:proofErr w:type="gramEnd"/>
-            <w:r>
-              <w:rPr>
-                <w:lang w:val="en-US"/>
-              </w:rPr>
-              <w:t xml:space="preserve"> sure that you have collected all the Purchase Orders sent to you today before submitting. A missed order is a missed </w:t>
-            </w:r>
-            <w:proofErr w:type="gramStart"/>
-            <w:r>
-              <w:rPr>
-                <w:lang w:val="en-US"/>
-              </w:rPr>
-              <w:t>opportunity![</w:t>
-            </w:r>
-            <w:proofErr w:type="gramEnd"/>
-            <w:r>
-              <w:rPr>
-                <w:lang w:val="en-US"/>
-              </w:rPr>
-              <w:t>/b]</w:t>
+              <w:t>[p][b]Make sure that you have collected all the Purchase Orders sent to you today before submitting. A missed order is a missed opportunity![/b]</w:t>
             </w:r>
           </w:p>
           <w:p>
@@ -2693,19 +2648,32 @@
               <w:t>]</w:t>
             </w:r>
             <w:r>
-              <w:t xml:space="preserve">Thank you for choosing Orbit </w:t>
-            </w:r>
-            <w:proofErr w:type="gramStart"/>
-            <w:r>
-              <w:t>Antivirus!</w:t>
+              <w:t>Thank you for choosing Orbit Antivirus!</w:t>
+            </w:r>
+            <w:r>
+              <w:t>[/</w:t>
+            </w:r>
+            <w:proofErr w:type="spellStart"/>
+            <w:r>
+              <w:t>center</w:t>
+            </w:r>
+            <w:proofErr w:type="spellEnd"/>
+            <w:r>
+              <w:t>]</w:t>
+            </w:r>
+          </w:p>
+          <w:p>
+            <w:r>
+              <w:t xml:space="preserve">[p] </w:t>
+            </w:r>
+          </w:p>
+          <w:p>
+            <w:r>
+              <w:t>[p]</w:t>
             </w:r>
             <w:r>
               <w:t>[</w:t>
             </w:r>
-            <w:proofErr w:type="gramEnd"/>
-            <w:r>
-              <w:t>/</w:t>
-            </w:r>
             <w:proofErr w:type="spellStart"/>
             <w:r>
               <w:t>center</w:t>
@@ -2714,29 +2682,22 @@
             <w:r>
               <w:t>]</w:t>
             </w:r>
-          </w:p>
-          <w:p>
-            <w:r>
-              <w:t xml:space="preserve">[p] </w:t>
-            </w:r>
-          </w:p>
-          <w:p>
-            <w:r>
-              <w:t>[p]</w:t>
-            </w:r>
             <w:r>
               <w:t>[</w:t>
             </w:r>
             <w:proofErr w:type="spellStart"/>
             <w:r>
-              <w:t>center</w:t>
+              <w:t>img</w:t>
             </w:r>
             <w:proofErr w:type="spellEnd"/>
             <w:r>
               <w:t>]</w:t>
             </w:r>
             <w:r>
-              <w:t>[</w:t>
+              <w:t>assets/</w:t>
+            </w:r>
+            <w:r>
+              <w:t>orbit_logo.png[/</w:t>
             </w:r>
             <w:proofErr w:type="spellStart"/>
             <w:r>
@@ -2747,26 +2708,7 @@
               <w:t>]</w:t>
             </w:r>
             <w:r>
-              <w:t>assets/</w:t>
-            </w:r>
-            <w:r>
-              <w:t>orbit_logo.png[/</w:t>
-            </w:r>
-            <w:proofErr w:type="spellStart"/>
-            <w:proofErr w:type="gramStart"/>
-            <w:r>
-              <w:t>img</w:t>
-            </w:r>
-            <w:proofErr w:type="spellEnd"/>
-            <w:r>
-              <w:t>]</w:t>
-            </w:r>
-            <w:r>
-              <w:t>[</w:t>
-            </w:r>
-            <w:proofErr w:type="gramEnd"/>
-            <w:r>
-              <w:t>/</w:t>
+              <w:t>[/</w:t>
             </w:r>
             <w:proofErr w:type="spellStart"/>
             <w:r>
@@ -3025,19 +2967,11 @@
                 <w:lang w:val="en-US"/>
               </w:rPr>
             </w:pPr>
-            <w:proofErr w:type="gramStart"/>
-            <w:r>
-              <w:rPr>
-                <w:lang w:val="en-US"/>
-              </w:rPr>
-              <w:t>[p]</w:t>
-            </w:r>
-            <w:proofErr w:type="gramEnd"/>
-            <w:r>
-              <w:rPr>
-                <w:lang w:val="en-US"/>
-              </w:rPr>
-              <w:t>Please refer to the PO attached.</w:t>
+            <w:r>
+              <w:rPr>
+                <w:lang w:val="en-US"/>
+              </w:rPr>
+              <w:t>[p]Please refer to the PO attached.</w:t>
             </w:r>
           </w:p>
           <w:p>
@@ -3410,7 +3344,6 @@
               <w:t>trippo_ad.jpg[/</w:t>
             </w:r>
             <w:proofErr w:type="spellStart"/>
-            <w:proofErr w:type="gramStart"/>
             <w:r>
               <w:t>img</w:t>
             </w:r>
@@ -3419,11 +3352,7 @@
               <w:t>]</w:t>
             </w:r>
             <w:r>
-              <w:t>[</w:t>
-            </w:r>
-            <w:proofErr w:type="gramEnd"/>
-            <w:r>
-              <w:t>/</w:t>
+              <w:t>[/</w:t>
             </w:r>
             <w:proofErr w:type="spellStart"/>
             <w:r>
@@ -4138,11 +4067,104 @@
               </w:rPr>
               <w:t xml:space="preserve">[p] </w:t>
             </w:r>
-            <w:r>
-              <w:rPr>
-                <w:lang w:val="en-US"/>
-              </w:rPr>
-              <w:t>*add images</w:t>
+          </w:p>
+          <w:p>
+            <w:pPr>
+              <w:rPr>
+                <w:lang w:val="en-US"/>
+              </w:rPr>
+            </w:pPr>
+            <w:r>
+              <w:rPr>
+                <w:lang w:val="en-US"/>
+              </w:rPr>
+              <w:t>[p]</w:t>
+            </w:r>
+            <w:r>
+              <w:rPr>
+                <w:lang w:val="en-US"/>
+              </w:rPr>
+              <w:t>[center][</w:t>
+            </w:r>
+            <w:proofErr w:type="spellStart"/>
+            <w:r>
+              <w:rPr>
+                <w:lang w:val="en-US"/>
+              </w:rPr>
+              <w:t>img</w:t>
+            </w:r>
+            <w:proofErr w:type="spellEnd"/>
+            <w:r>
+              <w:rPr>
+                <w:lang w:val="en-US"/>
+              </w:rPr>
+              <w:t>]assets/tutorial/hover1.png[/</w:t>
+            </w:r>
+            <w:proofErr w:type="spellStart"/>
+            <w:r>
+              <w:rPr>
+                <w:lang w:val="en-US"/>
+              </w:rPr>
+              <w:t>img</w:t>
+            </w:r>
+            <w:proofErr w:type="spellEnd"/>
+            <w:r>
+              <w:rPr>
+                <w:lang w:val="en-US"/>
+              </w:rPr>
+              <w:t xml:space="preserve">] </w:t>
+            </w:r>
+            <w:r>
+              <w:rPr>
+                <w:lang w:val="en-US"/>
+              </w:rPr>
+              <w:t>[</w:t>
+            </w:r>
+            <w:proofErr w:type="spellStart"/>
+            <w:r>
+              <w:rPr>
+                <w:lang w:val="en-US"/>
+              </w:rPr>
+              <w:t>img</w:t>
+            </w:r>
+            <w:proofErr w:type="spellEnd"/>
+            <w:r>
+              <w:rPr>
+                <w:lang w:val="en-US"/>
+              </w:rPr>
+              <w:t>]assets/tutorial/hover</w:t>
+            </w:r>
+            <w:r>
+              <w:rPr>
+                <w:lang w:val="en-US"/>
+              </w:rPr>
+              <w:t>2</w:t>
+            </w:r>
+            <w:r>
+              <w:rPr>
+                <w:lang w:val="en-US"/>
+              </w:rPr>
+              <w:t>.png[/</w:t>
+            </w:r>
+            <w:proofErr w:type="spellStart"/>
+            <w:r>
+              <w:rPr>
+                <w:lang w:val="en-US"/>
+              </w:rPr>
+              <w:t>img</w:t>
+            </w:r>
+            <w:proofErr w:type="spellEnd"/>
+            <w:r>
+              <w:rPr>
+                <w:lang w:val="en-US"/>
+              </w:rPr>
+              <w:t>]</w:t>
+            </w:r>
+            <w:r>
+              <w:rPr>
+                <w:lang w:val="en-US"/>
+              </w:rPr>
+              <w:t xml:space="preserve"> [/center]</w:t>
             </w:r>
           </w:p>
           <w:p>
@@ -4866,6 +4888,25 @@
         <w:br w:type="page"/>
       </w:r>
     </w:p>
+    <w:p>
+      <w:pPr>
+        <w:pStyle w:val="Heading1"/>
+        <w:rPr>
+          <w:b/>
+          <w:bCs/>
+          <w:lang w:val="en-US"/>
+        </w:rPr>
+      </w:pPr>
+      <w:r>
+        <w:rPr>
+          <w:b/>
+          <w:bCs/>
+          <w:lang w:val="en-US"/>
+        </w:rPr>
+        <w:lastRenderedPageBreak/>
+        <w:t>Tuesday</w:t>
+      </w:r>
+    </w:p>
     <w:tbl>
       <w:tblPr>
         <w:tblStyle w:val="TableGrid"/>
@@ -4900,7 +4941,6 @@
                 <w:bCs/>
                 <w:lang w:val="en-US"/>
               </w:rPr>
-              <w:lastRenderedPageBreak/>
               <w:t>D</w:t>
             </w:r>
             <w:proofErr w:type="spellStart"/>
@@ -5315,13 +5355,7 @@
               <w:rPr>
                 <w:lang w:val="en-US"/>
               </w:rPr>
-              <w:t xml:space="preserve">] </w:t>
-            </w:r>
-            <w:r>
-              <w:rPr>
-                <w:lang w:val="en-US"/>
-              </w:rPr>
-              <w:t>[</w:t>
+              <w:t>] [</w:t>
             </w:r>
             <w:proofErr w:type="spellStart"/>
             <w:r>
@@ -5335,19 +5369,7 @@
               <w:rPr>
                 <w:lang w:val="en-US"/>
               </w:rPr>
-              <w:t>]assets/tutorial/highlight</w:t>
-            </w:r>
-            <w:r>
-              <w:rPr>
-                <w:lang w:val="en-US"/>
-              </w:rPr>
-              <w:t>2</w:t>
-            </w:r>
-            <w:r>
-              <w:rPr>
-                <w:lang w:val="en-US"/>
-              </w:rPr>
-              <w:t>.png[/</w:t>
+              <w:t>]assets/tutorial/highlight2.png[/</w:t>
             </w:r>
             <w:proofErr w:type="spellStart"/>
             <w:r>
@@ -5361,19 +5383,7 @@
               <w:rPr>
                 <w:lang w:val="en-US"/>
               </w:rPr>
-              <w:t>]</w:t>
-            </w:r>
-            <w:r>
-              <w:rPr>
-                <w:lang w:val="en-US"/>
-              </w:rPr>
-              <w:t xml:space="preserve"> </w:t>
-            </w:r>
-            <w:r>
-              <w:rPr>
-                <w:lang w:val="en-US"/>
-              </w:rPr>
-              <w:t>[</w:t>
+              <w:t>] [</w:t>
             </w:r>
             <w:proofErr w:type="spellStart"/>
             <w:r>
@@ -5387,19 +5397,7 @@
               <w:rPr>
                 <w:lang w:val="en-US"/>
               </w:rPr>
-              <w:t>]assets/tutorial/highlight</w:t>
-            </w:r>
-            <w:r>
-              <w:rPr>
-                <w:lang w:val="en-US"/>
-              </w:rPr>
-              <w:t>3</w:t>
-            </w:r>
-            <w:r>
-              <w:rPr>
-                <w:lang w:val="en-US"/>
-              </w:rPr>
-              <w:t>.png[/</w:t>
+              <w:t>]assets/tutorial/highlight3.png[/</w:t>
             </w:r>
             <w:proofErr w:type="spellStart"/>
             <w:r>
@@ -5930,6 +5928,12 @@
               <w:rPr>
                 <w:lang w:val="en-US"/>
               </w:rPr>
+              <w:t>[p]</w:t>
+            </w:r>
+            <w:r>
+              <w:rPr>
+                <w:lang w:val="en-US"/>
+              </w:rPr>
               <w:t>Today we will talk about 3 types of malwares:</w:t>
             </w:r>
           </w:p>
@@ -5957,27 +5961,14 @@
               <w:rPr>
                 <w:lang w:val="en-US"/>
               </w:rPr>
-              <w:t>[</w:t>
-            </w:r>
-            <w:proofErr w:type="gramStart"/>
-            <w:r>
-              <w:rPr>
-                <w:lang w:val="en-US"/>
-              </w:rPr>
-              <w:t>b]</w:t>
+              <w:t>[b]</w:t>
             </w:r>
             <w:r>
               <w:t>Malware</w:t>
             </w:r>
-            <w:proofErr w:type="gramEnd"/>
-            <w:r>
-              <w:t>[/b</w:t>
-            </w:r>
-            <w:proofErr w:type="gramStart"/>
-            <w:r>
-              <w:t>] :</w:t>
-            </w:r>
-            <w:proofErr w:type="gramEnd"/>
+            <w:r>
+              <w:t>[/b] :</w:t>
+            </w:r>
             <w:r>
               <w:t xml:space="preserve"> Software that runs in the background silently. They have various goals, such as recording what you type, </w:t>
             </w:r>
@@ -6003,32 +5994,10 @@
               <w:rPr>
                 <w:lang w:val="en-US"/>
               </w:rPr>
-              <w:t>[p][</w:t>
-            </w:r>
-            <w:proofErr w:type="gramStart"/>
-            <w:r>
-              <w:rPr>
-                <w:lang w:val="en-US"/>
-              </w:rPr>
-              <w:t>b]</w:t>
-            </w:r>
-            <w:r>
-              <w:t>Adware</w:t>
-            </w:r>
-            <w:proofErr w:type="gramEnd"/>
-            <w:r>
-              <w:t>[/b</w:t>
-            </w:r>
-            <w:proofErr w:type="gramStart"/>
-            <w:r>
-              <w:t xml:space="preserve">] </w:t>
-            </w:r>
-            <w:r>
-              <w:t>:</w:t>
-            </w:r>
-            <w:proofErr w:type="gramEnd"/>
-            <w:r>
-              <w:t xml:space="preserve"> If it exists in your device, you will get spammed by various advertisements which can be very distracting.</w:t>
+              <w:t>[p][b]</w:t>
+            </w:r>
+            <w:r>
+              <w:t>Adware[/b] : If it exists in your device, you will get spammed by various advertisements which can be very distracting.</w:t>
             </w:r>
           </w:p>
           <w:p>
@@ -6049,47 +6018,23 @@
               <w:rPr>
                 <w:lang w:val="en-US"/>
               </w:rPr>
-              <w:t>[p]</w:t>
-            </w:r>
-            <w:r>
-              <w:rPr>
-                <w:lang w:val="en-US"/>
-              </w:rPr>
-              <w:t>[</w:t>
-            </w:r>
-            <w:proofErr w:type="gramStart"/>
-            <w:r>
-              <w:rPr>
-                <w:lang w:val="en-US"/>
-              </w:rPr>
-              <w:t>b]</w:t>
-            </w:r>
-            <w:r>
-              <w:t>Ransomware</w:t>
-            </w:r>
-            <w:proofErr w:type="gramEnd"/>
-            <w:r>
-              <w:t>[/b</w:t>
-            </w:r>
-            <w:proofErr w:type="gramStart"/>
-            <w:r>
-              <w:t>] :</w:t>
-            </w:r>
-            <w:proofErr w:type="gramEnd"/>
-            <w:r>
-              <w:t xml:space="preserve"> One of the most dangerous software to have in your device. It will lock your files and demand a large sum of money to unlock your files. Do not pay the ransom, it will not guarantee your files return.</w:t>
-            </w:r>
-          </w:p>
-          <w:p>
-            <w:pPr>
-              <w:rPr>
-                <w:lang w:val="en-US"/>
-              </w:rPr>
-            </w:pPr>
-            <w:r>
-              <w:rPr>
-                <w:lang w:val="en-US"/>
-              </w:rPr>
+              <w:t>[p][b]</w:t>
+            </w:r>
+            <w:r>
+              <w:t>Ransomware[/b] : One of the most dangerous software to have in your device. It will lock your files and demand a large sum of money to unlock your files. Do not pay the ransom, it will not guarantee your files return.</w:t>
+            </w:r>
+          </w:p>
+          <w:p>
+            <w:pPr>
+              <w:rPr>
+                <w:lang w:val="en-US"/>
+              </w:rPr>
+            </w:pPr>
+            <w:r>
+              <w:rPr>
+                <w:lang w:val="en-US"/>
+              </w:rPr>
+              <w:lastRenderedPageBreak/>
               <w:t xml:space="preserve">[p] </w:t>
             </w:r>
           </w:p>
@@ -6103,7 +6048,6 @@
               <w:rPr>
                 <w:lang w:val="en-US"/>
               </w:rPr>
-              <w:lastRenderedPageBreak/>
               <w:t>[p]Be careful of what you download</w:t>
             </w:r>
             <w:r>
@@ -6494,13 +6438,7 @@
               <w:rPr>
                 <w:lang w:val="en-US"/>
               </w:rPr>
-              <w:t xml:space="preserve">: </w:t>
-            </w:r>
-            <w:r>
-              <w:rPr>
-                <w:lang w:val="en-US"/>
-              </w:rPr>
-              <w:t>Message</w:t>
+              <w:t>: Message</w:t>
             </w:r>
           </w:p>
           <w:p>
@@ -6677,47 +6615,19 @@
               <w:rPr>
                 <w:lang w:val="en-US"/>
               </w:rPr>
-              <w:t>=500x</w:t>
-            </w:r>
-            <w:proofErr w:type="gramStart"/>
-            <w:r>
-              <w:rPr>
-                <w:lang w:val="en-US"/>
-              </w:rPr>
-              <w:t>500</w:t>
-            </w:r>
-            <w:r>
-              <w:rPr>
-                <w:lang w:val="en-US"/>
-              </w:rPr>
-              <w:t>]assets/adware/c17_recruit.jpg</w:t>
-            </w:r>
-            <w:proofErr w:type="gramEnd"/>
-            <w:r>
-              <w:rPr>
-                <w:lang w:val="en-US"/>
-              </w:rPr>
-              <w:t>[/</w:t>
-            </w:r>
-            <w:proofErr w:type="gramStart"/>
-            <w:r>
-              <w:rPr>
-                <w:lang w:val="en-US"/>
-              </w:rPr>
-              <w:t>img]</w:t>
-            </w:r>
-            <w:r>
-              <w:rPr>
-                <w:lang w:val="en-US"/>
-              </w:rPr>
-              <w:t>[</w:t>
-            </w:r>
-            <w:proofErr w:type="gramEnd"/>
-            <w:r>
-              <w:rPr>
-                <w:lang w:val="en-US"/>
-              </w:rPr>
-              <w:t>/center]</w:t>
+              <w:t>=500x500</w:t>
+            </w:r>
+            <w:r>
+              <w:rPr>
+                <w:lang w:val="en-US"/>
+              </w:rPr>
+              <w:t>]assets/adware/c17_recruit.jpg[/img]</w:t>
+            </w:r>
+            <w:r>
+              <w:rPr>
+                <w:lang w:val="en-US"/>
+              </w:rPr>
+              <w:t>[/center]</w:t>
             </w:r>
           </w:p>
         </w:tc>
@@ -7002,19 +6912,11 @@
                 <w:lang w:val="en-US"/>
               </w:rPr>
             </w:pPr>
-            <w:proofErr w:type="gramStart"/>
-            <w:r>
-              <w:rPr>
-                <w:lang w:val="en-US"/>
-              </w:rPr>
-              <w:t>[p]</w:t>
-            </w:r>
-            <w:proofErr w:type="gramEnd"/>
-            <w:r>
-              <w:rPr>
-                <w:lang w:val="en-US"/>
-              </w:rPr>
-              <w:t xml:space="preserve">Please download and send the </w:t>
+            <w:r>
+              <w:rPr>
+                <w:lang w:val="en-US"/>
+              </w:rPr>
+              <w:t xml:space="preserve">[p]Please download and send the </w:t>
             </w:r>
             <w:proofErr w:type="spellStart"/>
             <w:r>
@@ -7369,14 +7271,12 @@
                 <w:lang w:val="en-US"/>
               </w:rPr>
             </w:pPr>
-            <w:proofErr w:type="gramStart"/>
             <w:r>
               <w:rPr>
                 <w:lang w:val="en-US"/>
               </w:rPr>
               <w:t>[p]</w:t>
             </w:r>
-            <w:proofErr w:type="gramEnd"/>
             <w:r>
               <w:rPr>
                 <w:lang w:val="en-US"/>
@@ -7708,6 +7608,7 @@
               <w:rPr>
                 <w:lang w:val="en-US"/>
               </w:rPr>
+              <w:lastRenderedPageBreak/>
               <w:t>[p]Blue Pens = 100 units</w:t>
             </w:r>
           </w:p>
@@ -7721,7 +7622,6 @@
               <w:rPr>
                 <w:lang w:val="en-US"/>
               </w:rPr>
-              <w:lastRenderedPageBreak/>
               <w:t>[p]Red Pens = 100 units</w:t>
             </w:r>
           </w:p>
@@ -8130,19 +8030,11 @@
                 <w:lang w:val="en-US"/>
               </w:rPr>
             </w:pPr>
-            <w:proofErr w:type="gramStart"/>
-            <w:r>
-              <w:rPr>
-                <w:lang w:val="en-US"/>
-              </w:rPr>
-              <w:t>[p]</w:t>
-            </w:r>
-            <w:proofErr w:type="gramEnd"/>
-            <w:r>
-              <w:rPr>
-                <w:lang w:val="en-US"/>
-              </w:rPr>
-              <w:t xml:space="preserve">Please download </w:t>
+            <w:r>
+              <w:rPr>
+                <w:lang w:val="en-US"/>
+              </w:rPr>
+              <w:t xml:space="preserve">[p]Please download </w:t>
             </w:r>
             <w:r>
               <w:rPr>
@@ -8313,31 +8205,7 @@
               <w:rPr>
                 <w:lang w:val="en-US"/>
               </w:rPr>
-              <w:t>mike</w:t>
-            </w:r>
-            <w:r>
-              <w:rPr>
-                <w:lang w:val="en-US"/>
-              </w:rPr>
-              <w:t>@</w:t>
-            </w:r>
-            <w:r>
-              <w:rPr>
-                <w:lang w:val="en-US"/>
-              </w:rPr>
-              <w:t>abc</w:t>
-            </w:r>
-            <w:r>
-              <w:rPr>
-                <w:lang w:val="en-US"/>
-              </w:rPr>
-              <w:t>.com</w:t>
-            </w:r>
-            <w:r>
-              <w:rPr>
-                <w:lang w:val="en-US"/>
-              </w:rPr>
-              <w:t>.my</w:t>
+              <w:t>mike@abc.com.my</w:t>
             </w:r>
           </w:p>
           <w:p>
@@ -9114,6 +8982,7 @@
   <w:style w:type="character" w:default="1" w:styleId="DefaultParagraphFont">
     <w:name w:val="Default Paragraph Font"/>
     <w:uiPriority w:val="1"/>
+    <w:semiHidden/>
     <w:unhideWhenUsed/>
   </w:style>
   <w:style w:type="table" w:default="1" w:styleId="TableNormal">

</xml_diff>

<commit_message>
Upgrade: Remove Hardcoding Email Dictionary
</commit_message>
<xml_diff>
--- a/level design.docx
+++ b/level design.docx
@@ -868,8 +868,8 @@
         <w:tblLook w:val="04A0" w:firstRow="1" w:lastRow="0" w:firstColumn="1" w:lastColumn="0" w:noHBand="0" w:noVBand="1"/>
       </w:tblPr>
       <w:tblGrid>
-        <w:gridCol w:w="3115"/>
-        <w:gridCol w:w="5901"/>
+        <w:gridCol w:w="2948"/>
+        <w:gridCol w:w="6068"/>
       </w:tblGrid>
       <w:tr>
         <w:trPr>
@@ -1471,6 +1471,7 @@
               <w:t>]assets/tutorial/report_email.png[/</w:t>
             </w:r>
             <w:proofErr w:type="spellStart"/>
+            <w:proofErr w:type="gramStart"/>
             <w:r>
               <w:rPr>
                 <w:lang w:val="en-US"/>
@@ -1488,7 +1489,14 @@
               <w:rPr>
                 <w:lang w:val="en-US"/>
               </w:rPr>
-              <w:t>[/center]</w:t>
+              <w:t>[</w:t>
+            </w:r>
+            <w:proofErr w:type="gramEnd"/>
+            <w:r>
+              <w:rPr>
+                <w:lang w:val="en-US"/>
+              </w:rPr>
+              <w:t>/center]</w:t>
             </w:r>
           </w:p>
           <w:p>
@@ -1876,7 +1884,21 @@
               <w:rPr>
                 <w:lang w:val="en-US"/>
               </w:rPr>
-              <w:t>[p]To make things easier for you, I'll send you a request email like this every day and you can just drop the files in and click send!</w:t>
+              <w:t>[p]</w:t>
+            </w:r>
+            <w:proofErr w:type="gramStart"/>
+            <w:r>
+              <w:rPr>
+                <w:lang w:val="en-US"/>
+              </w:rPr>
+              <w:t>To</w:t>
+            </w:r>
+            <w:proofErr w:type="gramEnd"/>
+            <w:r>
+              <w:rPr>
+                <w:lang w:val="en-US"/>
+              </w:rPr>
+              <w:t xml:space="preserve"> make things easier for you, I'll send you a request email like this every day and you can just drop the files in and click send!</w:t>
             </w:r>
           </w:p>
           <w:p>
@@ -1902,7 +1924,35 @@
               <w:rPr>
                 <w:lang w:val="en-US"/>
               </w:rPr>
-              <w:t>[p][b]Make sure that you have collected all the Purchase Orders sent to you today before submitting. A missed order is a missed opportunity![/b]</w:t>
+              <w:t>[p][</w:t>
+            </w:r>
+            <w:proofErr w:type="gramStart"/>
+            <w:r>
+              <w:rPr>
+                <w:lang w:val="en-US"/>
+              </w:rPr>
+              <w:t>b]Make</w:t>
+            </w:r>
+            <w:proofErr w:type="gramEnd"/>
+            <w:r>
+              <w:rPr>
+                <w:lang w:val="en-US"/>
+              </w:rPr>
+              <w:t xml:space="preserve"> sure that you have collected all the Purchase Orders sent to you today before submitting. A missed order is a missed </w:t>
+            </w:r>
+            <w:proofErr w:type="gramStart"/>
+            <w:r>
+              <w:rPr>
+                <w:lang w:val="en-US"/>
+              </w:rPr>
+              <w:t>opportunity![</w:t>
+            </w:r>
+            <w:proofErr w:type="gramEnd"/>
+            <w:r>
+              <w:rPr>
+                <w:lang w:val="en-US"/>
+              </w:rPr>
+              <w:t>/b]</w:t>
             </w:r>
           </w:p>
           <w:p>
@@ -2176,7 +2226,6 @@
                 <w:bCs/>
                 <w:lang w:val="en-US"/>
               </w:rPr>
-              <w:lastRenderedPageBreak/>
               <w:t>CC Address</w:t>
             </w:r>
             <w:r>
@@ -2328,7 +2377,6 @@
               <w:rPr>
                 <w:lang w:val="en-US"/>
               </w:rPr>
-              <w:lastRenderedPageBreak/>
               <w:t>[p]</w:t>
             </w:r>
             <w:r>
@@ -2648,10 +2696,18 @@
               <w:t>]</w:t>
             </w:r>
             <w:r>
-              <w:t>Thank you for choosing Orbit Antivirus!</w:t>
-            </w:r>
-            <w:r>
-              <w:t>[/</w:t>
+              <w:t xml:space="preserve">Thank you for choosing Orbit </w:t>
+            </w:r>
+            <w:proofErr w:type="gramStart"/>
+            <w:r>
+              <w:t>Antivirus!</w:t>
+            </w:r>
+            <w:r>
+              <w:t>[</w:t>
+            </w:r>
+            <w:proofErr w:type="gramEnd"/>
+            <w:r>
+              <w:t>/</w:t>
             </w:r>
             <w:proofErr w:type="spellStart"/>
             <w:r>
@@ -2700,6 +2756,7 @@
               <w:t>orbit_logo.png[/</w:t>
             </w:r>
             <w:proofErr w:type="spellStart"/>
+            <w:proofErr w:type="gramStart"/>
             <w:r>
               <w:t>img</w:t>
             </w:r>
@@ -2708,7 +2765,11 @@
               <w:t>]</w:t>
             </w:r>
             <w:r>
-              <w:t>[/</w:t>
+              <w:t>[</w:t>
+            </w:r>
+            <w:proofErr w:type="gramEnd"/>
+            <w:r>
+              <w:t>/</w:t>
             </w:r>
             <w:proofErr w:type="spellStart"/>
             <w:r>
@@ -2967,11 +3028,19 @@
                 <w:lang w:val="en-US"/>
               </w:rPr>
             </w:pPr>
-            <w:r>
-              <w:rPr>
-                <w:lang w:val="en-US"/>
-              </w:rPr>
-              <w:t>[p]Please refer to the PO attached.</w:t>
+            <w:proofErr w:type="gramStart"/>
+            <w:r>
+              <w:rPr>
+                <w:lang w:val="en-US"/>
+              </w:rPr>
+              <w:t>[p]</w:t>
+            </w:r>
+            <w:proofErr w:type="gramEnd"/>
+            <w:r>
+              <w:rPr>
+                <w:lang w:val="en-US"/>
+              </w:rPr>
+              <w:t>Please refer to the PO attached.</w:t>
             </w:r>
           </w:p>
           <w:p>
@@ -3316,51 +3385,41 @@
               <w:t>[p]</w:t>
             </w:r>
             <w:r>
+              <w:t>[center]</w:t>
+            </w:r>
+            <w:r>
+              <w:t>[img</w:t>
+            </w:r>
+            <w:r>
+              <w:t>=750x</w:t>
+            </w:r>
+            <w:proofErr w:type="gramStart"/>
+            <w:r>
+              <w:t>750</w:t>
+            </w:r>
+            <w:r>
+              <w:t>]</w:t>
+            </w:r>
+            <w:r>
+              <w:t>assets/adware/</w:t>
+            </w:r>
+            <w:r>
+              <w:t>trippo_ad.jpg</w:t>
+            </w:r>
+            <w:proofErr w:type="gramEnd"/>
+            <w:r>
+              <w:t>[/</w:t>
+            </w:r>
+            <w:proofErr w:type="gramStart"/>
+            <w:r>
+              <w:t>img]</w:t>
+            </w:r>
+            <w:r>
               <w:t>[</w:t>
             </w:r>
-            <w:proofErr w:type="spellStart"/>
-            <w:r>
-              <w:t>center</w:t>
-            </w:r>
-            <w:proofErr w:type="spellEnd"/>
-            <w:r>
-              <w:t>]</w:t>
-            </w:r>
-            <w:r>
-              <w:t>[</w:t>
-            </w:r>
-            <w:proofErr w:type="spellStart"/>
-            <w:r>
-              <w:t>img</w:t>
-            </w:r>
-            <w:proofErr w:type="spellEnd"/>
-            <w:r>
-              <w:t>]</w:t>
-            </w:r>
-            <w:r>
-              <w:t>assets/adware/</w:t>
-            </w:r>
-            <w:r>
-              <w:t>trippo_ad.jpg[/</w:t>
-            </w:r>
-            <w:proofErr w:type="spellStart"/>
-            <w:r>
-              <w:t>img</w:t>
-            </w:r>
-            <w:proofErr w:type="spellEnd"/>
-            <w:r>
-              <w:t>]</w:t>
-            </w:r>
-            <w:r>
-              <w:t>[/</w:t>
-            </w:r>
-            <w:proofErr w:type="spellStart"/>
-            <w:r>
-              <w:t>center</w:t>
-            </w:r>
-            <w:proofErr w:type="spellEnd"/>
-            <w:r>
-              <w:t>]</w:t>
+            <w:proofErr w:type="gramEnd"/>
+            <w:r>
+              <w:t>/center]</w:t>
             </w:r>
           </w:p>
         </w:tc>
@@ -3780,7 +3839,6 @@
                 <w:bCs/>
                 <w:lang w:val="en-US"/>
               </w:rPr>
-              <w:lastRenderedPageBreak/>
               <w:t>Sender Address</w:t>
             </w:r>
             <w:r>
@@ -3879,6 +3937,7 @@
                 <w:bCs/>
                 <w:lang w:val="en-US"/>
               </w:rPr>
+              <w:lastRenderedPageBreak/>
               <w:t>Subject</w:t>
             </w:r>
             <w:r>
@@ -3939,101 +3998,101 @@
               <w:rPr>
                 <w:lang w:val="en-US"/>
               </w:rPr>
+              <w:t>[p]</w:t>
+            </w:r>
+            <w:r>
+              <w:rPr>
+                <w:lang w:val="en-US"/>
+              </w:rPr>
+              <w:t xml:space="preserve"> </w:t>
+            </w:r>
+          </w:p>
+          <w:p>
+            <w:pPr>
+              <w:rPr>
+                <w:lang w:val="en-US"/>
+              </w:rPr>
+            </w:pPr>
+            <w:r>
+              <w:rPr>
+                <w:lang w:val="en-US"/>
+              </w:rPr>
+              <w:t>[p]Be extra careful with emails that:</w:t>
+            </w:r>
+          </w:p>
+          <w:p>
+            <w:pPr>
+              <w:rPr>
+                <w:lang w:val="en-US"/>
+              </w:rPr>
+            </w:pPr>
+            <w:r>
+              <w:rPr>
+                <w:lang w:val="en-US"/>
+              </w:rPr>
+              <w:t>[p]</w:t>
+            </w:r>
+            <w:r>
+              <w:rPr>
+                <w:lang w:val="en-US"/>
+              </w:rPr>
+              <w:t xml:space="preserve"> </w:t>
+            </w:r>
+            <w:r>
+              <w:rPr>
+                <w:lang w:val="en-US"/>
+              </w:rPr>
+              <w:t xml:space="preserve">- </w:t>
+            </w:r>
+            <w:r>
+              <w:rPr>
+                <w:lang w:val="en-US"/>
+              </w:rPr>
+              <w:t>Sounds</w:t>
+            </w:r>
+            <w:r>
+              <w:rPr>
+                <w:lang w:val="en-US"/>
+              </w:rPr>
+              <w:t xml:space="preserve"> urgent or threatening</w:t>
+            </w:r>
+            <w:r>
+              <w:rPr>
+                <w:lang w:val="en-US"/>
+              </w:rPr>
+              <w:t>.</w:t>
+            </w:r>
+          </w:p>
+          <w:p>
+            <w:pPr>
+              <w:rPr>
+                <w:lang w:val="en-US"/>
+              </w:rPr>
+            </w:pPr>
+            <w:r>
+              <w:rPr>
+                <w:lang w:val="en-US"/>
+              </w:rPr>
+              <w:t>[p] - Have poor grammar (but not always)</w:t>
+            </w:r>
+            <w:r>
+              <w:rPr>
+                <w:lang w:val="en-US"/>
+              </w:rPr>
+              <w:t>.</w:t>
+            </w:r>
+          </w:p>
+          <w:p>
+            <w:pPr>
+              <w:rPr>
+                <w:lang w:val="en-US"/>
+              </w:rPr>
+            </w:pPr>
+            <w:r>
+              <w:rPr>
+                <w:lang w:val="en-US"/>
+              </w:rPr>
               <w:lastRenderedPageBreak/>
-              <w:t>[p]</w:t>
-            </w:r>
-            <w:r>
-              <w:rPr>
-                <w:lang w:val="en-US"/>
-              </w:rPr>
-              <w:t xml:space="preserve"> </w:t>
-            </w:r>
-          </w:p>
-          <w:p>
-            <w:pPr>
-              <w:rPr>
-                <w:lang w:val="en-US"/>
-              </w:rPr>
-            </w:pPr>
-            <w:r>
-              <w:rPr>
-                <w:lang w:val="en-US"/>
-              </w:rPr>
-              <w:t>[p]Be extra careful with emails that:</w:t>
-            </w:r>
-          </w:p>
-          <w:p>
-            <w:pPr>
-              <w:rPr>
-                <w:lang w:val="en-US"/>
-              </w:rPr>
-            </w:pPr>
-            <w:r>
-              <w:rPr>
-                <w:lang w:val="en-US"/>
-              </w:rPr>
-              <w:t>[p]</w:t>
-            </w:r>
-            <w:r>
-              <w:rPr>
-                <w:lang w:val="en-US"/>
-              </w:rPr>
-              <w:t xml:space="preserve"> </w:t>
-            </w:r>
-            <w:r>
-              <w:rPr>
-                <w:lang w:val="en-US"/>
-              </w:rPr>
-              <w:t xml:space="preserve">- </w:t>
-            </w:r>
-            <w:r>
-              <w:rPr>
-                <w:lang w:val="en-US"/>
-              </w:rPr>
-              <w:t>Sounds</w:t>
-            </w:r>
-            <w:r>
-              <w:rPr>
-                <w:lang w:val="en-US"/>
-              </w:rPr>
-              <w:t xml:space="preserve"> urgent or threatening</w:t>
-            </w:r>
-            <w:r>
-              <w:rPr>
-                <w:lang w:val="en-US"/>
-              </w:rPr>
-              <w:t>.</w:t>
-            </w:r>
-          </w:p>
-          <w:p>
-            <w:pPr>
-              <w:rPr>
-                <w:lang w:val="en-US"/>
-              </w:rPr>
-            </w:pPr>
-            <w:r>
-              <w:rPr>
-                <w:lang w:val="en-US"/>
-              </w:rPr>
-              <w:t>[p] - Have poor grammar (but not always)</w:t>
-            </w:r>
-            <w:r>
-              <w:rPr>
-                <w:lang w:val="en-US"/>
-              </w:rPr>
-              <w:t>.</w:t>
-            </w:r>
-          </w:p>
-          <w:p>
-            <w:pPr>
-              <w:rPr>
-                <w:lang w:val="en-US"/>
-              </w:rPr>
-            </w:pPr>
-            <w:r>
-              <w:rPr>
-                <w:lang w:val="en-US"/>
-              </w:rPr>
               <w:t>[p]</w:t>
             </w:r>
             <w:r>
@@ -5961,14 +6020,27 @@
               <w:rPr>
                 <w:lang w:val="en-US"/>
               </w:rPr>
-              <w:t>[b]</w:t>
+              <w:t>[</w:t>
+            </w:r>
+            <w:proofErr w:type="gramStart"/>
+            <w:r>
+              <w:rPr>
+                <w:lang w:val="en-US"/>
+              </w:rPr>
+              <w:t>b]</w:t>
             </w:r>
             <w:r>
               <w:t>Malware</w:t>
             </w:r>
-            <w:r>
-              <w:t>[/b] :</w:t>
-            </w:r>
+            <w:proofErr w:type="gramEnd"/>
+            <w:r>
+              <w:t>[/b</w:t>
+            </w:r>
+            <w:proofErr w:type="gramStart"/>
+            <w:r>
+              <w:t>] :</w:t>
+            </w:r>
+            <w:proofErr w:type="gramEnd"/>
             <w:r>
               <w:t xml:space="preserve"> Software that runs in the background silently. They have various goals, such as recording what you type, </w:t>
             </w:r>
@@ -5994,10 +6066,29 @@
               <w:rPr>
                 <w:lang w:val="en-US"/>
               </w:rPr>
-              <w:t>[p][b]</w:t>
-            </w:r>
-            <w:r>
-              <w:t>Adware[/b] : If it exists in your device, you will get spammed by various advertisements which can be very distracting.</w:t>
+              <w:t>[p][</w:t>
+            </w:r>
+            <w:proofErr w:type="gramStart"/>
+            <w:r>
+              <w:rPr>
+                <w:lang w:val="en-US"/>
+              </w:rPr>
+              <w:t>b]</w:t>
+            </w:r>
+            <w:r>
+              <w:t>Adware</w:t>
+            </w:r>
+            <w:proofErr w:type="gramEnd"/>
+            <w:r>
+              <w:t>[/b</w:t>
+            </w:r>
+            <w:proofErr w:type="gramStart"/>
+            <w:r>
+              <w:t>] :</w:t>
+            </w:r>
+            <w:proofErr w:type="gramEnd"/>
+            <w:r>
+              <w:t xml:space="preserve"> If it exists in your device, you will get spammed by various advertisements which can be very distracting.</w:t>
             </w:r>
           </w:p>
           <w:p>
@@ -6018,23 +6109,41 @@
               <w:rPr>
                 <w:lang w:val="en-US"/>
               </w:rPr>
-              <w:t>[p][b]</w:t>
-            </w:r>
-            <w:r>
-              <w:t>Ransomware[/b] : One of the most dangerous software to have in your device. It will lock your files and demand a large sum of money to unlock your files. Do not pay the ransom, it will not guarantee your files return.</w:t>
-            </w:r>
-          </w:p>
-          <w:p>
-            <w:pPr>
-              <w:rPr>
-                <w:lang w:val="en-US"/>
-              </w:rPr>
-            </w:pPr>
-            <w:r>
-              <w:rPr>
-                <w:lang w:val="en-US"/>
-              </w:rPr>
-              <w:lastRenderedPageBreak/>
+              <w:t>[p][</w:t>
+            </w:r>
+            <w:proofErr w:type="gramStart"/>
+            <w:r>
+              <w:rPr>
+                <w:lang w:val="en-US"/>
+              </w:rPr>
+              <w:t>b]</w:t>
+            </w:r>
+            <w:r>
+              <w:t>Ransomware</w:t>
+            </w:r>
+            <w:proofErr w:type="gramEnd"/>
+            <w:r>
+              <w:t>[/b</w:t>
+            </w:r>
+            <w:proofErr w:type="gramStart"/>
+            <w:r>
+              <w:t>] :</w:t>
+            </w:r>
+            <w:proofErr w:type="gramEnd"/>
+            <w:r>
+              <w:t xml:space="preserve"> One of the most dangerous software to have in your device. It will lock your files and demand a large sum of money to unlock your files. Do not pay the ransom, it will not guarantee your files return.</w:t>
+            </w:r>
+          </w:p>
+          <w:p>
+            <w:pPr>
+              <w:rPr>
+                <w:lang w:val="en-US"/>
+              </w:rPr>
+            </w:pPr>
+            <w:r>
+              <w:rPr>
+                <w:lang w:val="en-US"/>
+              </w:rPr>
               <w:t xml:space="preserve">[p] </w:t>
             </w:r>
           </w:p>
@@ -6615,19 +6724,47 @@
               <w:rPr>
                 <w:lang w:val="en-US"/>
               </w:rPr>
-              <w:t>=500x500</w:t>
-            </w:r>
-            <w:r>
-              <w:rPr>
-                <w:lang w:val="en-US"/>
-              </w:rPr>
-              <w:t>]assets/adware/c17_recruit.jpg[/img]</w:t>
-            </w:r>
-            <w:r>
-              <w:rPr>
-                <w:lang w:val="en-US"/>
-              </w:rPr>
-              <w:t>[/center]</w:t>
+              <w:t>=500x</w:t>
+            </w:r>
+            <w:proofErr w:type="gramStart"/>
+            <w:r>
+              <w:rPr>
+                <w:lang w:val="en-US"/>
+              </w:rPr>
+              <w:t>500</w:t>
+            </w:r>
+            <w:r>
+              <w:rPr>
+                <w:lang w:val="en-US"/>
+              </w:rPr>
+              <w:t>]assets/adware/c17_recruit.jpg</w:t>
+            </w:r>
+            <w:proofErr w:type="gramEnd"/>
+            <w:r>
+              <w:rPr>
+                <w:lang w:val="en-US"/>
+              </w:rPr>
+              <w:t>[/</w:t>
+            </w:r>
+            <w:proofErr w:type="gramStart"/>
+            <w:r>
+              <w:rPr>
+                <w:lang w:val="en-US"/>
+              </w:rPr>
+              <w:t>img]</w:t>
+            </w:r>
+            <w:r>
+              <w:rPr>
+                <w:lang w:val="en-US"/>
+              </w:rPr>
+              <w:t>[</w:t>
+            </w:r>
+            <w:proofErr w:type="gramEnd"/>
+            <w:r>
+              <w:rPr>
+                <w:lang w:val="en-US"/>
+              </w:rPr>
+              <w:t>/center]</w:t>
             </w:r>
           </w:p>
         </w:tc>
@@ -6912,11 +7049,19 @@
                 <w:lang w:val="en-US"/>
               </w:rPr>
             </w:pPr>
-            <w:r>
-              <w:rPr>
-                <w:lang w:val="en-US"/>
-              </w:rPr>
-              <w:t xml:space="preserve">[p]Please download and send the </w:t>
+            <w:proofErr w:type="gramStart"/>
+            <w:r>
+              <w:rPr>
+                <w:lang w:val="en-US"/>
+              </w:rPr>
+              <w:t>[p]</w:t>
+            </w:r>
+            <w:proofErr w:type="gramEnd"/>
+            <w:r>
+              <w:rPr>
+                <w:lang w:val="en-US"/>
+              </w:rPr>
+              <w:t xml:space="preserve">Please download and send the </w:t>
             </w:r>
             <w:proofErr w:type="spellStart"/>
             <w:r>
@@ -7271,12 +7416,14 @@
                 <w:lang w:val="en-US"/>
               </w:rPr>
             </w:pPr>
+            <w:proofErr w:type="gramStart"/>
             <w:r>
               <w:rPr>
                 <w:lang w:val="en-US"/>
               </w:rPr>
               <w:t>[p]</w:t>
             </w:r>
+            <w:proofErr w:type="gramEnd"/>
             <w:r>
               <w:rPr>
                 <w:lang w:val="en-US"/>
@@ -7424,7 +7571,6 @@
                 <w:bCs/>
                 <w:lang w:val="en-US"/>
               </w:rPr>
-              <w:lastRenderedPageBreak/>
               <w:t>Sender Address</w:t>
             </w:r>
             <w:r>
@@ -7608,7 +7754,6 @@
               <w:rPr>
                 <w:lang w:val="en-US"/>
               </w:rPr>
-              <w:lastRenderedPageBreak/>
               <w:t>[p]Blue Pens = 100 units</w:t>
             </w:r>
           </w:p>
@@ -8030,11 +8175,19 @@
                 <w:lang w:val="en-US"/>
               </w:rPr>
             </w:pPr>
-            <w:r>
-              <w:rPr>
-                <w:lang w:val="en-US"/>
-              </w:rPr>
-              <w:t xml:space="preserve">[p]Please download </w:t>
+            <w:proofErr w:type="gramStart"/>
+            <w:r>
+              <w:rPr>
+                <w:lang w:val="en-US"/>
+              </w:rPr>
+              <w:t>[p]</w:t>
+            </w:r>
+            <w:proofErr w:type="gramEnd"/>
+            <w:r>
+              <w:rPr>
+                <w:lang w:val="en-US"/>
+              </w:rPr>
+              <w:t xml:space="preserve">Please download </w:t>
             </w:r>
             <w:r>
               <w:rPr>
@@ -8358,6 +8511,1095 @@
               </w:rPr>
               <w:t>[p]Was really busy today and found a lot of new clients! Here are the purchase orders, like usual please help me send them to Finance. Thanks!</w:t>
             </w:r>
+          </w:p>
+        </w:tc>
+      </w:tr>
+    </w:tbl>
+    <w:p>
+      <w:pPr>
+        <w:rPr>
+          <w:lang w:val="en-US"/>
+        </w:rPr>
+      </w:pPr>
+    </w:p>
+    <w:p>
+      <w:pPr>
+        <w:rPr>
+          <w:lang w:val="en-US"/>
+        </w:rPr>
+      </w:pPr>
+      <w:r>
+        <w:rPr>
+          <w:lang w:val="en-US"/>
+        </w:rPr>
+        <w:br w:type="page"/>
+      </w:r>
+    </w:p>
+    <w:p>
+      <w:pPr>
+        <w:pStyle w:val="Heading1"/>
+        <w:rPr>
+          <w:b/>
+          <w:bCs/>
+          <w:lang w:val="en-US"/>
+        </w:rPr>
+      </w:pPr>
+      <w:r>
+        <w:rPr>
+          <w:b/>
+          <w:bCs/>
+          <w:lang w:val="en-US"/>
+        </w:rPr>
+        <w:t>Wednesday</w:t>
+      </w:r>
+    </w:p>
+    <w:tbl>
+      <w:tblPr>
+        <w:tblStyle w:val="TableGrid"/>
+        <w:tblW w:w="0" w:type="auto"/>
+        <w:tblLook w:val="04A0" w:firstRow="1" w:lastRow="0" w:firstColumn="1" w:lastColumn="0" w:noHBand="0" w:noVBand="1"/>
+      </w:tblPr>
+      <w:tblGrid>
+        <w:gridCol w:w="3955"/>
+        <w:gridCol w:w="5061"/>
+      </w:tblGrid>
+      <w:tr>
+        <w:trPr>
+          <w:trHeight w:val="360"/>
+        </w:trPr>
+        <w:tc>
+          <w:tcPr>
+            <w:tcW w:w="3955" w:type="dxa"/>
+            <w:vAlign w:val="center"/>
+          </w:tcPr>
+          <w:p>
+            <w:pPr>
+              <w:jc w:val="center"/>
+              <w:rPr>
+                <w:b/>
+                <w:bCs/>
+                <w:lang w:val="en-US"/>
+              </w:rPr>
+            </w:pPr>
+            <w:r>
+              <w:rPr>
+                <w:b/>
+                <w:bCs/>
+                <w:lang w:val="en-US"/>
+              </w:rPr>
+              <w:t>D</w:t>
+            </w:r>
+            <w:proofErr w:type="spellStart"/>
+            <w:r>
+              <w:rPr>
+                <w:b/>
+                <w:bCs/>
+              </w:rPr>
+              <w:t>etails</w:t>
+            </w:r>
+            <w:proofErr w:type="spellEnd"/>
+          </w:p>
+        </w:tc>
+        <w:tc>
+          <w:tcPr>
+            <w:tcW w:w="5061" w:type="dxa"/>
+            <w:vAlign w:val="center"/>
+          </w:tcPr>
+          <w:p>
+            <w:pPr>
+              <w:jc w:val="center"/>
+              <w:rPr>
+                <w:b/>
+                <w:bCs/>
+                <w:lang w:val="en-US"/>
+              </w:rPr>
+            </w:pPr>
+            <w:r>
+              <w:rPr>
+                <w:b/>
+                <w:bCs/>
+                <w:lang w:val="en-US"/>
+              </w:rPr>
+              <w:t>WEDNESDAY</w:t>
+            </w:r>
+          </w:p>
+        </w:tc>
+      </w:tr>
+      <w:tr>
+        <w:trPr>
+          <w:trHeight w:val="360"/>
+        </w:trPr>
+        <w:tc>
+          <w:tcPr>
+            <w:tcW w:w="3955" w:type="dxa"/>
+            <w:vAlign w:val="center"/>
+          </w:tcPr>
+          <w:p>
+            <w:pPr>
+              <w:rPr>
+                <w:b/>
+                <w:bCs/>
+                <w:lang w:val="en-US"/>
+              </w:rPr>
+            </w:pPr>
+          </w:p>
+          <w:p>
+            <w:pPr>
+              <w:rPr>
+                <w:lang w:val="en-US"/>
+              </w:rPr>
+            </w:pPr>
+            <w:r>
+              <w:rPr>
+                <w:b/>
+                <w:bCs/>
+                <w:lang w:val="en-US"/>
+              </w:rPr>
+              <w:t>Type</w:t>
+            </w:r>
+            <w:r>
+              <w:rPr>
+                <w:lang w:val="en-US"/>
+              </w:rPr>
+              <w:t>: Message</w:t>
+            </w:r>
+          </w:p>
+          <w:p>
+            <w:pPr>
+              <w:rPr>
+                <w:lang w:val="en-US"/>
+              </w:rPr>
+            </w:pPr>
+            <w:r>
+              <w:rPr>
+                <w:b/>
+                <w:bCs/>
+                <w:lang w:val="en-US"/>
+              </w:rPr>
+              <w:t>Sender Name</w:t>
+            </w:r>
+            <w:r>
+              <w:rPr>
+                <w:lang w:val="en-US"/>
+              </w:rPr>
+              <w:t xml:space="preserve">: </w:t>
+            </w:r>
+            <w:r>
+              <w:rPr>
+                <w:lang w:val="en-US"/>
+              </w:rPr>
+              <w:t>Kai Jie</w:t>
+            </w:r>
+          </w:p>
+          <w:p>
+            <w:pPr>
+              <w:rPr>
+                <w:lang w:val="en-US"/>
+              </w:rPr>
+            </w:pPr>
+            <w:r>
+              <w:rPr>
+                <w:b/>
+                <w:bCs/>
+                <w:lang w:val="en-US"/>
+              </w:rPr>
+              <w:t>Sender Address</w:t>
+            </w:r>
+            <w:r>
+              <w:rPr>
+                <w:lang w:val="en-US"/>
+              </w:rPr>
+              <w:t xml:space="preserve">: </w:t>
+            </w:r>
+            <w:hyperlink r:id="rId17" w:history="1">
+              <w:r>
+                <w:rPr>
+                  <w:rStyle w:val="Hyperlink"/>
+                  <w:lang w:val="en-US"/>
+                </w:rPr>
+                <w:t>k</w:t>
+              </w:r>
+              <w:r>
+                <w:rPr>
+                  <w:rStyle w:val="Hyperlink"/>
+                </w:rPr>
+                <w:t>aijie.it</w:t>
+              </w:r>
+              <w:r>
+                <w:rPr>
+                  <w:rStyle w:val="Hyperlink"/>
+                  <w:lang w:val="en-US"/>
+                </w:rPr>
+                <w:t>@abc.com.my</w:t>
+              </w:r>
+            </w:hyperlink>
+          </w:p>
+          <w:p>
+            <w:pPr>
+              <w:rPr>
+                <w:lang w:val="en-US"/>
+              </w:rPr>
+            </w:pPr>
+            <w:r>
+              <w:rPr>
+                <w:b/>
+                <w:bCs/>
+                <w:lang w:val="en-US"/>
+              </w:rPr>
+              <w:t>To Address</w:t>
+            </w:r>
+            <w:r>
+              <w:rPr>
+                <w:lang w:val="en-US"/>
+              </w:rPr>
+              <w:t>: {</w:t>
+            </w:r>
+            <w:proofErr w:type="spellStart"/>
+            <w:r>
+              <w:rPr>
+                <w:lang w:val="en-US"/>
+              </w:rPr>
+              <w:t>player_email</w:t>
+            </w:r>
+            <w:proofErr w:type="spellEnd"/>
+            <w:r>
+              <w:rPr>
+                <w:lang w:val="en-US"/>
+              </w:rPr>
+              <w:t>}</w:t>
+            </w:r>
+          </w:p>
+          <w:p>
+            <w:pPr>
+              <w:rPr>
+                <w:lang w:val="en-US"/>
+              </w:rPr>
+            </w:pPr>
+            <w:r>
+              <w:rPr>
+                <w:b/>
+                <w:bCs/>
+                <w:lang w:val="en-US"/>
+              </w:rPr>
+              <w:t>CC Address</w:t>
+            </w:r>
+            <w:r>
+              <w:rPr>
+                <w:lang w:val="en-US"/>
+              </w:rPr>
+              <w:t>:</w:t>
+            </w:r>
+            <w:r>
+              <w:rPr>
+                <w:lang w:val="en-US"/>
+              </w:rPr>
+              <w:t xml:space="preserve"> </w:t>
+            </w:r>
+            <w:hyperlink r:id="rId18" w:history="1">
+              <w:r>
+                <w:rPr>
+                  <w:rStyle w:val="Hyperlink"/>
+                  <w:lang w:val="en-US"/>
+                </w:rPr>
+                <w:t>blake@abc.com.my</w:t>
+              </w:r>
+            </w:hyperlink>
+            <w:r>
+              <w:rPr>
+                <w:lang w:val="en-US"/>
+              </w:rPr>
+              <w:t xml:space="preserve">, </w:t>
+            </w:r>
+            <w:hyperlink r:id="rId19" w:history="1">
+              <w:r>
+                <w:rPr>
+                  <w:rStyle w:val="Hyperlink"/>
+                  <w:lang w:val="en-US"/>
+                </w:rPr>
+                <w:t>mike@abc.com.my</w:t>
+              </w:r>
+            </w:hyperlink>
+            <w:r>
+              <w:rPr>
+                <w:lang w:val="en-US"/>
+              </w:rPr>
+              <w:t xml:space="preserve">, </w:t>
+            </w:r>
+            <w:hyperlink r:id="rId20" w:history="1">
+              <w:r>
+                <w:rPr>
+                  <w:rStyle w:val="Hyperlink"/>
+                  <w:lang w:val="en-US"/>
+                </w:rPr>
+                <w:t>nazrin.</w:t>
+              </w:r>
+              <w:r>
+                <w:rPr>
+                  <w:rStyle w:val="Hyperlink"/>
+                </w:rPr>
+                <w:t>finance</w:t>
+              </w:r>
+              <w:r>
+                <w:rPr>
+                  <w:rStyle w:val="Hyperlink"/>
+                  <w:lang w:val="en-US"/>
+                </w:rPr>
+                <w:t>@abc.com.my</w:t>
+              </w:r>
+            </w:hyperlink>
+            <w:r>
+              <w:rPr>
+                <w:lang w:val="en-US"/>
+              </w:rPr>
+              <w:t xml:space="preserve"> </w:t>
+            </w:r>
+          </w:p>
+          <w:p>
+            <w:pPr>
+              <w:rPr>
+                <w:lang w:val="en-US"/>
+              </w:rPr>
+            </w:pPr>
+            <w:r>
+              <w:rPr>
+                <w:b/>
+                <w:bCs/>
+                <w:lang w:val="en-US"/>
+              </w:rPr>
+              <w:t>Subject</w:t>
+            </w:r>
+            <w:r>
+              <w:rPr>
+                <w:lang w:val="en-US"/>
+              </w:rPr>
+              <w:t xml:space="preserve">: </w:t>
+            </w:r>
+            <w:r>
+              <w:rPr>
+                <w:lang w:val="en-US"/>
+              </w:rPr>
+              <w:t>Ransomware Alert</w:t>
+            </w:r>
+          </w:p>
+          <w:p>
+            <w:pPr>
+              <w:rPr>
+                <w:b/>
+                <w:bCs/>
+                <w:lang w:val="en-US"/>
+              </w:rPr>
+            </w:pPr>
+          </w:p>
+        </w:tc>
+        <w:tc>
+          <w:tcPr>
+            <w:tcW w:w="5061" w:type="dxa"/>
+            <w:vAlign w:val="center"/>
+          </w:tcPr>
+          <w:p>
+            <w:pPr>
+              <w:rPr>
+                <w:lang w:val="en-US"/>
+              </w:rPr>
+            </w:pPr>
+          </w:p>
+          <w:p>
+            <w:pPr>
+              <w:rPr>
+                <w:lang w:val="en-US"/>
+              </w:rPr>
+            </w:pPr>
+            <w:r>
+              <w:rPr>
+                <w:lang w:val="en-US"/>
+              </w:rPr>
+              <w:t>Attention</w:t>
+            </w:r>
+            <w:r>
+              <w:rPr>
+                <w:lang w:val="en-US"/>
+              </w:rPr>
+              <w:t>, everyone!</w:t>
+            </w:r>
+          </w:p>
+          <w:p>
+            <w:pPr>
+              <w:rPr>
+                <w:lang w:val="en-US"/>
+              </w:rPr>
+            </w:pPr>
+            <w:r>
+              <w:rPr>
+                <w:lang w:val="en-US"/>
+              </w:rPr>
+              <w:t xml:space="preserve">[p] </w:t>
+            </w:r>
+          </w:p>
+          <w:p>
+            <w:pPr>
+              <w:rPr>
+                <w:lang w:val="en-US"/>
+              </w:rPr>
+            </w:pPr>
+            <w:r>
+              <w:rPr>
+                <w:lang w:val="en-US"/>
+              </w:rPr>
+              <w:t>[p]</w:t>
+            </w:r>
+            <w:r>
+              <w:rPr>
+                <w:lang w:val="en-US"/>
+              </w:rPr>
+              <w:t>There has been targeted attacks against businesses by unknown parties using malwares. Some fell victim to a very dangerous Ransomware spreading around lately.</w:t>
+            </w:r>
+          </w:p>
+          <w:p>
+            <w:pPr>
+              <w:rPr>
+                <w:lang w:val="en-US"/>
+              </w:rPr>
+            </w:pPr>
+            <w:r>
+              <w:rPr>
+                <w:lang w:val="en-US"/>
+              </w:rPr>
+              <w:t xml:space="preserve">[p] </w:t>
+            </w:r>
+          </w:p>
+          <w:p>
+            <w:pPr>
+              <w:rPr>
+                <w:lang w:val="en-US"/>
+              </w:rPr>
+            </w:pPr>
+            <w:r>
+              <w:rPr>
+                <w:lang w:val="en-US"/>
+              </w:rPr>
+              <w:t>[p]</w:t>
+            </w:r>
+            <w:r>
+              <w:rPr>
+                <w:lang w:val="en-US"/>
+              </w:rPr>
+              <w:t xml:space="preserve">Here is a list </w:t>
+            </w:r>
+            <w:r>
+              <w:rPr>
+                <w:lang w:val="en-US"/>
+              </w:rPr>
+              <w:t>of commonly spotted email addresses sending ransomware, please be aware that this is not a complete list.</w:t>
+            </w:r>
+          </w:p>
+          <w:p>
+            <w:pPr>
+              <w:rPr>
+                <w:lang w:val="en-US"/>
+              </w:rPr>
+            </w:pPr>
+            <w:r>
+              <w:rPr>
+                <w:lang w:val="en-US"/>
+              </w:rPr>
+              <w:t xml:space="preserve">[p] </w:t>
+            </w:r>
+          </w:p>
+          <w:p>
+            <w:pPr>
+              <w:rPr>
+                <w:lang w:val="en-US"/>
+              </w:rPr>
+            </w:pPr>
+            <w:r>
+              <w:rPr>
+                <w:lang w:val="en-US"/>
+              </w:rPr>
+              <w:t>[p]</w:t>
+            </w:r>
+            <w:hyperlink r:id="rId21" w:history="1">
+              <w:r>
+                <w:rPr>
+                  <w:rStyle w:val="Hyperlink"/>
+                  <w:lang w:val="en-US"/>
+                </w:rPr>
+                <w:t>sus@email.com</w:t>
+              </w:r>
+            </w:hyperlink>
+          </w:p>
+          <w:p>
+            <w:pPr>
+              <w:rPr>
+                <w:lang w:val="en-US"/>
+              </w:rPr>
+            </w:pPr>
+            <w:r>
+              <w:rPr>
+                <w:lang w:val="en-US"/>
+              </w:rPr>
+              <w:t>[p]</w:t>
+            </w:r>
+            <w:r>
+              <w:rPr>
+                <w:lang w:val="en-US"/>
+              </w:rPr>
+              <w:t>sus@email.com</w:t>
+            </w:r>
+          </w:p>
+          <w:p>
+            <w:pPr>
+              <w:rPr>
+                <w:lang w:val="en-US"/>
+              </w:rPr>
+            </w:pPr>
+            <w:r>
+              <w:rPr>
+                <w:lang w:val="en-US"/>
+              </w:rPr>
+              <w:t>[p]</w:t>
+            </w:r>
+            <w:r>
+              <w:rPr>
+                <w:lang w:val="en-US"/>
+              </w:rPr>
+              <w:t>sus@email.com</w:t>
+            </w:r>
+          </w:p>
+          <w:p>
+            <w:pPr>
+              <w:rPr>
+                <w:lang w:val="en-US"/>
+              </w:rPr>
+            </w:pPr>
+          </w:p>
+          <w:p>
+            <w:pPr>
+              <w:rPr>
+                <w:lang w:val="en-US"/>
+              </w:rPr>
+            </w:pPr>
+          </w:p>
+        </w:tc>
+      </w:tr>
+      <w:tr>
+        <w:trPr>
+          <w:trHeight w:val="360"/>
+        </w:trPr>
+        <w:tc>
+          <w:tcPr>
+            <w:tcW w:w="3955" w:type="dxa"/>
+            <w:vAlign w:val="center"/>
+          </w:tcPr>
+          <w:p>
+            <w:pPr>
+              <w:rPr>
+                <w:b/>
+                <w:bCs/>
+                <w:lang w:val="en-US"/>
+              </w:rPr>
+            </w:pPr>
+          </w:p>
+          <w:p>
+            <w:pPr>
+              <w:rPr>
+                <w:lang w:val="en-US"/>
+              </w:rPr>
+            </w:pPr>
+            <w:r>
+              <w:rPr>
+                <w:b/>
+                <w:bCs/>
+                <w:lang w:val="en-US"/>
+              </w:rPr>
+              <w:t>Type</w:t>
+            </w:r>
+            <w:r>
+              <w:rPr>
+                <w:lang w:val="en-US"/>
+              </w:rPr>
+              <w:t xml:space="preserve">: </w:t>
+            </w:r>
+            <w:r>
+              <w:rPr>
+                <w:lang w:val="en-US"/>
+              </w:rPr>
+              <w:t>Inbound</w:t>
+            </w:r>
+          </w:p>
+          <w:p>
+            <w:pPr>
+              <w:rPr>
+                <w:lang w:val="en-US"/>
+              </w:rPr>
+            </w:pPr>
+            <w:r>
+              <w:rPr>
+                <w:b/>
+                <w:bCs/>
+                <w:lang w:val="en-US"/>
+              </w:rPr>
+              <w:t>Sender Name</w:t>
+            </w:r>
+            <w:r>
+              <w:rPr>
+                <w:lang w:val="en-US"/>
+              </w:rPr>
+              <w:t xml:space="preserve">: </w:t>
+            </w:r>
+            <w:r>
+              <w:rPr>
+                <w:lang w:val="en-US"/>
+              </w:rPr>
+              <w:t>Lina Zahra</w:t>
+            </w:r>
+          </w:p>
+          <w:p>
+            <w:pPr>
+              <w:rPr>
+                <w:lang w:val="en-US"/>
+              </w:rPr>
+            </w:pPr>
+            <w:r>
+              <w:rPr>
+                <w:b/>
+                <w:bCs/>
+                <w:lang w:val="en-US"/>
+              </w:rPr>
+              <w:t>Sender Address</w:t>
+            </w:r>
+            <w:r>
+              <w:rPr>
+                <w:lang w:val="en-US"/>
+              </w:rPr>
+              <w:t xml:space="preserve">: </w:t>
+            </w:r>
+            <w:r>
+              <w:rPr>
+                <w:lang w:val="en-US"/>
+              </w:rPr>
+              <w:t>linaArts821@email.com</w:t>
+            </w:r>
+          </w:p>
+          <w:p>
+            <w:pPr>
+              <w:rPr>
+                <w:lang w:val="en-US"/>
+              </w:rPr>
+            </w:pPr>
+            <w:r>
+              <w:rPr>
+                <w:b/>
+                <w:bCs/>
+                <w:lang w:val="en-US"/>
+              </w:rPr>
+              <w:t>To Address</w:t>
+            </w:r>
+            <w:r>
+              <w:rPr>
+                <w:lang w:val="en-US"/>
+              </w:rPr>
+              <w:t>: {</w:t>
+            </w:r>
+            <w:proofErr w:type="spellStart"/>
+            <w:r>
+              <w:rPr>
+                <w:lang w:val="en-US"/>
+              </w:rPr>
+              <w:t>player_email</w:t>
+            </w:r>
+            <w:proofErr w:type="spellEnd"/>
+            <w:r>
+              <w:rPr>
+                <w:lang w:val="en-US"/>
+              </w:rPr>
+              <w:t>}</w:t>
+            </w:r>
+          </w:p>
+          <w:p>
+            <w:pPr>
+              <w:rPr>
+                <w:lang w:val="en-US"/>
+              </w:rPr>
+            </w:pPr>
+            <w:r>
+              <w:rPr>
+                <w:b/>
+                <w:bCs/>
+                <w:lang w:val="en-US"/>
+              </w:rPr>
+              <w:t>CC Address</w:t>
+            </w:r>
+            <w:r>
+              <w:rPr>
+                <w:lang w:val="en-US"/>
+              </w:rPr>
+              <w:t>:</w:t>
+            </w:r>
+            <w:r>
+              <w:rPr>
+                <w:lang w:val="en-US"/>
+              </w:rPr>
+              <w:t xml:space="preserve"> </w:t>
+            </w:r>
+          </w:p>
+          <w:p>
+            <w:pPr>
+              <w:rPr>
+                <w:lang w:val="en-US"/>
+              </w:rPr>
+            </w:pPr>
+            <w:r>
+              <w:rPr>
+                <w:b/>
+                <w:bCs/>
+                <w:lang w:val="en-US"/>
+              </w:rPr>
+              <w:t>Subject</w:t>
+            </w:r>
+            <w:r>
+              <w:rPr>
+                <w:lang w:val="en-US"/>
+              </w:rPr>
+              <w:t xml:space="preserve">: </w:t>
+            </w:r>
+            <w:r>
+              <w:rPr>
+                <w:lang w:val="en-US"/>
+              </w:rPr>
+              <w:t>Purchase Order Changed</w:t>
+            </w:r>
+          </w:p>
+          <w:p>
+            <w:pPr>
+              <w:rPr>
+                <w:b/>
+                <w:bCs/>
+                <w:lang w:val="en-US"/>
+              </w:rPr>
+            </w:pPr>
+          </w:p>
+        </w:tc>
+        <w:tc>
+          <w:tcPr>
+            <w:tcW w:w="5061" w:type="dxa"/>
+            <w:vAlign w:val="center"/>
+          </w:tcPr>
+          <w:p>
+            <w:pPr>
+              <w:rPr>
+                <w:lang w:val="en-US"/>
+              </w:rPr>
+            </w:pPr>
+          </w:p>
+          <w:p>
+            <w:pPr>
+              <w:rPr>
+                <w:lang w:val="en-US"/>
+              </w:rPr>
+            </w:pPr>
+            <w:r>
+              <w:rPr>
+                <w:lang w:val="en-US"/>
+              </w:rPr>
+              <w:t>Good morning!</w:t>
+            </w:r>
+          </w:p>
+          <w:p>
+            <w:pPr>
+              <w:rPr>
+                <w:lang w:val="en-US"/>
+              </w:rPr>
+            </w:pPr>
+            <w:r>
+              <w:rPr>
+                <w:lang w:val="en-US"/>
+              </w:rPr>
+              <w:t xml:space="preserve">[p] </w:t>
+            </w:r>
+          </w:p>
+          <w:p>
+            <w:pPr>
+              <w:rPr>
+                <w:lang w:val="en-US"/>
+              </w:rPr>
+            </w:pPr>
+            <w:r>
+              <w:rPr>
+                <w:lang w:val="en-US"/>
+              </w:rPr>
+              <w:t>[p]Yesterday someone from your company, Mr. Mike submitted a purchase order on my behalf. After some considerations I want to add on more items in the purchase order. Please notify them to refer to this revised purchase order. Sorry for the inconvenience!</w:t>
+            </w:r>
+          </w:p>
+          <w:p>
+            <w:pPr>
+              <w:rPr>
+                <w:lang w:val="en-US"/>
+              </w:rPr>
+            </w:pPr>
+            <w:r>
+              <w:rPr>
+                <w:lang w:val="en-US"/>
+              </w:rPr>
+              <w:t xml:space="preserve">[p] </w:t>
+            </w:r>
+          </w:p>
+          <w:p>
+            <w:pPr>
+              <w:rPr>
+                <w:lang w:val="en-US"/>
+              </w:rPr>
+            </w:pPr>
+            <w:r>
+              <w:rPr>
+                <w:lang w:val="en-US"/>
+              </w:rPr>
+              <w:t xml:space="preserve">[p] </w:t>
+            </w:r>
+          </w:p>
+          <w:p>
+            <w:pPr>
+              <w:rPr>
+                <w:lang w:val="en-US"/>
+              </w:rPr>
+            </w:pPr>
+            <w:r>
+              <w:rPr>
+                <w:lang w:val="en-US"/>
+              </w:rPr>
+              <w:t>[p]Lina Zahra</w:t>
+            </w:r>
+          </w:p>
+          <w:p>
+            <w:pPr>
+              <w:rPr>
+                <w:lang w:val="en-US"/>
+              </w:rPr>
+            </w:pPr>
+            <w:r>
+              <w:rPr>
+                <w:lang w:val="en-US"/>
+              </w:rPr>
+              <w:t>[p]Lina Arts &amp; Crafts Store Manager</w:t>
+            </w:r>
+          </w:p>
+          <w:p>
+            <w:pPr>
+              <w:rPr>
+                <w:lang w:val="en-US"/>
+              </w:rPr>
+            </w:pPr>
+          </w:p>
+        </w:tc>
+      </w:tr>
+      <w:tr>
+        <w:trPr>
+          <w:trHeight w:val="360"/>
+        </w:trPr>
+        <w:tc>
+          <w:tcPr>
+            <w:tcW w:w="3955" w:type="dxa"/>
+            <w:vAlign w:val="center"/>
+          </w:tcPr>
+          <w:p>
+            <w:pPr>
+              <w:rPr>
+                <w:b/>
+                <w:bCs/>
+                <w:lang w:val="en-US"/>
+              </w:rPr>
+            </w:pPr>
+          </w:p>
+          <w:p>
+            <w:pPr>
+              <w:rPr>
+                <w:lang w:val="en-US"/>
+              </w:rPr>
+            </w:pPr>
+            <w:r>
+              <w:rPr>
+                <w:b/>
+                <w:bCs/>
+                <w:lang w:val="en-US"/>
+              </w:rPr>
+              <w:t>Type</w:t>
+            </w:r>
+            <w:r>
+              <w:rPr>
+                <w:lang w:val="en-US"/>
+              </w:rPr>
+              <w:t xml:space="preserve">: </w:t>
+            </w:r>
+            <w:r>
+              <w:rPr>
+                <w:lang w:val="en-US"/>
+              </w:rPr>
+              <w:t>Outbound</w:t>
+            </w:r>
+          </w:p>
+          <w:p>
+            <w:pPr>
+              <w:rPr>
+                <w:lang w:val="en-US"/>
+              </w:rPr>
+            </w:pPr>
+            <w:r>
+              <w:rPr>
+                <w:b/>
+                <w:bCs/>
+                <w:lang w:val="en-US"/>
+              </w:rPr>
+              <w:t>Sender Name</w:t>
+            </w:r>
+            <w:r>
+              <w:rPr>
+                <w:lang w:val="en-US"/>
+              </w:rPr>
+              <w:t xml:space="preserve">: </w:t>
+            </w:r>
+            <w:r>
+              <w:rPr>
+                <w:lang w:val="en-US"/>
+              </w:rPr>
+              <w:t>Nazrin</w:t>
+            </w:r>
+          </w:p>
+          <w:p>
+            <w:pPr>
+              <w:rPr>
+                <w:lang w:val="en-US"/>
+              </w:rPr>
+            </w:pPr>
+            <w:r>
+              <w:rPr>
+                <w:b/>
+                <w:bCs/>
+                <w:lang w:val="en-US"/>
+              </w:rPr>
+              <w:t>Sender Address</w:t>
+            </w:r>
+            <w:r>
+              <w:rPr>
+                <w:lang w:val="en-US"/>
+              </w:rPr>
+              <w:t xml:space="preserve">: </w:t>
+            </w:r>
+            <w:r>
+              <w:rPr>
+                <w:lang w:val="en-US"/>
+              </w:rPr>
+              <w:t>nazrin.finance@abc.com.my</w:t>
+            </w:r>
+          </w:p>
+          <w:p>
+            <w:pPr>
+              <w:rPr>
+                <w:lang w:val="en-US"/>
+              </w:rPr>
+            </w:pPr>
+            <w:r>
+              <w:rPr>
+                <w:b/>
+                <w:bCs/>
+                <w:lang w:val="en-US"/>
+              </w:rPr>
+              <w:t>To Address</w:t>
+            </w:r>
+            <w:r>
+              <w:rPr>
+                <w:lang w:val="en-US"/>
+              </w:rPr>
+              <w:t>: {</w:t>
+            </w:r>
+            <w:proofErr w:type="spellStart"/>
+            <w:r>
+              <w:rPr>
+                <w:lang w:val="en-US"/>
+              </w:rPr>
+              <w:t>player_email</w:t>
+            </w:r>
+            <w:proofErr w:type="spellEnd"/>
+            <w:r>
+              <w:rPr>
+                <w:lang w:val="en-US"/>
+              </w:rPr>
+              <w:t>}</w:t>
+            </w:r>
+          </w:p>
+          <w:p>
+            <w:pPr>
+              <w:rPr>
+                <w:lang w:val="en-US"/>
+              </w:rPr>
+            </w:pPr>
+            <w:r>
+              <w:rPr>
+                <w:b/>
+                <w:bCs/>
+                <w:lang w:val="en-US"/>
+              </w:rPr>
+              <w:t>CC Address</w:t>
+            </w:r>
+            <w:r>
+              <w:rPr>
+                <w:lang w:val="en-US"/>
+              </w:rPr>
+              <w:t>:</w:t>
+            </w:r>
+            <w:r>
+              <w:rPr>
+                <w:lang w:val="en-US"/>
+              </w:rPr>
+              <w:t xml:space="preserve"> </w:t>
+            </w:r>
+          </w:p>
+          <w:p>
+            <w:pPr>
+              <w:rPr>
+                <w:lang w:val="en-US"/>
+              </w:rPr>
+            </w:pPr>
+            <w:r>
+              <w:rPr>
+                <w:b/>
+                <w:bCs/>
+                <w:lang w:val="en-US"/>
+              </w:rPr>
+              <w:t>Subject</w:t>
+            </w:r>
+            <w:r>
+              <w:rPr>
+                <w:lang w:val="en-US"/>
+              </w:rPr>
+              <w:t xml:space="preserve">: </w:t>
+            </w:r>
+            <w:r>
+              <w:rPr>
+                <w:lang w:val="en-US"/>
+              </w:rPr>
+              <w:t>Submission Point for Purchase Orders</w:t>
+            </w:r>
+          </w:p>
+          <w:p>
+            <w:pPr>
+              <w:rPr>
+                <w:b/>
+                <w:bCs/>
+                <w:lang w:val="en-US"/>
+              </w:rPr>
+            </w:pPr>
+          </w:p>
+        </w:tc>
+        <w:tc>
+          <w:tcPr>
+            <w:tcW w:w="5061" w:type="dxa"/>
+            <w:vAlign w:val="center"/>
+          </w:tcPr>
+          <w:p>
+            <w:pPr>
+              <w:rPr>
+                <w:lang w:val="en-US"/>
+              </w:rPr>
+            </w:pPr>
           </w:p>
         </w:tc>
       </w:tr>
@@ -8982,7 +10224,6 @@
   <w:style w:type="character" w:default="1" w:styleId="DefaultParagraphFont">
     <w:name w:val="Default Paragraph Font"/>
     <w:uiPriority w:val="1"/>
-    <w:semiHidden/>
     <w:unhideWhenUsed/>
   </w:style>
   <w:style w:type="table" w:default="1" w:styleId="TableNormal">

</xml_diff>

<commit_message>
Upgrade: FileDatabase auto builds according to files in dir
</commit_message>
<xml_diff>
--- a/level design.docx
+++ b/level design.docx
@@ -9579,6 +9579,45 @@
               <w:t>Submission Point for Purchase Orders</w:t>
             </w:r>
           </w:p>
+          <w:p>
+            <w:pPr>
+              <w:rPr>
+                <w:b/>
+                <w:bCs/>
+                <w:lang w:val="en-US"/>
+              </w:rPr>
+            </w:pPr>
+          </w:p>
+        </w:tc>
+        <w:tc>
+          <w:tcPr>
+            <w:tcW w:w="5061" w:type="dxa"/>
+            <w:vAlign w:val="center"/>
+          </w:tcPr>
+          <w:p>
+            <w:pPr>
+              <w:rPr>
+                <w:lang w:val="en-US"/>
+              </w:rPr>
+            </w:pPr>
+            <w:r>
+              <w:rPr>
+                <w:lang w:val="en-US"/>
+              </w:rPr>
+              <w:t>We have to be extra vigilant. Recently a company was hit by a ransomware attack and had their files locked. Even worse is that they did not back up their data for a long time.</w:t>
+            </w:r>
+          </w:p>
+        </w:tc>
+      </w:tr>
+      <w:tr>
+        <w:trPr>
+          <w:trHeight w:val="360"/>
+        </w:trPr>
+        <w:tc>
+          <w:tcPr>
+            <w:tcW w:w="3955" w:type="dxa"/>
+            <w:vAlign w:val="center"/>
+          </w:tcPr>
           <w:p>
             <w:pPr>
               <w:rPr>

</xml_diff>

<commit_message>
Level Design: Wednesday Emails
</commit_message>
<xml_diff>
--- a/level design.docx
+++ b/level design.docx
@@ -1471,7 +1471,6 @@
               <w:t>]assets/tutorial/report_email.png[/</w:t>
             </w:r>
             <w:proofErr w:type="spellStart"/>
-            <w:proofErr w:type="gramStart"/>
             <w:r>
               <w:rPr>
                 <w:lang w:val="en-US"/>
@@ -1489,14 +1488,7 @@
               <w:rPr>
                 <w:lang w:val="en-US"/>
               </w:rPr>
-              <w:t>[</w:t>
-            </w:r>
-            <w:proofErr w:type="gramEnd"/>
-            <w:r>
-              <w:rPr>
-                <w:lang w:val="en-US"/>
-              </w:rPr>
-              <w:t>/center]</w:t>
+              <w:t>[/center]</w:t>
             </w:r>
           </w:p>
           <w:p>
@@ -1884,21 +1876,7 @@
               <w:rPr>
                 <w:lang w:val="en-US"/>
               </w:rPr>
-              <w:t>[p]</w:t>
-            </w:r>
-            <w:proofErr w:type="gramStart"/>
-            <w:r>
-              <w:rPr>
-                <w:lang w:val="en-US"/>
-              </w:rPr>
-              <w:t>To</w:t>
-            </w:r>
-            <w:proofErr w:type="gramEnd"/>
-            <w:r>
-              <w:rPr>
-                <w:lang w:val="en-US"/>
-              </w:rPr>
-              <w:t xml:space="preserve"> make things easier for you, I'll send you a request email like this every day and you can just drop the files in and click send!</w:t>
+              <w:t>[p]To make things easier for you, I'll send you a request email like this every day and you can just drop the files in and click send!</w:t>
             </w:r>
           </w:p>
           <w:p>
@@ -1924,35 +1902,7 @@
               <w:rPr>
                 <w:lang w:val="en-US"/>
               </w:rPr>
-              <w:t>[p][</w:t>
-            </w:r>
-            <w:proofErr w:type="gramStart"/>
-            <w:r>
-              <w:rPr>
-                <w:lang w:val="en-US"/>
-              </w:rPr>
-              <w:t>b]Make</w:t>
-            </w:r>
-            <w:proofErr w:type="gramEnd"/>
-            <w:r>
-              <w:rPr>
-                <w:lang w:val="en-US"/>
-              </w:rPr>
-              <w:t xml:space="preserve"> sure that you have collected all the Purchase Orders sent to you today before submitting. A missed order is a missed </w:t>
-            </w:r>
-            <w:proofErr w:type="gramStart"/>
-            <w:r>
-              <w:rPr>
-                <w:lang w:val="en-US"/>
-              </w:rPr>
-              <w:t>opportunity![</w:t>
-            </w:r>
-            <w:proofErr w:type="gramEnd"/>
-            <w:r>
-              <w:rPr>
-                <w:lang w:val="en-US"/>
-              </w:rPr>
-              <w:t>/b]</w:t>
+              <w:t>[p][b]Make sure that you have collected all the Purchase Orders sent to you today before submitting. A missed order is a missed opportunity![/b]</w:t>
             </w:r>
           </w:p>
           <w:p>
@@ -2696,19 +2646,32 @@
               <w:t>]</w:t>
             </w:r>
             <w:r>
-              <w:t xml:space="preserve">Thank you for choosing Orbit </w:t>
-            </w:r>
-            <w:proofErr w:type="gramStart"/>
-            <w:r>
-              <w:t>Antivirus!</w:t>
+              <w:t>Thank you for choosing Orbit Antivirus!</w:t>
+            </w:r>
+            <w:r>
+              <w:t>[/</w:t>
+            </w:r>
+            <w:proofErr w:type="spellStart"/>
+            <w:r>
+              <w:t>center</w:t>
+            </w:r>
+            <w:proofErr w:type="spellEnd"/>
+            <w:r>
+              <w:t>]</w:t>
+            </w:r>
+          </w:p>
+          <w:p>
+            <w:r>
+              <w:t xml:space="preserve">[p] </w:t>
+            </w:r>
+          </w:p>
+          <w:p>
+            <w:r>
+              <w:t>[p]</w:t>
             </w:r>
             <w:r>
               <w:t>[</w:t>
             </w:r>
-            <w:proofErr w:type="gramEnd"/>
-            <w:r>
-              <w:t>/</w:t>
-            </w:r>
             <w:proofErr w:type="spellStart"/>
             <w:r>
               <w:t>center</w:t>
@@ -2717,29 +2680,22 @@
             <w:r>
               <w:t>]</w:t>
             </w:r>
-          </w:p>
-          <w:p>
-            <w:r>
-              <w:t xml:space="preserve">[p] </w:t>
-            </w:r>
-          </w:p>
-          <w:p>
-            <w:r>
-              <w:t>[p]</w:t>
-            </w:r>
             <w:r>
               <w:t>[</w:t>
             </w:r>
             <w:proofErr w:type="spellStart"/>
             <w:r>
-              <w:t>center</w:t>
+              <w:t>img</w:t>
             </w:r>
             <w:proofErr w:type="spellEnd"/>
             <w:r>
               <w:t>]</w:t>
             </w:r>
             <w:r>
-              <w:t>[</w:t>
+              <w:t>assets/</w:t>
+            </w:r>
+            <w:r>
+              <w:t>orbit_logo.png[/</w:t>
             </w:r>
             <w:proofErr w:type="spellStart"/>
             <w:r>
@@ -2750,26 +2706,7 @@
               <w:t>]</w:t>
             </w:r>
             <w:r>
-              <w:t>assets/</w:t>
-            </w:r>
-            <w:r>
-              <w:t>orbit_logo.png[/</w:t>
-            </w:r>
-            <w:proofErr w:type="spellStart"/>
-            <w:proofErr w:type="gramStart"/>
-            <w:r>
-              <w:t>img</w:t>
-            </w:r>
-            <w:proofErr w:type="spellEnd"/>
-            <w:r>
-              <w:t>]</w:t>
-            </w:r>
-            <w:r>
-              <w:t>[</w:t>
-            </w:r>
-            <w:proofErr w:type="gramEnd"/>
-            <w:r>
-              <w:t>/</w:t>
+              <w:t>[/</w:t>
             </w:r>
             <w:proofErr w:type="spellStart"/>
             <w:r>
@@ -3028,19 +2965,11 @@
                 <w:lang w:val="en-US"/>
               </w:rPr>
             </w:pPr>
-            <w:proofErr w:type="gramStart"/>
-            <w:r>
-              <w:rPr>
-                <w:lang w:val="en-US"/>
-              </w:rPr>
-              <w:t>[p]</w:t>
-            </w:r>
-            <w:proofErr w:type="gramEnd"/>
-            <w:r>
-              <w:rPr>
-                <w:lang w:val="en-US"/>
-              </w:rPr>
-              <w:t>Please refer to the PO attached.</w:t>
+            <w:r>
+              <w:rPr>
+                <w:lang w:val="en-US"/>
+              </w:rPr>
+              <w:t>[p]Please refer to the PO attached.</w:t>
             </w:r>
           </w:p>
           <w:p>
@@ -3391,11 +3320,7 @@
               <w:t>[img</w:t>
             </w:r>
             <w:r>
-              <w:t>=750x</w:t>
-            </w:r>
-            <w:proofErr w:type="gramStart"/>
-            <w:r>
-              <w:t>750</w:t>
+              <w:t>=750x750</w:t>
             </w:r>
             <w:r>
               <w:t>]</w:t>
@@ -3404,22 +3329,10 @@
               <w:t>assets/adware/</w:t>
             </w:r>
             <w:r>
-              <w:t>trippo_ad.jpg</w:t>
-            </w:r>
-            <w:proofErr w:type="gramEnd"/>
-            <w:r>
-              <w:t>[/</w:t>
-            </w:r>
-            <w:proofErr w:type="gramStart"/>
-            <w:r>
-              <w:t>img]</w:t>
-            </w:r>
-            <w:r>
-              <w:t>[</w:t>
-            </w:r>
-            <w:proofErr w:type="gramEnd"/>
-            <w:r>
-              <w:t>/center]</w:t>
+              <w:t>trippo_ad.jpg[/img]</w:t>
+            </w:r>
+            <w:r>
+              <w:t>[/center]</w:t>
             </w:r>
           </w:p>
         </w:tc>
@@ -4171,13 +4084,7 @@
               <w:rPr>
                 <w:lang w:val="en-US"/>
               </w:rPr>
-              <w:t xml:space="preserve">] </w:t>
-            </w:r>
-            <w:r>
-              <w:rPr>
-                <w:lang w:val="en-US"/>
-              </w:rPr>
-              <w:t>[</w:t>
+              <w:t>] [</w:t>
             </w:r>
             <w:proofErr w:type="spellStart"/>
             <w:r>
@@ -4191,19 +4098,7 @@
               <w:rPr>
                 <w:lang w:val="en-US"/>
               </w:rPr>
-              <w:t>]assets/tutorial/hover</w:t>
-            </w:r>
-            <w:r>
-              <w:rPr>
-                <w:lang w:val="en-US"/>
-              </w:rPr>
-              <w:t>2</w:t>
-            </w:r>
-            <w:r>
-              <w:rPr>
-                <w:lang w:val="en-US"/>
-              </w:rPr>
-              <w:t>.png[/</w:t>
+              <w:t>]assets/tutorial/hover2.png[/</w:t>
             </w:r>
             <w:proofErr w:type="spellStart"/>
             <w:r>
@@ -4217,13 +4112,7 @@
               <w:rPr>
                 <w:lang w:val="en-US"/>
               </w:rPr>
-              <w:t>]</w:t>
-            </w:r>
-            <w:r>
-              <w:rPr>
-                <w:lang w:val="en-US"/>
-              </w:rPr>
-              <w:t xml:space="preserve"> [/center]</w:t>
+              <w:t>] [/center]</w:t>
             </w:r>
           </w:p>
           <w:p>
@@ -6020,27 +5909,14 @@
               <w:rPr>
                 <w:lang w:val="en-US"/>
               </w:rPr>
-              <w:t>[</w:t>
-            </w:r>
-            <w:proofErr w:type="gramStart"/>
-            <w:r>
-              <w:rPr>
-                <w:lang w:val="en-US"/>
-              </w:rPr>
-              <w:t>b]</w:t>
+              <w:t>[b]</w:t>
             </w:r>
             <w:r>
               <w:t>Malware</w:t>
             </w:r>
-            <w:proofErr w:type="gramEnd"/>
-            <w:r>
-              <w:t>[/b</w:t>
-            </w:r>
-            <w:proofErr w:type="gramStart"/>
-            <w:r>
-              <w:t>] :</w:t>
-            </w:r>
-            <w:proofErr w:type="gramEnd"/>
+            <w:r>
+              <w:t>[/b] :</w:t>
+            </w:r>
             <w:r>
               <w:t xml:space="preserve"> Software that runs in the background silently. They have various goals, such as recording what you type, </w:t>
             </w:r>
@@ -6066,29 +5942,10 @@
               <w:rPr>
                 <w:lang w:val="en-US"/>
               </w:rPr>
-              <w:t>[p][</w:t>
-            </w:r>
-            <w:proofErr w:type="gramStart"/>
-            <w:r>
-              <w:rPr>
-                <w:lang w:val="en-US"/>
-              </w:rPr>
-              <w:t>b]</w:t>
-            </w:r>
-            <w:r>
-              <w:t>Adware</w:t>
-            </w:r>
-            <w:proofErr w:type="gramEnd"/>
-            <w:r>
-              <w:t>[/b</w:t>
-            </w:r>
-            <w:proofErr w:type="gramStart"/>
-            <w:r>
-              <w:t>] :</w:t>
-            </w:r>
-            <w:proofErr w:type="gramEnd"/>
-            <w:r>
-              <w:t xml:space="preserve"> If it exists in your device, you will get spammed by various advertisements which can be very distracting.</w:t>
+              <w:t>[p][b]</w:t>
+            </w:r>
+            <w:r>
+              <w:t>Adware[/b] : If it exists in your device, you will get spammed by various advertisements which can be very distracting.</w:t>
             </w:r>
           </w:p>
           <w:p>
@@ -6109,29 +5966,10 @@
               <w:rPr>
                 <w:lang w:val="en-US"/>
               </w:rPr>
-              <w:t>[p][</w:t>
-            </w:r>
-            <w:proofErr w:type="gramStart"/>
-            <w:r>
-              <w:rPr>
-                <w:lang w:val="en-US"/>
-              </w:rPr>
-              <w:t>b]</w:t>
-            </w:r>
-            <w:r>
-              <w:t>Ransomware</w:t>
-            </w:r>
-            <w:proofErr w:type="gramEnd"/>
-            <w:r>
-              <w:t>[/b</w:t>
-            </w:r>
-            <w:proofErr w:type="gramStart"/>
-            <w:r>
-              <w:t>] :</w:t>
-            </w:r>
-            <w:proofErr w:type="gramEnd"/>
-            <w:r>
-              <w:t xml:space="preserve"> One of the most dangerous software to have in your device. It will lock your files and demand a large sum of money to unlock your files. Do not pay the ransom, it will not guarantee your files return.</w:t>
+              <w:t>[p][b]</w:t>
+            </w:r>
+            <w:r>
+              <w:t>Ransomware[/b] : One of the most dangerous software to have in your device. It will lock your files and demand a large sum of money to unlock your files. Do not pay the ransom, it will not guarantee your files return.</w:t>
             </w:r>
           </w:p>
           <w:p>
@@ -6724,47 +6562,19 @@
               <w:rPr>
                 <w:lang w:val="en-US"/>
               </w:rPr>
-              <w:t>=500x</w:t>
-            </w:r>
-            <w:proofErr w:type="gramStart"/>
-            <w:r>
-              <w:rPr>
-                <w:lang w:val="en-US"/>
-              </w:rPr>
-              <w:t>500</w:t>
-            </w:r>
-            <w:r>
-              <w:rPr>
-                <w:lang w:val="en-US"/>
-              </w:rPr>
-              <w:t>]assets/adware/c17_recruit.jpg</w:t>
-            </w:r>
-            <w:proofErr w:type="gramEnd"/>
-            <w:r>
-              <w:rPr>
-                <w:lang w:val="en-US"/>
-              </w:rPr>
-              <w:t>[/</w:t>
-            </w:r>
-            <w:proofErr w:type="gramStart"/>
-            <w:r>
-              <w:rPr>
-                <w:lang w:val="en-US"/>
-              </w:rPr>
-              <w:t>img]</w:t>
-            </w:r>
-            <w:r>
-              <w:rPr>
-                <w:lang w:val="en-US"/>
-              </w:rPr>
-              <w:t>[</w:t>
-            </w:r>
-            <w:proofErr w:type="gramEnd"/>
-            <w:r>
-              <w:rPr>
-                <w:lang w:val="en-US"/>
-              </w:rPr>
-              <w:t>/center]</w:t>
+              <w:t>=500x500</w:t>
+            </w:r>
+            <w:r>
+              <w:rPr>
+                <w:lang w:val="en-US"/>
+              </w:rPr>
+              <w:t>]assets/adware/c17_recruit.jpg[/img]</w:t>
+            </w:r>
+            <w:r>
+              <w:rPr>
+                <w:lang w:val="en-US"/>
+              </w:rPr>
+              <w:t>[/center]</w:t>
             </w:r>
           </w:p>
         </w:tc>
@@ -7049,19 +6859,11 @@
                 <w:lang w:val="en-US"/>
               </w:rPr>
             </w:pPr>
-            <w:proofErr w:type="gramStart"/>
-            <w:r>
-              <w:rPr>
-                <w:lang w:val="en-US"/>
-              </w:rPr>
-              <w:t>[p]</w:t>
-            </w:r>
-            <w:proofErr w:type="gramEnd"/>
-            <w:r>
-              <w:rPr>
-                <w:lang w:val="en-US"/>
-              </w:rPr>
-              <w:t xml:space="preserve">Please download and send the </w:t>
+            <w:r>
+              <w:rPr>
+                <w:lang w:val="en-US"/>
+              </w:rPr>
+              <w:t xml:space="preserve">[p]Please download and send the </w:t>
             </w:r>
             <w:proofErr w:type="spellStart"/>
             <w:r>
@@ -7416,14 +7218,12 @@
                 <w:lang w:val="en-US"/>
               </w:rPr>
             </w:pPr>
-            <w:proofErr w:type="gramStart"/>
             <w:r>
               <w:rPr>
                 <w:lang w:val="en-US"/>
               </w:rPr>
               <w:t>[p]</w:t>
             </w:r>
-            <w:proofErr w:type="gramEnd"/>
             <w:r>
               <w:rPr>
                 <w:lang w:val="en-US"/>
@@ -8175,19 +7975,11 @@
                 <w:lang w:val="en-US"/>
               </w:rPr>
             </w:pPr>
-            <w:proofErr w:type="gramStart"/>
-            <w:r>
-              <w:rPr>
-                <w:lang w:val="en-US"/>
-              </w:rPr>
-              <w:t>[p]</w:t>
-            </w:r>
-            <w:proofErr w:type="gramEnd"/>
-            <w:r>
-              <w:rPr>
-                <w:lang w:val="en-US"/>
-              </w:rPr>
-              <w:t xml:space="preserve">Please download </w:t>
+            <w:r>
+              <w:rPr>
+                <w:lang w:val="en-US"/>
+              </w:rPr>
+              <w:t xml:space="preserve">[p]Please download </w:t>
             </w:r>
             <w:r>
               <w:rPr>
@@ -8560,8 +8352,8 @@
         <w:tblLook w:val="04A0" w:firstRow="1" w:lastRow="0" w:firstColumn="1" w:lastColumn="0" w:noHBand="0" w:noVBand="1"/>
       </w:tblPr>
       <w:tblGrid>
-        <w:gridCol w:w="3955"/>
-        <w:gridCol w:w="5061"/>
+        <w:gridCol w:w="3443"/>
+        <w:gridCol w:w="5573"/>
       </w:tblGrid>
       <w:tr>
         <w:trPr>
@@ -8989,7 +8781,31 @@
               <w:rPr>
                 <w:lang w:val="en-US"/>
               </w:rPr>
-              <w:t>of commonly spotted email addresses sending ransomware, please be aware that this is not a complete list.</w:t>
+              <w:t xml:space="preserve">of email addresses </w:t>
+            </w:r>
+            <w:r>
+              <w:rPr>
+                <w:lang w:val="en-US"/>
+              </w:rPr>
+              <w:t xml:space="preserve">that were reported to be </w:t>
+            </w:r>
+            <w:r>
+              <w:rPr>
+                <w:lang w:val="en-US"/>
+              </w:rPr>
+              <w:t>behind the</w:t>
+            </w:r>
+            <w:r>
+              <w:rPr>
+                <w:lang w:val="en-US"/>
+              </w:rPr>
+              <w:t xml:space="preserve"> ransomware attacks</w:t>
+            </w:r>
+            <w:r>
+              <w:rPr>
+                <w:lang w:val="en-US"/>
+              </w:rPr>
+              <w:t>, please be aware that this is not a complete list.</w:t>
             </w:r>
           </w:p>
           <w:p>
@@ -9023,7 +8839,20 @@
                   <w:rStyle w:val="Hyperlink"/>
                   <w:lang w:val="en-US"/>
                 </w:rPr>
-                <w:t>sus@email.com</w:t>
+                <w:t>a</w:t>
+              </w:r>
+              <w:r>
+                <w:rPr>
+                  <w:rStyle w:val="Hyperlink"/>
+                </w:rPr>
+                <w:t>nth0ny41</w:t>
+              </w:r>
+              <w:r>
+                <w:rPr>
+                  <w:rStyle w:val="Hyperlink"/>
+                  <w:lang w:val="en-US"/>
+                </w:rPr>
+                <w:t>@email.com</w:t>
               </w:r>
             </w:hyperlink>
           </w:p>
@@ -9039,11 +8868,20 @@
               </w:rPr>
               <w:t>[p]</w:t>
             </w:r>
-            <w:r>
-              <w:rPr>
-                <w:lang w:val="en-US"/>
-              </w:rPr>
-              <w:t>sus@email.com</w:t>
+            <w:hyperlink r:id="rId22" w:history="1">
+              <w:r>
+                <w:rPr>
+                  <w:rStyle w:val="Hyperlink"/>
+                  <w:lang w:val="en-US"/>
+                </w:rPr>
+                <w:t>888lottery@email.com</w:t>
+              </w:r>
+            </w:hyperlink>
+            <w:r>
+              <w:rPr>
+                <w:lang w:val="en-US"/>
+              </w:rPr>
+              <w:t xml:space="preserve"> </w:t>
             </w:r>
           </w:p>
           <w:p>
@@ -9058,19 +8896,34 @@
               </w:rPr>
               <w:t>[p]</w:t>
             </w:r>
-            <w:r>
-              <w:rPr>
-                <w:lang w:val="en-US"/>
-              </w:rPr>
-              <w:t>sus@email.com</w:t>
-            </w:r>
-          </w:p>
-          <w:p>
-            <w:pPr>
-              <w:rPr>
-                <w:lang w:val="en-US"/>
-              </w:rPr>
-            </w:pPr>
+            <w:hyperlink r:id="rId23" w:history="1">
+              <w:r>
+                <w:rPr>
+                  <w:rStyle w:val="Hyperlink"/>
+                  <w:lang w:val="en-US"/>
+                </w:rPr>
+                <w:t>audit.gov.</w:t>
+              </w:r>
+              <w:r>
+                <w:rPr>
+                  <w:rStyle w:val="Hyperlink"/>
+                </w:rPr>
+                <w:t>admin</w:t>
+              </w:r>
+              <w:r>
+                <w:rPr>
+                  <w:rStyle w:val="Hyperlink"/>
+                  <w:lang w:val="en-US"/>
+                </w:rPr>
+                <w:t>@email.com</w:t>
+              </w:r>
+            </w:hyperlink>
+            <w:r>
+              <w:rPr>
+                <w:lang w:val="en-US"/>
+              </w:rPr>
+              <w:t xml:space="preserve"> </w:t>
+            </w:r>
           </w:p>
           <w:p>
             <w:pPr>
@@ -9327,7 +9180,19 @@
               <w:rPr>
                 <w:lang w:val="en-US"/>
               </w:rPr>
-              <w:t>[p]Yesterday someone from your company, Mr. Mike submitted a purchase order on my behalf. After some considerations I want to add on more items in the purchase order. Please notify them to refer to this revised purchase order. Sorry for the inconvenience!</w:t>
+              <w:t xml:space="preserve">[p]Yesterday someone from your company, Mr. Mike submitted a purchase order on my behalf. After some considerations I want to add on </w:t>
+            </w:r>
+            <w:r>
+              <w:rPr>
+                <w:lang w:val="en-US"/>
+              </w:rPr>
+              <w:t>some</w:t>
+            </w:r>
+            <w:r>
+              <w:rPr>
+                <w:lang w:val="en-US"/>
+              </w:rPr>
+              <w:t xml:space="preserve"> items in the purchase order. Please notify them to refer to this revised purchase order. Sorry for the inconvenience!</w:t>
             </w:r>
           </w:p>
           <w:p>
@@ -9604,7 +9469,55 @@
               <w:rPr>
                 <w:lang w:val="en-US"/>
               </w:rPr>
-              <w:t>We have to be extra vigilant. Recently a company was hit by a ransomware attack and had their files locked. Even worse is that they did not back up their data for a long time.</w:t>
+              <w:t xml:space="preserve">We have to be extra </w:t>
+            </w:r>
+            <w:r>
+              <w:rPr>
+                <w:lang w:val="en-US"/>
+              </w:rPr>
+              <w:t>careful these days</w:t>
+            </w:r>
+            <w:r>
+              <w:rPr>
+                <w:lang w:val="en-US"/>
+              </w:rPr>
+              <w:t xml:space="preserve">. Recently a company was hit by a ransomware attack and had their files locked. Even worse is that they did not </w:t>
+            </w:r>
+            <w:r>
+              <w:rPr>
+                <w:lang w:val="en-US"/>
+              </w:rPr>
+              <w:t xml:space="preserve">do any data backups, </w:t>
+            </w:r>
+            <w:r>
+              <w:rPr>
+                <w:lang w:val="en-US"/>
+              </w:rPr>
+              <w:t>recovery is going to be difficult unless they kept</w:t>
+            </w:r>
+            <w:r>
+              <w:rPr>
+                <w:lang w:val="en-US"/>
+              </w:rPr>
+              <w:t xml:space="preserve"> </w:t>
+            </w:r>
+            <w:r>
+              <w:rPr>
+                <w:lang w:val="en-US"/>
+              </w:rPr>
+              <w:t>hard copies</w:t>
+            </w:r>
+            <w:r>
+              <w:rPr>
+                <w:lang w:val="en-US"/>
+              </w:rPr>
+              <w:t xml:space="preserve"> of files</w:t>
+            </w:r>
+            <w:r>
+              <w:rPr>
+                <w:lang w:val="en-US"/>
+              </w:rPr>
+              <w:t>.</w:t>
             </w:r>
           </w:p>
         </w:tc>
@@ -9627,6 +9540,213 @@
               </w:rPr>
             </w:pPr>
           </w:p>
+          <w:p>
+            <w:pPr>
+              <w:rPr>
+                <w:lang w:val="en-US"/>
+              </w:rPr>
+            </w:pPr>
+            <w:r>
+              <w:rPr>
+                <w:b/>
+                <w:bCs/>
+                <w:lang w:val="en-US"/>
+              </w:rPr>
+              <w:t>Type</w:t>
+            </w:r>
+            <w:r>
+              <w:rPr>
+                <w:lang w:val="en-US"/>
+              </w:rPr>
+              <w:t xml:space="preserve">: </w:t>
+            </w:r>
+            <w:r>
+              <w:rPr>
+                <w:lang w:val="en-US"/>
+              </w:rPr>
+              <w:t>Message</w:t>
+            </w:r>
+          </w:p>
+          <w:p>
+            <w:pPr>
+              <w:rPr>
+                <w:lang w:val="en-US"/>
+              </w:rPr>
+            </w:pPr>
+            <w:r>
+              <w:rPr>
+                <w:b/>
+                <w:bCs/>
+                <w:lang w:val="en-US"/>
+              </w:rPr>
+              <w:t>Sender Name</w:t>
+            </w:r>
+            <w:r>
+              <w:rPr>
+                <w:lang w:val="en-US"/>
+              </w:rPr>
+              <w:t xml:space="preserve">: </w:t>
+            </w:r>
+            <w:r>
+              <w:rPr>
+                <w:lang w:val="en-US"/>
+              </w:rPr>
+              <w:t>Cyber News Daily</w:t>
+            </w:r>
+          </w:p>
+          <w:p>
+            <w:pPr>
+              <w:rPr>
+                <w:lang w:val="en-US"/>
+              </w:rPr>
+            </w:pPr>
+            <w:r>
+              <w:rPr>
+                <w:b/>
+                <w:bCs/>
+                <w:lang w:val="en-US"/>
+              </w:rPr>
+              <w:t>Sender Address</w:t>
+            </w:r>
+            <w:r>
+              <w:rPr>
+                <w:lang w:val="en-US"/>
+              </w:rPr>
+              <w:t xml:space="preserve">: </w:t>
+            </w:r>
+            <w:r>
+              <w:rPr>
+                <w:lang w:val="en-US"/>
+              </w:rPr>
+              <w:t>dailynews</w:t>
+            </w:r>
+            <w:r>
+              <w:rPr>
+                <w:lang w:val="en-US"/>
+              </w:rPr>
+              <w:t>@</w:t>
+            </w:r>
+            <w:r>
+              <w:rPr>
+                <w:lang w:val="en-US"/>
+              </w:rPr>
+              <w:t>cnd</w:t>
+            </w:r>
+            <w:r>
+              <w:rPr>
+                <w:lang w:val="en-US"/>
+              </w:rPr>
+              <w:t>.com</w:t>
+            </w:r>
+          </w:p>
+          <w:p>
+            <w:pPr>
+              <w:rPr>
+                <w:lang w:val="en-US"/>
+              </w:rPr>
+            </w:pPr>
+            <w:r>
+              <w:rPr>
+                <w:b/>
+                <w:bCs/>
+                <w:lang w:val="en-US"/>
+              </w:rPr>
+              <w:t>To Address</w:t>
+            </w:r>
+            <w:r>
+              <w:rPr>
+                <w:lang w:val="en-US"/>
+              </w:rPr>
+              <w:t>: {</w:t>
+            </w:r>
+            <w:proofErr w:type="spellStart"/>
+            <w:r>
+              <w:rPr>
+                <w:lang w:val="en-US"/>
+              </w:rPr>
+              <w:t>player_email</w:t>
+            </w:r>
+            <w:proofErr w:type="spellEnd"/>
+            <w:r>
+              <w:rPr>
+                <w:lang w:val="en-US"/>
+              </w:rPr>
+              <w:t>}</w:t>
+            </w:r>
+          </w:p>
+          <w:p>
+            <w:pPr>
+              <w:rPr>
+                <w:lang w:val="en-US"/>
+              </w:rPr>
+            </w:pPr>
+            <w:r>
+              <w:rPr>
+                <w:b/>
+                <w:bCs/>
+                <w:lang w:val="en-US"/>
+              </w:rPr>
+              <w:t>CC Address</w:t>
+            </w:r>
+            <w:r>
+              <w:rPr>
+                <w:lang w:val="en-US"/>
+              </w:rPr>
+              <w:t>:</w:t>
+            </w:r>
+            <w:r>
+              <w:rPr>
+                <w:lang w:val="en-US"/>
+              </w:rPr>
+              <w:t xml:space="preserve"> </w:t>
+            </w:r>
+          </w:p>
+          <w:p>
+            <w:pPr>
+              <w:rPr>
+                <w:lang w:val="en-US"/>
+              </w:rPr>
+            </w:pPr>
+            <w:r>
+              <w:rPr>
+                <w:b/>
+                <w:bCs/>
+                <w:lang w:val="en-US"/>
+              </w:rPr>
+              <w:lastRenderedPageBreak/>
+              <w:t>Subject</w:t>
+            </w:r>
+            <w:r>
+              <w:rPr>
+                <w:lang w:val="en-US"/>
+              </w:rPr>
+              <w:t xml:space="preserve">: </w:t>
+            </w:r>
+            <w:r>
+              <w:rPr>
+                <w:lang w:val="en-US"/>
+              </w:rPr>
+              <w:t>Recent Ransomware Attacks</w:t>
+            </w:r>
+          </w:p>
+          <w:p>
+            <w:pPr>
+              <w:rPr>
+                <w:b/>
+                <w:bCs/>
+                <w:lang w:val="en-US"/>
+              </w:rPr>
+            </w:pPr>
+          </w:p>
+          <w:p>
+            <w:pPr>
+              <w:rPr>
+                <w:b/>
+                <w:bCs/>
+                <w:lang w:val="en-US"/>
+              </w:rPr>
+            </w:pPr>
+          </w:p>
         </w:tc>
         <w:tc>
           <w:tcPr>
@@ -9639,6 +9759,2061 @@
                 <w:lang w:val="en-US"/>
               </w:rPr>
             </w:pPr>
+          </w:p>
+          <w:p>
+            <w:pPr>
+              <w:rPr>
+                <w:lang w:val="en-US"/>
+              </w:rPr>
+            </w:pPr>
+            <w:r>
+              <w:rPr>
+                <w:lang w:val="en-US"/>
+              </w:rPr>
+              <w:t>Recently a few companies were hit by ransomware attacks. Please pay attention to email addresses and the files attached in the emails they sent.</w:t>
+            </w:r>
+          </w:p>
+          <w:p>
+            <w:pPr>
+              <w:rPr>
+                <w:lang w:val="en-US"/>
+              </w:rPr>
+            </w:pPr>
+            <w:r>
+              <w:rPr>
+                <w:lang w:val="en-US"/>
+              </w:rPr>
+              <w:t xml:space="preserve">[p] </w:t>
+            </w:r>
+          </w:p>
+          <w:p>
+            <w:pPr>
+              <w:rPr>
+                <w:lang w:val="en-US"/>
+              </w:rPr>
+            </w:pPr>
+            <w:r>
+              <w:rPr>
+                <w:lang w:val="en-US"/>
+              </w:rPr>
+              <w:t xml:space="preserve">[p]Also, do not blindly trust the icons of the files attached. A file named invoice.pdf.exe could be displayed as a .pdf file </w:t>
+            </w:r>
+            <w:r>
+              <w:rPr>
+                <w:lang w:val="en-US"/>
+              </w:rPr>
+              <w:lastRenderedPageBreak/>
+              <w:t xml:space="preserve">but in </w:t>
+            </w:r>
+            <w:r>
+              <w:rPr>
+                <w:lang w:val="en-US"/>
+              </w:rPr>
+              <w:t>reality,</w:t>
+            </w:r>
+            <w:r>
+              <w:rPr>
+                <w:lang w:val="en-US"/>
+              </w:rPr>
+              <w:t xml:space="preserve"> it is an executable file (.exe) possibly containing malware, like the ransomware.</w:t>
+            </w:r>
+          </w:p>
+          <w:p>
+            <w:pPr>
+              <w:rPr>
+                <w:lang w:val="en-US"/>
+              </w:rPr>
+            </w:pPr>
+            <w:r>
+              <w:rPr>
+                <w:lang w:val="en-US"/>
+              </w:rPr>
+              <w:t xml:space="preserve">[p] </w:t>
+            </w:r>
+          </w:p>
+          <w:p>
+            <w:pPr>
+              <w:rPr>
+                <w:lang w:val="en-US"/>
+              </w:rPr>
+            </w:pPr>
+            <w:r>
+              <w:rPr>
+                <w:lang w:val="en-US"/>
+              </w:rPr>
+              <w:t>[p]Look before you leap</w:t>
+            </w:r>
+            <w:r>
+              <w:rPr>
+                <w:lang w:val="en-US"/>
+              </w:rPr>
+              <w:t xml:space="preserve"> (in this case, download)</w:t>
+            </w:r>
+            <w:r>
+              <w:rPr>
+                <w:lang w:val="en-US"/>
+              </w:rPr>
+              <w:t>.</w:t>
+            </w:r>
+          </w:p>
+          <w:p>
+            <w:pPr>
+              <w:rPr>
+                <w:lang w:val="en-US"/>
+              </w:rPr>
+            </w:pPr>
+          </w:p>
+        </w:tc>
+      </w:tr>
+      <w:tr>
+        <w:trPr>
+          <w:trHeight w:val="360"/>
+        </w:trPr>
+        <w:tc>
+          <w:tcPr>
+            <w:tcW w:w="3955" w:type="dxa"/>
+            <w:vAlign w:val="center"/>
+          </w:tcPr>
+          <w:p>
+            <w:pPr>
+              <w:rPr>
+                <w:b/>
+                <w:bCs/>
+                <w:lang w:val="en-US"/>
+              </w:rPr>
+            </w:pPr>
+          </w:p>
+          <w:p>
+            <w:pPr>
+              <w:rPr>
+                <w:lang w:val="en-US"/>
+              </w:rPr>
+            </w:pPr>
+            <w:r>
+              <w:rPr>
+                <w:b/>
+                <w:bCs/>
+                <w:lang w:val="en-US"/>
+              </w:rPr>
+              <w:t>Type</w:t>
+            </w:r>
+            <w:r>
+              <w:rPr>
+                <w:lang w:val="en-US"/>
+              </w:rPr>
+              <w:t>: Inbound</w:t>
+            </w:r>
+          </w:p>
+          <w:p>
+            <w:pPr>
+              <w:rPr>
+                <w:lang w:val="en-US"/>
+              </w:rPr>
+            </w:pPr>
+            <w:r>
+              <w:rPr>
+                <w:b/>
+                <w:bCs/>
+                <w:lang w:val="en-US"/>
+              </w:rPr>
+              <w:t>Sender Name</w:t>
+            </w:r>
+            <w:r>
+              <w:rPr>
+                <w:lang w:val="en-US"/>
+              </w:rPr>
+              <w:t xml:space="preserve">: </w:t>
+            </w:r>
+            <w:proofErr w:type="spellStart"/>
+            <w:r>
+              <w:rPr>
+                <w:lang w:val="en-US"/>
+              </w:rPr>
+              <w:t>JOYSTORE</w:t>
+            </w:r>
+            <w:proofErr w:type="spellEnd"/>
+          </w:p>
+          <w:p>
+            <w:pPr>
+              <w:rPr>
+                <w:lang w:val="en-US"/>
+              </w:rPr>
+            </w:pPr>
+            <w:r>
+              <w:rPr>
+                <w:b/>
+                <w:bCs/>
+                <w:lang w:val="en-US"/>
+              </w:rPr>
+              <w:t>Sender Address</w:t>
+            </w:r>
+            <w:r>
+              <w:rPr>
+                <w:lang w:val="en-US"/>
+              </w:rPr>
+              <w:t xml:space="preserve">: </w:t>
+            </w:r>
+            <w:r>
+              <w:rPr>
+                <w:lang w:val="en-US"/>
+              </w:rPr>
+              <w:t>joystore@email.com</w:t>
+            </w:r>
+          </w:p>
+          <w:p>
+            <w:pPr>
+              <w:rPr>
+                <w:lang w:val="en-US"/>
+              </w:rPr>
+            </w:pPr>
+            <w:r>
+              <w:rPr>
+                <w:b/>
+                <w:bCs/>
+                <w:lang w:val="en-US"/>
+              </w:rPr>
+              <w:t>To Address</w:t>
+            </w:r>
+            <w:r>
+              <w:rPr>
+                <w:lang w:val="en-US"/>
+              </w:rPr>
+              <w:t>: {</w:t>
+            </w:r>
+            <w:proofErr w:type="spellStart"/>
+            <w:r>
+              <w:rPr>
+                <w:lang w:val="en-US"/>
+              </w:rPr>
+              <w:t>player_email</w:t>
+            </w:r>
+            <w:proofErr w:type="spellEnd"/>
+            <w:r>
+              <w:rPr>
+                <w:lang w:val="en-US"/>
+              </w:rPr>
+              <w:t>}</w:t>
+            </w:r>
+          </w:p>
+          <w:p>
+            <w:pPr>
+              <w:rPr>
+                <w:lang w:val="en-US"/>
+              </w:rPr>
+            </w:pPr>
+            <w:r>
+              <w:rPr>
+                <w:b/>
+                <w:bCs/>
+                <w:lang w:val="en-US"/>
+              </w:rPr>
+              <w:t>CC Address</w:t>
+            </w:r>
+            <w:r>
+              <w:rPr>
+                <w:lang w:val="en-US"/>
+              </w:rPr>
+              <w:t>:</w:t>
+            </w:r>
+            <w:r>
+              <w:rPr>
+                <w:lang w:val="en-US"/>
+              </w:rPr>
+              <w:t xml:space="preserve"> </w:t>
+            </w:r>
+          </w:p>
+          <w:p>
+            <w:pPr>
+              <w:rPr>
+                <w:lang w:val="en-US"/>
+              </w:rPr>
+            </w:pPr>
+            <w:r>
+              <w:rPr>
+                <w:b/>
+                <w:bCs/>
+                <w:lang w:val="en-US"/>
+              </w:rPr>
+              <w:t>Subject</w:t>
+            </w:r>
+            <w:r>
+              <w:rPr>
+                <w:lang w:val="en-US"/>
+              </w:rPr>
+              <w:t xml:space="preserve">: </w:t>
+            </w:r>
+            <w:r>
+              <w:rPr>
+                <w:lang w:val="en-US"/>
+              </w:rPr>
+              <w:t>REQUEST TO ORDER STATIONERY</w:t>
+            </w:r>
+          </w:p>
+          <w:p>
+            <w:pPr>
+              <w:rPr>
+                <w:b/>
+                <w:bCs/>
+                <w:lang w:val="en-US"/>
+              </w:rPr>
+            </w:pPr>
+          </w:p>
+        </w:tc>
+        <w:tc>
+          <w:tcPr>
+            <w:tcW w:w="5061" w:type="dxa"/>
+            <w:vAlign w:val="center"/>
+          </w:tcPr>
+          <w:p>
+            <w:pPr>
+              <w:rPr>
+                <w:lang w:val="en-US"/>
+              </w:rPr>
+            </w:pPr>
+          </w:p>
+          <w:p>
+            <w:pPr>
+              <w:rPr>
+                <w:lang w:val="en-US"/>
+              </w:rPr>
+            </w:pPr>
+            <w:r>
+              <w:rPr>
+                <w:lang w:val="en-US"/>
+              </w:rPr>
+              <w:t>DEAR PERSON IN CHARGE,</w:t>
+            </w:r>
+          </w:p>
+          <w:p>
+            <w:pPr>
+              <w:rPr>
+                <w:lang w:val="en-US"/>
+              </w:rPr>
+            </w:pPr>
+            <w:r>
+              <w:rPr>
+                <w:lang w:val="en-US"/>
+              </w:rPr>
+              <w:t xml:space="preserve">[p] </w:t>
+            </w:r>
+          </w:p>
+          <w:p>
+            <w:pPr>
+              <w:rPr>
+                <w:lang w:val="en-US"/>
+              </w:rPr>
+            </w:pPr>
+            <w:r>
+              <w:rPr>
+                <w:lang w:val="en-US"/>
+              </w:rPr>
+              <w:t>[p]I WANT TO ORDER STATIONERY FOR MY SHOP (</w:t>
+            </w:r>
+            <w:proofErr w:type="spellStart"/>
+            <w:r>
+              <w:rPr>
+                <w:lang w:val="en-US"/>
+              </w:rPr>
+              <w:t>JOYSTORE</w:t>
+            </w:r>
+            <w:proofErr w:type="spellEnd"/>
+            <w:r>
+              <w:rPr>
+                <w:lang w:val="en-US"/>
+              </w:rPr>
+              <w:t>). ORDER FILE IS IN EMAIL. THANK YOU.</w:t>
+            </w:r>
+          </w:p>
+          <w:p>
+            <w:pPr>
+              <w:rPr>
+                <w:lang w:val="en-US"/>
+              </w:rPr>
+            </w:pPr>
+            <w:r>
+              <w:rPr>
+                <w:lang w:val="en-US"/>
+              </w:rPr>
+              <w:t xml:space="preserve">[p] </w:t>
+            </w:r>
+          </w:p>
+          <w:p>
+            <w:pPr>
+              <w:rPr>
+                <w:lang w:val="en-US"/>
+              </w:rPr>
+            </w:pPr>
+            <w:r>
+              <w:rPr>
+                <w:lang w:val="en-US"/>
+              </w:rPr>
+              <w:t xml:space="preserve">[p] </w:t>
+            </w:r>
+          </w:p>
+          <w:p>
+            <w:pPr>
+              <w:rPr>
+                <w:lang w:val="en-US"/>
+              </w:rPr>
+            </w:pPr>
+            <w:r>
+              <w:rPr>
+                <w:lang w:val="en-US"/>
+              </w:rPr>
+              <w:t>[p]</w:t>
+            </w:r>
+            <w:proofErr w:type="spellStart"/>
+            <w:r>
+              <w:rPr>
+                <w:lang w:val="en-US"/>
+              </w:rPr>
+              <w:t>JOYSTORE</w:t>
+            </w:r>
+            <w:proofErr w:type="spellEnd"/>
+            <w:r>
+              <w:rPr>
+                <w:lang w:val="en-US"/>
+              </w:rPr>
+              <w:t xml:space="preserve"> </w:t>
+            </w:r>
+            <w:r>
+              <w:rPr>
+                <w:lang w:val="en-US"/>
+              </w:rPr>
+              <w:t>OWNER</w:t>
+            </w:r>
+          </w:p>
+          <w:p>
+            <w:pPr>
+              <w:rPr>
+                <w:lang w:val="en-US"/>
+              </w:rPr>
+            </w:pPr>
+          </w:p>
+        </w:tc>
+      </w:tr>
+      <w:tr>
+        <w:trPr>
+          <w:trHeight w:val="360"/>
+        </w:trPr>
+        <w:tc>
+          <w:tcPr>
+            <w:tcW w:w="3955" w:type="dxa"/>
+            <w:vAlign w:val="center"/>
+          </w:tcPr>
+          <w:p>
+            <w:pPr>
+              <w:rPr>
+                <w:b/>
+                <w:bCs/>
+                <w:lang w:val="en-US"/>
+              </w:rPr>
+            </w:pPr>
+          </w:p>
+          <w:p>
+            <w:pPr>
+              <w:rPr>
+                <w:lang w:val="en-US"/>
+              </w:rPr>
+            </w:pPr>
+            <w:r>
+              <w:rPr>
+                <w:b/>
+                <w:bCs/>
+                <w:lang w:val="en-US"/>
+              </w:rPr>
+              <w:t>Type</w:t>
+            </w:r>
+            <w:r>
+              <w:rPr>
+                <w:lang w:val="en-US"/>
+              </w:rPr>
+              <w:t>: Inbound</w:t>
+            </w:r>
+          </w:p>
+          <w:p>
+            <w:pPr>
+              <w:rPr>
+                <w:lang w:val="en-US"/>
+              </w:rPr>
+            </w:pPr>
+            <w:r>
+              <w:rPr>
+                <w:b/>
+                <w:bCs/>
+                <w:lang w:val="en-US"/>
+              </w:rPr>
+              <w:t>Sender Name</w:t>
+            </w:r>
+            <w:r>
+              <w:rPr>
+                <w:lang w:val="en-US"/>
+              </w:rPr>
+              <w:t xml:space="preserve">: </w:t>
+            </w:r>
+            <w:r>
+              <w:rPr>
+                <w:lang w:val="en-US"/>
+              </w:rPr>
+              <w:t>Mike</w:t>
+            </w:r>
+          </w:p>
+          <w:p>
+            <w:pPr>
+              <w:rPr>
+                <w:lang w:val="en-US"/>
+              </w:rPr>
+            </w:pPr>
+            <w:r>
+              <w:rPr>
+                <w:b/>
+                <w:bCs/>
+                <w:lang w:val="en-US"/>
+              </w:rPr>
+              <w:t>Sender Address</w:t>
+            </w:r>
+            <w:r>
+              <w:rPr>
+                <w:lang w:val="en-US"/>
+              </w:rPr>
+              <w:t xml:space="preserve">: </w:t>
+            </w:r>
+            <w:r>
+              <w:rPr>
+                <w:lang w:val="en-US"/>
+              </w:rPr>
+              <w:t>mike@abc.com.my</w:t>
+            </w:r>
+          </w:p>
+          <w:p>
+            <w:pPr>
+              <w:rPr>
+                <w:lang w:val="en-US"/>
+              </w:rPr>
+            </w:pPr>
+            <w:r>
+              <w:rPr>
+                <w:b/>
+                <w:bCs/>
+                <w:lang w:val="en-US"/>
+              </w:rPr>
+              <w:t>To Address</w:t>
+            </w:r>
+            <w:r>
+              <w:rPr>
+                <w:lang w:val="en-US"/>
+              </w:rPr>
+              <w:t>: {</w:t>
+            </w:r>
+            <w:proofErr w:type="spellStart"/>
+            <w:r>
+              <w:rPr>
+                <w:lang w:val="en-US"/>
+              </w:rPr>
+              <w:t>player_email</w:t>
+            </w:r>
+            <w:proofErr w:type="spellEnd"/>
+            <w:r>
+              <w:rPr>
+                <w:lang w:val="en-US"/>
+              </w:rPr>
+              <w:t>}</w:t>
+            </w:r>
+          </w:p>
+          <w:p>
+            <w:pPr>
+              <w:rPr>
+                <w:lang w:val="en-US"/>
+              </w:rPr>
+            </w:pPr>
+            <w:r>
+              <w:rPr>
+                <w:b/>
+                <w:bCs/>
+                <w:lang w:val="en-US"/>
+              </w:rPr>
+              <w:t>CC Address</w:t>
+            </w:r>
+            <w:r>
+              <w:rPr>
+                <w:lang w:val="en-US"/>
+              </w:rPr>
+              <w:t>:</w:t>
+            </w:r>
+            <w:r>
+              <w:rPr>
+                <w:lang w:val="en-US"/>
+              </w:rPr>
+              <w:t xml:space="preserve"> </w:t>
+            </w:r>
+          </w:p>
+          <w:p>
+            <w:pPr>
+              <w:rPr>
+                <w:lang w:val="en-US"/>
+              </w:rPr>
+            </w:pPr>
+            <w:r>
+              <w:rPr>
+                <w:b/>
+                <w:bCs/>
+                <w:lang w:val="en-US"/>
+              </w:rPr>
+              <w:t>Subject</w:t>
+            </w:r>
+            <w:r>
+              <w:rPr>
+                <w:lang w:val="en-US"/>
+              </w:rPr>
+              <w:t xml:space="preserve">: </w:t>
+            </w:r>
+            <w:r>
+              <w:rPr>
+                <w:lang w:val="en-US"/>
+              </w:rPr>
+              <w:t xml:space="preserve">Daily </w:t>
+            </w:r>
+            <w:r>
+              <w:rPr>
+                <w:lang w:val="en-US"/>
+              </w:rPr>
+              <w:t>New Purchase Orders</w:t>
+            </w:r>
+          </w:p>
+          <w:p>
+            <w:pPr>
+              <w:rPr>
+                <w:b/>
+                <w:bCs/>
+                <w:lang w:val="en-US"/>
+              </w:rPr>
+            </w:pPr>
+          </w:p>
+        </w:tc>
+        <w:tc>
+          <w:tcPr>
+            <w:tcW w:w="5061" w:type="dxa"/>
+            <w:vAlign w:val="center"/>
+          </w:tcPr>
+          <w:p>
+            <w:pPr>
+              <w:rPr>
+                <w:lang w:val="en-US"/>
+              </w:rPr>
+            </w:pPr>
+          </w:p>
+          <w:p>
+            <w:pPr>
+              <w:rPr>
+                <w:lang w:val="en-US"/>
+              </w:rPr>
+            </w:pPr>
+            <w:r>
+              <w:rPr>
+                <w:lang w:val="en-US"/>
+              </w:rPr>
+              <w:t>Good afternoon, {</w:t>
+            </w:r>
+            <w:proofErr w:type="spellStart"/>
+            <w:r>
+              <w:rPr>
+                <w:lang w:val="en-US"/>
+              </w:rPr>
+              <w:t>player_name</w:t>
+            </w:r>
+            <w:proofErr w:type="spellEnd"/>
+            <w:r>
+              <w:rPr>
+                <w:lang w:val="en-US"/>
+              </w:rPr>
+              <w:t>}!</w:t>
+            </w:r>
+          </w:p>
+          <w:p>
+            <w:pPr>
+              <w:rPr>
+                <w:lang w:val="en-US"/>
+              </w:rPr>
+            </w:pPr>
+            <w:r>
+              <w:rPr>
+                <w:lang w:val="en-US"/>
+              </w:rPr>
+              <w:t xml:space="preserve">[p] </w:t>
+            </w:r>
+          </w:p>
+          <w:p>
+            <w:pPr>
+              <w:rPr>
+                <w:lang w:val="en-US"/>
+              </w:rPr>
+            </w:pPr>
+            <w:r>
+              <w:rPr>
+                <w:lang w:val="en-US"/>
+              </w:rPr>
+              <w:t xml:space="preserve">[p]I heard about the ransomware attacks </w:t>
+            </w:r>
+            <w:r>
+              <w:rPr>
+                <w:lang w:val="en-US"/>
+              </w:rPr>
+              <w:t>happening lately. You’ve got to take your time, read through the addresses and files before committing any actions.</w:t>
+            </w:r>
+            <w:r>
+              <w:rPr>
+                <w:lang w:val="en-US"/>
+              </w:rPr>
+              <w:t xml:space="preserve"> </w:t>
+            </w:r>
+            <w:r>
+              <w:rPr>
+                <w:lang w:val="en-US"/>
+              </w:rPr>
+              <w:t>Slow and steady wins the race.</w:t>
+            </w:r>
+          </w:p>
+          <w:p>
+            <w:pPr>
+              <w:rPr>
+                <w:lang w:val="en-US"/>
+              </w:rPr>
+            </w:pPr>
+            <w:r>
+              <w:rPr>
+                <w:lang w:val="en-US"/>
+              </w:rPr>
+              <w:t xml:space="preserve">[p] </w:t>
+            </w:r>
+          </w:p>
+          <w:p>
+            <w:pPr>
+              <w:rPr>
+                <w:lang w:val="en-US"/>
+              </w:rPr>
+            </w:pPr>
+            <w:r>
+              <w:rPr>
+                <w:lang w:val="en-US"/>
+              </w:rPr>
+              <w:t>[p]</w:t>
+            </w:r>
+            <w:r>
+              <w:rPr>
+                <w:lang w:val="en-US"/>
+              </w:rPr>
+              <w:t>Anyway here are the purchase orders I’ve gathered today.</w:t>
+            </w:r>
+          </w:p>
+          <w:p>
+            <w:pPr>
+              <w:rPr>
+                <w:lang w:val="en-US"/>
+              </w:rPr>
+            </w:pPr>
+          </w:p>
+        </w:tc>
+      </w:tr>
+      <w:tr>
+        <w:trPr>
+          <w:trHeight w:val="360"/>
+        </w:trPr>
+        <w:tc>
+          <w:tcPr>
+            <w:tcW w:w="3955" w:type="dxa"/>
+            <w:vAlign w:val="center"/>
+          </w:tcPr>
+          <w:p>
+            <w:pPr>
+              <w:rPr>
+                <w:b/>
+                <w:bCs/>
+                <w:lang w:val="en-US"/>
+              </w:rPr>
+            </w:pPr>
+          </w:p>
+          <w:p>
+            <w:pPr>
+              <w:rPr>
+                <w:lang w:val="en-US"/>
+              </w:rPr>
+            </w:pPr>
+            <w:r>
+              <w:rPr>
+                <w:b/>
+                <w:bCs/>
+                <w:lang w:val="en-US"/>
+              </w:rPr>
+              <w:t>Type</w:t>
+            </w:r>
+            <w:r>
+              <w:rPr>
+                <w:lang w:val="en-US"/>
+              </w:rPr>
+              <w:t>: Inbound</w:t>
+            </w:r>
+          </w:p>
+          <w:p>
+            <w:pPr>
+              <w:rPr>
+                <w:lang w:val="en-US"/>
+              </w:rPr>
+            </w:pPr>
+            <w:r>
+              <w:rPr>
+                <w:b/>
+                <w:bCs/>
+                <w:lang w:val="en-US"/>
+              </w:rPr>
+              <w:t>Sender Name</w:t>
+            </w:r>
+            <w:r>
+              <w:rPr>
+                <w:lang w:val="en-US"/>
+              </w:rPr>
+              <w:t xml:space="preserve">: </w:t>
+            </w:r>
+            <w:r>
+              <w:rPr>
+                <w:lang w:val="en-US"/>
+              </w:rPr>
+              <w:t>Faiq Hazim</w:t>
+            </w:r>
+          </w:p>
+          <w:p>
+            <w:pPr>
+              <w:rPr>
+                <w:lang w:val="en-US"/>
+              </w:rPr>
+            </w:pPr>
+            <w:r>
+              <w:rPr>
+                <w:b/>
+                <w:bCs/>
+                <w:lang w:val="en-US"/>
+              </w:rPr>
+              <w:t>Sender Address</w:t>
+            </w:r>
+            <w:r>
+              <w:rPr>
+                <w:lang w:val="en-US"/>
+              </w:rPr>
+              <w:t xml:space="preserve">: </w:t>
+            </w:r>
+            <w:r>
+              <w:rPr>
+                <w:lang w:val="en-US"/>
+              </w:rPr>
+              <w:t>faiq@s</w:t>
+            </w:r>
+            <w:r>
+              <w:rPr>
+                <w:lang w:val="en-US"/>
+              </w:rPr>
+              <w:t>kcahaya</w:t>
+            </w:r>
+            <w:r>
+              <w:rPr>
+                <w:lang w:val="en-US"/>
+              </w:rPr>
+              <w:t>.com.my</w:t>
+            </w:r>
+          </w:p>
+          <w:p>
+            <w:pPr>
+              <w:rPr>
+                <w:lang w:val="en-US"/>
+              </w:rPr>
+            </w:pPr>
+            <w:r>
+              <w:rPr>
+                <w:b/>
+                <w:bCs/>
+                <w:lang w:val="en-US"/>
+              </w:rPr>
+              <w:t>To Address</w:t>
+            </w:r>
+            <w:r>
+              <w:rPr>
+                <w:lang w:val="en-US"/>
+              </w:rPr>
+              <w:t>: {</w:t>
+            </w:r>
+            <w:proofErr w:type="spellStart"/>
+            <w:r>
+              <w:rPr>
+                <w:lang w:val="en-US"/>
+              </w:rPr>
+              <w:t>player_email</w:t>
+            </w:r>
+            <w:proofErr w:type="spellEnd"/>
+            <w:r>
+              <w:rPr>
+                <w:lang w:val="en-US"/>
+              </w:rPr>
+              <w:t>}</w:t>
+            </w:r>
+          </w:p>
+          <w:p>
+            <w:pPr>
+              <w:rPr>
+                <w:lang w:val="en-US"/>
+              </w:rPr>
+            </w:pPr>
+            <w:r>
+              <w:rPr>
+                <w:b/>
+                <w:bCs/>
+                <w:lang w:val="en-US"/>
+              </w:rPr>
+              <w:t>CC Address</w:t>
+            </w:r>
+            <w:r>
+              <w:rPr>
+                <w:lang w:val="en-US"/>
+              </w:rPr>
+              <w:t>:</w:t>
+            </w:r>
+            <w:r>
+              <w:rPr>
+                <w:lang w:val="en-US"/>
+              </w:rPr>
+              <w:t xml:space="preserve"> </w:t>
+            </w:r>
+          </w:p>
+          <w:p>
+            <w:pPr>
+              <w:rPr>
+                <w:lang w:val="en-US"/>
+              </w:rPr>
+            </w:pPr>
+            <w:r>
+              <w:rPr>
+                <w:b/>
+                <w:bCs/>
+                <w:lang w:val="en-US"/>
+              </w:rPr>
+              <w:t>Subject</w:t>
+            </w:r>
+            <w:r>
+              <w:rPr>
+                <w:lang w:val="en-US"/>
+              </w:rPr>
+              <w:t xml:space="preserve">: </w:t>
+            </w:r>
+            <w:r>
+              <w:rPr>
+                <w:lang w:val="en-US"/>
+              </w:rPr>
+              <w:t>Sponsorship Request for School Opening Event</w:t>
+            </w:r>
+          </w:p>
+          <w:p>
+            <w:pPr>
+              <w:rPr>
+                <w:b/>
+                <w:bCs/>
+                <w:lang w:val="en-US"/>
+              </w:rPr>
+            </w:pPr>
+          </w:p>
+        </w:tc>
+        <w:tc>
+          <w:tcPr>
+            <w:tcW w:w="5061" w:type="dxa"/>
+            <w:vAlign w:val="center"/>
+          </w:tcPr>
+          <w:p>
+            <w:pPr>
+              <w:rPr>
+                <w:lang w:val="en-US"/>
+              </w:rPr>
+            </w:pPr>
+          </w:p>
+          <w:p>
+            <w:pPr>
+              <w:rPr>
+                <w:lang w:val="en-US"/>
+              </w:rPr>
+            </w:pPr>
+            <w:r>
+              <w:rPr>
+                <w:lang w:val="en-US"/>
+              </w:rPr>
+              <w:t>Dear Sir/Madam,</w:t>
+            </w:r>
+          </w:p>
+          <w:p>
+            <w:pPr>
+              <w:rPr>
+                <w:lang w:val="en-US"/>
+              </w:rPr>
+            </w:pPr>
+            <w:r>
+              <w:rPr>
+                <w:lang w:val="en-US"/>
+              </w:rPr>
+              <w:t xml:space="preserve">[p] </w:t>
+            </w:r>
+          </w:p>
+          <w:p>
+            <w:pPr>
+              <w:rPr>
+                <w:lang w:val="en-US"/>
+              </w:rPr>
+            </w:pPr>
+            <w:r>
+              <w:rPr>
+                <w:lang w:val="en-US"/>
+              </w:rPr>
+              <w:t xml:space="preserve">[p]My name is Faiq Hazim. I am a teacher from </w:t>
+            </w:r>
+            <w:proofErr w:type="spellStart"/>
+            <w:r>
+              <w:rPr>
+                <w:lang w:val="en-US"/>
+              </w:rPr>
+              <w:t>Sekolah</w:t>
+            </w:r>
+            <w:proofErr w:type="spellEnd"/>
+            <w:r>
+              <w:rPr>
+                <w:lang w:val="en-US"/>
+              </w:rPr>
+              <w:t xml:space="preserve"> </w:t>
+            </w:r>
+            <w:proofErr w:type="spellStart"/>
+            <w:r>
+              <w:rPr>
+                <w:lang w:val="en-US"/>
+              </w:rPr>
+              <w:t>Kebangsaan</w:t>
+            </w:r>
+            <w:proofErr w:type="spellEnd"/>
+            <w:r>
+              <w:rPr>
+                <w:lang w:val="en-US"/>
+              </w:rPr>
+              <w:t xml:space="preserve"> Cahaya. Our school is having a</w:t>
+            </w:r>
+            <w:r>
+              <w:rPr>
+                <w:lang w:val="en-US"/>
+              </w:rPr>
+              <w:t xml:space="preserve"> school starting </w:t>
+            </w:r>
+            <w:r>
+              <w:rPr>
+                <w:lang w:val="en-US"/>
+              </w:rPr>
+              <w:t xml:space="preserve">event and would like to request a sponsorship of school supplies. The supplies are intended to be distributed </w:t>
+            </w:r>
+            <w:r>
+              <w:rPr>
+                <w:lang w:val="en-US"/>
+              </w:rPr>
+              <w:t>among</w:t>
+            </w:r>
+            <w:r>
+              <w:rPr>
+                <w:lang w:val="en-US"/>
+              </w:rPr>
+              <w:t xml:space="preserve"> new students coming from families </w:t>
+            </w:r>
+            <w:r>
+              <w:rPr>
+                <w:lang w:val="en-US"/>
+              </w:rPr>
+              <w:t>facing</w:t>
+            </w:r>
+            <w:r>
+              <w:rPr>
+                <w:lang w:val="en-US"/>
+              </w:rPr>
+              <w:t xml:space="preserve"> financial hardship.</w:t>
+            </w:r>
+          </w:p>
+          <w:p>
+            <w:pPr>
+              <w:rPr>
+                <w:lang w:val="en-US"/>
+              </w:rPr>
+            </w:pPr>
+            <w:r>
+              <w:rPr>
+                <w:lang w:val="en-US"/>
+              </w:rPr>
+              <w:t xml:space="preserve">[p] </w:t>
+            </w:r>
+          </w:p>
+          <w:p>
+            <w:r>
+              <w:rPr>
+                <w:lang w:val="en-US"/>
+              </w:rPr>
+              <w:t xml:space="preserve">[p]The details are in the file attached. </w:t>
+            </w:r>
+            <w:r>
+              <w:t>I look forward to hearing your thoughts</w:t>
+            </w:r>
+            <w:r>
+              <w:t xml:space="preserve"> and please do not hesitate to contact me if there are any inquiries</w:t>
+            </w:r>
+            <w:r>
+              <w:t>.</w:t>
+            </w:r>
+          </w:p>
+          <w:p>
+            <w:pPr>
+              <w:rPr>
+                <w:lang w:val="en-US"/>
+              </w:rPr>
+            </w:pPr>
+            <w:r>
+              <w:rPr>
+                <w:lang w:val="en-US"/>
+              </w:rPr>
+              <w:t xml:space="preserve">[p] </w:t>
+            </w:r>
+          </w:p>
+          <w:p>
+            <w:pPr>
+              <w:rPr>
+                <w:lang w:val="en-US"/>
+              </w:rPr>
+            </w:pPr>
+            <w:r>
+              <w:rPr>
+                <w:lang w:val="en-US"/>
+              </w:rPr>
+              <w:t xml:space="preserve">[p] </w:t>
+            </w:r>
+          </w:p>
+          <w:p>
+            <w:pPr>
+              <w:rPr>
+                <w:lang w:val="en-US"/>
+              </w:rPr>
+            </w:pPr>
+            <w:r>
+              <w:rPr>
+                <w:lang w:val="en-US"/>
+              </w:rPr>
+              <w:t>[p]Sincerely,</w:t>
+            </w:r>
+          </w:p>
+          <w:p>
+            <w:pPr>
+              <w:rPr>
+                <w:lang w:val="en-US"/>
+              </w:rPr>
+            </w:pPr>
+            <w:r>
+              <w:rPr>
+                <w:lang w:val="en-US"/>
+              </w:rPr>
+              <w:t>[p]Faiq Hazim</w:t>
+            </w:r>
+          </w:p>
+          <w:p>
+            <w:pPr>
+              <w:rPr>
+                <w:lang w:val="en-US"/>
+              </w:rPr>
+            </w:pPr>
+          </w:p>
+        </w:tc>
+      </w:tr>
+      <w:tr>
+        <w:trPr>
+          <w:trHeight w:val="360"/>
+        </w:trPr>
+        <w:tc>
+          <w:tcPr>
+            <w:tcW w:w="3955" w:type="dxa"/>
+            <w:vAlign w:val="center"/>
+          </w:tcPr>
+          <w:p>
+            <w:pPr>
+              <w:rPr>
+                <w:b/>
+                <w:bCs/>
+                <w:lang w:val="en-US"/>
+              </w:rPr>
+            </w:pPr>
+          </w:p>
+          <w:p>
+            <w:pPr>
+              <w:rPr>
+                <w:lang w:val="en-US"/>
+              </w:rPr>
+            </w:pPr>
+            <w:r>
+              <w:rPr>
+                <w:b/>
+                <w:bCs/>
+                <w:lang w:val="en-US"/>
+              </w:rPr>
+              <w:t>Type</w:t>
+            </w:r>
+            <w:r>
+              <w:rPr>
+                <w:lang w:val="en-US"/>
+              </w:rPr>
+              <w:t xml:space="preserve">: </w:t>
+            </w:r>
+            <w:r>
+              <w:rPr>
+                <w:lang w:val="en-US"/>
+              </w:rPr>
+              <w:t>Message</w:t>
+            </w:r>
+          </w:p>
+          <w:p>
+            <w:pPr>
+              <w:rPr>
+                <w:lang w:val="en-US"/>
+              </w:rPr>
+            </w:pPr>
+            <w:r>
+              <w:rPr>
+                <w:b/>
+                <w:bCs/>
+                <w:lang w:val="en-US"/>
+              </w:rPr>
+              <w:t>Sender Name</w:t>
+            </w:r>
+            <w:r>
+              <w:rPr>
+                <w:lang w:val="en-US"/>
+              </w:rPr>
+              <w:t xml:space="preserve">: </w:t>
+            </w:r>
+            <w:r>
+              <w:rPr>
+                <w:lang w:val="en-US"/>
+              </w:rPr>
+              <w:t xml:space="preserve">C17 </w:t>
+            </w:r>
+            <w:r>
+              <w:rPr>
+                <w:lang w:val="en-US"/>
+              </w:rPr>
+              <w:t>North</w:t>
+            </w:r>
+          </w:p>
+          <w:p>
+            <w:pPr>
+              <w:rPr>
+                <w:lang w:val="en-US"/>
+              </w:rPr>
+            </w:pPr>
+            <w:r>
+              <w:rPr>
+                <w:b/>
+                <w:bCs/>
+                <w:lang w:val="en-US"/>
+              </w:rPr>
+              <w:t>Sender Address</w:t>
+            </w:r>
+            <w:r>
+              <w:rPr>
+                <w:lang w:val="en-US"/>
+              </w:rPr>
+              <w:t xml:space="preserve">: </w:t>
+            </w:r>
+            <w:r>
+              <w:rPr>
+                <w:lang w:val="en-US"/>
+              </w:rPr>
+              <w:t>recruiting</w:t>
+            </w:r>
+            <w:r>
+              <w:rPr>
+                <w:lang w:val="en-US"/>
+              </w:rPr>
+              <w:t>.north</w:t>
+            </w:r>
+            <w:r>
+              <w:rPr>
+                <w:lang w:val="en-US"/>
+              </w:rPr>
+              <w:t>@c17.com</w:t>
+            </w:r>
+          </w:p>
+          <w:p>
+            <w:pPr>
+              <w:rPr>
+                <w:lang w:val="en-US"/>
+              </w:rPr>
+            </w:pPr>
+            <w:r>
+              <w:rPr>
+                <w:b/>
+                <w:bCs/>
+                <w:lang w:val="en-US"/>
+              </w:rPr>
+              <w:t>To Address</w:t>
+            </w:r>
+            <w:r>
+              <w:rPr>
+                <w:lang w:val="en-US"/>
+              </w:rPr>
+              <w:t>: {</w:t>
+            </w:r>
+            <w:proofErr w:type="spellStart"/>
+            <w:r>
+              <w:rPr>
+                <w:lang w:val="en-US"/>
+              </w:rPr>
+              <w:t>player_email</w:t>
+            </w:r>
+            <w:proofErr w:type="spellEnd"/>
+            <w:r>
+              <w:rPr>
+                <w:lang w:val="en-US"/>
+              </w:rPr>
+              <w:t>}</w:t>
+            </w:r>
+          </w:p>
+          <w:p>
+            <w:pPr>
+              <w:rPr>
+                <w:lang w:val="en-US"/>
+              </w:rPr>
+            </w:pPr>
+            <w:r>
+              <w:rPr>
+                <w:b/>
+                <w:bCs/>
+                <w:lang w:val="en-US"/>
+              </w:rPr>
+              <w:t>CC Address</w:t>
+            </w:r>
+            <w:r>
+              <w:rPr>
+                <w:lang w:val="en-US"/>
+              </w:rPr>
+              <w:t>:</w:t>
+            </w:r>
+            <w:r>
+              <w:rPr>
+                <w:lang w:val="en-US"/>
+              </w:rPr>
+              <w:t xml:space="preserve"> </w:t>
+            </w:r>
+          </w:p>
+          <w:p>
+            <w:pPr>
+              <w:rPr>
+                <w:lang w:val="en-US"/>
+              </w:rPr>
+            </w:pPr>
+            <w:r>
+              <w:rPr>
+                <w:b/>
+                <w:bCs/>
+                <w:lang w:val="en-US"/>
+              </w:rPr>
+              <w:lastRenderedPageBreak/>
+              <w:t>Subject</w:t>
+            </w:r>
+            <w:r>
+              <w:rPr>
+                <w:lang w:val="en-US"/>
+              </w:rPr>
+              <w:t xml:space="preserve">: </w:t>
+            </w:r>
+            <w:r>
+              <w:rPr>
+                <w:lang w:val="en-US"/>
+              </w:rPr>
+              <w:t>Join the C17 Family</w:t>
+            </w:r>
+          </w:p>
+          <w:p>
+            <w:pPr>
+              <w:rPr>
+                <w:b/>
+                <w:bCs/>
+                <w:lang w:val="en-US"/>
+              </w:rPr>
+            </w:pPr>
+          </w:p>
+        </w:tc>
+        <w:tc>
+          <w:tcPr>
+            <w:tcW w:w="5061" w:type="dxa"/>
+            <w:vAlign w:val="center"/>
+          </w:tcPr>
+          <w:p>
+            <w:pPr>
+              <w:rPr>
+                <w:lang w:val="en-US"/>
+              </w:rPr>
+            </w:pPr>
+            <w:r>
+              <w:rPr>
+                <w:lang w:val="en-US"/>
+              </w:rPr>
+              <w:lastRenderedPageBreak/>
+              <w:t>[center][</w:t>
+            </w:r>
+            <w:proofErr w:type="spellStart"/>
+            <w:r>
+              <w:rPr>
+                <w:lang w:val="en-US"/>
+              </w:rPr>
+              <w:t>img</w:t>
+            </w:r>
+            <w:proofErr w:type="spellEnd"/>
+            <w:r>
+              <w:rPr>
+                <w:lang w:val="en-US"/>
+              </w:rPr>
+              <w:t>=500x500</w:t>
+            </w:r>
+            <w:r>
+              <w:rPr>
+                <w:lang w:val="en-US"/>
+              </w:rPr>
+              <w:t>]assets/adware/??.</w:t>
+            </w:r>
+            <w:proofErr w:type="spellStart"/>
+            <w:r>
+              <w:rPr>
+                <w:lang w:val="en-US"/>
+              </w:rPr>
+              <w:t>png</w:t>
+            </w:r>
+            <w:proofErr w:type="spellEnd"/>
+            <w:r>
+              <w:rPr>
+                <w:lang w:val="en-US"/>
+              </w:rPr>
+              <w:t>[/</w:t>
+            </w:r>
+            <w:proofErr w:type="spellStart"/>
+            <w:r>
+              <w:rPr>
+                <w:lang w:val="en-US"/>
+              </w:rPr>
+              <w:t>img</w:t>
+            </w:r>
+            <w:proofErr w:type="spellEnd"/>
+            <w:r>
+              <w:rPr>
+                <w:lang w:val="en-US"/>
+              </w:rPr>
+              <w:t>][/center]</w:t>
+            </w:r>
+          </w:p>
+        </w:tc>
+      </w:tr>
+      <w:tr>
+        <w:trPr>
+          <w:trHeight w:val="360"/>
+        </w:trPr>
+        <w:tc>
+          <w:tcPr>
+            <w:tcW w:w="3955" w:type="dxa"/>
+            <w:vAlign w:val="center"/>
+          </w:tcPr>
+          <w:p>
+            <w:pPr>
+              <w:rPr>
+                <w:b/>
+                <w:bCs/>
+                <w:lang w:val="en-US"/>
+              </w:rPr>
+            </w:pPr>
+          </w:p>
+          <w:p>
+            <w:pPr>
+              <w:rPr>
+                <w:lang w:val="en-US"/>
+              </w:rPr>
+            </w:pPr>
+            <w:r>
+              <w:rPr>
+                <w:b/>
+                <w:bCs/>
+                <w:lang w:val="en-US"/>
+              </w:rPr>
+              <w:t>Type</w:t>
+            </w:r>
+            <w:r>
+              <w:rPr>
+                <w:lang w:val="en-US"/>
+              </w:rPr>
+              <w:t>: Inbound</w:t>
+            </w:r>
+          </w:p>
+          <w:p>
+            <w:pPr>
+              <w:rPr>
+                <w:lang w:val="en-US"/>
+              </w:rPr>
+            </w:pPr>
+            <w:r>
+              <w:rPr>
+                <w:b/>
+                <w:bCs/>
+                <w:lang w:val="en-US"/>
+              </w:rPr>
+              <w:t>Sender Name</w:t>
+            </w:r>
+            <w:r>
+              <w:rPr>
+                <w:lang w:val="en-US"/>
+              </w:rPr>
+              <w:t xml:space="preserve">: </w:t>
+            </w:r>
+            <w:r>
+              <w:rPr>
+                <w:lang w:val="en-US"/>
+              </w:rPr>
+              <w:t xml:space="preserve">Ceria Mall </w:t>
+            </w:r>
+            <w:r>
+              <w:rPr>
+                <w:lang w:val="en-US"/>
+              </w:rPr>
+              <w:t>Anthony</w:t>
+            </w:r>
+          </w:p>
+          <w:p>
+            <w:pPr>
+              <w:rPr>
+                <w:lang w:val="en-US"/>
+              </w:rPr>
+            </w:pPr>
+            <w:r>
+              <w:rPr>
+                <w:b/>
+                <w:bCs/>
+                <w:lang w:val="en-US"/>
+              </w:rPr>
+              <w:t>Sender Address</w:t>
+            </w:r>
+            <w:r>
+              <w:rPr>
+                <w:lang w:val="en-US"/>
+              </w:rPr>
+              <w:t xml:space="preserve">: </w:t>
+            </w:r>
+            <w:r>
+              <w:rPr>
+                <w:lang w:val="en-US"/>
+              </w:rPr>
+              <w:t>anth0ny41@email.com</w:t>
+            </w:r>
+          </w:p>
+          <w:p>
+            <w:pPr>
+              <w:rPr>
+                <w:lang w:val="en-US"/>
+              </w:rPr>
+            </w:pPr>
+            <w:r>
+              <w:rPr>
+                <w:b/>
+                <w:bCs/>
+                <w:lang w:val="en-US"/>
+              </w:rPr>
+              <w:t>To Address</w:t>
+            </w:r>
+            <w:r>
+              <w:rPr>
+                <w:lang w:val="en-US"/>
+              </w:rPr>
+              <w:t>: {</w:t>
+            </w:r>
+            <w:proofErr w:type="spellStart"/>
+            <w:r>
+              <w:rPr>
+                <w:lang w:val="en-US"/>
+              </w:rPr>
+              <w:t>player_email</w:t>
+            </w:r>
+            <w:proofErr w:type="spellEnd"/>
+            <w:r>
+              <w:rPr>
+                <w:lang w:val="en-US"/>
+              </w:rPr>
+              <w:t>}</w:t>
+            </w:r>
+          </w:p>
+          <w:p>
+            <w:pPr>
+              <w:rPr>
+                <w:lang w:val="en-US"/>
+              </w:rPr>
+            </w:pPr>
+            <w:r>
+              <w:rPr>
+                <w:b/>
+                <w:bCs/>
+                <w:lang w:val="en-US"/>
+              </w:rPr>
+              <w:t>CC Address</w:t>
+            </w:r>
+            <w:r>
+              <w:rPr>
+                <w:lang w:val="en-US"/>
+              </w:rPr>
+              <w:t>:</w:t>
+            </w:r>
+            <w:r>
+              <w:rPr>
+                <w:lang w:val="en-US"/>
+              </w:rPr>
+              <w:t xml:space="preserve"> </w:t>
+            </w:r>
+          </w:p>
+          <w:p>
+            <w:pPr>
+              <w:rPr>
+                <w:lang w:val="en-US"/>
+              </w:rPr>
+            </w:pPr>
+            <w:r>
+              <w:rPr>
+                <w:b/>
+                <w:bCs/>
+                <w:lang w:val="en-US"/>
+              </w:rPr>
+              <w:t>Subject</w:t>
+            </w:r>
+            <w:r>
+              <w:rPr>
+                <w:lang w:val="en-US"/>
+              </w:rPr>
+              <w:t xml:space="preserve">: </w:t>
+            </w:r>
+            <w:r>
+              <w:rPr>
+                <w:lang w:val="en-US"/>
+              </w:rPr>
+              <w:t>Ceria Mall Purchase Order</w:t>
+            </w:r>
+          </w:p>
+          <w:p>
+            <w:pPr>
+              <w:rPr>
+                <w:b/>
+                <w:bCs/>
+                <w:lang w:val="en-US"/>
+              </w:rPr>
+            </w:pPr>
+          </w:p>
+        </w:tc>
+        <w:tc>
+          <w:tcPr>
+            <w:tcW w:w="5061" w:type="dxa"/>
+            <w:vAlign w:val="center"/>
+          </w:tcPr>
+          <w:p>
+            <w:pPr>
+              <w:rPr>
+                <w:lang w:val="en-US"/>
+              </w:rPr>
+            </w:pPr>
+          </w:p>
+          <w:p>
+            <w:pPr>
+              <w:rPr>
+                <w:lang w:val="en-US"/>
+              </w:rPr>
+            </w:pPr>
+            <w:r>
+              <w:rPr>
+                <w:lang w:val="en-US"/>
+              </w:rPr>
+              <w:t>Hello, I’d like to place an order for a variety of office supplies for my company, Ceria Mall’s soon-to-be-opened latest branch.</w:t>
+            </w:r>
+          </w:p>
+          <w:p>
+            <w:pPr>
+              <w:rPr>
+                <w:lang w:val="en-US"/>
+              </w:rPr>
+            </w:pPr>
+            <w:r>
+              <w:rPr>
+                <w:lang w:val="en-US"/>
+              </w:rPr>
+              <w:t xml:space="preserve">[p] </w:t>
+            </w:r>
+          </w:p>
+          <w:p>
+            <w:pPr>
+              <w:rPr>
+                <w:lang w:val="en-US"/>
+              </w:rPr>
+            </w:pPr>
+            <w:r>
+              <w:rPr>
+                <w:lang w:val="en-US"/>
+              </w:rPr>
+              <w:t>[p]Please forward this email to the person-in-charge if you are not the intended recipient.</w:t>
+            </w:r>
+          </w:p>
+          <w:p>
+            <w:pPr>
+              <w:rPr>
+                <w:lang w:val="en-US"/>
+              </w:rPr>
+            </w:pPr>
+            <w:r>
+              <w:rPr>
+                <w:lang w:val="en-US"/>
+              </w:rPr>
+              <w:t xml:space="preserve">[p] </w:t>
+            </w:r>
+          </w:p>
+          <w:p>
+            <w:pPr>
+              <w:rPr>
+                <w:lang w:val="en-US"/>
+              </w:rPr>
+            </w:pPr>
+            <w:r>
+              <w:rPr>
+                <w:lang w:val="en-US"/>
+              </w:rPr>
+              <w:t xml:space="preserve">[p] </w:t>
+            </w:r>
+          </w:p>
+          <w:p>
+            <w:pPr>
+              <w:rPr>
+                <w:lang w:val="en-US"/>
+              </w:rPr>
+            </w:pPr>
+            <w:r>
+              <w:rPr>
+                <w:lang w:val="en-US"/>
+              </w:rPr>
+              <w:t>[p]Sincerely,</w:t>
+            </w:r>
+          </w:p>
+          <w:p>
+            <w:pPr>
+              <w:rPr>
+                <w:lang w:val="en-US"/>
+              </w:rPr>
+            </w:pPr>
+            <w:r>
+              <w:rPr>
+                <w:lang w:val="en-US"/>
+              </w:rPr>
+              <w:t>[p]Anthony, Ceria Mall Purchasing Officer</w:t>
+            </w:r>
+          </w:p>
+          <w:p>
+            <w:pPr>
+              <w:rPr>
+                <w:lang w:val="en-US"/>
+              </w:rPr>
+            </w:pPr>
+          </w:p>
+        </w:tc>
+      </w:tr>
+      <w:tr>
+        <w:trPr>
+          <w:trHeight w:val="360"/>
+        </w:trPr>
+        <w:tc>
+          <w:tcPr>
+            <w:tcW w:w="3955" w:type="dxa"/>
+            <w:vAlign w:val="center"/>
+          </w:tcPr>
+          <w:p>
+            <w:pPr>
+              <w:rPr>
+                <w:b/>
+                <w:bCs/>
+                <w:lang w:val="en-US"/>
+              </w:rPr>
+            </w:pPr>
+          </w:p>
+          <w:p>
+            <w:pPr>
+              <w:rPr>
+                <w:lang w:val="en-US"/>
+              </w:rPr>
+            </w:pPr>
+            <w:r>
+              <w:rPr>
+                <w:b/>
+                <w:bCs/>
+                <w:lang w:val="en-US"/>
+              </w:rPr>
+              <w:t>Type</w:t>
+            </w:r>
+            <w:r>
+              <w:rPr>
+                <w:lang w:val="en-US"/>
+              </w:rPr>
+              <w:t>: Inbound</w:t>
+            </w:r>
+          </w:p>
+          <w:p>
+            <w:pPr>
+              <w:rPr>
+                <w:lang w:val="en-US"/>
+              </w:rPr>
+            </w:pPr>
+            <w:r>
+              <w:rPr>
+                <w:b/>
+                <w:bCs/>
+                <w:lang w:val="en-US"/>
+              </w:rPr>
+              <w:t>Sender Name</w:t>
+            </w:r>
+            <w:r>
+              <w:rPr>
+                <w:lang w:val="en-US"/>
+              </w:rPr>
+              <w:t xml:space="preserve">: </w:t>
+            </w:r>
+            <w:r>
+              <w:rPr>
+                <w:lang w:val="en-US"/>
+              </w:rPr>
+              <w:t>Blake</w:t>
+            </w:r>
+          </w:p>
+          <w:p>
+            <w:pPr>
+              <w:rPr>
+                <w:lang w:val="en-US"/>
+              </w:rPr>
+            </w:pPr>
+            <w:r>
+              <w:rPr>
+                <w:b/>
+                <w:bCs/>
+                <w:lang w:val="en-US"/>
+              </w:rPr>
+              <w:t>Sender Address</w:t>
+            </w:r>
+            <w:r>
+              <w:rPr>
+                <w:lang w:val="en-US"/>
+              </w:rPr>
+              <w:t xml:space="preserve">: </w:t>
+            </w:r>
+            <w:r>
+              <w:rPr>
+                <w:lang w:val="en-US"/>
+              </w:rPr>
+              <w:t>bIake@abc.com.my</w:t>
+            </w:r>
+          </w:p>
+          <w:p>
+            <w:pPr>
+              <w:rPr>
+                <w:lang w:val="en-US"/>
+              </w:rPr>
+            </w:pPr>
+            <w:r>
+              <w:rPr>
+                <w:b/>
+                <w:bCs/>
+                <w:lang w:val="en-US"/>
+              </w:rPr>
+              <w:t>To Address</w:t>
+            </w:r>
+            <w:r>
+              <w:rPr>
+                <w:lang w:val="en-US"/>
+              </w:rPr>
+              <w:t>: {</w:t>
+            </w:r>
+            <w:proofErr w:type="spellStart"/>
+            <w:r>
+              <w:rPr>
+                <w:lang w:val="en-US"/>
+              </w:rPr>
+              <w:t>player_email</w:t>
+            </w:r>
+            <w:proofErr w:type="spellEnd"/>
+            <w:r>
+              <w:rPr>
+                <w:lang w:val="en-US"/>
+              </w:rPr>
+              <w:t>}</w:t>
+            </w:r>
+          </w:p>
+          <w:p>
+            <w:pPr>
+              <w:rPr>
+                <w:lang w:val="en-US"/>
+              </w:rPr>
+            </w:pPr>
+            <w:r>
+              <w:rPr>
+                <w:b/>
+                <w:bCs/>
+                <w:lang w:val="en-US"/>
+              </w:rPr>
+              <w:t>CC Address</w:t>
+            </w:r>
+            <w:r>
+              <w:rPr>
+                <w:lang w:val="en-US"/>
+              </w:rPr>
+              <w:t>:</w:t>
+            </w:r>
+            <w:r>
+              <w:rPr>
+                <w:lang w:val="en-US"/>
+              </w:rPr>
+              <w:t xml:space="preserve"> </w:t>
+            </w:r>
+          </w:p>
+          <w:p>
+            <w:pPr>
+              <w:rPr>
+                <w:lang w:val="en-US"/>
+              </w:rPr>
+            </w:pPr>
+            <w:r>
+              <w:rPr>
+                <w:b/>
+                <w:bCs/>
+                <w:lang w:val="en-US"/>
+              </w:rPr>
+              <w:t>Subject</w:t>
+            </w:r>
+            <w:r>
+              <w:rPr>
+                <w:lang w:val="en-US"/>
+              </w:rPr>
+              <w:t xml:space="preserve">: </w:t>
+            </w:r>
+            <w:r>
+              <w:rPr>
+                <w:lang w:val="en-US"/>
+              </w:rPr>
+              <w:t>You missed one PO</w:t>
+            </w:r>
+          </w:p>
+          <w:p>
+            <w:pPr>
+              <w:rPr>
+                <w:b/>
+                <w:bCs/>
+                <w:lang w:val="en-US"/>
+              </w:rPr>
+            </w:pPr>
+          </w:p>
+        </w:tc>
+        <w:tc>
+          <w:tcPr>
+            <w:tcW w:w="5061" w:type="dxa"/>
+            <w:vAlign w:val="center"/>
+          </w:tcPr>
+          <w:p>
+            <w:pPr>
+              <w:rPr>
+                <w:lang w:val="en-US"/>
+              </w:rPr>
+            </w:pPr>
+            <w:r>
+              <w:rPr>
+                <w:lang w:val="en-US"/>
+              </w:rPr>
+              <w:t>Hey {</w:t>
+            </w:r>
+            <w:proofErr w:type="spellStart"/>
+            <w:r>
+              <w:rPr>
+                <w:lang w:val="en-US"/>
+              </w:rPr>
+              <w:t>player_name</w:t>
+            </w:r>
+            <w:proofErr w:type="spellEnd"/>
+            <w:r>
+              <w:rPr>
+                <w:lang w:val="en-US"/>
+              </w:rPr>
+              <w:t>}!</w:t>
+            </w:r>
+          </w:p>
+          <w:p>
+            <w:pPr>
+              <w:rPr>
+                <w:lang w:val="en-US"/>
+              </w:rPr>
+            </w:pPr>
+            <w:r>
+              <w:rPr>
+                <w:lang w:val="en-US"/>
+              </w:rPr>
+              <w:t xml:space="preserve">[p] </w:t>
+            </w:r>
+          </w:p>
+          <w:p>
+            <w:pPr>
+              <w:rPr>
+                <w:lang w:val="en-US"/>
+              </w:rPr>
+            </w:pPr>
+            <w:r>
+              <w:rPr>
+                <w:lang w:val="en-US"/>
+              </w:rPr>
+              <w:t>[p]I received a purchase order from a client</w:t>
+            </w:r>
+            <w:r>
+              <w:rPr>
+                <w:lang w:val="en-US"/>
+              </w:rPr>
+              <w:t>. Please forward it to finance.</w:t>
+            </w:r>
+          </w:p>
+          <w:p>
+            <w:pPr>
+              <w:rPr>
+                <w:lang w:val="en-US"/>
+              </w:rPr>
+            </w:pPr>
+            <w:r>
+              <w:rPr>
+                <w:lang w:val="en-US"/>
+              </w:rPr>
+              <w:t xml:space="preserve">[p] </w:t>
+            </w:r>
+          </w:p>
+          <w:p>
+            <w:pPr>
+              <w:rPr>
+                <w:lang w:val="en-US"/>
+              </w:rPr>
+            </w:pPr>
+            <w:r>
+              <w:rPr>
+                <w:lang w:val="en-US"/>
+              </w:rPr>
+              <w:t xml:space="preserve">[p] </w:t>
+            </w:r>
+          </w:p>
+          <w:p>
+            <w:pPr>
+              <w:rPr>
+                <w:lang w:val="en-US"/>
+              </w:rPr>
+            </w:pPr>
+            <w:r>
+              <w:rPr>
+                <w:lang w:val="en-US"/>
+              </w:rPr>
+              <w:t>[p]-Blake</w:t>
+            </w:r>
           </w:p>
         </w:tc>
       </w:tr>

</xml_diff>

<commit_message>
Add: Counters for Email Based Consequences
- also unchecked is_phishing for jusco po on Tuesday.
</commit_message>
<xml_diff>
--- a/level design.docx
+++ b/level design.docx
@@ -3939,6 +3939,7 @@
                 <w:bCs/>
                 <w:lang w:val="en-US"/>
               </w:rPr>
+              <w:lastRenderedPageBreak/>
               <w:t>Subject</w:t>
             </w:r>
             <w:r>
@@ -4093,6 +4094,7 @@
               <w:rPr>
                 <w:lang w:val="en-US"/>
               </w:rPr>
+              <w:lastRenderedPageBreak/>
               <w:t>[p]</w:t>
             </w:r>
             <w:r>
@@ -4938,6 +4940,7 @@
           <w:bCs/>
           <w:lang w:val="en-US"/>
         </w:rPr>
+        <w:lastRenderedPageBreak/>
         <w:t>Tuesday</w:t>
       </w:r>
     </w:p>
@@ -6119,6 +6122,7 @@
               <w:rPr>
                 <w:lang w:val="en-US"/>
               </w:rPr>
+              <w:lastRenderedPageBreak/>
               <w:t xml:space="preserve">[p] </w:t>
             </w:r>
           </w:p>
@@ -7546,6 +7550,7 @@
                 <w:bCs/>
                 <w:lang w:val="en-US"/>
               </w:rPr>
+              <w:lastRenderedPageBreak/>
               <w:t>Sender Address</w:t>
             </w:r>
             <w:r>
@@ -7729,6 +7734,7 @@
               <w:rPr>
                 <w:lang w:val="en-US"/>
               </w:rPr>
+              <w:lastRenderedPageBreak/>
               <w:t>[p]Blue Pens = 100 units</w:t>
             </w:r>
           </w:p>
@@ -8525,6 +8531,7 @@
           <w:bCs/>
           <w:lang w:val="en-US"/>
         </w:rPr>
+        <w:lastRenderedPageBreak/>
         <w:t>Wednesday</w:t>
       </w:r>
     </w:p>
@@ -9974,6 +9981,7 @@
                 <w:bCs/>
                 <w:lang w:val="en-US"/>
               </w:rPr>
+              <w:lastRenderedPageBreak/>
               <w:t>Subject</w:t>
             </w:r>
             <w:r>
@@ -10093,6 +10101,7 @@
               <w:rPr>
                 <w:lang w:val="en-US"/>
               </w:rPr>
+              <w:lastRenderedPageBreak/>
               <w:t xml:space="preserve">[p] </w:t>
             </w:r>
           </w:p>
@@ -11330,7 +11339,6 @@
               <w:rPr>
                 <w:lang w:val="en-US"/>
               </w:rPr>
-              <w:lastRenderedPageBreak/>
               <w:t>[p]</w:t>
             </w:r>
             <w:proofErr w:type="gramStart"/>
@@ -12622,6 +12630,744 @@
               </w:rPr>
               <w:t xml:space="preserve"> in advance but it is rather urgent that the order is made first.</w:t>
             </w:r>
+          </w:p>
+        </w:tc>
+      </w:tr>
+    </w:tbl>
+    <w:p>
+      <w:pPr>
+        <w:rPr>
+          <w:lang w:val="en-US"/>
+        </w:rPr>
+      </w:pPr>
+    </w:p>
+    <w:p>
+      <w:pPr>
+        <w:rPr>
+          <w:lang w:val="en-US"/>
+        </w:rPr>
+      </w:pPr>
+      <w:r>
+        <w:rPr>
+          <w:lang w:val="en-US"/>
+        </w:rPr>
+        <w:br w:type="page"/>
+      </w:r>
+    </w:p>
+    <w:p>
+      <w:pPr>
+        <w:pStyle w:val="Heading1"/>
+        <w:rPr>
+          <w:b/>
+          <w:bCs/>
+          <w:lang w:val="en-US"/>
+        </w:rPr>
+      </w:pPr>
+      <w:r>
+        <w:rPr>
+          <w:b/>
+          <w:bCs/>
+          <w:lang w:val="en-US"/>
+        </w:rPr>
+        <w:lastRenderedPageBreak/>
+        <w:t>Special Event</w:t>
+      </w:r>
+    </w:p>
+    <w:tbl>
+      <w:tblPr>
+        <w:tblStyle w:val="TableGrid"/>
+        <w:tblW w:w="0" w:type="auto"/>
+        <w:tblLook w:val="04A0" w:firstRow="1" w:lastRow="0" w:firstColumn="1" w:lastColumn="0" w:noHBand="0" w:noVBand="1"/>
+      </w:tblPr>
+      <w:tblGrid>
+        <w:gridCol w:w="3955"/>
+        <w:gridCol w:w="5061"/>
+      </w:tblGrid>
+      <w:tr>
+        <w:trPr>
+          <w:trHeight w:val="360"/>
+        </w:trPr>
+        <w:tc>
+          <w:tcPr>
+            <w:tcW w:w="3955" w:type="dxa"/>
+            <w:vAlign w:val="center"/>
+          </w:tcPr>
+          <w:p>
+            <w:pPr>
+              <w:jc w:val="center"/>
+              <w:rPr>
+                <w:b/>
+                <w:bCs/>
+                <w:lang w:val="en-US"/>
+              </w:rPr>
+            </w:pPr>
+            <w:r>
+              <w:rPr>
+                <w:b/>
+                <w:bCs/>
+                <w:lang w:val="en-US"/>
+              </w:rPr>
+              <w:t>D</w:t>
+            </w:r>
+            <w:proofErr w:type="spellStart"/>
+            <w:r>
+              <w:rPr>
+                <w:b/>
+                <w:bCs/>
+              </w:rPr>
+              <w:t>etails</w:t>
+            </w:r>
+            <w:proofErr w:type="spellEnd"/>
+          </w:p>
+        </w:tc>
+        <w:tc>
+          <w:tcPr>
+            <w:tcW w:w="5061" w:type="dxa"/>
+            <w:vAlign w:val="center"/>
+          </w:tcPr>
+          <w:p>
+            <w:pPr>
+              <w:jc w:val="center"/>
+              <w:rPr>
+                <w:b/>
+                <w:bCs/>
+                <w:lang w:val="en-US"/>
+              </w:rPr>
+            </w:pPr>
+            <w:r>
+              <w:rPr>
+                <w:b/>
+                <w:bCs/>
+                <w:lang w:val="en-US"/>
+              </w:rPr>
+              <w:t>Event</w:t>
+            </w:r>
+          </w:p>
+        </w:tc>
+      </w:tr>
+      <w:tr>
+        <w:trPr>
+          <w:trHeight w:val="360"/>
+        </w:trPr>
+        <w:tc>
+          <w:tcPr>
+            <w:tcW w:w="3955" w:type="dxa"/>
+            <w:vAlign w:val="center"/>
+          </w:tcPr>
+          <w:p>
+            <w:pPr>
+              <w:rPr>
+                <w:b/>
+                <w:bCs/>
+                <w:lang w:val="en-US"/>
+              </w:rPr>
+            </w:pPr>
+          </w:p>
+          <w:p>
+            <w:pPr>
+              <w:rPr>
+                <w:lang w:val="en-US"/>
+              </w:rPr>
+            </w:pPr>
+            <w:r>
+              <w:rPr>
+                <w:b/>
+                <w:bCs/>
+                <w:lang w:val="en-US"/>
+              </w:rPr>
+              <w:t>Type</w:t>
+            </w:r>
+            <w:r>
+              <w:rPr>
+                <w:lang w:val="en-US"/>
+              </w:rPr>
+              <w:t>: Message</w:t>
+            </w:r>
+          </w:p>
+          <w:p>
+            <w:pPr>
+              <w:rPr>
+                <w:lang w:val="en-US"/>
+              </w:rPr>
+            </w:pPr>
+            <w:r>
+              <w:rPr>
+                <w:b/>
+                <w:bCs/>
+                <w:lang w:val="en-US"/>
+              </w:rPr>
+              <w:t>Sender Name</w:t>
+            </w:r>
+            <w:r>
+              <w:rPr>
+                <w:lang w:val="en-US"/>
+              </w:rPr>
+              <w:t xml:space="preserve">: </w:t>
+            </w:r>
+            <w:r>
+              <w:rPr>
+                <w:lang w:val="en-US"/>
+              </w:rPr>
+              <w:t>Blake</w:t>
+            </w:r>
+          </w:p>
+          <w:p>
+            <w:pPr>
+              <w:rPr>
+                <w:lang w:val="en-US"/>
+              </w:rPr>
+            </w:pPr>
+            <w:r>
+              <w:rPr>
+                <w:b/>
+                <w:bCs/>
+                <w:lang w:val="en-US"/>
+              </w:rPr>
+              <w:t>Sender Address</w:t>
+            </w:r>
+            <w:r>
+              <w:rPr>
+                <w:lang w:val="en-US"/>
+              </w:rPr>
+              <w:t xml:space="preserve">: </w:t>
+            </w:r>
+            <w:r>
+              <w:rPr>
+                <w:lang w:val="en-US"/>
+              </w:rPr>
+              <w:t>blake@abc.com.my</w:t>
+            </w:r>
+          </w:p>
+          <w:p>
+            <w:pPr>
+              <w:rPr>
+                <w:lang w:val="en-US"/>
+              </w:rPr>
+            </w:pPr>
+            <w:r>
+              <w:rPr>
+                <w:b/>
+                <w:bCs/>
+                <w:lang w:val="en-US"/>
+              </w:rPr>
+              <w:t>To Address</w:t>
+            </w:r>
+            <w:r>
+              <w:rPr>
+                <w:lang w:val="en-US"/>
+              </w:rPr>
+              <w:t>: {</w:t>
+            </w:r>
+            <w:proofErr w:type="spellStart"/>
+            <w:r>
+              <w:rPr>
+                <w:lang w:val="en-US"/>
+              </w:rPr>
+              <w:t>player_email</w:t>
+            </w:r>
+            <w:proofErr w:type="spellEnd"/>
+            <w:r>
+              <w:rPr>
+                <w:lang w:val="en-US"/>
+              </w:rPr>
+              <w:t>}</w:t>
+            </w:r>
+          </w:p>
+          <w:p>
+            <w:pPr>
+              <w:rPr>
+                <w:lang w:val="en-US"/>
+              </w:rPr>
+            </w:pPr>
+            <w:r>
+              <w:rPr>
+                <w:b/>
+                <w:bCs/>
+                <w:lang w:val="en-US"/>
+              </w:rPr>
+              <w:t>CC Address</w:t>
+            </w:r>
+            <w:r>
+              <w:rPr>
+                <w:lang w:val="en-US"/>
+              </w:rPr>
+              <w:t xml:space="preserve">: </w:t>
+            </w:r>
+          </w:p>
+          <w:p>
+            <w:pPr>
+              <w:rPr>
+                <w:lang w:val="en-US"/>
+              </w:rPr>
+            </w:pPr>
+            <w:r>
+              <w:rPr>
+                <w:b/>
+                <w:bCs/>
+                <w:lang w:val="en-US"/>
+              </w:rPr>
+              <w:t>Subject</w:t>
+            </w:r>
+            <w:r>
+              <w:rPr>
+                <w:lang w:val="en-US"/>
+              </w:rPr>
+              <w:t xml:space="preserve">: </w:t>
+            </w:r>
+            <w:r>
+              <w:rPr>
+                <w:lang w:val="en-US"/>
+              </w:rPr>
+              <w:t>Report Function Abuse Warning</w:t>
+            </w:r>
+          </w:p>
+          <w:p>
+            <w:pPr>
+              <w:rPr>
+                <w:lang w:val="en-US"/>
+              </w:rPr>
+            </w:pPr>
+          </w:p>
+        </w:tc>
+        <w:tc>
+          <w:tcPr>
+            <w:tcW w:w="5061" w:type="dxa"/>
+            <w:vAlign w:val="center"/>
+          </w:tcPr>
+          <w:p>
+            <w:pPr>
+              <w:rPr>
+                <w:lang w:val="en-US"/>
+              </w:rPr>
+            </w:pPr>
+          </w:p>
+          <w:p>
+            <w:pPr>
+              <w:rPr>
+                <w:lang w:val="en-US"/>
+              </w:rPr>
+            </w:pPr>
+            <w:r>
+              <w:rPr>
+                <w:lang w:val="en-US"/>
+              </w:rPr>
+              <w:t>Hey {</w:t>
+            </w:r>
+            <w:proofErr w:type="spellStart"/>
+            <w:r>
+              <w:rPr>
+                <w:lang w:val="en-US"/>
+              </w:rPr>
+              <w:t>player_</w:t>
+            </w:r>
+            <w:proofErr w:type="gramStart"/>
+            <w:r>
+              <w:rPr>
+                <w:lang w:val="en-US"/>
+              </w:rPr>
+              <w:t>name</w:t>
+            </w:r>
+            <w:proofErr w:type="spellEnd"/>
+            <w:r>
+              <w:rPr>
+                <w:lang w:val="en-US"/>
+              </w:rPr>
+              <w:t>}…</w:t>
+            </w:r>
+            <w:proofErr w:type="gramEnd"/>
+          </w:p>
+          <w:p>
+            <w:pPr>
+              <w:rPr>
+                <w:lang w:val="en-US"/>
+              </w:rPr>
+            </w:pPr>
+            <w:r>
+              <w:rPr>
+                <w:lang w:val="en-US"/>
+              </w:rPr>
+              <w:t xml:space="preserve">[p] </w:t>
+            </w:r>
+          </w:p>
+          <w:p>
+            <w:pPr>
+              <w:rPr>
+                <w:lang w:val="en-US"/>
+              </w:rPr>
+            </w:pPr>
+            <w:r>
+              <w:rPr>
+                <w:lang w:val="en-US"/>
+              </w:rPr>
+              <w:t xml:space="preserve">[p]I just clocked in and heard about you in the office… You were found to be reporting a lot of legitimate emails. HR told </w:t>
+            </w:r>
+            <w:proofErr w:type="gramStart"/>
+            <w:r>
+              <w:rPr>
+                <w:lang w:val="en-US"/>
+              </w:rPr>
+              <w:t>me,</w:t>
+            </w:r>
+            <w:proofErr w:type="gramEnd"/>
+            <w:r>
+              <w:rPr>
+                <w:lang w:val="en-US"/>
+              </w:rPr>
+              <w:t xml:space="preserve"> to tell you, this is the final warning before termination.</w:t>
+            </w:r>
+          </w:p>
+          <w:p>
+            <w:pPr>
+              <w:rPr>
+                <w:lang w:val="en-US"/>
+              </w:rPr>
+            </w:pPr>
+            <w:r>
+              <w:rPr>
+                <w:lang w:val="en-US"/>
+              </w:rPr>
+              <w:t xml:space="preserve">[p] </w:t>
+            </w:r>
+          </w:p>
+          <w:p>
+            <w:pPr>
+              <w:rPr>
+                <w:lang w:val="en-US"/>
+              </w:rPr>
+            </w:pPr>
+            <w:proofErr w:type="gramStart"/>
+            <w:r>
+              <w:rPr>
+                <w:lang w:val="en-US"/>
+              </w:rPr>
+              <w:t>[p]</w:t>
+            </w:r>
+            <w:proofErr w:type="gramEnd"/>
+            <w:r>
+              <w:rPr>
+                <w:lang w:val="en-US"/>
+              </w:rPr>
+              <w:t>Please follow the rules and report</w:t>
+            </w:r>
+            <w:r>
+              <w:rPr>
+                <w:lang w:val="en-US"/>
+              </w:rPr>
+              <w:t xml:space="preserve"> only</w:t>
+            </w:r>
+            <w:r>
+              <w:rPr>
+                <w:lang w:val="en-US"/>
+              </w:rPr>
+              <w:t xml:space="preserve"> phishing emails.</w:t>
+            </w:r>
+          </w:p>
+          <w:p>
+            <w:pPr>
+              <w:rPr>
+                <w:lang w:val="en-US"/>
+              </w:rPr>
+            </w:pPr>
+          </w:p>
+        </w:tc>
+      </w:tr>
+      <w:tr>
+        <w:trPr>
+          <w:trHeight w:val="360"/>
+        </w:trPr>
+        <w:tc>
+          <w:tcPr>
+            <w:tcW w:w="3955" w:type="dxa"/>
+            <w:vAlign w:val="center"/>
+          </w:tcPr>
+          <w:p>
+            <w:pPr>
+              <w:rPr>
+                <w:b/>
+                <w:bCs/>
+                <w:lang w:val="en-US"/>
+              </w:rPr>
+            </w:pPr>
+          </w:p>
+          <w:p>
+            <w:pPr>
+              <w:rPr>
+                <w:lang w:val="en-US"/>
+              </w:rPr>
+            </w:pPr>
+            <w:r>
+              <w:rPr>
+                <w:b/>
+                <w:bCs/>
+                <w:lang w:val="en-US"/>
+              </w:rPr>
+              <w:t>Type</w:t>
+            </w:r>
+            <w:r>
+              <w:rPr>
+                <w:lang w:val="en-US"/>
+              </w:rPr>
+              <w:t>: Message</w:t>
+            </w:r>
+          </w:p>
+          <w:p>
+            <w:pPr>
+              <w:rPr>
+                <w:lang w:val="en-US"/>
+              </w:rPr>
+            </w:pPr>
+            <w:r>
+              <w:rPr>
+                <w:b/>
+                <w:bCs/>
+                <w:lang w:val="en-US"/>
+              </w:rPr>
+              <w:t>Sender Name</w:t>
+            </w:r>
+            <w:r>
+              <w:rPr>
+                <w:lang w:val="en-US"/>
+              </w:rPr>
+              <w:t xml:space="preserve">: </w:t>
+            </w:r>
+            <w:r>
+              <w:rPr>
+                <w:lang w:val="en-US"/>
+              </w:rPr>
+              <w:t>ABC Human Resources</w:t>
+            </w:r>
+          </w:p>
+          <w:p>
+            <w:pPr>
+              <w:rPr>
+                <w:lang w:val="en-US"/>
+              </w:rPr>
+            </w:pPr>
+            <w:r>
+              <w:rPr>
+                <w:b/>
+                <w:bCs/>
+                <w:lang w:val="en-US"/>
+              </w:rPr>
+              <w:t>Sender Address</w:t>
+            </w:r>
+            <w:r>
+              <w:rPr>
+                <w:lang w:val="en-US"/>
+              </w:rPr>
+              <w:t xml:space="preserve">: </w:t>
+            </w:r>
+            <w:r>
+              <w:rPr>
+                <w:lang w:val="en-US"/>
+              </w:rPr>
+              <w:t>hr@abc.com.my</w:t>
+            </w:r>
+          </w:p>
+          <w:p>
+            <w:pPr>
+              <w:rPr>
+                <w:lang w:val="en-US"/>
+              </w:rPr>
+            </w:pPr>
+            <w:r>
+              <w:rPr>
+                <w:b/>
+                <w:bCs/>
+                <w:lang w:val="en-US"/>
+              </w:rPr>
+              <w:t>To Address</w:t>
+            </w:r>
+            <w:r>
+              <w:rPr>
+                <w:lang w:val="en-US"/>
+              </w:rPr>
+              <w:t>: {</w:t>
+            </w:r>
+            <w:proofErr w:type="spellStart"/>
+            <w:r>
+              <w:rPr>
+                <w:lang w:val="en-US"/>
+              </w:rPr>
+              <w:t>player_email</w:t>
+            </w:r>
+            <w:proofErr w:type="spellEnd"/>
+            <w:r>
+              <w:rPr>
+                <w:lang w:val="en-US"/>
+              </w:rPr>
+              <w:t>}</w:t>
+            </w:r>
+          </w:p>
+          <w:p>
+            <w:pPr>
+              <w:rPr>
+                <w:lang w:val="en-US"/>
+              </w:rPr>
+            </w:pPr>
+            <w:r>
+              <w:rPr>
+                <w:b/>
+                <w:bCs/>
+                <w:lang w:val="en-US"/>
+              </w:rPr>
+              <w:t>CC Address</w:t>
+            </w:r>
+            <w:r>
+              <w:rPr>
+                <w:lang w:val="en-US"/>
+              </w:rPr>
+              <w:t xml:space="preserve">: </w:t>
+            </w:r>
+          </w:p>
+          <w:p>
+            <w:pPr>
+              <w:rPr>
+                <w:lang w:val="en-US"/>
+              </w:rPr>
+            </w:pPr>
+            <w:r>
+              <w:rPr>
+                <w:b/>
+                <w:bCs/>
+                <w:lang w:val="en-US"/>
+              </w:rPr>
+              <w:t>Subject</w:t>
+            </w:r>
+            <w:r>
+              <w:rPr>
+                <w:lang w:val="en-US"/>
+              </w:rPr>
+              <w:t xml:space="preserve">: </w:t>
+            </w:r>
+            <w:r>
+              <w:rPr>
+                <w:lang w:val="en-US"/>
+              </w:rPr>
+              <w:t>Employee Termination Notice</w:t>
+            </w:r>
+          </w:p>
+          <w:p>
+            <w:pPr>
+              <w:rPr>
+                <w:b/>
+                <w:bCs/>
+                <w:lang w:val="en-US"/>
+              </w:rPr>
+            </w:pPr>
+          </w:p>
+        </w:tc>
+        <w:tc>
+          <w:tcPr>
+            <w:tcW w:w="5061" w:type="dxa"/>
+            <w:vAlign w:val="center"/>
+          </w:tcPr>
+          <w:p>
+            <w:pPr>
+              <w:rPr>
+                <w:lang w:val="en-US"/>
+              </w:rPr>
+            </w:pPr>
+          </w:p>
+          <w:p>
+            <w:pPr>
+              <w:rPr>
+                <w:lang w:val="en-US"/>
+              </w:rPr>
+            </w:pPr>
+            <w:r>
+              <w:rPr>
+                <w:lang w:val="en-US"/>
+              </w:rPr>
+              <w:t>Dear Employee {</w:t>
+            </w:r>
+            <w:proofErr w:type="spellStart"/>
+            <w:r>
+              <w:rPr>
+                <w:lang w:val="en-US"/>
+              </w:rPr>
+              <w:t>player_name</w:t>
+            </w:r>
+            <w:proofErr w:type="spellEnd"/>
+            <w:r>
+              <w:rPr>
+                <w:lang w:val="en-US"/>
+              </w:rPr>
+              <w:t>},</w:t>
+            </w:r>
+          </w:p>
+          <w:p>
+            <w:pPr>
+              <w:rPr>
+                <w:lang w:val="en-US"/>
+              </w:rPr>
+            </w:pPr>
+            <w:r>
+              <w:rPr>
+                <w:lang w:val="en-US"/>
+              </w:rPr>
+              <w:t xml:space="preserve">[p] </w:t>
+            </w:r>
+          </w:p>
+          <w:p>
+            <w:pPr>
+              <w:rPr>
+                <w:lang w:val="en-US"/>
+              </w:rPr>
+            </w:pPr>
+            <w:r>
+              <w:rPr>
+                <w:lang w:val="en-US"/>
+              </w:rPr>
+              <w:t>[p]</w:t>
+            </w:r>
+            <w:r>
+              <w:rPr>
+                <w:lang w:val="en-US"/>
+              </w:rPr>
+              <w:t>After careful consideration, the company has deemed you a liability in its daily operations and has decided to terminate your position.</w:t>
+            </w:r>
+          </w:p>
+          <w:p>
+            <w:pPr>
+              <w:rPr>
+                <w:lang w:val="en-US"/>
+              </w:rPr>
+            </w:pPr>
+            <w:r>
+              <w:rPr>
+                <w:lang w:val="en-US"/>
+              </w:rPr>
+              <w:t xml:space="preserve">[p] </w:t>
+            </w:r>
+          </w:p>
+          <w:p>
+            <w:pPr>
+              <w:rPr>
+                <w:lang w:val="en-US"/>
+              </w:rPr>
+            </w:pPr>
+            <w:proofErr w:type="gramStart"/>
+            <w:r>
+              <w:rPr>
+                <w:lang w:val="en-US"/>
+              </w:rPr>
+              <w:t>[p]</w:t>
+            </w:r>
+            <w:proofErr w:type="gramEnd"/>
+            <w:r>
+              <w:rPr>
+                <w:lang w:val="en-US"/>
+              </w:rPr>
+              <w:t>Please gather your belongings and leave the company premises upon finish reading this email.</w:t>
+            </w:r>
+          </w:p>
+          <w:p>
+            <w:pPr>
+              <w:rPr>
+                <w:lang w:val="en-US"/>
+              </w:rPr>
+            </w:pPr>
           </w:p>
         </w:tc>
       </w:tr>

</xml_diff>

<commit_message>
Level Design Progress: Thursday
</commit_message>
<xml_diff>
--- a/level design.docx
+++ b/level design.docx
@@ -15962,6 +15962,484 @@
               <w:t xml:space="preserve"> huh?</w:t>
             </w:r>
           </w:p>
+          <w:p>
+            <w:pPr>
+              <w:rPr>
+                <w:lang w:val="en-US"/>
+              </w:rPr>
+            </w:pPr>
+          </w:p>
+        </w:tc>
+      </w:tr>
+    </w:tbl>
+    <w:p>
+      <w:pPr>
+        <w:rPr>
+          <w:lang w:val="en-US"/>
+        </w:rPr>
+      </w:pPr>
+    </w:p>
+    <w:p>
+      <w:pPr>
+        <w:pStyle w:val="Heading1"/>
+        <w:rPr>
+          <w:b/>
+          <w:bCs/>
+          <w:lang w:val="en-US"/>
+        </w:rPr>
+      </w:pPr>
+      <w:r>
+        <w:rPr>
+          <w:b/>
+          <w:bCs/>
+          <w:lang w:val="en-US"/>
+        </w:rPr>
+        <w:t>Friday</w:t>
+      </w:r>
+    </w:p>
+    <w:tbl>
+      <w:tblPr>
+        <w:tblStyle w:val="TableGrid"/>
+        <w:tblW w:w="0" w:type="auto"/>
+        <w:tblLook w:val="04A0" w:firstRow="1" w:lastRow="0" w:firstColumn="1" w:lastColumn="0" w:noHBand="0" w:noVBand="1"/>
+      </w:tblPr>
+      <w:tblGrid>
+        <w:gridCol w:w="3955"/>
+        <w:gridCol w:w="5061"/>
+      </w:tblGrid>
+      <w:tr>
+        <w:trPr>
+          <w:trHeight w:val="360"/>
+        </w:trPr>
+        <w:tc>
+          <w:tcPr>
+            <w:tcW w:w="3955" w:type="dxa"/>
+            <w:vAlign w:val="center"/>
+          </w:tcPr>
+          <w:p>
+            <w:pPr>
+              <w:jc w:val="center"/>
+              <w:rPr>
+                <w:b/>
+                <w:bCs/>
+                <w:lang w:val="en-US"/>
+              </w:rPr>
+            </w:pPr>
+            <w:r>
+              <w:rPr>
+                <w:b/>
+                <w:bCs/>
+                <w:lang w:val="en-US"/>
+              </w:rPr>
+              <w:t>D</w:t>
+            </w:r>
+            <w:proofErr w:type="spellStart"/>
+            <w:r>
+              <w:rPr>
+                <w:b/>
+                <w:bCs/>
+              </w:rPr>
+              <w:t>etails</w:t>
+            </w:r>
+            <w:proofErr w:type="spellEnd"/>
+          </w:p>
+        </w:tc>
+        <w:tc>
+          <w:tcPr>
+            <w:tcW w:w="5061" w:type="dxa"/>
+            <w:vAlign w:val="center"/>
+          </w:tcPr>
+          <w:p>
+            <w:pPr>
+              <w:jc w:val="center"/>
+              <w:rPr>
+                <w:b/>
+                <w:bCs/>
+                <w:lang w:val="en-US"/>
+              </w:rPr>
+            </w:pPr>
+            <w:r>
+              <w:rPr>
+                <w:b/>
+                <w:bCs/>
+                <w:lang w:val="en-US"/>
+              </w:rPr>
+              <w:t>Friday</w:t>
+            </w:r>
+          </w:p>
+        </w:tc>
+      </w:tr>
+      <w:tr>
+        <w:trPr>
+          <w:trHeight w:val="360"/>
+        </w:trPr>
+        <w:tc>
+          <w:tcPr>
+            <w:tcW w:w="3955" w:type="dxa"/>
+            <w:vAlign w:val="center"/>
+          </w:tcPr>
+          <w:p>
+            <w:pPr>
+              <w:rPr>
+                <w:b/>
+                <w:bCs/>
+                <w:lang w:val="en-US"/>
+              </w:rPr>
+            </w:pPr>
+          </w:p>
+          <w:p>
+            <w:pPr>
+              <w:rPr>
+                <w:lang w:val="en-US"/>
+              </w:rPr>
+            </w:pPr>
+            <w:r>
+              <w:rPr>
+                <w:b/>
+                <w:bCs/>
+                <w:lang w:val="en-US"/>
+              </w:rPr>
+              <w:t>Type</w:t>
+            </w:r>
+            <w:r>
+              <w:rPr>
+                <w:lang w:val="en-US"/>
+              </w:rPr>
+              <w:t>: Message</w:t>
+            </w:r>
+          </w:p>
+          <w:p>
+            <w:pPr>
+              <w:rPr>
+                <w:lang w:val="en-US"/>
+              </w:rPr>
+            </w:pPr>
+            <w:r>
+              <w:rPr>
+                <w:b/>
+                <w:bCs/>
+                <w:lang w:val="en-US"/>
+              </w:rPr>
+              <w:t>Sender Name</w:t>
+            </w:r>
+            <w:r>
+              <w:rPr>
+                <w:lang w:val="en-US"/>
+              </w:rPr>
+              <w:t xml:space="preserve">: </w:t>
+            </w:r>
+            <w:r>
+              <w:rPr>
+                <w:lang w:val="en-US"/>
+              </w:rPr>
+              <w:t>Blake</w:t>
+            </w:r>
+          </w:p>
+          <w:p>
+            <w:pPr>
+              <w:rPr>
+                <w:lang w:val="en-US"/>
+              </w:rPr>
+            </w:pPr>
+            <w:r>
+              <w:rPr>
+                <w:b/>
+                <w:bCs/>
+                <w:lang w:val="en-US"/>
+              </w:rPr>
+              <w:t>Sender Address</w:t>
+            </w:r>
+            <w:r>
+              <w:rPr>
+                <w:lang w:val="en-US"/>
+              </w:rPr>
+              <w:t xml:space="preserve">: </w:t>
+            </w:r>
+            <w:r>
+              <w:rPr>
+                <w:lang w:val="en-US"/>
+              </w:rPr>
+              <w:t>blake@abc.com.my</w:t>
+            </w:r>
+          </w:p>
+          <w:p>
+            <w:pPr>
+              <w:rPr>
+                <w:lang w:val="en-US"/>
+              </w:rPr>
+            </w:pPr>
+            <w:r>
+              <w:rPr>
+                <w:b/>
+                <w:bCs/>
+                <w:lang w:val="en-US"/>
+              </w:rPr>
+              <w:t>To Address</w:t>
+            </w:r>
+            <w:r>
+              <w:rPr>
+                <w:lang w:val="en-US"/>
+              </w:rPr>
+              <w:t>: {</w:t>
+            </w:r>
+            <w:proofErr w:type="spellStart"/>
+            <w:r>
+              <w:rPr>
+                <w:lang w:val="en-US"/>
+              </w:rPr>
+              <w:t>player_email</w:t>
+            </w:r>
+            <w:proofErr w:type="spellEnd"/>
+            <w:r>
+              <w:rPr>
+                <w:lang w:val="en-US"/>
+              </w:rPr>
+              <w:t>}</w:t>
+            </w:r>
+          </w:p>
+          <w:p>
+            <w:pPr>
+              <w:rPr>
+                <w:lang w:val="en-US"/>
+              </w:rPr>
+            </w:pPr>
+            <w:r>
+              <w:rPr>
+                <w:b/>
+                <w:bCs/>
+                <w:lang w:val="en-US"/>
+              </w:rPr>
+              <w:t>CC Address</w:t>
+            </w:r>
+            <w:r>
+              <w:rPr>
+                <w:lang w:val="en-US"/>
+              </w:rPr>
+              <w:t xml:space="preserve">: </w:t>
+            </w:r>
+          </w:p>
+          <w:p>
+            <w:pPr>
+              <w:rPr>
+                <w:lang w:val="en-US"/>
+              </w:rPr>
+            </w:pPr>
+            <w:r>
+              <w:rPr>
+                <w:b/>
+                <w:bCs/>
+                <w:lang w:val="en-US"/>
+              </w:rPr>
+              <w:t>Subject</w:t>
+            </w:r>
+            <w:r>
+              <w:rPr>
+                <w:lang w:val="en-US"/>
+              </w:rPr>
+              <w:t xml:space="preserve">: </w:t>
+            </w:r>
+            <w:r>
+              <w:rPr>
+                <w:lang w:val="en-US"/>
+              </w:rPr>
+              <w:t>Report Function Abuse Warning</w:t>
+            </w:r>
+          </w:p>
+          <w:p>
+            <w:pPr>
+              <w:rPr>
+                <w:lang w:val="en-US"/>
+              </w:rPr>
+            </w:pPr>
+          </w:p>
+        </w:tc>
+        <w:tc>
+          <w:tcPr>
+            <w:tcW w:w="5061" w:type="dxa"/>
+            <w:vAlign w:val="center"/>
+          </w:tcPr>
+          <w:p>
+            <w:pPr>
+              <w:rPr>
+                <w:lang w:val="en-US"/>
+              </w:rPr>
+            </w:pPr>
+          </w:p>
+          <w:p>
+            <w:pPr>
+              <w:rPr>
+                <w:lang w:val="en-US"/>
+              </w:rPr>
+            </w:pPr>
+            <w:r>
+              <w:rPr>
+                <w:lang w:val="en-US"/>
+              </w:rPr>
+              <w:t>Hey {</w:t>
+            </w:r>
+            <w:proofErr w:type="spellStart"/>
+            <w:r>
+              <w:rPr>
+                <w:lang w:val="en-US"/>
+              </w:rPr>
+              <w:t>player_</w:t>
+            </w:r>
+            <w:proofErr w:type="gramStart"/>
+            <w:r>
+              <w:rPr>
+                <w:lang w:val="en-US"/>
+              </w:rPr>
+              <w:t>name</w:t>
+            </w:r>
+            <w:proofErr w:type="spellEnd"/>
+            <w:r>
+              <w:rPr>
+                <w:lang w:val="en-US"/>
+              </w:rPr>
+              <w:t>}…</w:t>
+            </w:r>
+            <w:proofErr w:type="gramEnd"/>
+          </w:p>
+          <w:p>
+            <w:pPr>
+              <w:rPr>
+                <w:lang w:val="en-US"/>
+              </w:rPr>
+            </w:pPr>
+            <w:r>
+              <w:rPr>
+                <w:lang w:val="en-US"/>
+              </w:rPr>
+              <w:t xml:space="preserve">[p] </w:t>
+            </w:r>
+          </w:p>
+          <w:p>
+            <w:pPr>
+              <w:rPr>
+                <w:lang w:val="en-US"/>
+              </w:rPr>
+            </w:pPr>
+            <w:r>
+              <w:rPr>
+                <w:lang w:val="en-US"/>
+              </w:rPr>
+              <w:t xml:space="preserve">[p]I just clocked in and heard about you in the office… You were found to be reporting a lot of legitimate emails. HR told </w:t>
+            </w:r>
+            <w:proofErr w:type="gramStart"/>
+            <w:r>
+              <w:rPr>
+                <w:lang w:val="en-US"/>
+              </w:rPr>
+              <w:t>me,</w:t>
+            </w:r>
+            <w:proofErr w:type="gramEnd"/>
+            <w:r>
+              <w:rPr>
+                <w:lang w:val="en-US"/>
+              </w:rPr>
+              <w:t xml:space="preserve"> to tell you, this is the final warning before termination.</w:t>
+            </w:r>
+          </w:p>
+          <w:p>
+            <w:pPr>
+              <w:rPr>
+                <w:lang w:val="en-US"/>
+              </w:rPr>
+            </w:pPr>
+            <w:r>
+              <w:rPr>
+                <w:lang w:val="en-US"/>
+              </w:rPr>
+              <w:t xml:space="preserve">[p] </w:t>
+            </w:r>
+          </w:p>
+          <w:p>
+            <w:pPr>
+              <w:rPr>
+                <w:lang w:val="en-US"/>
+              </w:rPr>
+            </w:pPr>
+            <w:proofErr w:type="gramStart"/>
+            <w:r>
+              <w:rPr>
+                <w:lang w:val="en-US"/>
+              </w:rPr>
+              <w:t>[p]</w:t>
+            </w:r>
+            <w:proofErr w:type="gramEnd"/>
+            <w:r>
+              <w:rPr>
+                <w:lang w:val="en-US"/>
+              </w:rPr>
+              <w:t>Please follow the rules and report only phishing emails.</w:t>
+            </w:r>
+          </w:p>
+          <w:p>
+            <w:pPr>
+              <w:rPr>
+                <w:lang w:val="en-US"/>
+              </w:rPr>
+            </w:pPr>
+          </w:p>
+        </w:tc>
+      </w:tr>
+      <w:tr>
+        <w:trPr>
+          <w:trHeight w:val="360"/>
+        </w:trPr>
+        <w:tc>
+          <w:tcPr>
+            <w:tcW w:w="3955" w:type="dxa"/>
+            <w:vAlign w:val="center"/>
+          </w:tcPr>
+          <w:p>
+            <w:pPr>
+              <w:rPr>
+                <w:b/>
+                <w:bCs/>
+                <w:lang w:val="en-US"/>
+              </w:rPr>
+            </w:pPr>
+          </w:p>
+        </w:tc>
+        <w:tc>
+          <w:tcPr>
+            <w:tcW w:w="5061" w:type="dxa"/>
+            <w:vAlign w:val="center"/>
+          </w:tcPr>
+          <w:p>
+            <w:pPr>
+              <w:rPr>
+                <w:lang w:val="en-US"/>
+              </w:rPr>
+            </w:pPr>
+          </w:p>
+        </w:tc>
+      </w:tr>
+      <w:tr>
+        <w:trPr>
+          <w:trHeight w:val="360"/>
+        </w:trPr>
+        <w:tc>
+          <w:tcPr>
+            <w:tcW w:w="3955" w:type="dxa"/>
+            <w:vAlign w:val="center"/>
+          </w:tcPr>
+          <w:p>
+            <w:pPr>
+              <w:rPr>
+                <w:b/>
+                <w:bCs/>
+                <w:lang w:val="en-US"/>
+              </w:rPr>
+            </w:pPr>
+          </w:p>
+        </w:tc>
+        <w:tc>
+          <w:tcPr>
+            <w:tcW w:w="5061" w:type="dxa"/>
+            <w:vAlign w:val="center"/>
+          </w:tcPr>
           <w:p>
             <w:pPr>
               <w:rPr>

</xml_diff>

<commit_message>
Level Design Progress: Friday
</commit_message>
<xml_diff>
--- a/level design.docx
+++ b/level design.docx
@@ -14466,8 +14466,8 @@
         <w:tblLook w:val="04A0" w:firstRow="1" w:lastRow="0" w:firstColumn="1" w:lastColumn="0" w:noHBand="0" w:noVBand="1"/>
       </w:tblPr>
       <w:tblGrid>
-        <w:gridCol w:w="3145"/>
-        <w:gridCol w:w="5871"/>
+        <w:gridCol w:w="2605"/>
+        <w:gridCol w:w="6411"/>
       </w:tblGrid>
       <w:tr>
         <w:trPr>
@@ -14475,7 +14475,7 @@
         </w:trPr>
         <w:tc>
           <w:tcPr>
-            <w:tcW w:w="3145" w:type="dxa"/>
+            <w:tcW w:w="2605" w:type="dxa"/>
             <w:vAlign w:val="center"/>
           </w:tcPr>
           <w:p>
@@ -14506,7 +14506,7 @@
         </w:tc>
         <w:tc>
           <w:tcPr>
-            <w:tcW w:w="5871" w:type="dxa"/>
+            <w:tcW w:w="6411" w:type="dxa"/>
             <w:vAlign w:val="center"/>
           </w:tcPr>
           <w:p>
@@ -14535,7 +14535,7 @@
         </w:trPr>
         <w:tc>
           <w:tcPr>
-            <w:tcW w:w="3145" w:type="dxa"/>
+            <w:tcW w:w="2605" w:type="dxa"/>
             <w:vAlign w:val="center"/>
           </w:tcPr>
           <w:p>
@@ -14727,7 +14727,7 @@
         </w:tc>
         <w:tc>
           <w:tcPr>
-            <w:tcW w:w="5871" w:type="dxa"/>
+            <w:tcW w:w="6411" w:type="dxa"/>
             <w:vAlign w:val="center"/>
           </w:tcPr>
           <w:p>
@@ -14752,7 +14752,7 @@
         </w:trPr>
         <w:tc>
           <w:tcPr>
-            <w:tcW w:w="3145" w:type="dxa"/>
+            <w:tcW w:w="2605" w:type="dxa"/>
             <w:vAlign w:val="center"/>
           </w:tcPr>
           <w:p>
@@ -14918,7 +14918,7 @@
         </w:tc>
         <w:tc>
           <w:tcPr>
-            <w:tcW w:w="5871" w:type="dxa"/>
+            <w:tcW w:w="6411" w:type="dxa"/>
             <w:vAlign w:val="center"/>
           </w:tcPr>
           <w:p>
@@ -15052,7 +15052,7 @@
         </w:trPr>
         <w:tc>
           <w:tcPr>
-            <w:tcW w:w="3145" w:type="dxa"/>
+            <w:tcW w:w="2605" w:type="dxa"/>
             <w:vAlign w:val="center"/>
           </w:tcPr>
           <w:p>
@@ -15259,7 +15259,7 @@
         </w:tc>
         <w:tc>
           <w:tcPr>
-            <w:tcW w:w="5871" w:type="dxa"/>
+            <w:tcW w:w="6411" w:type="dxa"/>
             <w:vAlign w:val="center"/>
           </w:tcPr>
           <w:p>
@@ -15272,7 +15272,39 @@
               <w:rPr>
                 <w:lang w:val="en-US"/>
               </w:rPr>
-              <w:t>One more day. You can do it! After this I will be meeting up with the others to investigate further.</w:t>
+              <w:t>Just hold on for one more day.</w:t>
+            </w:r>
+            <w:r>
+              <w:rPr>
+                <w:lang w:val="en-US"/>
+              </w:rPr>
+              <w:t xml:space="preserve"> After this I will be meeting up with the others to investigate further.</w:t>
+            </w:r>
+          </w:p>
+          <w:p>
+            <w:pPr>
+              <w:rPr>
+                <w:lang w:val="en-US"/>
+              </w:rPr>
+            </w:pPr>
+            <w:r>
+              <w:rPr>
+                <w:lang w:val="en-US"/>
+              </w:rPr>
+              <w:t xml:space="preserve">[p] </w:t>
+            </w:r>
+          </w:p>
+          <w:p>
+            <w:pPr>
+              <w:rPr>
+                <w:lang w:val="en-US"/>
+              </w:rPr>
+            </w:pPr>
+            <w:r>
+              <w:rPr>
+                <w:lang w:val="en-US"/>
+              </w:rPr>
+              <w:t>[p]Mike is on leave today.</w:t>
             </w:r>
           </w:p>
         </w:tc>
@@ -15283,7 +15315,7 @@
         </w:trPr>
         <w:tc>
           <w:tcPr>
-            <w:tcW w:w="3145" w:type="dxa"/>
+            <w:tcW w:w="2605" w:type="dxa"/>
             <w:vAlign w:val="center"/>
           </w:tcPr>
           <w:p>
@@ -15313,13 +15345,7 @@
               <w:rPr>
                 <w:lang w:val="en-US"/>
               </w:rPr>
-              <w:t xml:space="preserve">: </w:t>
-            </w:r>
-            <w:r>
-              <w:rPr>
-                <w:lang w:val="en-US"/>
-              </w:rPr>
-              <w:t>Inbound</w:t>
+              <w:t>: Inbound</w:t>
             </w:r>
           </w:p>
           <w:p>
@@ -15370,1075 +15396,6 @@
               <w:t xml:space="preserve">: </w:t>
             </w:r>
             <w:hyperlink r:id="rId39" w:history="1">
-              <w:r>
-                <w:rPr>
-                  <w:rStyle w:val="Hyperlink"/>
-                  <w:lang w:val="en-US"/>
-                </w:rPr>
-                <w:t>dailysnew</w:t>
-              </w:r>
-              <w:r>
-                <w:rPr>
-                  <w:rStyle w:val="Hyperlink"/>
-                  <w:lang w:val="en-US"/>
-                </w:rPr>
-                <w:t>@</w:t>
-              </w:r>
-              <w:r>
-                <w:rPr>
-                  <w:rStyle w:val="Hyperlink"/>
-                  <w:lang w:val="en-US"/>
-                </w:rPr>
-                <w:t>cnd</w:t>
-              </w:r>
-              <w:r>
-                <w:rPr>
-                  <w:rStyle w:val="Hyperlink"/>
-                  <w:lang w:val="en-US"/>
-                </w:rPr>
-                <w:t>.co</w:t>
-              </w:r>
-              <w:r>
-                <w:rPr>
-                  <w:rStyle w:val="Hyperlink"/>
-                  <w:lang w:val="en-US"/>
-                </w:rPr>
-                <w:t>r</w:t>
-              </w:r>
-              <w:r>
-                <w:rPr>
-                  <w:rStyle w:val="Hyperlink"/>
-                </w:rPr>
-                <w:t>n</w:t>
-              </w:r>
-            </w:hyperlink>
-            <w:r>
-              <w:rPr>
-                <w:lang w:val="en-US"/>
-              </w:rPr>
-              <w:t xml:space="preserve"> </w:t>
-            </w:r>
-          </w:p>
-          <w:p>
-            <w:pPr>
-              <w:rPr>
-                <w:lang w:val="en-US"/>
-              </w:rPr>
-            </w:pPr>
-            <w:r>
-              <w:rPr>
-                <w:b/>
-                <w:bCs/>
-                <w:lang w:val="en-US"/>
-              </w:rPr>
-              <w:t>To Address</w:t>
-            </w:r>
-            <w:r>
-              <w:rPr>
-                <w:lang w:val="en-US"/>
-              </w:rPr>
-              <w:t>: {player_email}</w:t>
-            </w:r>
-          </w:p>
-          <w:p>
-            <w:pPr>
-              <w:rPr>
-                <w:lang w:val="en-US"/>
-              </w:rPr>
-            </w:pPr>
-            <w:r>
-              <w:rPr>
-                <w:b/>
-                <w:bCs/>
-                <w:lang w:val="en-US"/>
-              </w:rPr>
-              <w:t>CC Address</w:t>
-            </w:r>
-            <w:r>
-              <w:rPr>
-                <w:lang w:val="en-US"/>
-              </w:rPr>
-              <w:t xml:space="preserve">: </w:t>
-            </w:r>
-          </w:p>
-          <w:p>
-            <w:pPr>
-              <w:rPr>
-                <w:lang w:val="en-US"/>
-              </w:rPr>
-            </w:pPr>
-            <w:r>
-              <w:rPr>
-                <w:b/>
-                <w:bCs/>
-                <w:lang w:val="en-US"/>
-              </w:rPr>
-              <w:t>Subject</w:t>
-            </w:r>
-            <w:r>
-              <w:rPr>
-                <w:lang w:val="en-US"/>
-              </w:rPr>
-              <w:t xml:space="preserve">: </w:t>
-            </w:r>
-            <w:r>
-              <w:rPr>
-                <w:lang w:val="en-US"/>
-              </w:rPr>
-              <w:t>The Best Antivirus Defense</w:t>
-            </w:r>
-          </w:p>
-          <w:p>
-            <w:pPr>
-              <w:rPr>
-                <w:b/>
-                <w:bCs/>
-                <w:lang w:val="en-US"/>
-              </w:rPr>
-            </w:pPr>
-          </w:p>
-        </w:tc>
-        <w:tc>
-          <w:tcPr>
-            <w:tcW w:w="5871" w:type="dxa"/>
-            <w:vAlign w:val="center"/>
-          </w:tcPr>
-          <w:p>
-            <w:pPr>
-              <w:rPr>
-                <w:lang w:val="en-US"/>
-              </w:rPr>
-            </w:pPr>
-            <w:r>
-              <w:rPr>
-                <w:lang w:val="en-US"/>
-              </w:rPr>
-              <w:t>Worry no more! The best defense against the frequent cyber attacks is here! Download the file attached now, install the application and carry on without ever worrying about attacks!</w:t>
-            </w:r>
-          </w:p>
-        </w:tc>
-      </w:tr>
-      <w:tr>
-        <w:trPr>
-          <w:trHeight w:val="360"/>
-        </w:trPr>
-        <w:tc>
-          <w:tcPr>
-            <w:tcW w:w="3145" w:type="dxa"/>
-            <w:vAlign w:val="center"/>
-          </w:tcPr>
-          <w:p>
-            <w:pPr>
-              <w:rPr>
-                <w:b/>
-                <w:bCs/>
-                <w:lang w:val="en-US"/>
-              </w:rPr>
-            </w:pPr>
-          </w:p>
-          <w:p>
-            <w:pPr>
-              <w:rPr>
-                <w:lang w:val="en-US"/>
-              </w:rPr>
-            </w:pPr>
-            <w:r>
-              <w:rPr>
-                <w:b/>
-                <w:bCs/>
-                <w:lang w:val="en-US"/>
-              </w:rPr>
-              <w:t>Type</w:t>
-            </w:r>
-            <w:r>
-              <w:rPr>
-                <w:lang w:val="en-US"/>
-              </w:rPr>
-              <w:t>: Inbound</w:t>
-            </w:r>
-          </w:p>
-          <w:p>
-            <w:pPr>
-              <w:rPr>
-                <w:lang w:val="en-US"/>
-              </w:rPr>
-            </w:pPr>
-            <w:r>
-              <w:rPr>
-                <w:b/>
-                <w:bCs/>
-                <w:lang w:val="en-US"/>
-              </w:rPr>
-              <w:t>Sender Name</w:t>
-            </w:r>
-            <w:r>
-              <w:rPr>
-                <w:lang w:val="en-US"/>
-              </w:rPr>
-              <w:t xml:space="preserve">: </w:t>
-            </w:r>
-            <w:r>
-              <w:rPr>
-                <w:lang w:val="en-US"/>
-              </w:rPr>
-              <w:t>YS Store</w:t>
-            </w:r>
-          </w:p>
-          <w:p>
-            <w:pPr>
-              <w:rPr>
-                <w:lang w:val="en-US"/>
-              </w:rPr>
-            </w:pPr>
-            <w:r>
-              <w:rPr>
-                <w:b/>
-                <w:bCs/>
-                <w:lang w:val="en-US"/>
-              </w:rPr>
-              <w:t>Sender Address</w:t>
-            </w:r>
-            <w:r>
-              <w:rPr>
-                <w:lang w:val="en-US"/>
-              </w:rPr>
-              <w:t xml:space="preserve">: </w:t>
-            </w:r>
-            <w:hyperlink r:id="rId40" w:history="1">
-              <w:r>
-                <w:rPr>
-                  <w:rStyle w:val="Hyperlink"/>
-                  <w:lang w:val="en-US"/>
-                </w:rPr>
-                <w:t>ys1143@email.com</w:t>
-              </w:r>
-            </w:hyperlink>
-            <w:r>
-              <w:rPr>
-                <w:lang w:val="en-US"/>
-              </w:rPr>
-              <w:t xml:space="preserve"> </w:t>
-            </w:r>
-            <w:r>
-              <w:rPr>
-                <w:lang w:val="en-US"/>
-              </w:rPr>
-              <w:t xml:space="preserve"> </w:t>
-            </w:r>
-          </w:p>
-          <w:p>
-            <w:pPr>
-              <w:rPr>
-                <w:lang w:val="en-US"/>
-              </w:rPr>
-            </w:pPr>
-            <w:r>
-              <w:rPr>
-                <w:b/>
-                <w:bCs/>
-                <w:lang w:val="en-US"/>
-              </w:rPr>
-              <w:lastRenderedPageBreak/>
-              <w:t>To Address</w:t>
-            </w:r>
-            <w:r>
-              <w:rPr>
-                <w:lang w:val="en-US"/>
-              </w:rPr>
-              <w:t>: {player_email}</w:t>
-            </w:r>
-          </w:p>
-          <w:p>
-            <w:pPr>
-              <w:rPr>
-                <w:lang w:val="en-US"/>
-              </w:rPr>
-            </w:pPr>
-            <w:r>
-              <w:rPr>
-                <w:b/>
-                <w:bCs/>
-                <w:lang w:val="en-US"/>
-              </w:rPr>
-              <w:t>CC Address</w:t>
-            </w:r>
-            <w:r>
-              <w:rPr>
-                <w:lang w:val="en-US"/>
-              </w:rPr>
-              <w:t xml:space="preserve">: </w:t>
-            </w:r>
-          </w:p>
-          <w:p>
-            <w:pPr>
-              <w:rPr>
-                <w:lang w:val="en-US"/>
-              </w:rPr>
-            </w:pPr>
-            <w:r>
-              <w:rPr>
-                <w:b/>
-                <w:bCs/>
-                <w:lang w:val="en-US"/>
-              </w:rPr>
-              <w:t>Subject</w:t>
-            </w:r>
-            <w:r>
-              <w:rPr>
-                <w:lang w:val="en-US"/>
-              </w:rPr>
-              <w:t xml:space="preserve">: </w:t>
-            </w:r>
-            <w:r>
-              <w:rPr>
-                <w:lang w:val="en-US"/>
-              </w:rPr>
-              <w:t>YS Store Purchase Order</w:t>
-            </w:r>
-          </w:p>
-          <w:p>
-            <w:pPr>
-              <w:rPr>
-                <w:b/>
-                <w:bCs/>
-                <w:lang w:val="en-US"/>
-              </w:rPr>
-            </w:pPr>
-          </w:p>
-        </w:tc>
-        <w:tc>
-          <w:tcPr>
-            <w:tcW w:w="5871" w:type="dxa"/>
-            <w:vAlign w:val="center"/>
-          </w:tcPr>
-          <w:p>
-            <w:pPr>
-              <w:rPr>
-                <w:lang w:val="en-US"/>
-              </w:rPr>
-            </w:pPr>
-            <w:r>
-              <w:rPr>
-                <w:lang w:val="en-US"/>
-              </w:rPr>
-              <w:lastRenderedPageBreak/>
-              <w:t>Hi I want to place an order for products from your company.</w:t>
-            </w:r>
-            <w:r>
-              <w:rPr>
-                <w:lang w:val="en-US"/>
-              </w:rPr>
-              <w:t xml:space="preserve"> Please refer to the attached file for further details. Thank you.</w:t>
-            </w:r>
-          </w:p>
-          <w:p>
-            <w:pPr>
-              <w:rPr>
-                <w:lang w:val="en-US"/>
-              </w:rPr>
-            </w:pPr>
-            <w:r>
-              <w:rPr>
-                <w:lang w:val="en-US"/>
-              </w:rPr>
-              <w:t xml:space="preserve">[p] </w:t>
-            </w:r>
-          </w:p>
-          <w:p>
-            <w:pPr>
-              <w:rPr>
-                <w:lang w:val="en-US"/>
-              </w:rPr>
-            </w:pPr>
-            <w:r>
-              <w:rPr>
-                <w:lang w:val="en-US"/>
-              </w:rPr>
-              <w:t>[p]</w:t>
-            </w:r>
-            <w:r>
-              <w:rPr>
-                <w:lang w:val="en-US"/>
-              </w:rPr>
-              <w:t>-YS Store</w:t>
-            </w:r>
-            <w:r>
-              <w:rPr>
-                <w:lang w:val="en-US"/>
-              </w:rPr>
-              <w:t xml:space="preserve"> Manager</w:t>
-            </w:r>
-          </w:p>
-        </w:tc>
-      </w:tr>
-      <w:tr>
-        <w:trPr>
-          <w:trHeight w:val="360"/>
-        </w:trPr>
-        <w:tc>
-          <w:tcPr>
-            <w:tcW w:w="3145" w:type="dxa"/>
-            <w:vAlign w:val="center"/>
-          </w:tcPr>
-          <w:p>
-            <w:pPr>
-              <w:rPr>
-                <w:b/>
-                <w:bCs/>
-                <w:lang w:val="en-US"/>
-              </w:rPr>
-            </w:pPr>
-          </w:p>
-          <w:p>
-            <w:pPr>
-              <w:rPr>
-                <w:lang w:val="en-US"/>
-              </w:rPr>
-            </w:pPr>
-            <w:r>
-              <w:rPr>
-                <w:b/>
-                <w:bCs/>
-                <w:lang w:val="en-US"/>
-              </w:rPr>
-              <w:t>Type</w:t>
-            </w:r>
-            <w:r>
-              <w:rPr>
-                <w:lang w:val="en-US"/>
-              </w:rPr>
-              <w:t xml:space="preserve">: </w:t>
-            </w:r>
-            <w:r>
-              <w:rPr>
-                <w:lang w:val="en-US"/>
-              </w:rPr>
-              <w:t>Inbound</w:t>
-            </w:r>
-          </w:p>
-          <w:p>
-            <w:pPr>
-              <w:rPr>
-                <w:lang w:val="en-US"/>
-              </w:rPr>
-            </w:pPr>
-            <w:r>
-              <w:rPr>
-                <w:b/>
-                <w:bCs/>
-                <w:lang w:val="en-US"/>
-              </w:rPr>
-              <w:t>Sender Name</w:t>
-            </w:r>
-            <w:r>
-              <w:rPr>
-                <w:lang w:val="en-US"/>
-              </w:rPr>
-              <w:t xml:space="preserve">: </w:t>
-            </w:r>
-            <w:r>
-              <w:rPr>
-                <w:lang w:val="en-US"/>
-              </w:rPr>
-              <w:t>Kai Jie</w:t>
-            </w:r>
-          </w:p>
-          <w:p>
-            <w:pPr>
-              <w:rPr>
-                <w:lang w:val="en-US"/>
-              </w:rPr>
-            </w:pPr>
-            <w:r>
-              <w:rPr>
-                <w:b/>
-                <w:bCs/>
-                <w:lang w:val="en-US"/>
-              </w:rPr>
-              <w:t>Sender Address</w:t>
-            </w:r>
-            <w:r>
-              <w:rPr>
-                <w:lang w:val="en-US"/>
-              </w:rPr>
-              <w:t xml:space="preserve">: </w:t>
-            </w:r>
-            <w:r>
-              <w:rPr>
-                <w:lang w:val="en-US"/>
-              </w:rPr>
-              <w:t>kaijie</w:t>
-            </w:r>
-            <w:r>
-              <w:rPr>
-                <w:lang w:val="en-US"/>
-              </w:rPr>
-              <w:t>@</w:t>
-            </w:r>
-            <w:r>
-              <w:rPr>
-                <w:lang w:val="en-US"/>
-              </w:rPr>
-              <w:t>adc</w:t>
-            </w:r>
-            <w:r>
-              <w:rPr>
-                <w:lang w:val="en-US"/>
-              </w:rPr>
-              <w:t>.com</w:t>
-            </w:r>
-            <w:r>
-              <w:rPr>
-                <w:lang w:val="en-US"/>
-              </w:rPr>
-              <w:t>.m</w:t>
-            </w:r>
-            <w:r>
-              <w:rPr>
-                <w:lang w:val="en-US"/>
-              </w:rPr>
-              <w:t>y</w:t>
-            </w:r>
-          </w:p>
-          <w:p>
-            <w:pPr>
-              <w:rPr>
-                <w:lang w:val="en-US"/>
-              </w:rPr>
-            </w:pPr>
-            <w:r>
-              <w:rPr>
-                <w:b/>
-                <w:bCs/>
-                <w:lang w:val="en-US"/>
-              </w:rPr>
-              <w:t>To Address</w:t>
-            </w:r>
-            <w:r>
-              <w:rPr>
-                <w:lang w:val="en-US"/>
-              </w:rPr>
-              <w:t>: {player_email}</w:t>
-            </w:r>
-          </w:p>
-          <w:p>
-            <w:pPr>
-              <w:rPr>
-                <w:lang w:val="en-US"/>
-              </w:rPr>
-            </w:pPr>
-            <w:r>
-              <w:rPr>
-                <w:b/>
-                <w:bCs/>
-                <w:lang w:val="en-US"/>
-              </w:rPr>
-              <w:t>CC Address</w:t>
-            </w:r>
-            <w:r>
-              <w:rPr>
-                <w:lang w:val="en-US"/>
-              </w:rPr>
-              <w:t xml:space="preserve">: </w:t>
-            </w:r>
-          </w:p>
-          <w:p>
-            <w:pPr>
-              <w:rPr>
-                <w:lang w:val="en-US"/>
-              </w:rPr>
-            </w:pPr>
-            <w:r>
-              <w:rPr>
-                <w:b/>
-                <w:bCs/>
-                <w:lang w:val="en-US"/>
-              </w:rPr>
-              <w:t>Subject</w:t>
-            </w:r>
-            <w:r>
-              <w:rPr>
-                <w:lang w:val="en-US"/>
-              </w:rPr>
-              <w:t xml:space="preserve">: </w:t>
-            </w:r>
-            <w:r>
-              <w:rPr>
-                <w:lang w:val="en-US"/>
-              </w:rPr>
-              <w:t>New Login Software</w:t>
-            </w:r>
-          </w:p>
-          <w:p>
-            <w:pPr>
-              <w:rPr>
-                <w:b/>
-                <w:bCs/>
-                <w:lang w:val="en-US"/>
-              </w:rPr>
-            </w:pPr>
-          </w:p>
-        </w:tc>
-        <w:tc>
-          <w:tcPr>
-            <w:tcW w:w="5871" w:type="dxa"/>
-            <w:vAlign w:val="center"/>
-          </w:tcPr>
-          <w:p>
-            <w:pPr>
-              <w:rPr>
-                <w:lang w:val="en-US"/>
-              </w:rPr>
-            </w:pPr>
-            <w:r>
-              <w:rPr>
-                <w:lang w:val="en-US"/>
-              </w:rPr>
-              <w:t>Hi. Our company has a new log in software to help increase security and protect us from outside attacks. Please install the software and wait for further instructions. Thank you.</w:t>
-            </w:r>
-          </w:p>
-          <w:p>
-            <w:pPr>
-              <w:rPr>
-                <w:lang w:val="en-US"/>
-              </w:rPr>
-            </w:pPr>
-            <w:r>
-              <w:rPr>
-                <w:lang w:val="en-US"/>
-              </w:rPr>
-              <w:t xml:space="preserve">[p] </w:t>
-            </w:r>
-          </w:p>
-          <w:p>
-            <w:pPr>
-              <w:rPr>
-                <w:lang w:val="en-US"/>
-              </w:rPr>
-            </w:pPr>
-            <w:r>
-              <w:rPr>
-                <w:lang w:val="en-US"/>
-              </w:rPr>
-              <w:t>[p]</w:t>
-            </w:r>
-            <w:r>
-              <w:rPr>
-                <w:lang w:val="en-US"/>
-              </w:rPr>
-              <w:t>-Kai Jie</w:t>
-            </w:r>
-            <w:r>
-              <w:rPr>
-                <w:lang w:val="en-US"/>
-              </w:rPr>
-              <w:t xml:space="preserve"> f</w:t>
-            </w:r>
-            <w:r>
-              <w:rPr>
-                <w:lang w:val="en-US"/>
-              </w:rPr>
-              <w:t>ro</w:t>
-            </w:r>
-            <w:r>
-              <w:rPr>
-                <w:lang w:val="en-US"/>
-              </w:rPr>
-              <w:t>m IT</w:t>
-            </w:r>
-          </w:p>
-        </w:tc>
-      </w:tr>
-      <w:tr>
-        <w:trPr>
-          <w:trHeight w:val="360"/>
-        </w:trPr>
-        <w:tc>
-          <w:tcPr>
-            <w:tcW w:w="3145" w:type="dxa"/>
-            <w:vAlign w:val="center"/>
-          </w:tcPr>
-          <w:p>
-            <w:pPr>
-              <w:rPr>
-                <w:b/>
-                <w:bCs/>
-                <w:lang w:val="en-US"/>
-              </w:rPr>
-            </w:pPr>
-          </w:p>
-          <w:p>
-            <w:pPr>
-              <w:rPr>
-                <w:lang w:val="en-US"/>
-              </w:rPr>
-            </w:pPr>
-            <w:r>
-              <w:rPr>
-                <w:b/>
-                <w:bCs/>
-                <w:lang w:val="en-US"/>
-              </w:rPr>
-              <w:t>Type</w:t>
-            </w:r>
-            <w:r>
-              <w:rPr>
-                <w:lang w:val="en-US"/>
-              </w:rPr>
-              <w:t>: Inbound</w:t>
-            </w:r>
-          </w:p>
-          <w:p>
-            <w:pPr>
-              <w:rPr>
-                <w:lang w:val="en-US"/>
-              </w:rPr>
-            </w:pPr>
-            <w:r>
-              <w:rPr>
-                <w:b/>
-                <w:bCs/>
-                <w:lang w:val="en-US"/>
-              </w:rPr>
-              <w:t>Sender Name</w:t>
-            </w:r>
-            <w:r>
-              <w:rPr>
-                <w:lang w:val="en-US"/>
-              </w:rPr>
-              <w:t xml:space="preserve">: </w:t>
-            </w:r>
-            <w:r>
-              <w:rPr>
-                <w:lang w:val="en-US"/>
-              </w:rPr>
-              <w:t>HOBBYART</w:t>
-            </w:r>
-          </w:p>
-          <w:p>
-            <w:pPr>
-              <w:rPr>
-                <w:lang w:val="en-US"/>
-              </w:rPr>
-            </w:pPr>
-            <w:r>
-              <w:rPr>
-                <w:b/>
-                <w:bCs/>
-                <w:lang w:val="en-US"/>
-              </w:rPr>
-              <w:t>Sender Address</w:t>
-            </w:r>
-            <w:r>
-              <w:rPr>
-                <w:lang w:val="en-US"/>
-              </w:rPr>
-              <w:t xml:space="preserve">: </w:t>
-            </w:r>
-            <w:r>
-              <w:rPr>
-                <w:lang w:val="en-US"/>
-              </w:rPr>
-              <w:t>shafie@hobbyart.com</w:t>
-            </w:r>
-          </w:p>
-          <w:p>
-            <w:pPr>
-              <w:rPr>
-                <w:lang w:val="en-US"/>
-              </w:rPr>
-            </w:pPr>
-            <w:r>
-              <w:rPr>
-                <w:b/>
-                <w:bCs/>
-                <w:lang w:val="en-US"/>
-              </w:rPr>
-              <w:t>To Address</w:t>
-            </w:r>
-            <w:r>
-              <w:rPr>
-                <w:lang w:val="en-US"/>
-              </w:rPr>
-              <w:t>: {player_email}</w:t>
-            </w:r>
-          </w:p>
-          <w:p>
-            <w:pPr>
-              <w:rPr>
-                <w:lang w:val="en-US"/>
-              </w:rPr>
-            </w:pPr>
-            <w:r>
-              <w:rPr>
-                <w:b/>
-                <w:bCs/>
-                <w:lang w:val="en-US"/>
-              </w:rPr>
-              <w:t>CC Address</w:t>
-            </w:r>
-            <w:r>
-              <w:rPr>
-                <w:lang w:val="en-US"/>
-              </w:rPr>
-              <w:t xml:space="preserve">: </w:t>
-            </w:r>
-          </w:p>
-          <w:p>
-            <w:pPr>
-              <w:rPr>
-                <w:lang w:val="en-US"/>
-              </w:rPr>
-            </w:pPr>
-            <w:r>
-              <w:rPr>
-                <w:b/>
-                <w:bCs/>
-                <w:lang w:val="en-US"/>
-              </w:rPr>
-              <w:t>Subject</w:t>
-            </w:r>
-            <w:r>
-              <w:rPr>
-                <w:lang w:val="en-US"/>
-              </w:rPr>
-              <w:t xml:space="preserve">: </w:t>
-            </w:r>
-            <w:r>
-              <w:rPr>
-                <w:lang w:val="en-US"/>
-              </w:rPr>
-              <w:t>Order for Stationeries</w:t>
-            </w:r>
-          </w:p>
-          <w:p>
-            <w:pPr>
-              <w:rPr>
-                <w:b/>
-                <w:bCs/>
-                <w:lang w:val="en-US"/>
-              </w:rPr>
-            </w:pPr>
-          </w:p>
-        </w:tc>
-        <w:tc>
-          <w:tcPr>
-            <w:tcW w:w="5871" w:type="dxa"/>
-            <w:vAlign w:val="center"/>
-          </w:tcPr>
-          <w:p>
-            <w:pPr>
-              <w:rPr>
-                <w:lang w:val="en-US"/>
-              </w:rPr>
-            </w:pPr>
-          </w:p>
-          <w:p>
-            <w:pPr>
-              <w:rPr>
-                <w:lang w:val="en-US"/>
-              </w:rPr>
-            </w:pPr>
-            <w:r>
-              <w:rPr>
-                <w:lang w:val="en-US"/>
-              </w:rPr>
-              <w:t>Hello ABC Stationeries. I’d like to place an order for stationeries</w:t>
-            </w:r>
-            <w:r>
-              <w:rPr>
-                <w:lang w:val="en-US"/>
-              </w:rPr>
-              <w:t xml:space="preserve"> for HOBBYART Art Supplies Store.</w:t>
-            </w:r>
-          </w:p>
-          <w:p>
-            <w:pPr>
-              <w:rPr>
-                <w:lang w:val="en-US"/>
-              </w:rPr>
-            </w:pPr>
-            <w:r>
-              <w:rPr>
-                <w:lang w:val="en-US"/>
-              </w:rPr>
-              <w:t xml:space="preserve">[p] </w:t>
-            </w:r>
-          </w:p>
-          <w:p>
-            <w:pPr>
-              <w:rPr>
-                <w:lang w:val="en-US"/>
-              </w:rPr>
-            </w:pPr>
-            <w:r>
-              <w:rPr>
-                <w:lang w:val="en-US"/>
-              </w:rPr>
-              <w:t>[p]The order file is attached in this email. Please refer to it for details and contact us if there are any issues.</w:t>
-            </w:r>
-          </w:p>
-          <w:p>
-            <w:pPr>
-              <w:rPr>
-                <w:lang w:val="en-US"/>
-              </w:rPr>
-            </w:pPr>
-            <w:r>
-              <w:rPr>
-                <w:lang w:val="en-US"/>
-              </w:rPr>
-              <w:t xml:space="preserve">[p] </w:t>
-            </w:r>
-          </w:p>
-          <w:p>
-            <w:pPr>
-              <w:rPr>
-                <w:lang w:val="en-US"/>
-              </w:rPr>
-            </w:pPr>
-            <w:r>
-              <w:rPr>
-                <w:lang w:val="en-US"/>
-              </w:rPr>
-              <w:t xml:space="preserve">[p] </w:t>
-            </w:r>
-          </w:p>
-          <w:p>
-            <w:pPr>
-              <w:rPr>
-                <w:lang w:val="en-US"/>
-              </w:rPr>
-            </w:pPr>
-            <w:r>
-              <w:rPr>
-                <w:lang w:val="en-US"/>
-              </w:rPr>
-              <w:t>[p]We look forward to hear from you.</w:t>
-            </w:r>
-          </w:p>
-          <w:p>
-            <w:pPr>
-              <w:rPr>
-                <w:lang w:val="en-US"/>
-              </w:rPr>
-            </w:pPr>
-            <w:r>
-              <w:rPr>
-                <w:lang w:val="en-US"/>
-              </w:rPr>
-              <w:t xml:space="preserve">[p] </w:t>
-            </w:r>
-          </w:p>
-          <w:p>
-            <w:pPr>
-              <w:rPr>
-                <w:lang w:val="en-US"/>
-              </w:rPr>
-            </w:pPr>
-            <w:r>
-              <w:rPr>
-                <w:lang w:val="en-US"/>
-              </w:rPr>
-              <w:t>[p]-Shafie</w:t>
-            </w:r>
-          </w:p>
-          <w:p>
-            <w:pPr>
-              <w:rPr>
-                <w:lang w:val="en-US"/>
-              </w:rPr>
-            </w:pPr>
-          </w:p>
-        </w:tc>
-      </w:tr>
-      <w:tr>
-        <w:trPr>
-          <w:trHeight w:val="360"/>
-        </w:trPr>
-        <w:tc>
-          <w:tcPr>
-            <w:tcW w:w="3145" w:type="dxa"/>
-            <w:vAlign w:val="center"/>
-          </w:tcPr>
-          <w:p>
-            <w:pPr>
-              <w:rPr>
-                <w:b/>
-                <w:bCs/>
-                <w:lang w:val="en-US"/>
-              </w:rPr>
-            </w:pPr>
-          </w:p>
-          <w:p>
-            <w:pPr>
-              <w:rPr>
-                <w:lang w:val="en-US"/>
-              </w:rPr>
-            </w:pPr>
-            <w:r>
-              <w:rPr>
-                <w:b/>
-                <w:bCs/>
-                <w:lang w:val="en-US"/>
-              </w:rPr>
-              <w:t>Type</w:t>
-            </w:r>
-            <w:r>
-              <w:rPr>
-                <w:lang w:val="en-US"/>
-              </w:rPr>
-              <w:t>: Inbound</w:t>
-            </w:r>
-          </w:p>
-          <w:p>
-            <w:pPr>
-              <w:rPr>
-                <w:lang w:val="en-US"/>
-              </w:rPr>
-            </w:pPr>
-            <w:r>
-              <w:rPr>
-                <w:b/>
-                <w:bCs/>
-                <w:lang w:val="en-US"/>
-              </w:rPr>
-              <w:t>Sender Name</w:t>
-            </w:r>
-            <w:r>
-              <w:rPr>
-                <w:lang w:val="en-US"/>
-              </w:rPr>
-              <w:t xml:space="preserve">: </w:t>
-            </w:r>
-            <w:r>
-              <w:rPr>
-                <w:lang w:val="en-US"/>
-              </w:rPr>
-              <w:t>Cyber News Daily</w:t>
-            </w:r>
-          </w:p>
-          <w:p>
-            <w:pPr>
-              <w:rPr>
-                <w:lang w:val="en-US"/>
-              </w:rPr>
-            </w:pPr>
-            <w:r>
-              <w:rPr>
-                <w:b/>
-                <w:bCs/>
-                <w:lang w:val="en-US"/>
-              </w:rPr>
-              <w:t>Sender Address</w:t>
-            </w:r>
-            <w:r>
-              <w:rPr>
-                <w:lang w:val="en-US"/>
-              </w:rPr>
-              <w:t xml:space="preserve">: </w:t>
-            </w:r>
-            <w:hyperlink r:id="rId41" w:history="1">
               <w:r>
                 <w:rPr>
                   <w:rStyle w:val="Hyperlink"/>
@@ -16541,7 +15498,7 @@
         </w:tc>
         <w:tc>
           <w:tcPr>
-            <w:tcW w:w="5871" w:type="dxa"/>
+            <w:tcW w:w="6411" w:type="dxa"/>
             <w:vAlign w:val="center"/>
           </w:tcPr>
           <w:p>
@@ -16554,51 +15511,7 @@
               <w:rPr>
                 <w:lang w:val="en-US"/>
               </w:rPr>
-              <w:t>Worry no more!</w:t>
-            </w:r>
-          </w:p>
-          <w:p>
-            <w:pPr>
-              <w:rPr>
-                <w:lang w:val="en-US"/>
-              </w:rPr>
-            </w:pPr>
-            <w:r>
-              <w:rPr>
-                <w:lang w:val="en-US"/>
-              </w:rPr>
-              <w:t xml:space="preserve">[p] </w:t>
-            </w:r>
-          </w:p>
-          <w:p>
-            <w:pPr>
-              <w:rPr>
-                <w:lang w:val="en-US"/>
-              </w:rPr>
-            </w:pPr>
-            <w:r>
-              <w:rPr>
-                <w:lang w:val="en-US"/>
-              </w:rPr>
-              <w:t>[p]</w:t>
-            </w:r>
-            <w:r>
-              <w:rPr>
-                <w:lang w:val="en-US"/>
-              </w:rPr>
-              <w:t xml:space="preserve">The best defense against the frequent </w:t>
-            </w:r>
-            <w:r>
-              <w:rPr>
-                <w:lang w:val="en-US"/>
-              </w:rPr>
-              <w:t>cyber-attacks</w:t>
-            </w:r>
-            <w:r>
-              <w:rPr>
-                <w:lang w:val="en-US"/>
-              </w:rPr>
-              <w:t xml:space="preserve"> is here! Download the file attached now, install the application and carry on without ever worrying about attacks!</w:t>
+              <w:t>Worry no more! The best defense against the frequent cyber attacks is here! Download the file attached now, install the application and carry on without ever worrying about attacks!</w:t>
             </w:r>
           </w:p>
         </w:tc>
@@ -16609,7 +15522,7 @@
         </w:trPr>
         <w:tc>
           <w:tcPr>
-            <w:tcW w:w="3145" w:type="dxa"/>
+            <w:tcW w:w="2605" w:type="dxa"/>
             <w:vAlign w:val="center"/>
           </w:tcPr>
           <w:p>
@@ -16666,6 +15579,841 @@
               <w:rPr>
                 <w:lang w:val="en-US"/>
               </w:rPr>
+              <w:t>YS Store</w:t>
+            </w:r>
+          </w:p>
+          <w:p>
+            <w:pPr>
+              <w:rPr>
+                <w:lang w:val="en-US"/>
+              </w:rPr>
+            </w:pPr>
+            <w:r>
+              <w:rPr>
+                <w:b/>
+                <w:bCs/>
+                <w:lang w:val="en-US"/>
+              </w:rPr>
+              <w:lastRenderedPageBreak/>
+              <w:t>Sender Address</w:t>
+            </w:r>
+            <w:r>
+              <w:rPr>
+                <w:lang w:val="en-US"/>
+              </w:rPr>
+              <w:t xml:space="preserve">: </w:t>
+            </w:r>
+            <w:hyperlink r:id="rId40" w:history="1">
+              <w:r>
+                <w:rPr>
+                  <w:rStyle w:val="Hyperlink"/>
+                  <w:lang w:val="en-US"/>
+                </w:rPr>
+                <w:t>ys1143@email.com</w:t>
+              </w:r>
+            </w:hyperlink>
+            <w:r>
+              <w:rPr>
+                <w:lang w:val="en-US"/>
+              </w:rPr>
+              <w:t xml:space="preserve"> </w:t>
+            </w:r>
+            <w:r>
+              <w:rPr>
+                <w:lang w:val="en-US"/>
+              </w:rPr>
+              <w:t xml:space="preserve"> </w:t>
+            </w:r>
+          </w:p>
+          <w:p>
+            <w:pPr>
+              <w:rPr>
+                <w:lang w:val="en-US"/>
+              </w:rPr>
+            </w:pPr>
+            <w:r>
+              <w:rPr>
+                <w:b/>
+                <w:bCs/>
+                <w:lang w:val="en-US"/>
+              </w:rPr>
+              <w:t>To Address</w:t>
+            </w:r>
+            <w:r>
+              <w:rPr>
+                <w:lang w:val="en-US"/>
+              </w:rPr>
+              <w:t>: {player_email}</w:t>
+            </w:r>
+          </w:p>
+          <w:p>
+            <w:pPr>
+              <w:rPr>
+                <w:lang w:val="en-US"/>
+              </w:rPr>
+            </w:pPr>
+            <w:r>
+              <w:rPr>
+                <w:b/>
+                <w:bCs/>
+                <w:lang w:val="en-US"/>
+              </w:rPr>
+              <w:t>CC Address</w:t>
+            </w:r>
+            <w:r>
+              <w:rPr>
+                <w:lang w:val="en-US"/>
+              </w:rPr>
+              <w:t xml:space="preserve">: </w:t>
+            </w:r>
+          </w:p>
+          <w:p>
+            <w:pPr>
+              <w:rPr>
+                <w:lang w:val="en-US"/>
+              </w:rPr>
+            </w:pPr>
+            <w:r>
+              <w:rPr>
+                <w:b/>
+                <w:bCs/>
+                <w:lang w:val="en-US"/>
+              </w:rPr>
+              <w:t>Subject</w:t>
+            </w:r>
+            <w:r>
+              <w:rPr>
+                <w:lang w:val="en-US"/>
+              </w:rPr>
+              <w:t xml:space="preserve">: </w:t>
+            </w:r>
+            <w:r>
+              <w:rPr>
+                <w:lang w:val="en-US"/>
+              </w:rPr>
+              <w:t>YS Store Purchase Order</w:t>
+            </w:r>
+          </w:p>
+          <w:p>
+            <w:pPr>
+              <w:rPr>
+                <w:b/>
+                <w:bCs/>
+                <w:lang w:val="en-US"/>
+              </w:rPr>
+            </w:pPr>
+          </w:p>
+        </w:tc>
+        <w:tc>
+          <w:tcPr>
+            <w:tcW w:w="6411" w:type="dxa"/>
+            <w:vAlign w:val="center"/>
+          </w:tcPr>
+          <w:p>
+            <w:pPr>
+              <w:rPr>
+                <w:lang w:val="en-US"/>
+              </w:rPr>
+            </w:pPr>
+            <w:r>
+              <w:rPr>
+                <w:lang w:val="en-US"/>
+              </w:rPr>
+              <w:lastRenderedPageBreak/>
+              <w:t>Hi I want to place an order for products from your company.</w:t>
+            </w:r>
+            <w:r>
+              <w:rPr>
+                <w:lang w:val="en-US"/>
+              </w:rPr>
+              <w:t xml:space="preserve"> Please refer to the attached file for further details. Thank you.</w:t>
+            </w:r>
+          </w:p>
+          <w:p>
+            <w:pPr>
+              <w:rPr>
+                <w:lang w:val="en-US"/>
+              </w:rPr>
+            </w:pPr>
+            <w:r>
+              <w:rPr>
+                <w:lang w:val="en-US"/>
+              </w:rPr>
+              <w:t xml:space="preserve">[p] </w:t>
+            </w:r>
+          </w:p>
+          <w:p>
+            <w:pPr>
+              <w:rPr>
+                <w:lang w:val="en-US"/>
+              </w:rPr>
+            </w:pPr>
+            <w:r>
+              <w:rPr>
+                <w:lang w:val="en-US"/>
+              </w:rPr>
+              <w:lastRenderedPageBreak/>
+              <w:t>[p]</w:t>
+            </w:r>
+            <w:r>
+              <w:rPr>
+                <w:lang w:val="en-US"/>
+              </w:rPr>
+              <w:t>-YS Store</w:t>
+            </w:r>
+            <w:r>
+              <w:rPr>
+                <w:lang w:val="en-US"/>
+              </w:rPr>
+              <w:t xml:space="preserve"> Manager</w:t>
+            </w:r>
+          </w:p>
+        </w:tc>
+      </w:tr>
+      <w:tr>
+        <w:trPr>
+          <w:trHeight w:val="360"/>
+        </w:trPr>
+        <w:tc>
+          <w:tcPr>
+            <w:tcW w:w="2605" w:type="dxa"/>
+            <w:vAlign w:val="center"/>
+          </w:tcPr>
+          <w:p>
+            <w:pPr>
+              <w:rPr>
+                <w:b/>
+                <w:bCs/>
+                <w:lang w:val="en-US"/>
+              </w:rPr>
+            </w:pPr>
+          </w:p>
+          <w:p>
+            <w:pPr>
+              <w:rPr>
+                <w:lang w:val="en-US"/>
+              </w:rPr>
+            </w:pPr>
+            <w:r>
+              <w:rPr>
+                <w:b/>
+                <w:bCs/>
+                <w:lang w:val="en-US"/>
+              </w:rPr>
+              <w:t>Type</w:t>
+            </w:r>
+            <w:r>
+              <w:rPr>
+                <w:lang w:val="en-US"/>
+              </w:rPr>
+              <w:t xml:space="preserve">: </w:t>
+            </w:r>
+            <w:r>
+              <w:rPr>
+                <w:lang w:val="en-US"/>
+              </w:rPr>
+              <w:t>Inbound</w:t>
+            </w:r>
+          </w:p>
+          <w:p>
+            <w:pPr>
+              <w:rPr>
+                <w:lang w:val="en-US"/>
+              </w:rPr>
+            </w:pPr>
+            <w:r>
+              <w:rPr>
+                <w:b/>
+                <w:bCs/>
+                <w:lang w:val="en-US"/>
+              </w:rPr>
+              <w:t>Sender Name</w:t>
+            </w:r>
+            <w:r>
+              <w:rPr>
+                <w:lang w:val="en-US"/>
+              </w:rPr>
+              <w:t xml:space="preserve">: </w:t>
+            </w:r>
+            <w:r>
+              <w:rPr>
+                <w:lang w:val="en-US"/>
+              </w:rPr>
+              <w:t>Kai Jie</w:t>
+            </w:r>
+          </w:p>
+          <w:p>
+            <w:pPr>
+              <w:rPr>
+                <w:lang w:val="en-US"/>
+              </w:rPr>
+            </w:pPr>
+            <w:r>
+              <w:rPr>
+                <w:b/>
+                <w:bCs/>
+                <w:lang w:val="en-US"/>
+              </w:rPr>
+              <w:t>Sender Address</w:t>
+            </w:r>
+            <w:r>
+              <w:rPr>
+                <w:lang w:val="en-US"/>
+              </w:rPr>
+              <w:t xml:space="preserve">: </w:t>
+            </w:r>
+            <w:r>
+              <w:rPr>
+                <w:lang w:val="en-US"/>
+              </w:rPr>
+              <w:t>kaijie</w:t>
+            </w:r>
+            <w:r>
+              <w:rPr>
+                <w:lang w:val="en-US"/>
+              </w:rPr>
+              <w:t>@</w:t>
+            </w:r>
+            <w:r>
+              <w:rPr>
+                <w:lang w:val="en-US"/>
+              </w:rPr>
+              <w:t>adc</w:t>
+            </w:r>
+            <w:r>
+              <w:rPr>
+                <w:lang w:val="en-US"/>
+              </w:rPr>
+              <w:t>.com</w:t>
+            </w:r>
+            <w:r>
+              <w:rPr>
+                <w:lang w:val="en-US"/>
+              </w:rPr>
+              <w:t>.m</w:t>
+            </w:r>
+            <w:r>
+              <w:rPr>
+                <w:lang w:val="en-US"/>
+              </w:rPr>
+              <w:t>y</w:t>
+            </w:r>
+          </w:p>
+          <w:p>
+            <w:pPr>
+              <w:rPr>
+                <w:lang w:val="en-US"/>
+              </w:rPr>
+            </w:pPr>
+            <w:r>
+              <w:rPr>
+                <w:b/>
+                <w:bCs/>
+                <w:lang w:val="en-US"/>
+              </w:rPr>
+              <w:t>To Address</w:t>
+            </w:r>
+            <w:r>
+              <w:rPr>
+                <w:lang w:val="en-US"/>
+              </w:rPr>
+              <w:t>: {player_email}</w:t>
+            </w:r>
+          </w:p>
+          <w:p>
+            <w:pPr>
+              <w:rPr>
+                <w:lang w:val="en-US"/>
+              </w:rPr>
+            </w:pPr>
+            <w:r>
+              <w:rPr>
+                <w:b/>
+                <w:bCs/>
+                <w:lang w:val="en-US"/>
+              </w:rPr>
+              <w:t>CC Address</w:t>
+            </w:r>
+            <w:r>
+              <w:rPr>
+                <w:lang w:val="en-US"/>
+              </w:rPr>
+              <w:t xml:space="preserve">: </w:t>
+            </w:r>
+          </w:p>
+          <w:p>
+            <w:pPr>
+              <w:rPr>
+                <w:lang w:val="en-US"/>
+              </w:rPr>
+            </w:pPr>
+            <w:r>
+              <w:rPr>
+                <w:b/>
+                <w:bCs/>
+                <w:lang w:val="en-US"/>
+              </w:rPr>
+              <w:t>Subject</w:t>
+            </w:r>
+            <w:r>
+              <w:rPr>
+                <w:lang w:val="en-US"/>
+              </w:rPr>
+              <w:t xml:space="preserve">: </w:t>
+            </w:r>
+            <w:r>
+              <w:rPr>
+                <w:lang w:val="en-US"/>
+              </w:rPr>
+              <w:t>New Login Software</w:t>
+            </w:r>
+          </w:p>
+          <w:p>
+            <w:pPr>
+              <w:rPr>
+                <w:b/>
+                <w:bCs/>
+                <w:lang w:val="en-US"/>
+              </w:rPr>
+            </w:pPr>
+          </w:p>
+        </w:tc>
+        <w:tc>
+          <w:tcPr>
+            <w:tcW w:w="6411" w:type="dxa"/>
+            <w:vAlign w:val="center"/>
+          </w:tcPr>
+          <w:p>
+            <w:pPr>
+              <w:rPr>
+                <w:lang w:val="en-US"/>
+              </w:rPr>
+            </w:pPr>
+            <w:r>
+              <w:rPr>
+                <w:lang w:val="en-US"/>
+              </w:rPr>
+              <w:t>Hi. Our company has a new log in software to help increase security and protect us from outside attacks. Please install the software and wait for further instructions. Thank you.</w:t>
+            </w:r>
+          </w:p>
+          <w:p>
+            <w:pPr>
+              <w:rPr>
+                <w:lang w:val="en-US"/>
+              </w:rPr>
+            </w:pPr>
+            <w:r>
+              <w:rPr>
+                <w:lang w:val="en-US"/>
+              </w:rPr>
+              <w:t xml:space="preserve">[p] </w:t>
+            </w:r>
+          </w:p>
+          <w:p>
+            <w:pPr>
+              <w:rPr>
+                <w:lang w:val="en-US"/>
+              </w:rPr>
+            </w:pPr>
+            <w:r>
+              <w:rPr>
+                <w:lang w:val="en-US"/>
+              </w:rPr>
+              <w:t>[p]</w:t>
+            </w:r>
+            <w:r>
+              <w:rPr>
+                <w:lang w:val="en-US"/>
+              </w:rPr>
+              <w:t>-Kai Jie</w:t>
+            </w:r>
+            <w:r>
+              <w:rPr>
+                <w:lang w:val="en-US"/>
+              </w:rPr>
+              <w:t xml:space="preserve"> f</w:t>
+            </w:r>
+            <w:r>
+              <w:rPr>
+                <w:lang w:val="en-US"/>
+              </w:rPr>
+              <w:t>ro</w:t>
+            </w:r>
+            <w:r>
+              <w:rPr>
+                <w:lang w:val="en-US"/>
+              </w:rPr>
+              <w:t>m IT</w:t>
+            </w:r>
+          </w:p>
+        </w:tc>
+      </w:tr>
+      <w:tr>
+        <w:trPr>
+          <w:trHeight w:val="360"/>
+        </w:trPr>
+        <w:tc>
+          <w:tcPr>
+            <w:tcW w:w="2605" w:type="dxa"/>
+            <w:vAlign w:val="center"/>
+          </w:tcPr>
+          <w:p>
+            <w:pPr>
+              <w:rPr>
+                <w:b/>
+                <w:bCs/>
+                <w:lang w:val="en-US"/>
+              </w:rPr>
+            </w:pPr>
+          </w:p>
+          <w:p>
+            <w:pPr>
+              <w:rPr>
+                <w:lang w:val="en-US"/>
+              </w:rPr>
+            </w:pPr>
+            <w:r>
+              <w:rPr>
+                <w:b/>
+                <w:bCs/>
+                <w:lang w:val="en-US"/>
+              </w:rPr>
+              <w:t>Type</w:t>
+            </w:r>
+            <w:r>
+              <w:rPr>
+                <w:lang w:val="en-US"/>
+              </w:rPr>
+              <w:t>: Inbound</w:t>
+            </w:r>
+          </w:p>
+          <w:p>
+            <w:pPr>
+              <w:rPr>
+                <w:lang w:val="en-US"/>
+              </w:rPr>
+            </w:pPr>
+            <w:r>
+              <w:rPr>
+                <w:b/>
+                <w:bCs/>
+                <w:lang w:val="en-US"/>
+              </w:rPr>
+              <w:t>Sender Name</w:t>
+            </w:r>
+            <w:r>
+              <w:rPr>
+                <w:lang w:val="en-US"/>
+              </w:rPr>
+              <w:t xml:space="preserve">: </w:t>
+            </w:r>
+            <w:r>
+              <w:rPr>
+                <w:lang w:val="en-US"/>
+              </w:rPr>
+              <w:t>HOBBYART</w:t>
+            </w:r>
+          </w:p>
+          <w:p>
+            <w:pPr>
+              <w:rPr>
+                <w:lang w:val="en-US"/>
+              </w:rPr>
+            </w:pPr>
+            <w:r>
+              <w:rPr>
+                <w:b/>
+                <w:bCs/>
+                <w:lang w:val="en-US"/>
+              </w:rPr>
+              <w:t>Sender Address</w:t>
+            </w:r>
+            <w:r>
+              <w:rPr>
+                <w:lang w:val="en-US"/>
+              </w:rPr>
+              <w:t xml:space="preserve">: </w:t>
+            </w:r>
+            <w:r>
+              <w:rPr>
+                <w:lang w:val="en-US"/>
+              </w:rPr>
+              <w:t>shafie@hobbyart.com</w:t>
+            </w:r>
+          </w:p>
+          <w:p>
+            <w:pPr>
+              <w:rPr>
+                <w:lang w:val="en-US"/>
+              </w:rPr>
+            </w:pPr>
+            <w:r>
+              <w:rPr>
+                <w:b/>
+                <w:bCs/>
+                <w:lang w:val="en-US"/>
+              </w:rPr>
+              <w:t>To Address</w:t>
+            </w:r>
+            <w:r>
+              <w:rPr>
+                <w:lang w:val="en-US"/>
+              </w:rPr>
+              <w:t>: {player_email}</w:t>
+            </w:r>
+          </w:p>
+          <w:p>
+            <w:pPr>
+              <w:rPr>
+                <w:lang w:val="en-US"/>
+              </w:rPr>
+            </w:pPr>
+            <w:r>
+              <w:rPr>
+                <w:b/>
+                <w:bCs/>
+                <w:lang w:val="en-US"/>
+              </w:rPr>
+              <w:t>CC Address</w:t>
+            </w:r>
+            <w:r>
+              <w:rPr>
+                <w:lang w:val="en-US"/>
+              </w:rPr>
+              <w:t xml:space="preserve">: </w:t>
+            </w:r>
+          </w:p>
+          <w:p>
+            <w:pPr>
+              <w:rPr>
+                <w:lang w:val="en-US"/>
+              </w:rPr>
+            </w:pPr>
+            <w:r>
+              <w:rPr>
+                <w:b/>
+                <w:bCs/>
+                <w:lang w:val="en-US"/>
+              </w:rPr>
+              <w:t>Subject</w:t>
+            </w:r>
+            <w:r>
+              <w:rPr>
+                <w:lang w:val="en-US"/>
+              </w:rPr>
+              <w:t xml:space="preserve">: </w:t>
+            </w:r>
+            <w:r>
+              <w:rPr>
+                <w:lang w:val="en-US"/>
+              </w:rPr>
+              <w:t>Order for Stationeries</w:t>
+            </w:r>
+          </w:p>
+          <w:p>
+            <w:pPr>
+              <w:rPr>
+                <w:b/>
+                <w:bCs/>
+                <w:lang w:val="en-US"/>
+              </w:rPr>
+            </w:pPr>
+          </w:p>
+        </w:tc>
+        <w:tc>
+          <w:tcPr>
+            <w:tcW w:w="6411" w:type="dxa"/>
+            <w:vAlign w:val="center"/>
+          </w:tcPr>
+          <w:p>
+            <w:pPr>
+              <w:rPr>
+                <w:lang w:val="en-US"/>
+              </w:rPr>
+            </w:pPr>
+          </w:p>
+          <w:p>
+            <w:pPr>
+              <w:rPr>
+                <w:lang w:val="en-US"/>
+              </w:rPr>
+            </w:pPr>
+            <w:r>
+              <w:rPr>
+                <w:lang w:val="en-US"/>
+              </w:rPr>
+              <w:t>Hello ABC Stationeries. I’d like to place an order for stationeries</w:t>
+            </w:r>
+            <w:r>
+              <w:rPr>
+                <w:lang w:val="en-US"/>
+              </w:rPr>
+              <w:t xml:space="preserve"> for HOBBYART Art Supplies Store.</w:t>
+            </w:r>
+          </w:p>
+          <w:p>
+            <w:pPr>
+              <w:rPr>
+                <w:lang w:val="en-US"/>
+              </w:rPr>
+            </w:pPr>
+            <w:r>
+              <w:rPr>
+                <w:lang w:val="en-US"/>
+              </w:rPr>
+              <w:t xml:space="preserve">[p] </w:t>
+            </w:r>
+          </w:p>
+          <w:p>
+            <w:pPr>
+              <w:rPr>
+                <w:lang w:val="en-US"/>
+              </w:rPr>
+            </w:pPr>
+            <w:r>
+              <w:rPr>
+                <w:lang w:val="en-US"/>
+              </w:rPr>
+              <w:t>[p]The order file is attached in this email. Please refer to it for details and contact us if there are any issues.</w:t>
+            </w:r>
+          </w:p>
+          <w:p>
+            <w:pPr>
+              <w:rPr>
+                <w:lang w:val="en-US"/>
+              </w:rPr>
+            </w:pPr>
+            <w:r>
+              <w:rPr>
+                <w:lang w:val="en-US"/>
+              </w:rPr>
+              <w:t xml:space="preserve">[p] </w:t>
+            </w:r>
+          </w:p>
+          <w:p>
+            <w:pPr>
+              <w:rPr>
+                <w:lang w:val="en-US"/>
+              </w:rPr>
+            </w:pPr>
+            <w:r>
+              <w:rPr>
+                <w:lang w:val="en-US"/>
+              </w:rPr>
+              <w:t xml:space="preserve">[p] </w:t>
+            </w:r>
+          </w:p>
+          <w:p>
+            <w:pPr>
+              <w:rPr>
+                <w:lang w:val="en-US"/>
+              </w:rPr>
+            </w:pPr>
+            <w:r>
+              <w:rPr>
+                <w:lang w:val="en-US"/>
+              </w:rPr>
+              <w:t>[p]We look forward to hear from you.</w:t>
+            </w:r>
+          </w:p>
+          <w:p>
+            <w:pPr>
+              <w:rPr>
+                <w:lang w:val="en-US"/>
+              </w:rPr>
+            </w:pPr>
+            <w:r>
+              <w:rPr>
+                <w:lang w:val="en-US"/>
+              </w:rPr>
+              <w:t xml:space="preserve">[p] </w:t>
+            </w:r>
+          </w:p>
+          <w:p>
+            <w:pPr>
+              <w:rPr>
+                <w:lang w:val="en-US"/>
+              </w:rPr>
+            </w:pPr>
+            <w:r>
+              <w:rPr>
+                <w:lang w:val="en-US"/>
+              </w:rPr>
+              <w:t>[p]-Shafie</w:t>
+            </w:r>
+          </w:p>
+          <w:p>
+            <w:pPr>
+              <w:rPr>
+                <w:lang w:val="en-US"/>
+              </w:rPr>
+            </w:pPr>
+          </w:p>
+        </w:tc>
+      </w:tr>
+      <w:tr>
+        <w:trPr>
+          <w:trHeight w:val="360"/>
+        </w:trPr>
+        <w:tc>
+          <w:tcPr>
+            <w:tcW w:w="2605" w:type="dxa"/>
+            <w:vAlign w:val="center"/>
+          </w:tcPr>
+          <w:p>
+            <w:pPr>
+              <w:rPr>
+                <w:b/>
+                <w:bCs/>
+                <w:lang w:val="en-US"/>
+              </w:rPr>
+            </w:pPr>
+          </w:p>
+          <w:p>
+            <w:pPr>
+              <w:rPr>
+                <w:lang w:val="en-US"/>
+              </w:rPr>
+            </w:pPr>
+            <w:r>
+              <w:rPr>
+                <w:b/>
+                <w:bCs/>
+                <w:lang w:val="en-US"/>
+              </w:rPr>
+              <w:t>Type</w:t>
+            </w:r>
+            <w:r>
+              <w:rPr>
+                <w:lang w:val="en-US"/>
+              </w:rPr>
+              <w:t>: Inbound</w:t>
+            </w:r>
+          </w:p>
+          <w:p>
+            <w:pPr>
+              <w:rPr>
+                <w:lang w:val="en-US"/>
+              </w:rPr>
+            </w:pPr>
+            <w:r>
+              <w:rPr>
+                <w:b/>
+                <w:bCs/>
+                <w:lang w:val="en-US"/>
+              </w:rPr>
+              <w:t>Sender Name</w:t>
+            </w:r>
+            <w:r>
+              <w:rPr>
+                <w:lang w:val="en-US"/>
+              </w:rPr>
+              <w:t xml:space="preserve">: </w:t>
+            </w:r>
+            <w:r>
+              <w:rPr>
+                <w:lang w:val="en-US"/>
+              </w:rPr>
               <w:t>Mike</w:t>
             </w:r>
           </w:p>
@@ -16689,7 +16437,7 @@
               </w:rPr>
               <w:t xml:space="preserve">: </w:t>
             </w:r>
-            <w:hyperlink r:id="rId42" w:history="1">
+            <w:hyperlink r:id="rId41" w:history="1">
               <w:r>
                 <w:rPr>
                   <w:rStyle w:val="Hyperlink"/>
@@ -16752,7 +16500,7 @@
               </w:rPr>
               <w:t xml:space="preserve">: </w:t>
             </w:r>
-            <w:hyperlink r:id="rId43" w:history="1">
+            <w:hyperlink r:id="rId42" w:history="1">
               <w:r>
                 <w:rPr>
                   <w:rStyle w:val="Hyperlink"/>
@@ -16813,7 +16561,7 @@
         </w:tc>
         <w:tc>
           <w:tcPr>
-            <w:tcW w:w="5871" w:type="dxa"/>
+            <w:tcW w:w="6411" w:type="dxa"/>
             <w:vAlign w:val="center"/>
           </w:tcPr>
           <w:p>
@@ -16902,7 +16650,7 @@
         </w:trPr>
         <w:tc>
           <w:tcPr>
-            <w:tcW w:w="3145" w:type="dxa"/>
+            <w:tcW w:w="2605" w:type="dxa"/>
             <w:vAlign w:val="center"/>
           </w:tcPr>
           <w:p>
@@ -16932,7 +16680,13 @@
               <w:rPr>
                 <w:lang w:val="en-US"/>
               </w:rPr>
-              <w:t>: Inbound</w:t>
+              <w:t xml:space="preserve">: </w:t>
+            </w:r>
+            <w:r>
+              <w:rPr>
+                <w:lang w:val="en-US"/>
+              </w:rPr>
+              <w:t>Message</w:t>
             </w:r>
           </w:p>
           <w:p>
@@ -16982,7 +16736,7 @@
               </w:rPr>
               <w:t xml:space="preserve">: </w:t>
             </w:r>
-            <w:hyperlink r:id="rId44" w:history="1">
+            <w:hyperlink r:id="rId43" w:history="1">
               <w:r>
                 <w:rPr>
                   <w:rStyle w:val="Hyperlink"/>
@@ -17016,7 +16770,6 @@
                 <w:bCs/>
                 <w:lang w:val="en-US"/>
               </w:rPr>
-              <w:lastRenderedPageBreak/>
               <w:t>To Address</w:t>
             </w:r>
             <w:r>
@@ -17086,7 +16839,7 @@
         </w:tc>
         <w:tc>
           <w:tcPr>
-            <w:tcW w:w="5871" w:type="dxa"/>
+            <w:tcW w:w="6411" w:type="dxa"/>
             <w:vAlign w:val="center"/>
           </w:tcPr>
           <w:p>
@@ -17106,7 +16859,7 @@
               <w:rPr>
                 <w:lang w:val="en-US"/>
               </w:rPr>
-              <w:t>YOUWILLJOINUS</w:t>
+              <w:t>YOUWILLJOINUS YOUWILLJOINUS YOUWILLJOINUS YOUWILLJOINUS YOUWILLJOINUS YOUWILLJOINUS YOUWILLJOINUS YOUWILLJOINUS YOUWILLJOINUS YOUWILLJOINUS YOUWILLJOINUS YOUWILLJOINUS YOUWILLJOINUS YOUWILLJOINUS YOUWILLJOINUS</w:t>
             </w:r>
             <w:r>
               <w:rPr>
@@ -17118,7 +16871,7 @@
               <w:rPr>
                 <w:lang w:val="en-US"/>
               </w:rPr>
-              <w:t>YOUWILLJOINUS</w:t>
+              <w:t>YOUWILLJOINUS YOUWILLJOINUS YOUWILLJOINUS YOUWILLJOINUS YOUWILLJOINUS YOUWILLJOINUS YOUWILLJOINUS YOUWILLJOINUS YOUWILLJOINUS</w:t>
             </w:r>
             <w:r>
               <w:rPr>
@@ -17130,7 +16883,7 @@
               <w:rPr>
                 <w:lang w:val="en-US"/>
               </w:rPr>
-              <w:t>YOUWILLJOINUS</w:t>
+              <w:t>YOUWILLJOINUS YOUWILLJOINUS YOUWILLJOINUS YOUWILLJOINUS YOUWILLJOINUS YOUWILLJOINUS YOUWILLJOINUS YOUWILLJOINUS YOUWILLJOINUS</w:t>
             </w:r>
             <w:r>
               <w:rPr>
@@ -17142,7 +16895,14 @@
               <w:rPr>
                 <w:lang w:val="en-US"/>
               </w:rPr>
-              <w:t>YOUWILLJOINUS</w:t>
+              <w:t xml:space="preserve">YOUWILLJOINUS YOUWILLJOINUS YOUWILLJOINUS YOUWILLJOINUS YOUWILLJOINUS YOUWILLJOINUS YOUWILLJOINUS </w:t>
+            </w:r>
+            <w:r>
+              <w:rPr>
+                <w:lang w:val="en-US"/>
+              </w:rPr>
+              <w:lastRenderedPageBreak/>
+              <w:t>YOUWILLJOINUS YOUWILLJOINUS</w:t>
             </w:r>
             <w:r>
               <w:rPr>
@@ -17154,7 +16914,7 @@
               <w:rPr>
                 <w:lang w:val="en-US"/>
               </w:rPr>
-              <w:t>YOUWILLJOINUS</w:t>
+              <w:t>YOUWILLJOINUS YOUWILLJOINUS YOUWILLJOINUS YOUWILLJOINUS YOUWILLJOINUS YOUWILLJOINUS YOUWILLJOINUS YOUWILLJOINUS YOUWILLJOINUS</w:t>
             </w:r>
             <w:r>
               <w:rPr>
@@ -17166,7 +16926,7 @@
               <w:rPr>
                 <w:lang w:val="en-US"/>
               </w:rPr>
-              <w:t>YOUWILLJOINUS</w:t>
+              <w:t>YOUWILLJOINUS YOUWILLJOINUS YOUWILLJOINUS YOUWILLJOINUS YOUWILLJOINUS YOUWILLJOINUS YOUWILLJOINUS YOUWILLJOINUS YOUWILLJOINUS</w:t>
             </w:r>
             <w:r>
               <w:rPr>
@@ -17178,7 +16938,7 @@
               <w:rPr>
                 <w:lang w:val="en-US"/>
               </w:rPr>
-              <w:t>YOUWILLJOINUS</w:t>
+              <w:t>YOUWILLJOINUS YOUWILLJOINUS YOUWILLJOINUS YOUWILLJOINUS YOUWILLJOINUS YOUWILLJOINUS YOUWILLJOINUS YOUWILLJOINUS YOUWILLJOINUS YOUWILLJOINUS YOUWILLJOINUS YOUWILLJOINUS YOUWILLJOINUS YOUWILLJOINUS YOUWILLJOINUS YOUWILLJOINUS YOUWILLJOINUS YOUWILLJOINUS YOUWILLJOINUS YOUWILLJOINUS YOUWILLJOINUS YOUWILLJOINUS YOUWILLJOINUS YOUWILLJOINUS YOUWILLJOINUS YOUWILLJOINUS YOUWILLJOINUS YOUWILLJOINUS YOUWILLJOINUS YOUWILLJOINUS YOUWILLJOINUS YOUWILLJOINUS YOUWILLJOINUS YOUWILLJOINUS YOUWILLJOINUS YOUWILLJOINUS YOUWILLJOINUS YOUWILLJOINUS YOUWILLJOINUS YOUWILLJOINUS</w:t>
             </w:r>
             <w:r>
               <w:rPr>
@@ -17190,7 +16950,7 @@
               <w:rPr>
                 <w:lang w:val="en-US"/>
               </w:rPr>
-              <w:t>YOUWILLJOINUS</w:t>
+              <w:t>YOUWILLJOINUS YOUWILLJOINUS YOUWILLJOINUS YOUWILLJOINUS YOUWILLJOINUS YOUWILLJOINUS YOUWILLJOINUS YOUWILLJOINUS YOUWILLJOINUS YOUWILLJOINUS YOUWILLJOINUS YOUWILLJOINUS YOUWILLJOINUS YOUWILLJOINUS YOUWILLJOINUS YOUWILLJOINUS YOUWILLJOINUS YOUWILLJOINUS YOUWILLJOINUS YOUWILLJOINUS YOUWILLJOINUS YOUWILLJOINUS YOUWILLJOINUS YOUWILLJOINUS YOUWILLJOINUS YOUWILLJOINUS YOUWILLJOINUS YOUWILLJOINUS YOUWILLJOINUS YOUWILLJOINUS YOUWILLJOINUS YOUWILLJOINUS YOUWILLJOINUS YOUWILLJOINUS YOUWILLJOINUS YOUWILLJOINUS YOUWILLJOINUS YOUWILLJOINUS YOUWILLJOINUS YOUWILLJOINUS</w:t>
             </w:r>
             <w:r>
               <w:rPr>
@@ -17202,80 +16962,7 @@
               <w:rPr>
                 <w:lang w:val="en-US"/>
               </w:rPr>
-              <w:t>YOUWILLJOINUS</w:t>
-            </w:r>
-            <w:r>
-              <w:rPr>
-                <w:lang w:val="en-US"/>
-              </w:rPr>
-              <w:t xml:space="preserve"> </w:t>
-            </w:r>
-            <w:r>
-              <w:rPr>
-                <w:lang w:val="en-US"/>
-              </w:rPr>
-              <w:lastRenderedPageBreak/>
-              <w:t>YOUWILLJOINUS</w:t>
-            </w:r>
-            <w:r>
-              <w:rPr>
-                <w:lang w:val="en-US"/>
-              </w:rPr>
-              <w:t xml:space="preserve"> </w:t>
-            </w:r>
-            <w:r>
-              <w:rPr>
-                <w:lang w:val="en-US"/>
-              </w:rPr>
-              <w:t>YOUWILLJOINUS</w:t>
-            </w:r>
-            <w:r>
-              <w:rPr>
-                <w:lang w:val="en-US"/>
-              </w:rPr>
-              <w:t xml:space="preserve"> </w:t>
-            </w:r>
-            <w:r>
-              <w:rPr>
-                <w:lang w:val="en-US"/>
-              </w:rPr>
-              <w:t>YOUWILLJOINUS</w:t>
-            </w:r>
-            <w:r>
-              <w:rPr>
-                <w:lang w:val="en-US"/>
-              </w:rPr>
-              <w:t xml:space="preserve"> </w:t>
-            </w:r>
-            <w:r>
-              <w:rPr>
-                <w:lang w:val="en-US"/>
-              </w:rPr>
-              <w:t>YOUWILLJOINUS</w:t>
-            </w:r>
-            <w:r>
-              <w:rPr>
-                <w:lang w:val="en-US"/>
-              </w:rPr>
-              <w:t xml:space="preserve"> </w:t>
-            </w:r>
-            <w:r>
-              <w:rPr>
-                <w:lang w:val="en-US"/>
-              </w:rPr>
-              <w:t>YOUWILLJOINUS</w:t>
-            </w:r>
-            <w:r>
-              <w:rPr>
-                <w:lang w:val="en-US"/>
-              </w:rPr>
-              <w:t xml:space="preserve"> </w:t>
-            </w:r>
-            <w:r>
-              <w:rPr>
-                <w:lang w:val="en-US"/>
-              </w:rPr>
-              <w:t>YOUWILLJOINUS</w:t>
+              <w:t>YOUWILLJOINUS YOUWILLJOINUS YOUWILLJOINUS YOUWILLJOINUS YOUWILLJOINUS YOUWILLJOINUS YOUWILLJOINUS YOUWILLJOINUS YOUWILLJOINUS YOUWILLJOINUS YOUWILLJOINUS YOUWILLJOINUS YOUWILLJOINUS YOUWILLJOINUS YOUWILLJOINUS YOUWILLJOINUS YOUWILLJOINUS YOUWILLJOINUS YOUWILLJOINUS YOUWILLJOINUS YOUWILLJOINUS YOUWILLJOINUS YOUWILLJOINUS YOUWILLJOINUS YOUWILLJOINUS YOUWILLJOINUS YOUWILLJOINUS YOUWILLJOINUS YOUWILLJOINUS YOUWILLJOINUS YOUWILLJOINUS YOUWILLJOINUS YOUWILLJOINUS YOUWILLJOINUS YOUWILLJOINUS YOUWILLJOINUS YOUWILLJOINUS YOUWILLJOINUS YOUWILLJOINUS YOUWILLJOINUS</w:t>
             </w:r>
           </w:p>
         </w:tc>
@@ -17627,6 +17314,7 @@
               <w:rPr>
                 <w:lang w:val="en-US"/>
               </w:rPr>
+              <w:lastRenderedPageBreak/>
               <w:t>[p]Please follow the rules and report</w:t>
             </w:r>
             <w:r>

</xml_diff>